<commit_message>
modified the Util.generateFasterRefIndex func a little bit change in getRefSeqBypos_faster func for the situation of unknow chrlength and use 9999999999 to read all chr is a beta version
</commit_message>
<xml_diff>
--- a/life文档.docx
+++ b/life文档.docx
@@ -1,6 +1,6 @@
 
 <file path=word/document.xml><?xml version="1.0" encoding="utf-8"?>
-<w:document xmlns:wpc="http://schemas.microsoft.com/office/word/2010/wordprocessingCanvas" xmlns:cx="http://schemas.microsoft.com/office/drawing/2014/chartex" xmlns:cx1="http://schemas.microsoft.com/office/drawing/2015/9/8/chartex" xmlns:cx2="http://schemas.microsoft.com/office/drawing/2015/10/21/chartex" xmlns:cx3="http://schemas.microsoft.com/office/drawing/2016/5/9/chartex" xmlns:cx4="http://schemas.microsoft.com/office/drawing/2016/5/10/chartex" xmlns:cx5="http://schemas.microsoft.com/office/drawing/2016/5/11/chartex" xmlns:cx6="http://schemas.microsoft.com/office/drawing/2016/5/12/chartex" xmlns:cx7="http://schemas.microsoft.com/office/drawing/2016/5/13/chartex" xmlns:cx8="http://schemas.microsoft.com/office/drawing/2016/5/14/chartex" xmlns:mc="http://schemas.openxmlformats.org/markup-compatibility/2006" xmlns:aink="http://schemas.microsoft.com/office/drawing/2016/ink" xmlns:am3d="http://schemas.microsoft.com/office/drawing/2017/model3d" xmlns:o="urn:schemas-microsoft-com:office:office" xmlns:r="http://schemas.openxmlformats.org/officeDocument/2006/relationships" xmlns:m="http://schemas.openxmlformats.org/officeDocument/2006/math" xmlns:v="urn:schemas-microsoft-com:vml" xmlns:wp14="http://schemas.microsoft.com/office/word/2010/wordprocessingDrawing" xmlns:wp="http://schemas.openxmlformats.org/drawingml/2006/wordprocessingDrawing" xmlns:w10="urn:schemas-microsoft-com:office:word" xmlns:w="http://schemas.openxmlformats.org/wordprocessingml/2006/main" xmlns:w14="http://schemas.microsoft.com/office/word/2010/wordml" xmlns:w15="http://schemas.microsoft.com/office/word/2012/wordml" xmlns:w16cex="http://schemas.microsoft.com/office/word/2018/wordml/cex" xmlns:w16cid="http://schemas.microsoft.com/office/word/2016/wordml/cid" xmlns:w16="http://schemas.microsoft.com/office/word/2018/wordml" xmlns:w16se="http://schemas.microsoft.com/office/word/2015/wordml/symex" xmlns:wpg="http://schemas.microsoft.com/office/word/2010/wordprocessingGroup" xmlns:wpi="http://schemas.microsoft.com/office/word/2010/wordprocessingInk" xmlns:wne="http://schemas.microsoft.com/office/word/2006/wordml" xmlns:wps="http://schemas.microsoft.com/office/word/2010/wordprocessingShape" mc:Ignorable="w14 w15 w16se w16cid w16 w16cex wp14">
+<w:document xmlns:wpc="http://schemas.microsoft.com/office/word/2010/wordprocessingCanvas" xmlns:cx="http://schemas.microsoft.com/office/drawing/2014/chartex" xmlns:cx1="http://schemas.microsoft.com/office/drawing/2015/9/8/chartex" xmlns:cx2="http://schemas.microsoft.com/office/drawing/2015/10/21/chartex" xmlns:cx3="http://schemas.microsoft.com/office/drawing/2016/5/9/chartex" xmlns:cx4="http://schemas.microsoft.com/office/drawing/2016/5/10/chartex" xmlns:cx5="http://schemas.microsoft.com/office/drawing/2016/5/11/chartex" xmlns:cx6="http://schemas.microsoft.com/office/drawing/2016/5/12/chartex" xmlns:cx7="http://schemas.microsoft.com/office/drawing/2016/5/13/chartex" xmlns:cx8="http://schemas.microsoft.com/office/drawing/2016/5/14/chartex" xmlns:mc="http://schemas.openxmlformats.org/markup-compatibility/2006" xmlns:aink="http://schemas.microsoft.com/office/drawing/2016/ink" xmlns:am3d="http://schemas.microsoft.com/office/drawing/2017/model3d" xmlns:o="urn:schemas-microsoft-com:office:office" xmlns:r="http://schemas.openxmlformats.org/officeDocument/2006/relationships" xmlns:m="http://schemas.openxmlformats.org/officeDocument/2006/math" xmlns:v="urn:schemas-microsoft-com:vml" xmlns:wp14="http://schemas.microsoft.com/office/word/2010/wordprocessingDrawing" xmlns:wp="http://schemas.openxmlformats.org/drawingml/2006/wordprocessingDrawing" xmlns:w10="urn:schemas-microsoft-com:office:word" xmlns:w="http://schemas.openxmlformats.org/wordprocessingml/2006/main" xmlns:w14="http://schemas.microsoft.com/office/word/2010/wordml" xmlns:w15="http://schemas.microsoft.com/office/word/2012/wordml" xmlns:w16cex="http://schemas.microsoft.com/office/word/2018/wordml/cex" xmlns:w16cid="http://schemas.microsoft.com/office/word/2016/wordml/cid" xmlns:w16="http://schemas.microsoft.com/office/word/2018/wordml" xmlns:w16sdtdh="http://schemas.microsoft.com/office/word/2020/wordml/sdtdatahash" xmlns:w16se="http://schemas.microsoft.com/office/word/2015/wordml/symex" xmlns:wpg="http://schemas.microsoft.com/office/word/2010/wordprocessingGroup" xmlns:wpi="http://schemas.microsoft.com/office/word/2010/wordprocessingInk" xmlns:wne="http://schemas.microsoft.com/office/word/2006/wordml" xmlns:wps="http://schemas.microsoft.com/office/word/2010/wordprocessingShape" mc:Ignorable="w14 w15 w16se w16cid w16 w16cex w16sdtdh wp14">
   <w:body>
     <w:p>
       <w:pPr>
@@ -35,7 +35,6 @@
           <w:szCs w:val="24"/>
         </w:rPr>
       </w:pPr>
-      <w:proofErr w:type="spellStart"/>
       <w:r>
         <w:rPr>
           <w:rFonts w:ascii="Times New Roman" w:hAnsi="Times New Roman" w:cs="Times New Roman"/>
@@ -44,7 +43,6 @@
         </w:rPr>
         <w:t>VCFutil.VCF_Data</w:t>
       </w:r>
-      <w:proofErr w:type="spellEnd"/>
     </w:p>
     <w:p>
       <w:pPr>
@@ -259,7 +257,6 @@
             </w:pPr>
             <w:bookmarkStart w:id="0" w:name="OLE_LINK1"/>
             <w:bookmarkStart w:id="1" w:name="OLE_LINK2"/>
-            <w:proofErr w:type="spellStart"/>
             <w:r>
               <w:rPr>
                 <w:rFonts w:ascii="Times New Roman" w:hAnsi="Times New Roman" w:cs="Times New Roman"/>
@@ -274,16 +271,7 @@
                 <w:sz w:val="24"/>
                 <w:szCs w:val="24"/>
               </w:rPr>
-              <w:t>a</w:t>
-            </w:r>
-            <w:proofErr w:type="spellEnd"/>
-            <w:r>
-              <w:rPr>
-                <w:rFonts w:ascii="Times New Roman" w:hAnsi="Times New Roman" w:cs="Times New Roman"/>
-                <w:sz w:val="24"/>
-                <w:szCs w:val="24"/>
-              </w:rPr>
-              <w:t>()</w:t>
+              <w:t>a()</w:t>
             </w:r>
             <w:bookmarkEnd w:id="0"/>
             <w:bookmarkEnd w:id="1"/>
@@ -323,18 +311,8 @@
                 <w:sz w:val="24"/>
                 <w:szCs w:val="24"/>
               </w:rPr>
-              <w:t xml:space="preserve">from </w:t>
-            </w:r>
-            <w:proofErr w:type="spellStart"/>
-            <w:r>
-              <w:rPr>
-                <w:rFonts w:ascii="Times New Roman" w:hAnsi="Times New Roman" w:cs="Times New Roman"/>
-                <w:sz w:val="24"/>
-                <w:szCs w:val="24"/>
-              </w:rPr>
-              <w:t>NGS.BasicUtil</w:t>
-            </w:r>
-            <w:proofErr w:type="spellEnd"/>
+              <w:t xml:space="preserve">from NGS.BasicUtil import </w:t>
+            </w:r>
             <w:r>
               <w:rPr>
                 <w:rFonts w:ascii="Times New Roman" w:hAnsi="Times New Roman" w:cs="Times New Roman"/>
@@ -343,24 +321,6 @@
               </w:rPr>
               <w:t xml:space="preserve"> </w:t>
             </w:r>
-            <w:proofErr w:type="gramStart"/>
-            <w:r>
-              <w:rPr>
-                <w:rFonts w:ascii="Times New Roman" w:hAnsi="Times New Roman" w:cs="Times New Roman"/>
-                <w:sz w:val="24"/>
-                <w:szCs w:val="24"/>
-              </w:rPr>
-              <w:t xml:space="preserve">import </w:t>
-            </w:r>
-            <w:r>
-              <w:rPr>
-                <w:rFonts w:ascii="Times New Roman" w:hAnsi="Times New Roman" w:cs="Times New Roman"/>
-                <w:sz w:val="24"/>
-                <w:szCs w:val="24"/>
-              </w:rPr>
-              <w:t xml:space="preserve"> </w:t>
-            </w:r>
-            <w:proofErr w:type="spellStart"/>
             <w:r>
               <w:rPr>
                 <w:rFonts w:ascii="Times New Roman" w:hAnsi="Times New Roman" w:cs="Times New Roman"/>
@@ -369,8 +329,6 @@
               </w:rPr>
               <w:t>VCFutil</w:t>
             </w:r>
-            <w:proofErr w:type="spellEnd"/>
-            <w:proofErr w:type="gramEnd"/>
           </w:p>
         </w:tc>
         <w:tc>
@@ -393,7 +351,6 @@
               </w:rPr>
               <w:t>初始化参数为</w:t>
             </w:r>
-            <w:proofErr w:type="spellStart"/>
             <w:r>
               <w:rPr>
                 <w:rFonts w:ascii="Times New Roman" w:hAnsi="Times New Roman" w:cs="Times New Roman" w:hint="eastAsia"/>
@@ -410,7 +367,6 @@
               </w:rPr>
               <w:t>cf</w:t>
             </w:r>
-            <w:proofErr w:type="spellEnd"/>
             <w:r>
               <w:rPr>
                 <w:rFonts w:ascii="Times New Roman" w:hAnsi="Times New Roman" w:cs="Times New Roman" w:hint="eastAsia"/>
@@ -441,7 +397,6 @@
               </w:rPr>
               <w:t>将</w:t>
             </w:r>
-            <w:proofErr w:type="spellStart"/>
             <w:r>
               <w:rPr>
                 <w:rFonts w:ascii="Times New Roman" w:hAnsi="Times New Roman" w:cs="Times New Roman" w:hint="eastAsia"/>
@@ -458,7 +413,6 @@
               </w:rPr>
               <w:t>cf</w:t>
             </w:r>
-            <w:proofErr w:type="spellEnd"/>
             <w:r>
               <w:rPr>
                 <w:rFonts w:ascii="Times New Roman" w:hAnsi="Times New Roman" w:cs="Times New Roman" w:hint="eastAsia"/>
@@ -467,7 +421,6 @@
               </w:rPr>
               <w:t>文件加载到内存，如果第一次加载某个</w:t>
             </w:r>
-            <w:proofErr w:type="spellStart"/>
             <w:r>
               <w:rPr>
                 <w:rFonts w:ascii="Times New Roman" w:hAnsi="Times New Roman" w:cs="Times New Roman" w:hint="eastAsia"/>
@@ -484,7 +437,6 @@
               </w:rPr>
               <w:t>cf</w:t>
             </w:r>
-            <w:proofErr w:type="spellEnd"/>
             <w:r>
               <w:rPr>
                 <w:rFonts w:ascii="Times New Roman" w:hAnsi="Times New Roman" w:cs="Times New Roman" w:hint="eastAsia"/>
@@ -493,7 +445,6 @@
               </w:rPr>
               <w:t>文件会自动简历索引文件，要求</w:t>
             </w:r>
-            <w:proofErr w:type="spellStart"/>
             <w:r>
               <w:rPr>
                 <w:rFonts w:ascii="Times New Roman" w:hAnsi="Times New Roman" w:cs="Times New Roman" w:hint="eastAsia"/>
@@ -510,7 +461,6 @@
               </w:rPr>
               <w:t>cf</w:t>
             </w:r>
-            <w:proofErr w:type="spellEnd"/>
             <w:r>
               <w:rPr>
                 <w:rFonts w:ascii="Times New Roman" w:hAnsi="Times New Roman" w:cs="Times New Roman" w:hint="eastAsia"/>
@@ -554,7 +504,6 @@
                 <w:szCs w:val="24"/>
               </w:rPr>
             </w:pPr>
-            <w:proofErr w:type="spellStart"/>
             <w:r>
               <w:rPr>
                 <w:rFonts w:ascii="Times New Roman" w:hAnsi="Times New Roman" w:cs="Times New Roman"/>
@@ -563,7 +512,6 @@
               </w:rPr>
               <w:t>getVcfListByChrom</w:t>
             </w:r>
-            <w:proofErr w:type="spellEnd"/>
           </w:p>
         </w:tc>
         <w:tc>
@@ -586,7 +534,6 @@
               </w:rPr>
               <w:t>通过</w:t>
             </w:r>
-            <w:proofErr w:type="spellStart"/>
             <w:r>
               <w:rPr>
                 <w:rFonts w:ascii="Times New Roman" w:hAnsi="Times New Roman" w:cs="Times New Roman"/>
@@ -595,7 +542,6 @@
               </w:rPr>
               <w:t>VCF_Data</w:t>
             </w:r>
-            <w:proofErr w:type="spellEnd"/>
             <w:r>
               <w:rPr>
                 <w:rFonts w:ascii="Times New Roman" w:hAnsi="Times New Roman" w:cs="Times New Roman" w:hint="eastAsia"/>
@@ -618,7 +564,6 @@
                 <w:szCs w:val="24"/>
               </w:rPr>
             </w:pPr>
-            <w:proofErr w:type="spellStart"/>
             <w:r>
               <w:rPr>
                 <w:rFonts w:ascii="Times New Roman" w:hAnsi="Times New Roman" w:cs="Times New Roman" w:hint="eastAsia"/>
@@ -635,7 +580,6 @@
               </w:rPr>
               <w:t>hrom</w:t>
             </w:r>
-            <w:proofErr w:type="spellEnd"/>
             <w:r>
               <w:rPr>
                 <w:rFonts w:ascii="Times New Roman" w:hAnsi="Times New Roman" w:cs="Times New Roman" w:hint="eastAsia"/>
@@ -658,25 +602,7 @@
                 <w:sz w:val="24"/>
                 <w:szCs w:val="24"/>
               </w:rPr>
-              <w:t>,</w:t>
-            </w:r>
-            <w:proofErr w:type="spellStart"/>
-            <w:r>
-              <w:rPr>
-                <w:rFonts w:ascii="Times New Roman" w:hAnsi="Times New Roman" w:cs="Times New Roman"/>
-                <w:sz w:val="24"/>
-                <w:szCs w:val="24"/>
-              </w:rPr>
-              <w:t>startpos</w:t>
-            </w:r>
-            <w:proofErr w:type="spellEnd"/>
-            <w:r>
-              <w:rPr>
-                <w:rFonts w:ascii="Times New Roman" w:hAnsi="Times New Roman" w:cs="Times New Roman"/>
-                <w:sz w:val="24"/>
-                <w:szCs w:val="24"/>
-              </w:rPr>
-              <w:t>=</w:t>
+              <w:t>,startpos=</w:t>
             </w:r>
             <w:r>
               <w:rPr>
@@ -708,25 +634,7 @@
                 <w:sz w:val="24"/>
                 <w:szCs w:val="24"/>
               </w:rPr>
-              <w:t>,</w:t>
-            </w:r>
-            <w:proofErr w:type="spellStart"/>
-            <w:r>
-              <w:rPr>
-                <w:rFonts w:ascii="Times New Roman" w:hAnsi="Times New Roman" w:cs="Times New Roman"/>
-                <w:sz w:val="24"/>
-                <w:szCs w:val="24"/>
-              </w:rPr>
-              <w:t>endpos</w:t>
-            </w:r>
-            <w:proofErr w:type="spellEnd"/>
-            <w:r>
-              <w:rPr>
-                <w:rFonts w:ascii="Times New Roman" w:hAnsi="Times New Roman" w:cs="Times New Roman"/>
-                <w:sz w:val="24"/>
-                <w:szCs w:val="24"/>
-              </w:rPr>
-              <w:t>=</w:t>
+              <w:t>,endpos=</w:t>
             </w:r>
             <w:r>
               <w:rPr>
@@ -774,25 +682,7 @@
                 <w:sz w:val="24"/>
                 <w:szCs w:val="24"/>
               </w:rPr>
-              <w:t xml:space="preserve">, </w:t>
-            </w:r>
-            <w:proofErr w:type="spellStart"/>
-            <w:r>
-              <w:rPr>
-                <w:rFonts w:ascii="Times New Roman" w:hAnsi="Times New Roman" w:cs="Times New Roman"/>
-                <w:sz w:val="24"/>
-                <w:szCs w:val="24"/>
-              </w:rPr>
-              <w:t>dilutetodensity</w:t>
-            </w:r>
-            <w:proofErr w:type="spellEnd"/>
-            <w:r>
-              <w:rPr>
-                <w:rFonts w:ascii="Times New Roman" w:hAnsi="Times New Roman" w:cs="Times New Roman"/>
-                <w:sz w:val="24"/>
-                <w:szCs w:val="24"/>
-              </w:rPr>
-              <w:t>=</w:t>
+              <w:t>, dilutetodensity=</w:t>
             </w:r>
             <w:r>
               <w:rPr>
@@ -872,43 +762,7 @@
                 <w:sz w:val="24"/>
                 <w:szCs w:val="24"/>
               </w:rPr>
-              <w:t xml:space="preserve">, </w:t>
-            </w:r>
-            <w:proofErr w:type="spellStart"/>
-            <w:r>
-              <w:rPr>
-                <w:rFonts w:ascii="Times New Roman" w:hAnsi="Times New Roman" w:cs="Times New Roman"/>
-                <w:sz w:val="24"/>
-                <w:szCs w:val="24"/>
-              </w:rPr>
-              <w:t>posUniq</w:t>
-            </w:r>
-            <w:proofErr w:type="spellEnd"/>
-            <w:r>
-              <w:rPr>
-                <w:rFonts w:ascii="Times New Roman" w:hAnsi="Times New Roman" w:cs="Times New Roman"/>
-                <w:sz w:val="24"/>
-                <w:szCs w:val="24"/>
-              </w:rPr>
-              <w:t xml:space="preserve">=True, </w:t>
-            </w:r>
-            <w:proofErr w:type="spellStart"/>
-            <w:r>
-              <w:rPr>
-                <w:rFonts w:ascii="Times New Roman" w:hAnsi="Times New Roman" w:cs="Times New Roman"/>
-                <w:sz w:val="24"/>
-                <w:szCs w:val="24"/>
-              </w:rPr>
-              <w:t>considerINDELandmultpleallele</w:t>
-            </w:r>
-            <w:proofErr w:type="spellEnd"/>
-            <w:r>
-              <w:rPr>
-                <w:rFonts w:ascii="Times New Roman" w:hAnsi="Times New Roman" w:cs="Times New Roman"/>
-                <w:sz w:val="24"/>
-                <w:szCs w:val="24"/>
-              </w:rPr>
-              <w:t>=</w:t>
+              <w:t>, posUniq=True, considerINDELandmultpleallele=</w:t>
             </w:r>
             <w:r>
               <w:rPr>
@@ -948,25 +802,7 @@
                 <w:sz w:val="24"/>
                 <w:szCs w:val="24"/>
               </w:rPr>
-              <w:t>,</w:t>
-            </w:r>
-            <w:proofErr w:type="spellStart"/>
-            <w:r>
-              <w:rPr>
-                <w:rFonts w:ascii="Times New Roman" w:hAnsi="Times New Roman" w:cs="Times New Roman"/>
-                <w:sz w:val="24"/>
-                <w:szCs w:val="24"/>
-              </w:rPr>
-              <w:t>MQfilter</w:t>
-            </w:r>
-            <w:proofErr w:type="spellEnd"/>
-            <w:r>
-              <w:rPr>
-                <w:rFonts w:ascii="Times New Roman" w:hAnsi="Times New Roman" w:cs="Times New Roman"/>
-                <w:sz w:val="24"/>
-                <w:szCs w:val="24"/>
-              </w:rPr>
-              <w:t>=</w:t>
+              <w:t>,MQfilter=</w:t>
             </w:r>
             <w:r>
               <w:rPr>
@@ -1006,7 +842,6 @@
               </w:rPr>
               <w:t>返回该</w:t>
             </w:r>
-            <w:proofErr w:type="spellStart"/>
             <w:r>
               <w:rPr>
                 <w:rFonts w:ascii="Times New Roman" w:hAnsi="Times New Roman" w:cs="Times New Roman" w:hint="eastAsia"/>
@@ -1023,34 +858,14 @@
               </w:rPr>
               <w:t>cf</w:t>
             </w:r>
-            <w:proofErr w:type="spellEnd"/>
-            <w:r>
-              <w:rPr>
-                <w:rFonts w:ascii="Times New Roman" w:hAnsi="Times New Roman" w:cs="Times New Roman" w:hint="eastAsia"/>
-                <w:sz w:val="24"/>
-                <w:szCs w:val="24"/>
-              </w:rPr>
-              <w:t>文件的</w:t>
-            </w:r>
-            <w:proofErr w:type="gramStart"/>
-            <w:r>
-              <w:rPr>
-                <w:rFonts w:ascii="Times New Roman" w:hAnsi="Times New Roman" w:cs="Times New Roman" w:hint="eastAsia"/>
-                <w:sz w:val="24"/>
-                <w:szCs w:val="24"/>
-              </w:rPr>
-              <w:t>的</w:t>
-            </w:r>
-            <w:proofErr w:type="gramEnd"/>
-            <w:r>
-              <w:rPr>
-                <w:rFonts w:ascii="Times New Roman" w:hAnsi="Times New Roman" w:cs="Times New Roman" w:hint="eastAsia"/>
-                <w:sz w:val="24"/>
-                <w:szCs w:val="24"/>
-              </w:rPr>
-              <w:t>某一条染色体的全部记录或某一区段的记录，返回值为列表，元素为</w:t>
-            </w:r>
-            <w:proofErr w:type="spellStart"/>
+            <w:r>
+              <w:rPr>
+                <w:rFonts w:ascii="Times New Roman" w:hAnsi="Times New Roman" w:cs="Times New Roman" w:hint="eastAsia"/>
+                <w:sz w:val="24"/>
+                <w:szCs w:val="24"/>
+              </w:rPr>
+              <w:t>文件的的某一条染色体的全部记录或某一区段的记录，返回值为列表，元素为</w:t>
+            </w:r>
             <w:r>
               <w:rPr>
                 <w:rFonts w:ascii="Times New Roman" w:hAnsi="Times New Roman" w:cs="Times New Roman" w:hint="eastAsia"/>
@@ -1067,7 +882,6 @@
               </w:rPr>
               <w:t>cf</w:t>
             </w:r>
-            <w:proofErr w:type="spellEnd"/>
             <w:r>
               <w:rPr>
                 <w:rFonts w:ascii="Times New Roman" w:hAnsi="Times New Roman" w:cs="Times New Roman" w:hint="eastAsia"/>
@@ -1140,25 +954,7 @@
                 <w:sz w:val="24"/>
                 <w:szCs w:val="24"/>
               </w:rPr>
-              <w:t xml:space="preserve">from </w:t>
-            </w:r>
-            <w:proofErr w:type="spellStart"/>
-            <w:r>
-              <w:rPr>
-                <w:rFonts w:ascii="Times New Roman" w:hAnsi="Times New Roman" w:cs="Times New Roman"/>
-                <w:sz w:val="24"/>
-                <w:szCs w:val="24"/>
-              </w:rPr>
-              <w:t>NGS.BasicUtil</w:t>
-            </w:r>
-            <w:proofErr w:type="spellEnd"/>
-            <w:r>
-              <w:rPr>
-                <w:rFonts w:ascii="Times New Roman" w:hAnsi="Times New Roman" w:cs="Times New Roman"/>
-                <w:sz w:val="24"/>
-                <w:szCs w:val="24"/>
-              </w:rPr>
-              <w:t xml:space="preserve"> import</w:t>
+              <w:t>from NGS.BasicUtil import</w:t>
             </w:r>
             <w:r>
               <w:rPr>
@@ -1218,18 +1014,8 @@
                 <w:sz w:val="24"/>
                 <w:szCs w:val="24"/>
               </w:rPr>
-              <w:t>该实例化对象可以用来调用相关函数进行</w:t>
-            </w:r>
-            <w:proofErr w:type="gramStart"/>
-            <w:r>
-              <w:rPr>
-                <w:rFonts w:ascii="Times New Roman" w:hAnsi="Times New Roman" w:cs="Times New Roman" w:hint="eastAsia"/>
-                <w:sz w:val="24"/>
-                <w:szCs w:val="24"/>
-              </w:rPr>
-              <w:t>滑窗操作</w:t>
-            </w:r>
-            <w:proofErr w:type="gramEnd"/>
+              <w:t>该实例化对象可以用来调用相关函数进行滑窗操作</w:t>
+            </w:r>
           </w:p>
         </w:tc>
       </w:tr>
@@ -1249,7 +1035,6 @@
                 <w:szCs w:val="24"/>
               </w:rPr>
             </w:pPr>
-            <w:proofErr w:type="spellStart"/>
             <w:r>
               <w:rPr>
                 <w:rFonts w:ascii="Times New Roman" w:hAnsi="Times New Roman" w:cs="Times New Roman"/>
@@ -1258,7 +1043,6 @@
               </w:rPr>
               <w:t>slidWindowOverlap</w:t>
             </w:r>
-            <w:proofErr w:type="spellEnd"/>
           </w:p>
         </w:tc>
         <w:tc>
@@ -1343,7 +1127,6 @@
               </w:rPr>
               <w:t>顺序排列的列表（如：</w:t>
             </w:r>
-            <w:proofErr w:type="spellStart"/>
             <w:r>
               <w:rPr>
                 <w:rFonts w:ascii="Times New Roman" w:hAnsi="Times New Roman" w:cs="Times New Roman"/>
@@ -1352,7 +1135,6 @@
               </w:rPr>
               <w:t>getVcfListByChrom</w:t>
             </w:r>
-            <w:proofErr w:type="spellEnd"/>
             <w:r>
               <w:rPr>
                 <w:rFonts w:ascii="Times New Roman" w:hAnsi="Times New Roman" w:cs="Times New Roman" w:hint="eastAsia"/>
@@ -1367,18 +1149,8 @@
                 <w:sz w:val="24"/>
                 <w:szCs w:val="24"/>
               </w:rPr>
-              <w:t xml:space="preserve">, </w:t>
-            </w:r>
-            <w:proofErr w:type="spellStart"/>
-            <w:r>
-              <w:rPr>
-                <w:rFonts w:ascii="Times New Roman" w:hAnsi="Times New Roman" w:cs="Times New Roman"/>
-                <w:sz w:val="24"/>
-                <w:szCs w:val="24"/>
-              </w:rPr>
-              <w:t>L_End_Pos</w:t>
-            </w:r>
-            <w:proofErr w:type="spellEnd"/>
+              <w:t>, L_End_Pos</w:t>
+            </w:r>
             <w:r>
               <w:rPr>
                 <w:rFonts w:ascii="Times New Roman" w:hAnsi="Times New Roman" w:cs="Times New Roman" w:hint="eastAsia"/>
@@ -1401,18 +1173,8 @@
                 <w:sz w:val="24"/>
                 <w:szCs w:val="24"/>
               </w:rPr>
-              <w:t xml:space="preserve">, </w:t>
-            </w:r>
-            <w:proofErr w:type="spellStart"/>
-            <w:r>
-              <w:rPr>
-                <w:rFonts w:ascii="Times New Roman" w:hAnsi="Times New Roman" w:cs="Times New Roman"/>
-                <w:sz w:val="24"/>
-                <w:szCs w:val="24"/>
-              </w:rPr>
-              <w:t>windowWidth</w:t>
-            </w:r>
-            <w:proofErr w:type="spellEnd"/>
+              <w:t>, windowWidth</w:t>
+            </w:r>
             <w:r>
               <w:rPr>
                 <w:rFonts w:ascii="Times New Roman" w:hAnsi="Times New Roman" w:cs="Times New Roman" w:hint="eastAsia"/>
@@ -1435,18 +1197,8 @@
                 <w:sz w:val="24"/>
                 <w:szCs w:val="24"/>
               </w:rPr>
-              <w:t xml:space="preserve">, </w:t>
-            </w:r>
-            <w:proofErr w:type="spellStart"/>
-            <w:r>
-              <w:rPr>
-                <w:rFonts w:ascii="Times New Roman" w:hAnsi="Times New Roman" w:cs="Times New Roman"/>
-                <w:sz w:val="24"/>
-                <w:szCs w:val="24"/>
-              </w:rPr>
-              <w:t>slideSize</w:t>
-            </w:r>
-            <w:proofErr w:type="spellEnd"/>
+              <w:t>, slideSize</w:t>
+            </w:r>
             <w:r>
               <w:rPr>
                 <w:rFonts w:ascii="Times New Roman" w:hAnsi="Times New Roman" w:cs="Times New Roman" w:hint="eastAsia"/>
@@ -1469,18 +1221,8 @@
                 <w:sz w:val="24"/>
                 <w:szCs w:val="24"/>
               </w:rPr>
-              <w:t xml:space="preserve">, </w:t>
-            </w:r>
-            <w:proofErr w:type="spellStart"/>
-            <w:r>
-              <w:rPr>
-                <w:rFonts w:ascii="Times New Roman" w:hAnsi="Times New Roman" w:cs="Times New Roman"/>
-                <w:sz w:val="24"/>
-                <w:szCs w:val="24"/>
-              </w:rPr>
-              <w:t>Caculator</w:t>
-            </w:r>
-            <w:proofErr w:type="spellEnd"/>
+              <w:t>, Caculator</w:t>
+            </w:r>
             <w:r>
               <w:rPr>
                 <w:rFonts w:ascii="Times New Roman" w:hAnsi="Times New Roman" w:cs="Times New Roman" w:hint="eastAsia"/>
@@ -1503,25 +1245,7 @@
                 <w:sz w:val="24"/>
                 <w:szCs w:val="24"/>
               </w:rPr>
-              <w:t>,</w:t>
-            </w:r>
-            <w:proofErr w:type="spellStart"/>
-            <w:r>
-              <w:rPr>
-                <w:rFonts w:ascii="Times New Roman" w:hAnsi="Times New Roman" w:cs="Times New Roman"/>
-                <w:sz w:val="24"/>
-                <w:szCs w:val="24"/>
-              </w:rPr>
-              <w:t>L_Start_Pos</w:t>
-            </w:r>
-            <w:proofErr w:type="spellEnd"/>
-            <w:r>
-              <w:rPr>
-                <w:rFonts w:ascii="Times New Roman" w:hAnsi="Times New Roman" w:cs="Times New Roman"/>
-                <w:sz w:val="24"/>
-                <w:szCs w:val="24"/>
-              </w:rPr>
-              <w:t>=</w:t>
+              <w:t>,L_Start_Pos=</w:t>
             </w:r>
             <w:r>
               <w:rPr>
@@ -1609,7 +1333,6 @@
               </w:rPr>
               <w:t>按照参数指定方式滑窗，计算每个窗口的值，计算方法有</w:t>
             </w:r>
-            <w:proofErr w:type="spellStart"/>
             <w:r>
               <w:rPr>
                 <w:rFonts w:ascii="Times New Roman" w:hAnsi="Times New Roman" w:cs="Times New Roman" w:hint="eastAsia"/>
@@ -1626,7 +1349,6 @@
               </w:rPr>
               <w:t>ulator</w:t>
             </w:r>
-            <w:proofErr w:type="spellEnd"/>
             <w:r>
               <w:rPr>
                 <w:rFonts w:ascii="Times New Roman" w:hAnsi="Times New Roman" w:cs="Times New Roman" w:hint="eastAsia"/>
@@ -1694,7 +1416,6 @@
                 <w:szCs w:val="24"/>
               </w:rPr>
             </w:pPr>
-            <w:proofErr w:type="spellStart"/>
             <w:r>
               <w:rPr>
                 <w:rFonts w:ascii="Times New Roman" w:hAnsi="Times New Roman" w:cs="Times New Roman"/>
@@ -1703,7 +1424,6 @@
               </w:rPr>
               <w:t>CaculatorToFindTAGs</w:t>
             </w:r>
-            <w:proofErr w:type="spellEnd"/>
             <w:r>
               <w:rPr>
                 <w:rFonts w:ascii="Times New Roman" w:hAnsi="Times New Roman" w:cs="Times New Roman"/>
@@ -1950,7 +1670,6 @@
           <w:szCs w:val="24"/>
         </w:rPr>
       </w:pPr>
-      <w:proofErr w:type="spellStart"/>
       <w:r>
         <w:rPr>
           <w:rFonts w:ascii="Times New Roman" w:eastAsia="宋体" w:hAnsi="Times New Roman" w:cs="Times New Roman"/>
@@ -1960,7 +1679,6 @@
         <w:lastRenderedPageBreak/>
         <w:t>alinmultPopSnpPos</w:t>
       </w:r>
-      <w:proofErr w:type="spellEnd"/>
       <w:r>
         <w:rPr>
           <w:rFonts w:ascii="Times New Roman" w:eastAsia="宋体" w:hAnsi="Times New Roman" w:cs="Times New Roman"/>
@@ -2047,23 +1765,13 @@
         </w:rPr>
         <w:t>参数：</w:t>
       </w:r>
-      <w:proofErr w:type="spellStart"/>
-      <w:r>
-        <w:rPr>
-          <w:rFonts w:ascii="Times New Roman" w:eastAsia="宋体" w:hAnsi="Times New Roman" w:cs="Times New Roman"/>
-          <w:sz w:val="24"/>
-          <w:szCs w:val="24"/>
-        </w:rPr>
-        <w:t>vcfMaplist</w:t>
-      </w:r>
-      <w:proofErr w:type="spellEnd"/>
-      <w:r>
-        <w:rPr>
-          <w:rFonts w:ascii="Times New Roman" w:eastAsia="宋体" w:hAnsi="Times New Roman" w:cs="Times New Roman"/>
-          <w:sz w:val="24"/>
-          <w:szCs w:val="24"/>
-        </w:rPr>
-        <w:t>=</w:t>
+      <w:r>
+        <w:rPr>
+          <w:rFonts w:ascii="Times New Roman" w:eastAsia="宋体" w:hAnsi="Times New Roman" w:cs="Times New Roman"/>
+          <w:sz w:val="24"/>
+          <w:szCs w:val="24"/>
+        </w:rPr>
+        <w:t>vcfMaplist=</w:t>
       </w:r>
       <w:r>
         <w:rPr>
@@ -2097,23 +1805,13 @@
         </w:rPr>
         <w:t>数据，</w:t>
       </w:r>
-      <w:proofErr w:type="spellStart"/>
-      <w:r>
-        <w:rPr>
-          <w:rFonts w:ascii="Times New Roman" w:eastAsia="宋体" w:hAnsi="Times New Roman" w:cs="Times New Roman"/>
-          <w:sz w:val="24"/>
-          <w:szCs w:val="24"/>
-        </w:rPr>
-        <w:t>jointmode</w:t>
-      </w:r>
-      <w:proofErr w:type="spellEnd"/>
-      <w:r>
-        <w:rPr>
-          <w:rFonts w:ascii="Times New Roman" w:eastAsia="宋体" w:hAnsi="Times New Roman" w:cs="Times New Roman"/>
-          <w:sz w:val="24"/>
-          <w:szCs w:val="24"/>
-        </w:rPr>
-        <w:t>=</w:t>
+      <w:r>
+        <w:rPr>
+          <w:rFonts w:ascii="Times New Roman" w:eastAsia="宋体" w:hAnsi="Times New Roman" w:cs="Times New Roman"/>
+          <w:sz w:val="24"/>
+          <w:szCs w:val="24"/>
+        </w:rPr>
+        <w:t>jointmode=</w:t>
       </w:r>
       <w:r>
         <w:rPr>
@@ -2129,25 +1827,7 @@
           <w:sz w:val="24"/>
           <w:szCs w:val="24"/>
         </w:rPr>
-        <w:t>“o”/“</w:t>
-      </w:r>
-      <w:proofErr w:type="spellStart"/>
-      <w:r>
-        <w:rPr>
-          <w:rFonts w:ascii="Times New Roman" w:eastAsia="宋体" w:hAnsi="Times New Roman" w:cs="Times New Roman"/>
-          <w:sz w:val="24"/>
-          <w:szCs w:val="24"/>
-        </w:rPr>
-        <w:t>i</w:t>
-      </w:r>
-      <w:proofErr w:type="spellEnd"/>
-      <w:r>
-        <w:rPr>
-          <w:rFonts w:ascii="Times New Roman" w:eastAsia="宋体" w:hAnsi="Times New Roman" w:cs="Times New Roman"/>
-          <w:sz w:val="24"/>
-          <w:szCs w:val="24"/>
-        </w:rPr>
-        <w:t>”</w:t>
+        <w:t>“o”/“i”</w:t>
       </w:r>
       <w:r>
         <w:rPr>
@@ -2237,25 +1917,7 @@
           <w:sz w:val="24"/>
           <w:szCs w:val="24"/>
         </w:rPr>
-        <w:t>vcffile</w:t>
-      </w:r>
-      <w:proofErr w:type="gramStart"/>
-      <w:r>
-        <w:rPr>
-          <w:rFonts w:ascii="Times New Roman" w:eastAsia="宋体" w:hAnsi="Times New Roman" w:cs="Times New Roman"/>
-          <w:sz w:val="24"/>
-          <w:szCs w:val="24"/>
-        </w:rPr>
-        <w:t>1,vcffle</w:t>
-      </w:r>
-      <w:proofErr w:type="gramEnd"/>
-      <w:r>
-        <w:rPr>
-          <w:rFonts w:ascii="Times New Roman" w:eastAsia="宋体" w:hAnsi="Times New Roman" w:cs="Times New Roman"/>
-          <w:sz w:val="24"/>
-          <w:szCs w:val="24"/>
-        </w:rPr>
-        <w:t>2,vcffile3…</w:t>
+        <w:t>vcffile1,vcffle2,vcffile3…</w:t>
       </w:r>
       <w:r>
         <w:rPr>
@@ -2338,9 +2000,24 @@
           <w:sz w:val="24"/>
           <w:szCs w:val="24"/>
         </w:rPr>
-        <w:t>[</w:t>
-      </w:r>
-      <w:proofErr w:type="spellStart"/>
+        <w:t>[chrNo:[</w:t>
+      </w:r>
+      <w:r>
+        <w:rPr>
+          <w:rFonts w:ascii="Times New Roman" w:eastAsia="宋体" w:hAnsi="Times New Roman" w:cs="Times New Roman"/>
+          <w:sz w:val="24"/>
+          <w:szCs w:val="24"/>
+        </w:rPr>
+        <w:t>vcffile1</w:t>
+      </w:r>
+      <w:r>
+        <w:rPr>
+          <w:rFonts w:ascii="Times New Roman" w:eastAsia="宋体" w:hAnsi="Times New Roman" w:cs="Times New Roman"/>
+          <w:sz w:val="24"/>
+          <w:szCs w:val="24"/>
+        </w:rPr>
+        <w:t>中</w:t>
+      </w:r>
       <w:r>
         <w:rPr>
           <w:rFonts w:ascii="Times New Roman" w:eastAsia="宋体" w:hAnsi="Times New Roman" w:cs="Times New Roman"/>
@@ -2349,22 +2026,29 @@
         </w:rPr>
         <w:t>chrNo</w:t>
       </w:r>
-      <w:proofErr w:type="spellEnd"/>
-      <w:r>
-        <w:rPr>
-          <w:rFonts w:ascii="Times New Roman" w:eastAsia="宋体" w:hAnsi="Times New Roman" w:cs="Times New Roman"/>
-          <w:sz w:val="24"/>
-          <w:szCs w:val="24"/>
-        </w:rPr>
-        <w:t>:[</w:t>
-      </w:r>
-      <w:r>
-        <w:rPr>
-          <w:rFonts w:ascii="Times New Roman" w:eastAsia="宋体" w:hAnsi="Times New Roman" w:cs="Times New Roman"/>
-          <w:sz w:val="24"/>
-          <w:szCs w:val="24"/>
-        </w:rPr>
-        <w:t>vcffile1</w:t>
+      <w:r>
+        <w:rPr>
+          <w:rFonts w:ascii="Times New Roman" w:eastAsia="宋体" w:hAnsi="Times New Roman" w:cs="Times New Roman"/>
+          <w:sz w:val="24"/>
+          <w:szCs w:val="24"/>
+        </w:rPr>
+        <w:t>的记录</w:t>
+      </w:r>
+      <w:r>
+        <w:rPr>
+          <w:rFonts w:ascii="Times New Roman" w:eastAsia="宋体" w:hAnsi="Times New Roman" w:cs="Times New Roman"/>
+          <w:sz w:val="24"/>
+          <w:szCs w:val="24"/>
+        </w:rPr>
+        <w:t>],{chrNo:[</w:t>
+      </w:r>
+      <w:r>
+        <w:rPr>
+          <w:rFonts w:ascii="Times New Roman" w:eastAsia="宋体" w:hAnsi="Times New Roman" w:cs="Times New Roman"/>
+          <w:sz w:val="24"/>
+          <w:szCs w:val="24"/>
+        </w:rPr>
+        <w:t xml:space="preserve"> vcffile2</w:t>
       </w:r>
       <w:r>
         <w:rPr>
@@ -2374,7 +2058,6 @@
         </w:rPr>
         <w:t>中</w:t>
       </w:r>
-      <w:proofErr w:type="spellStart"/>
       <w:r>
         <w:rPr>
           <w:rFonts w:ascii="Times New Roman" w:eastAsia="宋体" w:hAnsi="Times New Roman" w:cs="Times New Roman"/>
@@ -2383,7 +2066,6 @@
         </w:rPr>
         <w:t>chrNo</w:t>
       </w:r>
-      <w:proofErr w:type="spellEnd"/>
       <w:r>
         <w:rPr>
           <w:rFonts w:ascii="Times New Roman" w:eastAsia="宋体" w:hAnsi="Times New Roman" w:cs="Times New Roman"/>
@@ -2398,9 +2080,32 @@
           <w:sz w:val="24"/>
           <w:szCs w:val="24"/>
         </w:rPr>
-        <w:t>],{</w:t>
-      </w:r>
-      <w:proofErr w:type="spellStart"/>
+        <w:t>]},,,,,,]</w:t>
+      </w:r>
+      <w:r>
+        <w:rPr>
+          <w:rFonts w:ascii="Times New Roman" w:eastAsia="宋体" w:hAnsi="Times New Roman" w:cs="Times New Roman"/>
+          <w:sz w:val="24"/>
+          <w:szCs w:val="24"/>
+        </w:rPr>
+        <w:t>。每个</w:t>
+      </w:r>
+      <w:r>
+        <w:rPr>
+          <w:rFonts w:ascii="Times New Roman" w:eastAsia="宋体" w:hAnsi="Times New Roman" w:cs="Times New Roman"/>
+          <w:sz w:val="24"/>
+          <w:szCs w:val="24"/>
+        </w:rPr>
+        <w:t>VCF</w:t>
+      </w:r>
+      <w:r>
+        <w:rPr>
+          <w:rFonts w:ascii="Times New Roman" w:eastAsia="宋体" w:hAnsi="Times New Roman" w:cs="Times New Roman"/>
+          <w:sz w:val="24"/>
+          <w:szCs w:val="24"/>
+        </w:rPr>
+        <w:t>文件的对应</w:t>
+      </w:r>
       <w:r>
         <w:rPr>
           <w:rFonts w:ascii="Times New Roman" w:eastAsia="宋体" w:hAnsi="Times New Roman" w:cs="Times New Roman"/>
@@ -2409,91 +2114,6 @@
         </w:rPr>
         <w:t>chrNo</w:t>
       </w:r>
-      <w:proofErr w:type="spellEnd"/>
-      <w:r>
-        <w:rPr>
-          <w:rFonts w:ascii="Times New Roman" w:eastAsia="宋体" w:hAnsi="Times New Roman" w:cs="Times New Roman"/>
-          <w:sz w:val="24"/>
-          <w:szCs w:val="24"/>
-        </w:rPr>
-        <w:t>:[</w:t>
-      </w:r>
-      <w:r>
-        <w:rPr>
-          <w:rFonts w:ascii="Times New Roman" w:eastAsia="宋体" w:hAnsi="Times New Roman" w:cs="Times New Roman"/>
-          <w:sz w:val="24"/>
-          <w:szCs w:val="24"/>
-        </w:rPr>
-        <w:t xml:space="preserve"> vcffile2</w:t>
-      </w:r>
-      <w:r>
-        <w:rPr>
-          <w:rFonts w:ascii="Times New Roman" w:eastAsia="宋体" w:hAnsi="Times New Roman" w:cs="Times New Roman"/>
-          <w:sz w:val="24"/>
-          <w:szCs w:val="24"/>
-        </w:rPr>
-        <w:t>中</w:t>
-      </w:r>
-      <w:proofErr w:type="spellStart"/>
-      <w:r>
-        <w:rPr>
-          <w:rFonts w:ascii="Times New Roman" w:eastAsia="宋体" w:hAnsi="Times New Roman" w:cs="Times New Roman"/>
-          <w:sz w:val="24"/>
-          <w:szCs w:val="24"/>
-        </w:rPr>
-        <w:t>chrNo</w:t>
-      </w:r>
-      <w:proofErr w:type="spellEnd"/>
-      <w:r>
-        <w:rPr>
-          <w:rFonts w:ascii="Times New Roman" w:eastAsia="宋体" w:hAnsi="Times New Roman" w:cs="Times New Roman"/>
-          <w:sz w:val="24"/>
-          <w:szCs w:val="24"/>
-        </w:rPr>
-        <w:t>的记录</w:t>
-      </w:r>
-      <w:r>
-        <w:rPr>
-          <w:rFonts w:ascii="Times New Roman" w:eastAsia="宋体" w:hAnsi="Times New Roman" w:cs="Times New Roman"/>
-          <w:sz w:val="24"/>
-          <w:szCs w:val="24"/>
-        </w:rPr>
-        <w:t>]},,,,,,]</w:t>
-      </w:r>
-      <w:r>
-        <w:rPr>
-          <w:rFonts w:ascii="Times New Roman" w:eastAsia="宋体" w:hAnsi="Times New Roman" w:cs="Times New Roman"/>
-          <w:sz w:val="24"/>
-          <w:szCs w:val="24"/>
-        </w:rPr>
-        <w:t>。每个</w:t>
-      </w:r>
-      <w:r>
-        <w:rPr>
-          <w:rFonts w:ascii="Times New Roman" w:eastAsia="宋体" w:hAnsi="Times New Roman" w:cs="Times New Roman"/>
-          <w:sz w:val="24"/>
-          <w:szCs w:val="24"/>
-        </w:rPr>
-        <w:t>VCF</w:t>
-      </w:r>
-      <w:r>
-        <w:rPr>
-          <w:rFonts w:ascii="Times New Roman" w:eastAsia="宋体" w:hAnsi="Times New Roman" w:cs="Times New Roman"/>
-          <w:sz w:val="24"/>
-          <w:szCs w:val="24"/>
-        </w:rPr>
-        <w:t>文件的对应</w:t>
-      </w:r>
-      <w:proofErr w:type="spellStart"/>
-      <w:r>
-        <w:rPr>
-          <w:rFonts w:ascii="Times New Roman" w:eastAsia="宋体" w:hAnsi="Times New Roman" w:cs="Times New Roman"/>
-          <w:sz w:val="24"/>
-          <w:szCs w:val="24"/>
-        </w:rPr>
-        <w:t>chrNo</w:t>
-      </w:r>
-      <w:proofErr w:type="spellEnd"/>
       <w:r>
         <w:rPr>
           <w:rFonts w:ascii="Times New Roman" w:eastAsia="宋体" w:hAnsi="Times New Roman" w:cs="Times New Roman"/>
@@ -2510,23 +2130,13 @@
         </w:rPr>
         <w:t>的</w:t>
       </w:r>
-      <w:proofErr w:type="spellStart"/>
-      <w:r>
-        <w:rPr>
-          <w:rFonts w:ascii="Times New Roman" w:eastAsia="宋体" w:hAnsi="Times New Roman" w:cs="Times New Roman"/>
-          <w:sz w:val="24"/>
-          <w:szCs w:val="24"/>
-        </w:rPr>
-        <w:t>VCF_Data</w:t>
-      </w:r>
-      <w:proofErr w:type="spellEnd"/>
-      <w:r>
-        <w:rPr>
-          <w:rFonts w:ascii="Times New Roman" w:eastAsia="宋体" w:hAnsi="Times New Roman" w:cs="Times New Roman"/>
-          <w:sz w:val="24"/>
-          <w:szCs w:val="24"/>
-        </w:rPr>
-        <w:t>()</w:t>
+      <w:r>
+        <w:rPr>
+          <w:rFonts w:ascii="Times New Roman" w:eastAsia="宋体" w:hAnsi="Times New Roman" w:cs="Times New Roman"/>
+          <w:sz w:val="24"/>
+          <w:szCs w:val="24"/>
+        </w:rPr>
+        <w:t>VCF_Data()</w:t>
       </w:r>
       <w:r>
         <w:rPr>
@@ -2536,7 +2146,6 @@
         </w:rPr>
         <w:t>类的</w:t>
       </w:r>
-      <w:proofErr w:type="spellStart"/>
       <w:r>
         <w:rPr>
           <w:rFonts w:ascii="Times New Roman" w:eastAsia="宋体" w:hAnsi="Times New Roman" w:cs="Times New Roman"/>
@@ -2545,7 +2154,6 @@
         </w:rPr>
         <w:t>getVcfListByChrom</w:t>
       </w:r>
-      <w:proofErr w:type="spellEnd"/>
       <w:r>
         <w:rPr>
           <w:rFonts w:ascii="Times New Roman" w:eastAsia="宋体" w:hAnsi="Times New Roman" w:cs="Times New Roman"/>
@@ -2579,25 +2187,7 @@
           <w:sz w:val="24"/>
           <w:szCs w:val="24"/>
         </w:rPr>
-        <w:t>[</w:t>
-      </w:r>
-      <w:proofErr w:type="gramStart"/>
-      <w:r>
-        <w:rPr>
-          <w:rFonts w:ascii="Times New Roman" w:eastAsia="宋体" w:hAnsi="Times New Roman" w:cs="Times New Roman"/>
-          <w:sz w:val="24"/>
-          <w:szCs w:val="24"/>
-        </w:rPr>
-        <w:t>chrNo:[</w:t>
-      </w:r>
-      <w:proofErr w:type="gramEnd"/>
-      <w:r>
-        <w:rPr>
-          <w:rFonts w:ascii="Times New Roman" w:eastAsia="宋体" w:hAnsi="Times New Roman" w:cs="Times New Roman"/>
-          <w:sz w:val="24"/>
-          <w:szCs w:val="24"/>
-        </w:rPr>
-        <w:t xml:space="preserve">(pos,REF,ALT,INFO,FORMAT,sample,...),(pos,REF,ALT,INFO,FORMAT,sample,...),,,,,],{chrNo:[]},,,,,,] </w:t>
+        <w:t xml:space="preserve">[chrNo:[(pos,REF,ALT,INFO,FORMAT,sample,...),(pos,REF,ALT,INFO,FORMAT,sample,...),,,,,],{chrNo:[]},,,,,,] </w:t>
       </w:r>
       <w:r>
         <w:rPr>
@@ -2807,25 +2397,7 @@
           <w:szCs w:val="24"/>
         </w:rPr>
         <w:tab/>
-        <w:t xml:space="preserve">  [pos</w:t>
-      </w:r>
-      <w:proofErr w:type="gramStart"/>
-      <w:r>
-        <w:rPr>
-          <w:rFonts w:ascii="Times New Roman" w:eastAsia="宋体" w:hAnsi="Times New Roman" w:cs="Times New Roman"/>
-          <w:sz w:val="24"/>
-          <w:szCs w:val="24"/>
-        </w:rPr>
-        <w:t>2,REF</w:t>
-      </w:r>
-      <w:proofErr w:type="gramEnd"/>
-      <w:r>
-        <w:rPr>
-          <w:rFonts w:ascii="Times New Roman" w:eastAsia="宋体" w:hAnsi="Times New Roman" w:cs="Times New Roman"/>
-          <w:sz w:val="24"/>
-          <w:szCs w:val="24"/>
-        </w:rPr>
-        <w:t xml:space="preserve">,ALT,(              ), </w:t>
+        <w:t xml:space="preserve">  [pos2,REF,ALT,(              ), </w:t>
       </w:r>
       <w:r>
         <w:rPr>
@@ -2961,7 +2533,6 @@
         </w:rPr>
         <w:t>外连接方式合并，若某</w:t>
       </w:r>
-      <w:proofErr w:type="spellStart"/>
       <w:r>
         <w:rPr>
           <w:rFonts w:ascii="Times New Roman" w:eastAsia="宋体" w:hAnsi="Times New Roman" w:cs="Times New Roman" w:hint="eastAsia"/>
@@ -2978,7 +2549,6 @@
         </w:rPr>
         <w:t>cf</w:t>
       </w:r>
-      <w:proofErr w:type="spellEnd"/>
       <w:r>
         <w:rPr>
           <w:rFonts w:ascii="Times New Roman" w:eastAsia="宋体" w:hAnsi="Times New Roman" w:cs="Times New Roman" w:hint="eastAsia"/>
@@ -3035,7 +2605,6 @@
         </w:rPr>
         <w:t>。</w:t>
       </w:r>
-      <w:proofErr w:type="gramStart"/>
       <w:r>
         <w:rPr>
           <w:rFonts w:ascii="Times New Roman" w:eastAsia="宋体" w:hAnsi="Times New Roman" w:cs="Times New Roman" w:hint="eastAsia"/>
@@ -3052,8 +2621,6 @@
         </w:rPr>
         <w:t>各</w:t>
       </w:r>
-      <w:proofErr w:type="spellStart"/>
-      <w:proofErr w:type="gramEnd"/>
       <w:r>
         <w:rPr>
           <w:rFonts w:ascii="Times New Roman" w:eastAsia="宋体" w:hAnsi="Times New Roman" w:cs="Times New Roman" w:hint="eastAsia"/>
@@ -3070,7 +2637,6 @@
         </w:rPr>
         <w:t>cffile</w:t>
       </w:r>
-      <w:proofErr w:type="spellEnd"/>
       <w:r>
         <w:rPr>
           <w:rFonts w:ascii="Times New Roman" w:eastAsia="宋体" w:hAnsi="Times New Roman" w:cs="Times New Roman" w:hint="eastAsia"/>
@@ -3144,7 +2710,6 @@
           <w:szCs w:val="21"/>
         </w:rPr>
       </w:pPr>
-      <w:proofErr w:type="spellStart"/>
       <w:r>
         <w:rPr>
           <w:rFonts w:ascii="Consolas" w:hAnsi="Consolas" w:cs="Consolas" w:hint="eastAsia"/>
@@ -3156,7 +2721,6 @@
         <w:lastRenderedPageBreak/>
         <w:t>vcf</w:t>
       </w:r>
-      <w:proofErr w:type="spellEnd"/>
       <w:r>
         <w:rPr>
           <w:rFonts w:ascii="Consolas" w:hAnsi="Consolas" w:cs="Consolas" w:hint="eastAsia"/>
@@ -3167,7 +2731,6 @@
         </w:rPr>
         <w:t>数据表标准为：五列必须列，分别为</w:t>
       </w:r>
-      <w:proofErr w:type="spellStart"/>
       <w:r>
         <w:rPr>
           <w:rFonts w:ascii="Consolas" w:hAnsi="Consolas" w:cs="Consolas" w:hint="eastAsia"/>
@@ -3178,7 +2741,6 @@
         </w:rPr>
         <w:t>chrID</w:t>
       </w:r>
-      <w:proofErr w:type="spellEnd"/>
       <w:r>
         <w:rPr>
           <w:rFonts w:ascii="Consolas" w:hAnsi="Consolas" w:cs="Consolas" w:hint="eastAsia"/>
@@ -3189,7 +2751,6 @@
         </w:rPr>
         <w:t>，</w:t>
       </w:r>
-      <w:proofErr w:type="spellStart"/>
       <w:r>
         <w:rPr>
           <w:rFonts w:ascii="Consolas" w:hAnsi="Consolas" w:cs="Consolas" w:hint="eastAsia"/>
@@ -3200,7 +2761,6 @@
         </w:rPr>
         <w:t>snp_pos,snpID,ref_base,alt_base</w:t>
       </w:r>
-      <w:proofErr w:type="spellEnd"/>
       <w:r>
         <w:rPr>
           <w:rFonts w:ascii="Consolas" w:hAnsi="Consolas" w:cs="Consolas" w:hint="eastAsia"/>
@@ -3220,7 +2780,6 @@
           <w:szCs w:val="21"/>
         </w:rPr>
       </w:pPr>
-      <w:proofErr w:type="spellStart"/>
       <w:r>
         <w:rPr>
           <w:rFonts w:ascii="Consolas" w:hAnsi="Consolas" w:cs="Consolas" w:hint="eastAsia"/>
@@ -3229,9 +2788,8 @@
           <w:kern w:val="0"/>
           <w:szCs w:val="21"/>
         </w:rPr>
-        <w:t>toplevel</w:t>
-      </w:r>
-      <w:proofErr w:type="spellEnd"/>
+        <w:t>toplevel vcf</w:t>
+      </w:r>
       <w:r>
         <w:rPr>
           <w:rFonts w:ascii="Consolas" w:hAnsi="Consolas" w:cs="Consolas" w:hint="eastAsia"/>
@@ -3240,9 +2798,74 @@
           <w:kern w:val="0"/>
           <w:szCs w:val="21"/>
         </w:rPr>
+        <w:t>数据表为</w:t>
+      </w:r>
+      <w:r>
+        <w:rPr>
+          <w:rFonts w:ascii="Consolas" w:hAnsi="Consolas" w:cs="Consolas" w:hint="eastAsia"/>
+          <w:bCs/>
+          <w:color w:val="000000"/>
+          <w:kern w:val="0"/>
+          <w:szCs w:val="21"/>
+        </w:rPr>
+        <w:t>chrID</w:t>
+      </w:r>
+      <w:r>
+        <w:rPr>
+          <w:rFonts w:ascii="Consolas" w:hAnsi="Consolas" w:cs="Consolas" w:hint="eastAsia"/>
+          <w:bCs/>
+          <w:color w:val="000000"/>
+          <w:kern w:val="0"/>
+          <w:szCs w:val="21"/>
+        </w:rPr>
+        <w:t>，</w:t>
+      </w:r>
+      <w:r>
+        <w:rPr>
+          <w:rFonts w:ascii="Consolas" w:hAnsi="Consolas" w:cs="Consolas" w:hint="eastAsia"/>
+          <w:bCs/>
+          <w:color w:val="000000"/>
+          <w:kern w:val="0"/>
+          <w:szCs w:val="21"/>
+        </w:rPr>
+        <w:t>snp_pos,snpID,ref_base,alt_base</w:t>
+      </w:r>
+      <w:r>
+        <w:rPr>
+          <w:rFonts w:ascii="Consolas" w:hAnsi="Consolas" w:cs="Consolas" w:hint="eastAsia"/>
+          <w:bCs/>
+          <w:color w:val="000000"/>
+          <w:kern w:val="0"/>
+          <w:szCs w:val="21"/>
+        </w:rPr>
+        <w:t>，</w:t>
+      </w:r>
+      <w:r>
+        <w:rPr>
+          <w:rFonts w:ascii="Consolas" w:hAnsi="Consolas" w:cs="Consolas" w:hint="eastAsia"/>
+          <w:bCs/>
+          <w:color w:val="000000"/>
+          <w:kern w:val="0"/>
+          <w:szCs w:val="21"/>
+        </w:rPr>
+        <w:t>context,</w:t>
+      </w:r>
+      <w:r>
+        <w:rPr>
+          <w:szCs w:val="21"/>
+        </w:rPr>
         <w:t xml:space="preserve"> </w:t>
       </w:r>
-      <w:proofErr w:type="spellStart"/>
+      <w:r>
+        <w:rPr>
+          <w:rFonts w:ascii="Consolas" w:hAnsi="Consolas" w:cs="Consolas"/>
+          <w:bCs/>
+          <w:color w:val="000000"/>
+          <w:kern w:val="0"/>
+          <w:szCs w:val="21"/>
+        </w:rPr>
+        <w:t>wegeon_indvd_SNV_vcf_alt</w:t>
+      </w:r>
       <w:r>
         <w:rPr>
           <w:rFonts w:ascii="Consolas" w:hAnsi="Consolas" w:cs="Consolas" w:hint="eastAsia"/>
@@ -3251,119 +2874,24 @@
           <w:kern w:val="0"/>
           <w:szCs w:val="21"/>
         </w:rPr>
-        <w:t>vcf</w:t>
-      </w:r>
-      <w:proofErr w:type="spellEnd"/>
-      <w:r>
-        <w:rPr>
-          <w:rFonts w:ascii="Consolas" w:hAnsi="Consolas" w:cs="Consolas" w:hint="eastAsia"/>
+        <w:t>,</w:t>
+      </w:r>
+      <w:r>
+        <w:rPr>
+          <w:szCs w:val="21"/>
+        </w:rPr>
+        <w:t xml:space="preserve"> </w:t>
+      </w:r>
+      <w:r>
+        <w:rPr>
+          <w:rFonts w:ascii="Consolas" w:hAnsi="Consolas" w:cs="Consolas"/>
           <w:bCs/>
           <w:color w:val="000000"/>
           <w:kern w:val="0"/>
           <w:szCs w:val="21"/>
         </w:rPr>
-        <w:t>数据表为</w:t>
-      </w:r>
-      <w:proofErr w:type="spellStart"/>
-      <w:r>
-        <w:rPr>
-          <w:rFonts w:ascii="Consolas" w:hAnsi="Consolas" w:cs="Consolas" w:hint="eastAsia"/>
-          <w:bCs/>
-          <w:color w:val="000000"/>
-          <w:kern w:val="0"/>
-          <w:szCs w:val="21"/>
-        </w:rPr>
-        <w:t>chrID</w:t>
-      </w:r>
-      <w:proofErr w:type="spellEnd"/>
-      <w:r>
-        <w:rPr>
-          <w:rFonts w:ascii="Consolas" w:hAnsi="Consolas" w:cs="Consolas" w:hint="eastAsia"/>
-          <w:bCs/>
-          <w:color w:val="000000"/>
-          <w:kern w:val="0"/>
-          <w:szCs w:val="21"/>
-        </w:rPr>
-        <w:t>，</w:t>
-      </w:r>
-      <w:proofErr w:type="spellStart"/>
-      <w:r>
-        <w:rPr>
-          <w:rFonts w:ascii="Consolas" w:hAnsi="Consolas" w:cs="Consolas" w:hint="eastAsia"/>
-          <w:bCs/>
-          <w:color w:val="000000"/>
-          <w:kern w:val="0"/>
-          <w:szCs w:val="21"/>
-        </w:rPr>
-        <w:t>snp_pos,snpID,ref_base,alt_base</w:t>
-      </w:r>
-      <w:proofErr w:type="spellEnd"/>
-      <w:r>
-        <w:rPr>
-          <w:rFonts w:ascii="Consolas" w:hAnsi="Consolas" w:cs="Consolas" w:hint="eastAsia"/>
-          <w:bCs/>
-          <w:color w:val="000000"/>
-          <w:kern w:val="0"/>
-          <w:szCs w:val="21"/>
-        </w:rPr>
-        <w:t>，</w:t>
-      </w:r>
-      <w:r>
-        <w:rPr>
-          <w:rFonts w:ascii="Consolas" w:hAnsi="Consolas" w:cs="Consolas" w:hint="eastAsia"/>
-          <w:bCs/>
-          <w:color w:val="000000"/>
-          <w:kern w:val="0"/>
-          <w:szCs w:val="21"/>
-        </w:rPr>
-        <w:t>context,</w:t>
-      </w:r>
-      <w:r>
-        <w:rPr>
-          <w:szCs w:val="21"/>
-        </w:rPr>
-        <w:t xml:space="preserve"> </w:t>
-      </w:r>
-      <w:proofErr w:type="spellStart"/>
-      <w:r>
-        <w:rPr>
-          <w:rFonts w:ascii="Consolas" w:hAnsi="Consolas" w:cs="Consolas"/>
-          <w:bCs/>
-          <w:color w:val="000000"/>
-          <w:kern w:val="0"/>
-          <w:szCs w:val="21"/>
-        </w:rPr>
-        <w:t>wegeon_indvd_SNV_vcf_alt</w:t>
-      </w:r>
-      <w:proofErr w:type="spellEnd"/>
-      <w:r>
-        <w:rPr>
-          <w:rFonts w:ascii="Consolas" w:hAnsi="Consolas" w:cs="Consolas" w:hint="eastAsia"/>
-          <w:bCs/>
-          <w:color w:val="000000"/>
-          <w:kern w:val="0"/>
-          <w:szCs w:val="21"/>
-        </w:rPr>
-        <w:t>,</w:t>
-      </w:r>
-      <w:r>
-        <w:rPr>
-          <w:szCs w:val="21"/>
-        </w:rPr>
-        <w:t xml:space="preserve"> </w:t>
-      </w:r>
-      <w:proofErr w:type="spellStart"/>
-      <w:r>
-        <w:rPr>
-          <w:rFonts w:ascii="Consolas" w:hAnsi="Consolas" w:cs="Consolas"/>
-          <w:bCs/>
-          <w:color w:val="000000"/>
-          <w:kern w:val="0"/>
-          <w:szCs w:val="21"/>
-        </w:rPr>
         <w:t>wegeon_indvd_SNV_vcf_dep</w:t>
       </w:r>
-      <w:proofErr w:type="spellEnd"/>
       <w:r>
         <w:rPr>
           <w:rFonts w:ascii="Consolas" w:hAnsi="Consolas" w:cs="Consolas" w:hint="eastAsia"/>
@@ -3397,14 +2925,12 @@
           <w:numId w:val="3"/>
         </w:numPr>
       </w:pPr>
-      <w:proofErr w:type="spellStart"/>
       <w:r>
         <w:rPr>
           <w:bCs/>
         </w:rPr>
         <w:t>getRefSeqBypos</w:t>
       </w:r>
-      <w:proofErr w:type="spellEnd"/>
       <w:r>
         <w:rPr>
           <w:rFonts w:hint="eastAsia"/>
@@ -3427,27 +2953,43 @@
           <w:numId w:val="3"/>
         </w:numPr>
       </w:pPr>
-      <w:proofErr w:type="spellStart"/>
       <w:r>
         <w:rPr>
           <w:rFonts w:ascii="Consolas" w:hAnsi="Consolas" w:cs="Consolas"/>
-          <w:bCs/>
+          <w:b/>
+          <w:bCs/>
+          <w:color w:val="000000"/>
           <w:kern w:val="0"/>
           <w:sz w:val="20"/>
           <w:szCs w:val="20"/>
-        </w:rPr>
-        <w:t>getdepthByPos</w:t>
-      </w:r>
-      <w:proofErr w:type="spellEnd"/>
-      <w:r>
-        <w:rPr>
-          <w:rFonts w:ascii="Consolas" w:hAnsi="Consolas" w:cs="Consolas" w:hint="eastAsia"/>
-          <w:bCs/>
+          <w:highlight w:val="yellow"/>
+        </w:rPr>
+        <w:t>generateFasterRefIndex</w:t>
+      </w:r>
+      <w:r>
+        <w:rPr>
+          <w:rFonts w:ascii="Consolas" w:hAnsi="Consolas" w:cs="Consolas"/>
+          <w:b/>
+          <w:bCs/>
+          <w:color w:val="000000"/>
           <w:kern w:val="0"/>
           <w:sz w:val="20"/>
           <w:szCs w:val="20"/>
         </w:rPr>
-        <w:t>函数</w:t>
+        <w:t xml:space="preserve"> </w:t>
+      </w:r>
+      <w:r>
+        <w:rPr>
+          <w:rFonts w:ascii="Consolas" w:hAnsi="Consolas" w:cs="Consolas" w:hint="eastAsia"/>
+          <w:b/>
+          <w:bCs/>
+          <w:color w:val="000000"/>
+          <w:kern w:val="0"/>
+          <w:sz w:val="20"/>
+          <w:szCs w:val="20"/>
+          <w:highlight w:val="yellow"/>
+        </w:rPr>
+        <w:t>这个函数怎么处理染色体名的回去好好查查看看</w:t>
       </w:r>
     </w:p>
     <w:p>
@@ -3459,46 +3001,289 @@
       </w:pPr>
       <w:r>
         <w:rPr>
-          <w:rFonts w:hint="eastAsia"/>
-          <w:bCs/>
-        </w:rPr>
-        <w:t>发现GATK的depth文件并非包含所有位点，估计没有记录的位点是覆盖度为0</w:t>
-      </w:r>
-      <w:r>
-        <w:rPr>
-          <w:rFonts w:hint="eastAsia"/>
-          <w:bCs/>
-        </w:rPr>
-        <w:t>，或者因为基因组上该位置的序列为N</w:t>
-      </w:r>
-      <w:r>
-        <w:rPr>
-          <w:rFonts w:hint="eastAsia"/>
-          <w:bCs/>
-        </w:rPr>
-        <w:t>，所以</w:t>
-      </w:r>
-      <w:proofErr w:type="spellStart"/>
-      <w:r>
-        <w:rPr>
           <w:rFonts w:ascii="Consolas" w:hAnsi="Consolas" w:cs="Consolas"/>
-          <w:bCs/>
+          <w:color w:val="000000"/>
           <w:kern w:val="0"/>
           <w:sz w:val="20"/>
           <w:szCs w:val="20"/>
-        </w:rPr>
-        <w:t>getdepthByPos</w:t>
-      </w:r>
-      <w:proofErr w:type="spellEnd"/>
-      <w:r>
-        <w:rPr>
-          <w:rFonts w:ascii="Consolas" w:hAnsi="Consolas" w:cs="Consolas" w:hint="eastAsia"/>
+          <w:highlight w:val="yellow"/>
+        </w:rPr>
+        <w:t>getRefSeqBypos_faster</w:t>
+      </w:r>
+    </w:p>
+    <w:p>
+      <w:pPr>
+        <w:autoSpaceDE w:val="0"/>
+        <w:autoSpaceDN w:val="0"/>
+        <w:adjustRightInd w:val="0"/>
+        <w:ind w:leftChars="400" w:left="840" w:firstLine="1"/>
+        <w:jc w:val="left"/>
+        <w:rPr>
+          <w:rFonts w:ascii="Microsoft YaHei UI" w:eastAsia="Microsoft YaHei UI" w:cs="Microsoft YaHei UI"/>
+          <w:kern w:val="0"/>
+          <w:sz w:val="18"/>
+          <w:szCs w:val="18"/>
+        </w:rPr>
+      </w:pPr>
+      <w:r>
+        <w:rPr>
+          <w:rFonts w:ascii="Microsoft YaHei UI" w:eastAsia="Microsoft YaHei UI" w:cs="Microsoft YaHei UI"/>
+          <w:kern w:val="0"/>
+          <w:sz w:val="18"/>
+          <w:szCs w:val="18"/>
+        </w:rPr>
+        <w:t>def getRefSeqBypos_faster(refFastahandle, fasterrefindex, currentChromNO, startpos, endpos,  currentChromNOlen=None, seektuple=()):</w:t>
+      </w:r>
+    </w:p>
+    <w:p>
+      <w:pPr>
+        <w:autoSpaceDE w:val="0"/>
+        <w:autoSpaceDN w:val="0"/>
+        <w:adjustRightInd w:val="0"/>
+        <w:ind w:leftChars="400" w:left="840" w:firstLine="1"/>
+        <w:jc w:val="left"/>
+        <w:rPr>
+          <w:rFonts w:ascii="Microsoft YaHei UI" w:eastAsia="Microsoft YaHei UI" w:cs="Microsoft YaHei UI"/>
+          <w:kern w:val="0"/>
+          <w:sz w:val="18"/>
+          <w:szCs w:val="18"/>
+        </w:rPr>
+      </w:pPr>
+      <w:r>
+        <w:rPr>
+          <w:rFonts w:ascii="Microsoft YaHei UI" w:eastAsia="Microsoft YaHei UI" w:cs="Microsoft YaHei UI"/>
+          <w:kern w:val="0"/>
+          <w:sz w:val="18"/>
+          <w:szCs w:val="18"/>
+        </w:rPr>
+        <w:t xml:space="preserve">    '''</w:t>
+      </w:r>
+    </w:p>
+    <w:p>
+      <w:pPr>
+        <w:autoSpaceDE w:val="0"/>
+        <w:autoSpaceDN w:val="0"/>
+        <w:adjustRightInd w:val="0"/>
+        <w:ind w:leftChars="400" w:left="840" w:firstLine="1"/>
+        <w:jc w:val="left"/>
+        <w:rPr>
+          <w:rFonts w:ascii="Microsoft YaHei UI" w:eastAsia="Microsoft YaHei UI" w:cs="Microsoft YaHei UI"/>
+          <w:kern w:val="0"/>
+          <w:sz w:val="18"/>
+          <w:szCs w:val="18"/>
+        </w:rPr>
+      </w:pPr>
+      <w:r>
+        <w:rPr>
+          <w:rFonts w:ascii="Microsoft YaHei UI" w:eastAsia="Microsoft YaHei UI" w:cs="Microsoft YaHei UI"/>
+          <w:kern w:val="0"/>
+          <w:sz w:val="18"/>
+          <w:szCs w:val="18"/>
+        </w:rPr>
+        <w:t xml:space="preserve">    pos start at 1</w:t>
+      </w:r>
+    </w:p>
+    <w:p>
+      <w:pPr>
+        <w:autoSpaceDE w:val="0"/>
+        <w:autoSpaceDN w:val="0"/>
+        <w:adjustRightInd w:val="0"/>
+        <w:ind w:leftChars="400" w:left="840" w:firstLine="1"/>
+        <w:jc w:val="left"/>
+        <w:rPr>
+          <w:rFonts w:ascii="Microsoft YaHei UI" w:eastAsia="Microsoft YaHei UI" w:cs="Microsoft YaHei UI"/>
+          <w:kern w:val="0"/>
+          <w:sz w:val="18"/>
+          <w:szCs w:val="18"/>
+        </w:rPr>
+      </w:pPr>
+      <w:r>
+        <w:rPr>
+          <w:rFonts w:ascii="Microsoft YaHei UI" w:eastAsia="Microsoft YaHei UI" w:cs="Microsoft YaHei UI"/>
+          <w:kern w:val="0"/>
+          <w:sz w:val="18"/>
+          <w:szCs w:val="18"/>
+        </w:rPr>
+        <w:t xml:space="preserve">    seektuple=(filepos,basesbeforefilepos)</w:t>
+      </w:r>
+    </w:p>
+    <w:p>
+      <w:pPr>
+        <w:autoSpaceDE w:val="0"/>
+        <w:autoSpaceDN w:val="0"/>
+        <w:adjustRightInd w:val="0"/>
+        <w:ind w:leftChars="400" w:left="840" w:firstLine="1"/>
+        <w:jc w:val="left"/>
+        <w:rPr>
+          <w:rFonts w:ascii="Microsoft YaHei UI" w:eastAsia="Microsoft YaHei UI" w:cs="Microsoft YaHei UI"/>
+          <w:kern w:val="0"/>
+          <w:sz w:val="18"/>
+          <w:szCs w:val="18"/>
+        </w:rPr>
+      </w:pPr>
+      <w:r>
+        <w:rPr>
+          <w:rFonts w:ascii="Microsoft YaHei UI" w:eastAsia="Microsoft YaHei UI" w:cs="Microsoft YaHei UI"/>
+          <w:kern w:val="0"/>
+          <w:sz w:val="18"/>
+          <w:szCs w:val="18"/>
+        </w:rPr>
+        <w:t xml:space="preserve">    the refSeqMap has only one chromosome's sequence</w:t>
+      </w:r>
+    </w:p>
+    <w:p>
+      <w:pPr>
+        <w:autoSpaceDE w:val="0"/>
+        <w:autoSpaceDN w:val="0"/>
+        <w:adjustRightInd w:val="0"/>
+        <w:ind w:leftChars="400" w:left="840" w:firstLine="1"/>
+        <w:jc w:val="left"/>
+        <w:rPr>
+          <w:rFonts w:ascii="Microsoft YaHei UI" w:eastAsia="Microsoft YaHei UI" w:cs="Microsoft YaHei UI"/>
+          <w:kern w:val="0"/>
+          <w:sz w:val="18"/>
+          <w:szCs w:val="18"/>
+        </w:rPr>
+      </w:pPr>
+      <w:r>
+        <w:rPr>
+          <w:rFonts w:ascii="Microsoft YaHei UI" w:eastAsia="Microsoft YaHei UI" w:cs="Microsoft YaHei UI"/>
+          <w:kern w:val="0"/>
+          <w:sz w:val="18"/>
+          <w:szCs w:val="18"/>
+        </w:rPr>
+        <w:t xml:space="preserve">    There is no restriction on refFastahander</w:t>
+      </w:r>
+    </w:p>
+    <w:p>
+      <w:pPr>
+        <w:autoSpaceDE w:val="0"/>
+        <w:autoSpaceDN w:val="0"/>
+        <w:adjustRightInd w:val="0"/>
+        <w:ind w:leftChars="400" w:left="840" w:firstLine="1"/>
+        <w:jc w:val="left"/>
+        <w:rPr>
+          <w:rFonts w:ascii="Microsoft YaHei UI" w:eastAsia="Microsoft YaHei UI" w:cs="Microsoft YaHei UI"/>
+          <w:kern w:val="0"/>
+          <w:sz w:val="18"/>
+          <w:szCs w:val="18"/>
+        </w:rPr>
+      </w:pPr>
+      <w:r>
+        <w:rPr>
+          <w:rFonts w:ascii="Microsoft YaHei UI" w:eastAsia="Microsoft YaHei UI" w:cs="Microsoft YaHei UI"/>
+          <w:kern w:val="0"/>
+          <w:sz w:val="18"/>
+          <w:szCs w:val="18"/>
+        </w:rPr>
+        <w:t xml:space="preserve">    refindex must indexed by </w:t>
+      </w:r>
+      <w:r>
+        <w:rPr>
+          <w:rFonts w:ascii="Microsoft YaHei UI" w:eastAsia="Microsoft YaHei UI" w:cs="Microsoft YaHei UI"/>
+          <w:color w:val="FF0000"/>
+          <w:kern w:val="0"/>
+          <w:sz w:val="18"/>
+          <w:szCs w:val="18"/>
+        </w:rPr>
+        <w:t xml:space="preserve">generateFasterRefIndex </w:t>
+      </w:r>
+      <w:r>
+        <w:rPr>
+          <w:rFonts w:ascii="Microsoft YaHei UI" w:eastAsia="Microsoft YaHei UI" w:cs="Microsoft YaHei UI"/>
+          <w:kern w:val="0"/>
+          <w:sz w:val="18"/>
+          <w:szCs w:val="18"/>
+        </w:rPr>
+        <w:t>func</w:t>
+      </w:r>
+    </w:p>
+    <w:p>
+      <w:pPr>
+        <w:autoSpaceDE w:val="0"/>
+        <w:autoSpaceDN w:val="0"/>
+        <w:adjustRightInd w:val="0"/>
+        <w:ind w:leftChars="400" w:left="840" w:firstLine="1"/>
+        <w:jc w:val="left"/>
+        <w:rPr>
+          <w:rFonts w:ascii="Microsoft YaHei UI" w:eastAsia="Microsoft YaHei UI" w:cs="Microsoft YaHei UI"/>
+          <w:kern w:val="0"/>
+          <w:sz w:val="18"/>
+          <w:szCs w:val="18"/>
+        </w:rPr>
+      </w:pPr>
+      <w:r>
+        <w:rPr>
+          <w:rFonts w:ascii="Microsoft YaHei UI" w:eastAsia="Microsoft YaHei UI" w:cs="Microsoft YaHei UI"/>
+          <w:kern w:val="0"/>
+          <w:sz w:val="18"/>
+          <w:szCs w:val="18"/>
+        </w:rPr>
+        <w:t xml:space="preserve">    return {'1': [0, 'A']}</w:t>
+      </w:r>
+    </w:p>
+    <w:p>
+      <w:pPr>
+        <w:ind w:firstLineChars="500" w:firstLine="900"/>
+        <w:rPr>
+          <w:rFonts w:ascii="Microsoft YaHei UI" w:eastAsia="Microsoft YaHei UI" w:cs="Microsoft YaHei UI"/>
+          <w:kern w:val="0"/>
+          <w:sz w:val="18"/>
+          <w:szCs w:val="18"/>
+        </w:rPr>
+      </w:pPr>
+      <w:r>
+        <w:rPr>
+          <w:rFonts w:ascii="Microsoft YaHei UI" w:eastAsia="Microsoft YaHei UI" w:cs="Microsoft YaHei UI"/>
+          <w:kern w:val="0"/>
+          <w:sz w:val="18"/>
+          <w:szCs w:val="18"/>
+        </w:rPr>
+        <w:t xml:space="preserve">   '''</w:t>
+      </w:r>
+    </w:p>
+    <w:p>
+      <w:pPr>
+        <w:ind w:firstLineChars="500" w:firstLine="900"/>
+      </w:pPr>
+      <w:r>
+        <w:rPr>
+          <w:rFonts w:ascii="Microsoft YaHei UI" w:eastAsia="Microsoft YaHei UI" w:cs="Microsoft YaHei UI" w:hint="eastAsia"/>
+          <w:kern w:val="0"/>
+          <w:sz w:val="18"/>
+          <w:szCs w:val="18"/>
+        </w:rPr>
+        <w:t>最好的使用例子是参考</w:t>
+      </w:r>
+      <w:r>
+        <w:t>/life/src/NGS/Service/fillancestraltemp_usingBAM.py</w:t>
+      </w:r>
+      <w:r>
+        <w:rPr>
+          <w:rFonts w:hint="eastAsia"/>
+        </w:rPr>
+        <w:t>程序中使用该函式填充</w:t>
+      </w:r>
+      <w:r>
+        <w:t>SNP RECs 的context 和ancestral allele</w:t>
+      </w:r>
+    </w:p>
+    <w:p>
+      <w:pPr>
+        <w:numPr>
+          <w:ilvl w:val="0"/>
+          <w:numId w:val="3"/>
+        </w:numPr>
+      </w:pPr>
+      <w:r>
+        <w:rPr>
+          <w:rFonts w:ascii="Consolas" w:hAnsi="Consolas" w:cs="Consolas"/>
           <w:bCs/>
           <w:kern w:val="0"/>
           <w:sz w:val="20"/>
           <w:szCs w:val="20"/>
         </w:rPr>
-        <w:t>函数对于查找不到位置的位点直接返回</w:t>
+        <w:t>getdepthByPos</w:t>
       </w:r>
       <w:r>
         <w:rPr>
@@ -3508,7 +3293,36 @@
           <w:sz w:val="20"/>
           <w:szCs w:val="20"/>
         </w:rPr>
-        <w:t>[</w:t>
+        <w:t>函数</w:t>
+      </w:r>
+    </w:p>
+    <w:p>
+      <w:pPr>
+        <w:numPr>
+          <w:ilvl w:val="0"/>
+          <w:numId w:val="3"/>
+        </w:numPr>
+      </w:pPr>
+      <w:r>
+        <w:rPr>
+          <w:rFonts w:hint="eastAsia"/>
+          <w:bCs/>
+        </w:rPr>
+        <w:t>发现GATK的depth文件并非包含所有位点，估计没有记录的位点是覆盖度为0</w:t>
+      </w:r>
+      <w:r>
+        <w:rPr>
+          <w:rFonts w:hint="eastAsia"/>
+          <w:bCs/>
+        </w:rPr>
+        <w:t>，或者因为基因组上该位置的序列为N</w:t>
+      </w:r>
+      <w:r>
+        <w:rPr>
+          <w:rFonts w:hint="eastAsia"/>
+          <w:bCs/>
+        </w:rPr>
+        <w:t>，所以</w:t>
       </w:r>
       <w:r>
         <w:rPr>
@@ -3518,7 +3332,7 @@
           <w:sz w:val="20"/>
           <w:szCs w:val="20"/>
         </w:rPr>
-        <w:t>‘</w:t>
+        <w:t>getdepthByPos</w:t>
       </w:r>
       <w:r>
         <w:rPr>
@@ -3528,29 +3342,28 @@
           <w:sz w:val="20"/>
           <w:szCs w:val="20"/>
         </w:rPr>
-        <w:t>0</w:t>
-      </w:r>
-      <w:r>
-        <w:rPr>
-          <w:rFonts w:ascii="Consolas" w:hAnsi="Consolas" w:cs="Consolas"/>
+        <w:t>函数对于查找不到位置的位点直接返回</w:t>
+      </w:r>
+      <w:r>
+        <w:rPr>
+          <w:rFonts w:ascii="Consolas" w:hAnsi="Consolas" w:cs="Consolas" w:hint="eastAsia"/>
           <w:bCs/>
           <w:kern w:val="0"/>
           <w:sz w:val="20"/>
           <w:szCs w:val="20"/>
         </w:rPr>
-        <w:t>’</w:t>
-      </w:r>
-      <w:r>
-        <w:rPr>
-          <w:rFonts w:ascii="Consolas" w:hAnsi="Consolas" w:cs="Consolas" w:hint="eastAsia"/>
+        <w:t>[</w:t>
+      </w:r>
+      <w:r>
+        <w:rPr>
+          <w:rFonts w:ascii="Consolas" w:hAnsi="Consolas" w:cs="Consolas"/>
           <w:bCs/>
           <w:kern w:val="0"/>
           <w:sz w:val="20"/>
           <w:szCs w:val="20"/>
         </w:rPr>
-        <w:t>]*</w:t>
-      </w:r>
-      <w:proofErr w:type="spellStart"/>
+        <w:t>‘</w:t>
+      </w:r>
       <w:r>
         <w:rPr>
           <w:rFonts w:ascii="Consolas" w:hAnsi="Consolas" w:cs="Consolas" w:hint="eastAsia"/>
@@ -3559,20 +3372,18 @@
           <w:sz w:val="20"/>
           <w:szCs w:val="20"/>
         </w:rPr>
-        <w:t>len</w:t>
-      </w:r>
-      <w:proofErr w:type="spellEnd"/>
-      <w:r>
-        <w:rPr>
-          <w:rFonts w:ascii="Consolas" w:hAnsi="Consolas" w:cs="Consolas" w:hint="eastAsia"/>
+        <w:t>0</w:t>
+      </w:r>
+      <w:r>
+        <w:rPr>
+          <w:rFonts w:ascii="Consolas" w:hAnsi="Consolas" w:cs="Consolas"/>
           <w:bCs/>
           <w:kern w:val="0"/>
           <w:sz w:val="20"/>
           <w:szCs w:val="20"/>
         </w:rPr>
-        <w:t>(</w:t>
-      </w:r>
-      <w:proofErr w:type="spellStart"/>
+        <w:t>’</w:t>
+      </w:r>
       <w:r>
         <w:rPr>
           <w:rFonts w:ascii="Consolas" w:hAnsi="Consolas" w:cs="Consolas" w:hint="eastAsia"/>
@@ -3581,18 +3392,7 @@
           <w:sz w:val="20"/>
           <w:szCs w:val="20"/>
         </w:rPr>
-        <w:t>self.title</w:t>
-      </w:r>
-      <w:proofErr w:type="spellEnd"/>
-      <w:r>
-        <w:rPr>
-          <w:rFonts w:ascii="Consolas" w:hAnsi="Consolas" w:cs="Consolas" w:hint="eastAsia"/>
-          <w:bCs/>
-          <w:kern w:val="0"/>
-          <w:sz w:val="20"/>
-          <w:szCs w:val="20"/>
-        </w:rPr>
-        <w:t>)</w:t>
+        <w:t>]*len(self.title)</w:t>
       </w:r>
       <w:r>
         <w:rPr>
@@ -3614,7 +3414,6 @@
         </w:numPr>
         <w:ind w:firstLineChars="0"/>
       </w:pPr>
-      <w:proofErr w:type="spellStart"/>
       <w:r>
         <w:rPr>
           <w:rFonts w:ascii="Consolas" w:hAnsi="Consolas" w:cs="Consolas"/>
@@ -3626,7 +3425,6 @@
         </w:rPr>
         <w:t>GATK_depthfile</w:t>
       </w:r>
-      <w:proofErr w:type="spellEnd"/>
       <w:r>
         <w:rPr>
           <w:rFonts w:ascii="Consolas" w:hAnsi="Consolas" w:cs="Consolas" w:hint="eastAsia"/>
@@ -3638,7 +3436,6 @@
         </w:rPr>
         <w:t>函数中的</w:t>
       </w:r>
-      <w:proofErr w:type="spellStart"/>
       <w:r>
         <w:rPr>
           <w:rFonts w:ascii="Consolas" w:hAnsi="Consolas" w:cs="Consolas"/>
@@ -3650,7 +3447,6 @@
         </w:rPr>
         <w:t>getdepthByPos_optimized</w:t>
       </w:r>
-      <w:proofErr w:type="spellEnd"/>
       <w:r>
         <w:rPr>
           <w:rFonts w:ascii="Consolas" w:hAnsi="Consolas" w:cs="Consolas" w:hint="eastAsia"/>
@@ -3662,7 +3458,6 @@
         </w:rPr>
         <w:t>方法为</w:t>
       </w:r>
-      <w:proofErr w:type="spellStart"/>
       <w:r>
         <w:rPr>
           <w:rFonts w:ascii="Consolas" w:hAnsi="Consolas" w:cs="Consolas"/>
@@ -3673,7 +3468,6 @@
         </w:rPr>
         <w:t>getdepthByPos</w:t>
       </w:r>
-      <w:proofErr w:type="spellEnd"/>
       <w:r>
         <w:rPr>
           <w:rFonts w:ascii="Consolas" w:hAnsi="Consolas" w:cs="Consolas" w:hint="eastAsia"/>
@@ -3698,35 +3492,7 @@
         <w:rPr>
           <w:rFonts w:hint="eastAsia"/>
         </w:rPr>
-        <w:t>读入方式改为read()读入内存，在其中结构化为位置作为键的map，</w:t>
-      </w:r>
-      <w:proofErr w:type="gramStart"/>
-      <w:r>
-        <w:rPr>
-          <w:rFonts w:hint="eastAsia"/>
-        </w:rPr>
-        <w:t>然后再该</w:t>
-      </w:r>
-      <w:proofErr w:type="gramEnd"/>
-      <w:r>
-        <w:rPr>
-          <w:rFonts w:hint="eastAsia"/>
-        </w:rPr>
-        <w:t>map中查找位置，而非</w:t>
-      </w:r>
-      <w:proofErr w:type="spellStart"/>
-      <w:r>
-        <w:rPr>
-          <w:rFonts w:hint="eastAsia"/>
-        </w:rPr>
-        <w:t>readline</w:t>
-      </w:r>
-      <w:proofErr w:type="spellEnd"/>
-      <w:r>
-        <w:rPr>
-          <w:rFonts w:hint="eastAsia"/>
-        </w:rPr>
-        <w:t>()的方式从硬盘查找位置</w:t>
+        <w:t>读入方式改为read()读入内存，在其中结构化为位置作为键的map，然后再该map中查找位置，而非readline()的方式从硬盘查找位置</w:t>
       </w:r>
     </w:p>
     <w:p>
@@ -3742,35 +3508,14 @@
         <w:rPr>
           <w:rFonts w:hint="eastAsia"/>
         </w:rPr>
-        <w:t>多次实例化</w:t>
-      </w:r>
-      <w:proofErr w:type="spellStart"/>
+        <w:t>多次实例化GATK_depthfile类时，可能都是对一个gatkdepth文件经行实例化，那么用这样的逻辑来避免多次生成map，由于每次查找某个染色体的某个位置都一定要把这个染色体的depth都加载到内存，而单线程程序一般会生成多个实例，而且处理的时候同时处理同一个染色体，所以如果这几个实例都使用一个depth文件，则可以加载一次内存就够了。而多线程程序中不同线程不一定会在同一个时间处理同一个染色体，所以一定要为每个对象加载一次。是否加载通过如下逻辑判断，如果是多线程 或者 还没有加载 或者 将加载不同文件，</w:t>
+      </w:r>
       <w:r>
         <w:rPr>
           <w:rFonts w:hint="eastAsia"/>
         </w:rPr>
-        <w:t>GATK_depthfile</w:t>
-      </w:r>
-      <w:proofErr w:type="spellEnd"/>
-      <w:r>
-        <w:rPr>
-          <w:rFonts w:hint="eastAsia"/>
-        </w:rPr>
-        <w:t>类时，可能都是对一个</w:t>
-      </w:r>
-      <w:proofErr w:type="spellStart"/>
-      <w:r>
-        <w:rPr>
-          <w:rFonts w:hint="eastAsia"/>
-        </w:rPr>
-        <w:t>gatkdepth</w:t>
-      </w:r>
-      <w:proofErr w:type="spellEnd"/>
-      <w:r>
-        <w:rPr>
-          <w:rFonts w:hint="eastAsia"/>
-        </w:rPr>
-        <w:t>文件经行实例化，那么用这样的逻辑来避免多次生成map，由于每次查找某个染色体的某个位置都一定要把这个染色体的depth都加载到内存，而单线程程序一般会生成多个实例，而且处理的时候同时处理同一个染色体，所以如果这几个实例都使用一个depth文件，则可以加载一次内存就够了。而多线程程序中不同线程不一定会在同一个时间处理同一个染色体，所以一定要为每个对象加载一次。是否加载通过如下逻辑判断，如果是多线程 或者 还没有加载 或者 将加载不同文件，则加载</w:t>
+        <w:lastRenderedPageBreak/>
+        <w:t>则加载</w:t>
       </w:r>
     </w:p>
     <w:p>
@@ -3836,7 +3581,6 @@
           <w:szCs w:val="21"/>
         </w:rPr>
       </w:pPr>
-      <w:proofErr w:type="spellStart"/>
       <w:r>
         <w:rPr>
           <w:rFonts w:ascii="Consolas" w:hAnsi="Consolas" w:cs="Consolas" w:hint="eastAsia"/>
@@ -3857,7 +3601,6 @@
         </w:rPr>
         <w:t>etflankseqs</w:t>
       </w:r>
-      <w:proofErr w:type="spellEnd"/>
       <w:r>
         <w:rPr>
           <w:rFonts w:ascii="Consolas" w:hAnsi="Consolas" w:cs="Consolas" w:hint="eastAsia"/>
@@ -3868,7 +3611,6 @@
         </w:rPr>
         <w:t>函数，对</w:t>
       </w:r>
-      <w:proofErr w:type="spellStart"/>
       <w:r>
         <w:rPr>
           <w:rFonts w:ascii="Consolas" w:hAnsi="Consolas" w:cs="Consolas" w:hint="eastAsia"/>
@@ -3879,7 +3621,6 @@
         </w:rPr>
         <w:t>vcf</w:t>
       </w:r>
-      <w:proofErr w:type="spellEnd"/>
       <w:r>
         <w:rPr>
           <w:rFonts w:ascii="Consolas" w:hAnsi="Consolas" w:cs="Consolas" w:hint="eastAsia"/>
@@ -3890,7 +3631,6 @@
         </w:rPr>
         <w:t>数据表中（一般为</w:t>
       </w:r>
-      <w:proofErr w:type="spellStart"/>
       <w:r>
         <w:rPr>
           <w:rFonts w:ascii="Consolas" w:hAnsi="Consolas" w:cs="Consolas" w:hint="eastAsia"/>
@@ -3899,9 +3639,8 @@
           <w:kern w:val="0"/>
           <w:szCs w:val="21"/>
         </w:rPr>
-        <w:t>toplevel</w:t>
-      </w:r>
-      <w:proofErr w:type="spellEnd"/>
+        <w:t>toplevel vcf</w:t>
+      </w:r>
       <w:r>
         <w:rPr>
           <w:rFonts w:ascii="Consolas" w:hAnsi="Consolas" w:cs="Consolas" w:hint="eastAsia"/>
@@ -3910,9 +3649,8 @@
           <w:kern w:val="0"/>
           <w:szCs w:val="21"/>
         </w:rPr>
-        <w:t xml:space="preserve"> </w:t>
-      </w:r>
-      <w:proofErr w:type="spellStart"/>
+        <w:t>表），的某个染色体号的所有</w:t>
+      </w:r>
       <w:r>
         <w:rPr>
           <w:rFonts w:ascii="Consolas" w:hAnsi="Consolas" w:cs="Consolas" w:hint="eastAsia"/>
@@ -3921,9 +3659,8 @@
           <w:kern w:val="0"/>
           <w:szCs w:val="21"/>
         </w:rPr>
-        <w:t>vcf</w:t>
-      </w:r>
-      <w:proofErr w:type="spellEnd"/>
+        <w:t>snp</w:t>
+      </w:r>
       <w:r>
         <w:rPr>
           <w:rFonts w:ascii="Consolas" w:hAnsi="Consolas" w:cs="Consolas" w:hint="eastAsia"/>
@@ -3932,9 +3669,8 @@
           <w:kern w:val="0"/>
           <w:szCs w:val="21"/>
         </w:rPr>
-        <w:t>表），的某个染色体号的所有</w:t>
-      </w:r>
-      <w:proofErr w:type="spellStart"/>
+        <w:t>，输出其上下游的序列，并且填充表中的</w:t>
+      </w:r>
       <w:r>
         <w:rPr>
           <w:rFonts w:ascii="Consolas" w:hAnsi="Consolas" w:cs="Consolas" w:hint="eastAsia"/>
@@ -3943,51 +3679,28 @@
           <w:kern w:val="0"/>
           <w:szCs w:val="21"/>
         </w:rPr>
+        <w:t>context</w:t>
+      </w:r>
+      <w:r>
+        <w:rPr>
+          <w:rFonts w:ascii="Consolas" w:hAnsi="Consolas" w:cs="Consolas" w:hint="eastAsia"/>
+          <w:bCs/>
+          <w:color w:val="000000"/>
+          <w:kern w:val="0"/>
+          <w:szCs w:val="21"/>
+        </w:rPr>
+        <w:t>项为该</w:t>
+      </w:r>
+      <w:r>
+        <w:rPr>
+          <w:rFonts w:ascii="Consolas" w:hAnsi="Consolas" w:cs="Consolas" w:hint="eastAsia"/>
+          <w:bCs/>
+          <w:color w:val="000000"/>
+          <w:kern w:val="0"/>
+          <w:szCs w:val="21"/>
+        </w:rPr>
         <w:t>snp</w:t>
       </w:r>
-      <w:proofErr w:type="spellEnd"/>
-      <w:r>
-        <w:rPr>
-          <w:rFonts w:ascii="Consolas" w:hAnsi="Consolas" w:cs="Consolas" w:hint="eastAsia"/>
-          <w:bCs/>
-          <w:color w:val="000000"/>
-          <w:kern w:val="0"/>
-          <w:szCs w:val="21"/>
-        </w:rPr>
-        <w:t>，输出其上下游的序列，并且填充表中的</w:t>
-      </w:r>
-      <w:r>
-        <w:rPr>
-          <w:rFonts w:ascii="Consolas" w:hAnsi="Consolas" w:cs="Consolas" w:hint="eastAsia"/>
-          <w:bCs/>
-          <w:color w:val="000000"/>
-          <w:kern w:val="0"/>
-          <w:szCs w:val="21"/>
-        </w:rPr>
-        <w:t>context</w:t>
-      </w:r>
-      <w:r>
-        <w:rPr>
-          <w:rFonts w:ascii="Consolas" w:hAnsi="Consolas" w:cs="Consolas" w:hint="eastAsia"/>
-          <w:bCs/>
-          <w:color w:val="000000"/>
-          <w:kern w:val="0"/>
-          <w:szCs w:val="21"/>
-        </w:rPr>
-        <w:t>项为该</w:t>
-      </w:r>
-      <w:proofErr w:type="spellStart"/>
-      <w:r>
-        <w:rPr>
-          <w:rFonts w:ascii="Consolas" w:hAnsi="Consolas" w:cs="Consolas" w:hint="eastAsia"/>
-          <w:bCs/>
-          <w:color w:val="000000"/>
-          <w:kern w:val="0"/>
-          <w:szCs w:val="21"/>
-        </w:rPr>
-        <w:t>snp</w:t>
-      </w:r>
-      <w:proofErr w:type="spellEnd"/>
       <w:r>
         <w:rPr>
           <w:rFonts w:ascii="Consolas" w:hAnsi="Consolas" w:cs="Consolas" w:hint="eastAsia"/>
@@ -4021,7 +3734,6 @@
         </w:rPr>
         <w:t>输入参数为：染色体号，染色体长度，</w:t>
       </w:r>
-      <w:proofErr w:type="spellStart"/>
       <w:r>
         <w:rPr>
           <w:rFonts w:ascii="Consolas" w:hAnsi="Consolas" w:cs="Consolas" w:hint="eastAsia"/>
@@ -4032,7 +3744,6 @@
         </w:rPr>
         <w:t>yao</w:t>
       </w:r>
-      <w:proofErr w:type="spellEnd"/>
     </w:p>
     <w:p>
       <w:pPr>
@@ -4065,21 +3776,23 @@
         <w:rPr>
           <w:rFonts w:hint="eastAsia"/>
         </w:rPr>
-        <w:t>控制在计算</w:t>
-      </w:r>
-      <w:proofErr w:type="spellStart"/>
+        <w:t>控制在计算fst时，是否考虑差异固定；</w:t>
+      </w:r>
+    </w:p>
+    <w:p>
       <w:r>
         <w:rPr>
           <w:rFonts w:hint="eastAsia"/>
         </w:rPr>
-        <w:t>fst</w:t>
-      </w:r>
-      <w:proofErr w:type="spellEnd"/>
+        <w:t>当判断是否某个位点在该种群中固定时，用如下思路：</w:t>
+      </w:r>
+    </w:p>
+    <w:p>
       <w:r>
         <w:rPr>
           <w:rFonts w:hint="eastAsia"/>
         </w:rPr>
-        <w:t>时，是否考虑差异固定；</w:t>
+        <w:t>总的来讲，当某个种群所有被测个体都是一种等位基因时，则该位点当做在该种群中固定，否则不当做固定位点。</w:t>
       </w:r>
     </w:p>
     <w:p>
@@ -4087,7 +3800,7 @@
         <w:rPr>
           <w:rFonts w:hint="eastAsia"/>
         </w:rPr>
-        <w:t>当判断是否某个位点在该种群中固定时，用如下思路：</w:t>
+        <w:t>那么，具体来讲，判断根据两个文件（或者仅根据vcf），一个是vcf中的depth，当vcf没有该位点时根据GATK.depth文件判断：</w:t>
       </w:r>
     </w:p>
     <w:p>
@@ -4095,297 +3808,26 @@
         <w:rPr>
           <w:rFonts w:hint="eastAsia"/>
         </w:rPr>
-        <w:t>总的来讲，当某个种群所有被测个体都是一种等位基因时，则该位点</w:t>
-      </w:r>
-      <w:proofErr w:type="gramStart"/>
+        <w:t>如果是pool的数据，vcf中的depth，与GATK.depth文件中的depth等同，判断是否固定的深度标准是GATK.depth.summary中的</w:t>
+      </w:r>
+      <w:r>
+        <w:t>granular_median</w:t>
+      </w:r>
+    </w:p>
+    <w:p>
       <w:r>
         <w:rPr>
           <w:rFonts w:hint="eastAsia"/>
         </w:rPr>
-        <w:t>当做</w:t>
-      </w:r>
-      <w:proofErr w:type="gramEnd"/>
+        <w:t>如果是indvd的数据，则总共多少个个体的信息从vcf的title中得知，在vcf中，测到的AC等于个体数的话则判断固定为alt，如果vcf中没有该位点，GATK.depth文件中每个个体的深度如果超过4，则判定为固定位该位点。</w:t>
+      </w:r>
+    </w:p>
+    <w:p>
       <w:r>
         <w:rPr>
           <w:rFonts w:hint="eastAsia"/>
         </w:rPr>
-        <w:t>在该种群中固定，否则不</w:t>
-      </w:r>
-      <w:proofErr w:type="gramStart"/>
-      <w:r>
-        <w:rPr>
-          <w:rFonts w:hint="eastAsia"/>
-        </w:rPr>
-        <w:t>当做</w:t>
-      </w:r>
-      <w:proofErr w:type="gramEnd"/>
-      <w:r>
-        <w:rPr>
-          <w:rFonts w:hint="eastAsia"/>
-        </w:rPr>
-        <w:t>固定位点。</w:t>
-      </w:r>
-    </w:p>
-    <w:p>
-      <w:r>
-        <w:rPr>
-          <w:rFonts w:hint="eastAsia"/>
-        </w:rPr>
-        <w:t>那么，具体来讲，判断根据两个文件（或者仅根据</w:t>
-      </w:r>
-      <w:proofErr w:type="spellStart"/>
-      <w:r>
-        <w:rPr>
-          <w:rFonts w:hint="eastAsia"/>
-        </w:rPr>
-        <w:t>vcf</w:t>
-      </w:r>
-      <w:proofErr w:type="spellEnd"/>
-      <w:r>
-        <w:rPr>
-          <w:rFonts w:hint="eastAsia"/>
-        </w:rPr>
-        <w:t>），一个是</w:t>
-      </w:r>
-      <w:proofErr w:type="spellStart"/>
-      <w:r>
-        <w:rPr>
-          <w:rFonts w:hint="eastAsia"/>
-        </w:rPr>
-        <w:t>vcf</w:t>
-      </w:r>
-      <w:proofErr w:type="spellEnd"/>
-      <w:r>
-        <w:rPr>
-          <w:rFonts w:hint="eastAsia"/>
-        </w:rPr>
-        <w:t>中的depth，当</w:t>
-      </w:r>
-      <w:proofErr w:type="spellStart"/>
-      <w:r>
-        <w:rPr>
-          <w:rFonts w:hint="eastAsia"/>
-        </w:rPr>
-        <w:t>vcf</w:t>
-      </w:r>
-      <w:proofErr w:type="spellEnd"/>
-      <w:r>
-        <w:rPr>
-          <w:rFonts w:hint="eastAsia"/>
-        </w:rPr>
-        <w:t>没有该位点时根据</w:t>
-      </w:r>
-      <w:proofErr w:type="spellStart"/>
-      <w:r>
-        <w:rPr>
-          <w:rFonts w:hint="eastAsia"/>
-        </w:rPr>
-        <w:t>GATK.depth</w:t>
-      </w:r>
-      <w:proofErr w:type="spellEnd"/>
-      <w:r>
-        <w:rPr>
-          <w:rFonts w:hint="eastAsia"/>
-        </w:rPr>
-        <w:t>文件判断：</w:t>
-      </w:r>
-    </w:p>
-    <w:p>
-      <w:r>
-        <w:rPr>
-          <w:rFonts w:hint="eastAsia"/>
-        </w:rPr>
-        <w:lastRenderedPageBreak/>
-        <w:t>如果是pool的数据，</w:t>
-      </w:r>
-      <w:proofErr w:type="spellStart"/>
-      <w:r>
-        <w:rPr>
-          <w:rFonts w:hint="eastAsia"/>
-        </w:rPr>
-        <w:t>vcf</w:t>
-      </w:r>
-      <w:proofErr w:type="spellEnd"/>
-      <w:r>
-        <w:rPr>
-          <w:rFonts w:hint="eastAsia"/>
-        </w:rPr>
-        <w:t>中的depth，与</w:t>
-      </w:r>
-      <w:proofErr w:type="spellStart"/>
-      <w:r>
-        <w:rPr>
-          <w:rFonts w:hint="eastAsia"/>
-        </w:rPr>
-        <w:t>GATK.depth</w:t>
-      </w:r>
-      <w:proofErr w:type="spellEnd"/>
-      <w:r>
-        <w:rPr>
-          <w:rFonts w:hint="eastAsia"/>
-        </w:rPr>
-        <w:t>文件中的depth等同，判断是否固定的深度标准是</w:t>
-      </w:r>
-      <w:proofErr w:type="spellStart"/>
-      <w:r>
-        <w:rPr>
-          <w:rFonts w:hint="eastAsia"/>
-        </w:rPr>
-        <w:t>GATK.depth.summary</w:t>
-      </w:r>
-      <w:proofErr w:type="spellEnd"/>
-      <w:r>
-        <w:rPr>
-          <w:rFonts w:hint="eastAsia"/>
-        </w:rPr>
-        <w:t>中的</w:t>
-      </w:r>
-      <w:proofErr w:type="spellStart"/>
-      <w:r>
-        <w:t>granular_median</w:t>
-      </w:r>
-      <w:proofErr w:type="spellEnd"/>
-    </w:p>
-    <w:p>
-      <w:r>
-        <w:rPr>
-          <w:rFonts w:hint="eastAsia"/>
-        </w:rPr>
-        <w:t>如果是</w:t>
-      </w:r>
-      <w:proofErr w:type="spellStart"/>
-      <w:r>
-        <w:rPr>
-          <w:rFonts w:hint="eastAsia"/>
-        </w:rPr>
-        <w:t>indvd</w:t>
-      </w:r>
-      <w:proofErr w:type="spellEnd"/>
-      <w:r>
-        <w:rPr>
-          <w:rFonts w:hint="eastAsia"/>
-        </w:rPr>
-        <w:t>的数据，则总共多少个个体的信息从</w:t>
-      </w:r>
-      <w:proofErr w:type="spellStart"/>
-      <w:r>
-        <w:rPr>
-          <w:rFonts w:hint="eastAsia"/>
-        </w:rPr>
-        <w:t>vcf</w:t>
-      </w:r>
-      <w:proofErr w:type="spellEnd"/>
-      <w:r>
-        <w:rPr>
-          <w:rFonts w:hint="eastAsia"/>
-        </w:rPr>
-        <w:t>的title中得知，在</w:t>
-      </w:r>
-      <w:proofErr w:type="spellStart"/>
-      <w:r>
-        <w:rPr>
-          <w:rFonts w:hint="eastAsia"/>
-        </w:rPr>
-        <w:t>vcf</w:t>
-      </w:r>
-      <w:proofErr w:type="spellEnd"/>
-      <w:r>
-        <w:rPr>
-          <w:rFonts w:hint="eastAsia"/>
-        </w:rPr>
-        <w:t>中，测到的AC等于个体数的话</w:t>
-      </w:r>
-      <w:proofErr w:type="gramStart"/>
-      <w:r>
-        <w:rPr>
-          <w:rFonts w:hint="eastAsia"/>
-        </w:rPr>
-        <w:t>则判断</w:t>
-      </w:r>
-      <w:proofErr w:type="gramEnd"/>
-      <w:r>
-        <w:rPr>
-          <w:rFonts w:hint="eastAsia"/>
-        </w:rPr>
-        <w:t>固定为alt，如果</w:t>
-      </w:r>
-      <w:proofErr w:type="spellStart"/>
-      <w:r>
-        <w:rPr>
-          <w:rFonts w:hint="eastAsia"/>
-        </w:rPr>
-        <w:t>vcf</w:t>
-      </w:r>
-      <w:proofErr w:type="spellEnd"/>
-      <w:r>
-        <w:rPr>
-          <w:rFonts w:hint="eastAsia"/>
-        </w:rPr>
-        <w:t>中没有该位点，</w:t>
-      </w:r>
-      <w:proofErr w:type="spellStart"/>
-      <w:r>
-        <w:rPr>
-          <w:rFonts w:hint="eastAsia"/>
-        </w:rPr>
-        <w:t>GATK.depth</w:t>
-      </w:r>
-      <w:proofErr w:type="spellEnd"/>
-      <w:r>
-        <w:rPr>
-          <w:rFonts w:hint="eastAsia"/>
-        </w:rPr>
-        <w:t>文件中每个个体的深度如果超过4，则判定为</w:t>
-      </w:r>
-      <w:proofErr w:type="gramStart"/>
-      <w:r>
-        <w:rPr>
-          <w:rFonts w:hint="eastAsia"/>
-        </w:rPr>
-        <w:t>固定位该</w:t>
-      </w:r>
-      <w:proofErr w:type="gramEnd"/>
-      <w:r>
-        <w:rPr>
-          <w:rFonts w:hint="eastAsia"/>
-        </w:rPr>
-        <w:t>位点。</w:t>
-      </w:r>
-    </w:p>
-    <w:p>
-      <w:r>
-        <w:rPr>
-          <w:rFonts w:hint="eastAsia"/>
-        </w:rPr>
-        <w:t>如果没有depth文件，则仅从</w:t>
-      </w:r>
-      <w:proofErr w:type="spellStart"/>
-      <w:r>
-        <w:rPr>
-          <w:rFonts w:hint="eastAsia"/>
-        </w:rPr>
-        <w:t>vcf</w:t>
-      </w:r>
-      <w:proofErr w:type="spellEnd"/>
-      <w:r>
-        <w:rPr>
-          <w:rFonts w:hint="eastAsia"/>
-        </w:rPr>
-        <w:t>中是否判定为固定（pool的话就是ref为0，</w:t>
-      </w:r>
-      <w:proofErr w:type="spellStart"/>
-      <w:r>
-        <w:rPr>
-          <w:rFonts w:hint="eastAsia"/>
-        </w:rPr>
-        <w:t>indvd</w:t>
-      </w:r>
-      <w:proofErr w:type="spellEnd"/>
-      <w:r>
-        <w:rPr>
-          <w:rFonts w:hint="eastAsia"/>
-        </w:rPr>
-        <w:t>的话就是ac=个体数），或有无该位点判断固定。</w:t>
+        <w:t>如果没有depth文件，则仅从vcf中是否判定为固定（pool的话就是ref为0，indvd的话就是ac=个体数），或有无该位点判断固定。</w:t>
       </w:r>
     </w:p>
     <w:p>
@@ -4413,173 +3855,67 @@
           <w:rFonts w:hint="eastAsia"/>
           <w:b/>
         </w:rPr>
-        <w:t>临时性添加了</w:t>
-      </w:r>
-      <w:proofErr w:type="spellStart"/>
+        <w:t>临时性添加了Caculate_df的功能，此种情况下只提供一个vcf文件，但要提供两个群体名列表文件，对应vcf文件的title。当不指定-f 参数时则不影响原来计算hp的功能。</w:t>
+      </w:r>
+    </w:p>
+    <w:p>
+      <w:pPr>
+        <w:rPr>
+          <w:b/>
+        </w:rPr>
+      </w:pPr>
+    </w:p>
+    <w:p>
+      <w:pPr>
+        <w:rPr>
+          <w:b/>
+        </w:rPr>
+      </w:pPr>
       <w:r>
         <w:rPr>
           <w:rFonts w:hint="eastAsia"/>
           <w:b/>
         </w:rPr>
-        <w:t>Caculate_df</w:t>
-      </w:r>
-      <w:proofErr w:type="spellEnd"/>
-      <w:r>
-        <w:rPr>
-          <w:rFonts w:hint="eastAsia"/>
+        <w:t>使用多sql的示例</w:t>
+      </w:r>
+    </w:p>
+    <w:p>
+      <w:pPr>
+        <w:rPr>
           <w:b/>
         </w:rPr>
-        <w:t>的功能，此种情况下只提供一个</w:t>
-      </w:r>
-      <w:proofErr w:type="spellStart"/>
-      <w:r>
-        <w:rPr>
-          <w:rFonts w:hint="eastAsia"/>
+      </w:pPr>
+      <w:r>
+        <w:rPr>
           <w:b/>
         </w:rPr>
-        <w:t>vcf</w:t>
-      </w:r>
-      <w:proofErr w:type="spellEnd"/>
-      <w:r>
-        <w:rPr>
-          <w:rFonts w:hint="eastAsia"/>
+        <w:t>&gt;&gt;&gt; dbvariantstools.operateDB("insert",*l,data=[('KB742382.1',26,".","AAA","bbb","p"),('KB742382.1',27,".","f","l","123,0")])</w:t>
+      </w:r>
+    </w:p>
+    <w:p>
+      <w:pPr>
+        <w:rPr>
           <w:b/>
         </w:rPr>
-        <w:t>文件，但要提供两个群体名列表文件，对应</w:t>
-      </w:r>
-      <w:proofErr w:type="spellStart"/>
-      <w:r>
-        <w:rPr>
-          <w:rFonts w:hint="eastAsia"/>
+      </w:pPr>
+      <w:r>
+        <w:rPr>
           <w:b/>
         </w:rPr>
-        <w:t>vcf</w:t>
-      </w:r>
-      <w:proofErr w:type="spellEnd"/>
-      <w:r>
-        <w:rPr>
-          <w:rFonts w:hint="eastAsia"/>
+        <w:t>0</w:t>
+      </w:r>
+    </w:p>
+    <w:p>
+      <w:pPr>
+        <w:rPr>
           <w:b/>
         </w:rPr>
-        <w:t>文件的title。当不指定-f 参数时则不影响原来计算hp的功能。</w:t>
-      </w:r>
-    </w:p>
-    <w:p>
-      <w:pPr>
+      </w:pPr>
+      <w:r>
         <w:rPr>
           <w:b/>
         </w:rPr>
-      </w:pPr>
-    </w:p>
-    <w:p>
-      <w:pPr>
-        <w:rPr>
-          <w:b/>
-        </w:rPr>
-      </w:pPr>
-      <w:r>
-        <w:rPr>
-          <w:rFonts w:hint="eastAsia"/>
-          <w:b/>
-        </w:rPr>
-        <w:t>使用多</w:t>
-      </w:r>
-      <w:proofErr w:type="spellStart"/>
-      <w:r>
-        <w:rPr>
-          <w:rFonts w:hint="eastAsia"/>
-          <w:b/>
-        </w:rPr>
-        <w:t>sql</w:t>
-      </w:r>
-      <w:proofErr w:type="spellEnd"/>
-      <w:r>
-        <w:rPr>
-          <w:rFonts w:hint="eastAsia"/>
-          <w:b/>
-        </w:rPr>
-        <w:t>的示例</w:t>
-      </w:r>
-    </w:p>
-    <w:p>
-      <w:pPr>
-        <w:rPr>
-          <w:b/>
-        </w:rPr>
-      </w:pPr>
-      <w:r>
-        <w:rPr>
-          <w:b/>
-        </w:rPr>
-        <w:t xml:space="preserve">&gt;&gt;&gt; </w:t>
-      </w:r>
-      <w:proofErr w:type="gramStart"/>
-      <w:r>
-        <w:rPr>
-          <w:b/>
-        </w:rPr>
-        <w:t>dbvariantstools.operateDB</w:t>
-      </w:r>
-      <w:proofErr w:type="gramEnd"/>
-      <w:r>
-        <w:rPr>
-          <w:b/>
-        </w:rPr>
-        <w:t>("insert",*l,data=[('KB742382.1',26,".","AAA","bbb","p"),('KB742382.1',27,".","f","l","123,0")])</w:t>
-      </w:r>
-    </w:p>
-    <w:p>
-      <w:pPr>
-        <w:rPr>
-          <w:b/>
-        </w:rPr>
-      </w:pPr>
-      <w:r>
-        <w:rPr>
-          <w:b/>
-        </w:rPr>
-        <w:t>0</w:t>
-      </w:r>
-    </w:p>
-    <w:p>
-      <w:pPr>
-        <w:rPr>
-          <w:b/>
-        </w:rPr>
-      </w:pPr>
-      <w:r>
-        <w:rPr>
-          <w:b/>
-        </w:rPr>
-        <w:t>&gt;&gt;&gt; l=["insert into mspsgjlksy10pop_toplevel_pekingduckref_new(chrID,snp_pos,snpID,ref_base,alt_base,wegeon__pool_withindel_vcf_alt) VALUES(%</w:t>
-      </w:r>
-      <w:proofErr w:type="spellStart"/>
-      <w:r>
-        <w:rPr>
-          <w:b/>
-        </w:rPr>
-        <w:t>s,%s,%s,%s,%s,%s</w:t>
-      </w:r>
-      <w:proofErr w:type="spellEnd"/>
-      <w:r>
-        <w:rPr>
-          <w:b/>
-        </w:rPr>
-        <w:t>)","insert into mspsgjlksy10pop_toplevel_pekingduckref_new(chrID,snp_pos,snpID,ref_base,alt_base,wegeon__pool_withindel_vcf_dep) VALUES(%</w:t>
-      </w:r>
-      <w:proofErr w:type="spellStart"/>
-      <w:r>
-        <w:rPr>
-          <w:b/>
-        </w:rPr>
-        <w:t>s,%s,%s,%s,%s,%s</w:t>
-      </w:r>
-      <w:proofErr w:type="spellEnd"/>
-      <w:r>
-        <w:rPr>
-          <w:b/>
-        </w:rPr>
-        <w:t>)"]</w:t>
+        <w:t>&gt;&gt;&gt; l=["insert into mspsgjlksy10pop_toplevel_pekingduckref_new(chrID,snp_pos,snpID,ref_base,alt_base,wegeon__pool_withindel_vcf_alt) VALUES(%s,%s,%s,%s,%s,%s)","insert into mspsgjlksy10pop_toplevel_pekingduckref_new(chrID,snp_pos,snpID,ref_base,alt_base,wegeon__pool_withindel_vcf_dep) VALUES(%s,%s,%s,%s,%s,%s)"]</w:t>
       </w:r>
     </w:p>
     <w:p>
@@ -4588,7 +3924,6 @@
           <w:color w:val="000000" w:themeColor="text1"/>
         </w:rPr>
       </w:pPr>
-      <w:proofErr w:type="spellStart"/>
       <w:r>
         <w:rPr>
           <w:rFonts w:ascii="Consolas" w:hAnsi="Consolas" w:cs="Consolas"/>
@@ -4598,9 +3933,9 @@
           <w:sz w:val="20"/>
           <w:szCs w:val="20"/>
         </w:rPr>
+        <w:lastRenderedPageBreak/>
         <w:t>generateIndexByChrom</w:t>
       </w:r>
-      <w:proofErr w:type="spellEnd"/>
       <w:r>
         <w:rPr>
           <w:rFonts w:ascii="Consolas" w:hAnsi="Consolas" w:cs="Consolas" w:hint="eastAsia"/>
@@ -4634,7 +3969,6 @@
         </w:rPr>
         <w:t xml:space="preserve"> </w:t>
       </w:r>
-      <w:proofErr w:type="spellStart"/>
       <w:r>
         <w:rPr>
           <w:rFonts w:ascii="Consolas" w:hAnsi="Consolas" w:cs="Consolas"/>
@@ -4646,7 +3980,6 @@
         </w:rPr>
         <w:t>generateFasterRefIndex</w:t>
       </w:r>
-      <w:proofErr w:type="spellEnd"/>
       <w:r>
         <w:rPr>
           <w:rFonts w:ascii="Consolas" w:hAnsi="Consolas" w:cs="Consolas" w:hint="eastAsia"/>
@@ -4681,7 +4014,7 @@
 </file>
 
 <file path=word/endnotes.xml><?xml version="1.0" encoding="utf-8"?>
-<w:endnotes xmlns:wpc="http://schemas.microsoft.com/office/word/2010/wordprocessingCanvas" xmlns:cx="http://schemas.microsoft.com/office/drawing/2014/chartex" xmlns:cx1="http://schemas.microsoft.com/office/drawing/2015/9/8/chartex" xmlns:cx2="http://schemas.microsoft.com/office/drawing/2015/10/21/chartex" xmlns:cx3="http://schemas.microsoft.com/office/drawing/2016/5/9/chartex" xmlns:cx4="http://schemas.microsoft.com/office/drawing/2016/5/10/chartex" xmlns:cx5="http://schemas.microsoft.com/office/drawing/2016/5/11/chartex" xmlns:cx6="http://schemas.microsoft.com/office/drawing/2016/5/12/chartex" xmlns:cx7="http://schemas.microsoft.com/office/drawing/2016/5/13/chartex" xmlns:cx8="http://schemas.microsoft.com/office/drawing/2016/5/14/chartex" xmlns:mc="http://schemas.openxmlformats.org/markup-compatibility/2006" xmlns:aink="http://schemas.microsoft.com/office/drawing/2016/ink" xmlns:am3d="http://schemas.microsoft.com/office/drawing/2017/model3d" xmlns:o="urn:schemas-microsoft-com:office:office" xmlns:r="http://schemas.openxmlformats.org/officeDocument/2006/relationships" xmlns:m="http://schemas.openxmlformats.org/officeDocument/2006/math" xmlns:v="urn:schemas-microsoft-com:vml" xmlns:wp14="http://schemas.microsoft.com/office/word/2010/wordprocessingDrawing" xmlns:wp="http://schemas.openxmlformats.org/drawingml/2006/wordprocessingDrawing" xmlns:w10="urn:schemas-microsoft-com:office:word" xmlns:w="http://schemas.openxmlformats.org/wordprocessingml/2006/main" xmlns:w14="http://schemas.microsoft.com/office/word/2010/wordml" xmlns:w15="http://schemas.microsoft.com/office/word/2012/wordml" xmlns:w16cex="http://schemas.microsoft.com/office/word/2018/wordml/cex" xmlns:w16cid="http://schemas.microsoft.com/office/word/2016/wordml/cid" xmlns:w16="http://schemas.microsoft.com/office/word/2018/wordml" xmlns:w16se="http://schemas.microsoft.com/office/word/2015/wordml/symex" xmlns:wpg="http://schemas.microsoft.com/office/word/2010/wordprocessingGroup" xmlns:wpi="http://schemas.microsoft.com/office/word/2010/wordprocessingInk" xmlns:wne="http://schemas.microsoft.com/office/word/2006/wordml" xmlns:wps="http://schemas.microsoft.com/office/word/2010/wordprocessingShape" mc:Ignorable="w14 w15 w16se w16cid w16 w16cex wp14">
+<w:endnotes xmlns:wpc="http://schemas.microsoft.com/office/word/2010/wordprocessingCanvas" xmlns:cx="http://schemas.microsoft.com/office/drawing/2014/chartex" xmlns:cx1="http://schemas.microsoft.com/office/drawing/2015/9/8/chartex" xmlns:cx2="http://schemas.microsoft.com/office/drawing/2015/10/21/chartex" xmlns:cx3="http://schemas.microsoft.com/office/drawing/2016/5/9/chartex" xmlns:cx4="http://schemas.microsoft.com/office/drawing/2016/5/10/chartex" xmlns:cx5="http://schemas.microsoft.com/office/drawing/2016/5/11/chartex" xmlns:cx6="http://schemas.microsoft.com/office/drawing/2016/5/12/chartex" xmlns:cx7="http://schemas.microsoft.com/office/drawing/2016/5/13/chartex" xmlns:cx8="http://schemas.microsoft.com/office/drawing/2016/5/14/chartex" xmlns:mc="http://schemas.openxmlformats.org/markup-compatibility/2006" xmlns:aink="http://schemas.microsoft.com/office/drawing/2016/ink" xmlns:am3d="http://schemas.microsoft.com/office/drawing/2017/model3d" xmlns:o="urn:schemas-microsoft-com:office:office" xmlns:r="http://schemas.openxmlformats.org/officeDocument/2006/relationships" xmlns:m="http://schemas.openxmlformats.org/officeDocument/2006/math" xmlns:v="urn:schemas-microsoft-com:vml" xmlns:wp14="http://schemas.microsoft.com/office/word/2010/wordprocessingDrawing" xmlns:wp="http://schemas.openxmlformats.org/drawingml/2006/wordprocessingDrawing" xmlns:w10="urn:schemas-microsoft-com:office:word" xmlns:w="http://schemas.openxmlformats.org/wordprocessingml/2006/main" xmlns:w14="http://schemas.microsoft.com/office/word/2010/wordml" xmlns:w15="http://schemas.microsoft.com/office/word/2012/wordml" xmlns:w16cex="http://schemas.microsoft.com/office/word/2018/wordml/cex" xmlns:w16cid="http://schemas.microsoft.com/office/word/2016/wordml/cid" xmlns:w16="http://schemas.microsoft.com/office/word/2018/wordml" xmlns:w16sdtdh="http://schemas.microsoft.com/office/word/2020/wordml/sdtdatahash" xmlns:w16se="http://schemas.microsoft.com/office/word/2015/wordml/symex" xmlns:wpg="http://schemas.microsoft.com/office/word/2010/wordprocessingGroup" xmlns:wpi="http://schemas.microsoft.com/office/word/2010/wordprocessingInk" xmlns:wne="http://schemas.microsoft.com/office/word/2006/wordml" xmlns:wps="http://schemas.microsoft.com/office/word/2010/wordprocessingShape" mc:Ignorable="w14 w15 w16se w16cid w16 w16cex w16sdtdh wp14">
   <w:endnote w:type="separator" w:id="-1">
     <w:p>
       <w:r>
@@ -4700,7 +4033,7 @@
 </file>
 
 <file path=word/footnotes.xml><?xml version="1.0" encoding="utf-8"?>
-<w:footnotes xmlns:wpc="http://schemas.microsoft.com/office/word/2010/wordprocessingCanvas" xmlns:cx="http://schemas.microsoft.com/office/drawing/2014/chartex" xmlns:cx1="http://schemas.microsoft.com/office/drawing/2015/9/8/chartex" xmlns:cx2="http://schemas.microsoft.com/office/drawing/2015/10/21/chartex" xmlns:cx3="http://schemas.microsoft.com/office/drawing/2016/5/9/chartex" xmlns:cx4="http://schemas.microsoft.com/office/drawing/2016/5/10/chartex" xmlns:cx5="http://schemas.microsoft.com/office/drawing/2016/5/11/chartex" xmlns:cx6="http://schemas.microsoft.com/office/drawing/2016/5/12/chartex" xmlns:cx7="http://schemas.microsoft.com/office/drawing/2016/5/13/chartex" xmlns:cx8="http://schemas.microsoft.com/office/drawing/2016/5/14/chartex" xmlns:mc="http://schemas.openxmlformats.org/markup-compatibility/2006" xmlns:aink="http://schemas.microsoft.com/office/drawing/2016/ink" xmlns:am3d="http://schemas.microsoft.com/office/drawing/2017/model3d" xmlns:o="urn:schemas-microsoft-com:office:office" xmlns:r="http://schemas.openxmlformats.org/officeDocument/2006/relationships" xmlns:m="http://schemas.openxmlformats.org/officeDocument/2006/math" xmlns:v="urn:schemas-microsoft-com:vml" xmlns:wp14="http://schemas.microsoft.com/office/word/2010/wordprocessingDrawing" xmlns:wp="http://schemas.openxmlformats.org/drawingml/2006/wordprocessingDrawing" xmlns:w10="urn:schemas-microsoft-com:office:word" xmlns:w="http://schemas.openxmlformats.org/wordprocessingml/2006/main" xmlns:w14="http://schemas.microsoft.com/office/word/2010/wordml" xmlns:w15="http://schemas.microsoft.com/office/word/2012/wordml" xmlns:w16cex="http://schemas.microsoft.com/office/word/2018/wordml/cex" xmlns:w16cid="http://schemas.microsoft.com/office/word/2016/wordml/cid" xmlns:w16="http://schemas.microsoft.com/office/word/2018/wordml" xmlns:w16se="http://schemas.microsoft.com/office/word/2015/wordml/symex" xmlns:wpg="http://schemas.microsoft.com/office/word/2010/wordprocessingGroup" xmlns:wpi="http://schemas.microsoft.com/office/word/2010/wordprocessingInk" xmlns:wne="http://schemas.microsoft.com/office/word/2006/wordml" xmlns:wps="http://schemas.microsoft.com/office/word/2010/wordprocessingShape" mc:Ignorable="w14 w15 w16se w16cid w16 w16cex wp14">
+<w:footnotes xmlns:wpc="http://schemas.microsoft.com/office/word/2010/wordprocessingCanvas" xmlns:cx="http://schemas.microsoft.com/office/drawing/2014/chartex" xmlns:cx1="http://schemas.microsoft.com/office/drawing/2015/9/8/chartex" xmlns:cx2="http://schemas.microsoft.com/office/drawing/2015/10/21/chartex" xmlns:cx3="http://schemas.microsoft.com/office/drawing/2016/5/9/chartex" xmlns:cx4="http://schemas.microsoft.com/office/drawing/2016/5/10/chartex" xmlns:cx5="http://schemas.microsoft.com/office/drawing/2016/5/11/chartex" xmlns:cx6="http://schemas.microsoft.com/office/drawing/2016/5/12/chartex" xmlns:cx7="http://schemas.microsoft.com/office/drawing/2016/5/13/chartex" xmlns:cx8="http://schemas.microsoft.com/office/drawing/2016/5/14/chartex" xmlns:mc="http://schemas.openxmlformats.org/markup-compatibility/2006" xmlns:aink="http://schemas.microsoft.com/office/drawing/2016/ink" xmlns:am3d="http://schemas.microsoft.com/office/drawing/2017/model3d" xmlns:o="urn:schemas-microsoft-com:office:office" xmlns:r="http://schemas.openxmlformats.org/officeDocument/2006/relationships" xmlns:m="http://schemas.openxmlformats.org/officeDocument/2006/math" xmlns:v="urn:schemas-microsoft-com:vml" xmlns:wp14="http://schemas.microsoft.com/office/word/2010/wordprocessingDrawing" xmlns:wp="http://schemas.openxmlformats.org/drawingml/2006/wordprocessingDrawing" xmlns:w10="urn:schemas-microsoft-com:office:word" xmlns:w="http://schemas.openxmlformats.org/wordprocessingml/2006/main" xmlns:w14="http://schemas.microsoft.com/office/word/2010/wordml" xmlns:w15="http://schemas.microsoft.com/office/word/2012/wordml" xmlns:w16cex="http://schemas.microsoft.com/office/word/2018/wordml/cex" xmlns:w16cid="http://schemas.microsoft.com/office/word/2016/wordml/cid" xmlns:w16="http://schemas.microsoft.com/office/word/2018/wordml" xmlns:w16sdtdh="http://schemas.microsoft.com/office/word/2020/wordml/sdtdatahash" xmlns:w16se="http://schemas.microsoft.com/office/word/2015/wordml/symex" xmlns:wpg="http://schemas.microsoft.com/office/word/2010/wordprocessingGroup" xmlns:wpi="http://schemas.microsoft.com/office/word/2010/wordprocessingInk" xmlns:wne="http://schemas.microsoft.com/office/word/2006/wordml" xmlns:wps="http://schemas.microsoft.com/office/word/2010/wordprocessingShape" mc:Ignorable="w14 w15 w16se w16cid w16 w16cex w16sdtdh wp14">
   <w:footnote w:type="separator" w:id="-1">
     <w:p>
       <w:r>
@@ -4719,7 +4052,7 @@
 </file>
 
 <file path=word/numbering.xml><?xml version="1.0" encoding="utf-8"?>
-<w:numbering xmlns:wpc="http://schemas.microsoft.com/office/word/2010/wordprocessingCanvas" xmlns:cx="http://schemas.microsoft.com/office/drawing/2014/chartex" xmlns:cx1="http://schemas.microsoft.com/office/drawing/2015/9/8/chartex" xmlns:cx2="http://schemas.microsoft.com/office/drawing/2015/10/21/chartex" xmlns:cx3="http://schemas.microsoft.com/office/drawing/2016/5/9/chartex" xmlns:cx4="http://schemas.microsoft.com/office/drawing/2016/5/10/chartex" xmlns:cx5="http://schemas.microsoft.com/office/drawing/2016/5/11/chartex" xmlns:cx6="http://schemas.microsoft.com/office/drawing/2016/5/12/chartex" xmlns:cx7="http://schemas.microsoft.com/office/drawing/2016/5/13/chartex" xmlns:cx8="http://schemas.microsoft.com/office/drawing/2016/5/14/chartex" xmlns:mc="http://schemas.openxmlformats.org/markup-compatibility/2006" xmlns:aink="http://schemas.microsoft.com/office/drawing/2016/ink" xmlns:am3d="http://schemas.microsoft.com/office/drawing/2017/model3d" xmlns:o="urn:schemas-microsoft-com:office:office" xmlns:r="http://schemas.openxmlformats.org/officeDocument/2006/relationships" xmlns:m="http://schemas.openxmlformats.org/officeDocument/2006/math" xmlns:v="urn:schemas-microsoft-com:vml" xmlns:wp14="http://schemas.microsoft.com/office/word/2010/wordprocessingDrawing" xmlns:wp="http://schemas.openxmlformats.org/drawingml/2006/wordprocessingDrawing" xmlns:w10="urn:schemas-microsoft-com:office:word" xmlns:w="http://schemas.openxmlformats.org/wordprocessingml/2006/main" xmlns:w14="http://schemas.microsoft.com/office/word/2010/wordml" xmlns:w15="http://schemas.microsoft.com/office/word/2012/wordml" xmlns:w16cex="http://schemas.microsoft.com/office/word/2018/wordml/cex" xmlns:w16cid="http://schemas.microsoft.com/office/word/2016/wordml/cid" xmlns:w16="http://schemas.microsoft.com/office/word/2018/wordml" xmlns:w16se="http://schemas.microsoft.com/office/word/2015/wordml/symex" xmlns:wpg="http://schemas.microsoft.com/office/word/2010/wordprocessingGroup" xmlns:wpi="http://schemas.microsoft.com/office/word/2010/wordprocessingInk" xmlns:wne="http://schemas.microsoft.com/office/word/2006/wordml" xmlns:wps="http://schemas.microsoft.com/office/word/2010/wordprocessingShape" mc:Ignorable="w14 w15 w16se w16cid w16 w16cex wp14">
+<w:numbering xmlns:wpc="http://schemas.microsoft.com/office/word/2010/wordprocessingCanvas" xmlns:cx="http://schemas.microsoft.com/office/drawing/2014/chartex" xmlns:cx1="http://schemas.microsoft.com/office/drawing/2015/9/8/chartex" xmlns:cx2="http://schemas.microsoft.com/office/drawing/2015/10/21/chartex" xmlns:cx3="http://schemas.microsoft.com/office/drawing/2016/5/9/chartex" xmlns:cx4="http://schemas.microsoft.com/office/drawing/2016/5/10/chartex" xmlns:cx5="http://schemas.microsoft.com/office/drawing/2016/5/11/chartex" xmlns:cx6="http://schemas.microsoft.com/office/drawing/2016/5/12/chartex" xmlns:cx7="http://schemas.microsoft.com/office/drawing/2016/5/13/chartex" xmlns:cx8="http://schemas.microsoft.com/office/drawing/2016/5/14/chartex" xmlns:mc="http://schemas.openxmlformats.org/markup-compatibility/2006" xmlns:aink="http://schemas.microsoft.com/office/drawing/2016/ink" xmlns:am3d="http://schemas.microsoft.com/office/drawing/2017/model3d" xmlns:o="urn:schemas-microsoft-com:office:office" xmlns:r="http://schemas.openxmlformats.org/officeDocument/2006/relationships" xmlns:m="http://schemas.openxmlformats.org/officeDocument/2006/math" xmlns:v="urn:schemas-microsoft-com:vml" xmlns:wp14="http://schemas.microsoft.com/office/word/2010/wordprocessingDrawing" xmlns:wp="http://schemas.openxmlformats.org/drawingml/2006/wordprocessingDrawing" xmlns:w10="urn:schemas-microsoft-com:office:word" xmlns:w="http://schemas.openxmlformats.org/wordprocessingml/2006/main" xmlns:w14="http://schemas.microsoft.com/office/word/2010/wordml" xmlns:w15="http://schemas.microsoft.com/office/word/2012/wordml" xmlns:w16cex="http://schemas.microsoft.com/office/word/2018/wordml/cex" xmlns:w16cid="http://schemas.microsoft.com/office/word/2016/wordml/cid" xmlns:w16="http://schemas.microsoft.com/office/word/2018/wordml" xmlns:w16sdtdh="http://schemas.microsoft.com/office/word/2020/wordml/sdtdatahash" xmlns:w16se="http://schemas.microsoft.com/office/word/2015/wordml/symex" xmlns:wpg="http://schemas.microsoft.com/office/word/2010/wordprocessingGroup" xmlns:wpi="http://schemas.microsoft.com/office/word/2010/wordprocessingInk" xmlns:wne="http://schemas.microsoft.com/office/word/2006/wordml" xmlns:wps="http://schemas.microsoft.com/office/word/2010/wordprocessingShape" mc:Ignorable="w14 w15 w16se w16cid w16 w16cex w16sdtdh wp14">
   <w:abstractNum w:abstractNumId="0" w15:restartNumberingAfterBreak="0">
     <w:nsid w:val="2B995748"/>
     <w:multiLevelType w:val="hybridMultilevel"/>
@@ -5215,7 +4548,7 @@
 </file>
 
 <file path=word/styles.xml><?xml version="1.0" encoding="utf-8"?>
-<w:styles xmlns:mc="http://schemas.openxmlformats.org/markup-compatibility/2006" xmlns:r="http://schemas.openxmlformats.org/officeDocument/2006/relationships" xmlns:w="http://schemas.openxmlformats.org/wordprocessingml/2006/main" xmlns:w14="http://schemas.microsoft.com/office/word/2010/wordml" xmlns:w15="http://schemas.microsoft.com/office/word/2012/wordml" xmlns:w16cex="http://schemas.microsoft.com/office/word/2018/wordml/cex" xmlns:w16cid="http://schemas.microsoft.com/office/word/2016/wordml/cid" xmlns:w16="http://schemas.microsoft.com/office/word/2018/wordml" xmlns:w16se="http://schemas.microsoft.com/office/word/2015/wordml/symex" mc:Ignorable="w14 w15 w16se w16cid w16 w16cex">
+<w:styles xmlns:mc="http://schemas.openxmlformats.org/markup-compatibility/2006" xmlns:r="http://schemas.openxmlformats.org/officeDocument/2006/relationships" xmlns:w="http://schemas.openxmlformats.org/wordprocessingml/2006/main" xmlns:w14="http://schemas.microsoft.com/office/word/2010/wordml" xmlns:w15="http://schemas.microsoft.com/office/word/2012/wordml" xmlns:w16cex="http://schemas.microsoft.com/office/word/2018/wordml/cex" xmlns:w16cid="http://schemas.microsoft.com/office/word/2016/wordml/cid" xmlns:w16="http://schemas.microsoft.com/office/word/2018/wordml" xmlns:w16sdtdh="http://schemas.microsoft.com/office/word/2020/wordml/sdtdatahash" xmlns:w16se="http://schemas.microsoft.com/office/word/2015/wordml/symex" mc:Ignorable="w14 w15 w16se w16cid w16 w16cex w16sdtdh">
   <w:docDefaults>
     <w:rPrDefault>
       <w:rPr>
@@ -5334,6 +4667,7 @@
     <w:lsdException w:name="HTML Sample" w:semiHidden="1" w:unhideWhenUsed="1"/>
     <w:lsdException w:name="HTML Typewriter" w:semiHidden="1" w:unhideWhenUsed="1"/>
     <w:lsdException w:name="HTML Variable" w:semiHidden="1" w:unhideWhenUsed="1"/>
+    <w:lsdException w:name="Normal Table" w:semiHidden="1" w:unhideWhenUsed="1"/>
     <w:lsdException w:name="annotation subject" w:semiHidden="1" w:unhideWhenUsed="1"/>
     <w:lsdException w:name="No List" w:semiHidden="1" w:unhideWhenUsed="1"/>
     <w:lsdException w:name="Outline List 1" w:semiHidden="1" w:unhideWhenUsed="1"/>
@@ -5380,8 +4714,10 @@
     <w:lsdException w:name="Table Subtle 2" w:semiHidden="1" w:unhideWhenUsed="1"/>
     <w:lsdException w:name="Table Web 1" w:semiHidden="1" w:unhideWhenUsed="1"/>
     <w:lsdException w:name="Table Web 2" w:semiHidden="1" w:unhideWhenUsed="1"/>
+    <w:lsdException w:name="Table Web 3" w:semiHidden="1" w:unhideWhenUsed="1"/>
     <w:lsdException w:name="Balloon Text" w:semiHidden="1" w:unhideWhenUsed="1"/>
     <w:lsdException w:name="Table Grid" w:uiPriority="39"/>
+    <w:lsdException w:name="Table Theme" w:semiHidden="1" w:unhideWhenUsed="1"/>
     <w:lsdException w:name="Placeholder Text" w:semiHidden="1"/>
     <w:lsdException w:name="No Spacing" w:uiPriority="1" w:qFormat="1"/>
     <w:lsdException w:name="Light Shading" w:uiPriority="60"/>

</xml_diff>

<commit_message>
CORRECT but unfinished for species less than the total(14 for this case) need extract subtree
</commit_message>
<xml_diff>
--- a/life文档.docx
+++ b/life文档.docx
@@ -5,17 +5,95 @@
     <w:p>
       <w:pPr>
         <w:rPr>
+          <w:rFonts w:ascii="宋体" w:eastAsia="宋体" w:hAnsi="宋体" w:cs="Times New Roman"/>
+          <w:sz w:val="24"/>
+          <w:szCs w:val="24"/>
+        </w:rPr>
+      </w:pPr>
+      <w:r>
+        <w:rPr>
           <w:rFonts w:ascii="Times New Roman" w:hAnsi="Times New Roman" w:cs="Times New Roman"/>
           <w:sz w:val="24"/>
           <w:szCs w:val="24"/>
         </w:rPr>
-      </w:pPr>
+        <w:t>print(</w:t>
+      </w:r>
+      <w:proofErr w:type="spellStart"/>
       <w:r>
         <w:rPr>
           <w:rFonts w:ascii="Times New Roman" w:hAnsi="Times New Roman" w:cs="Times New Roman"/>
           <w:sz w:val="24"/>
           <w:szCs w:val="24"/>
         </w:rPr>
+        <w:t>seq_rec,CD_sites_idx</w:t>
+      </w:r>
+      <w:proofErr w:type="spellEnd"/>
+      <w:r>
+        <w:rPr>
+          <w:rFonts w:ascii="宋体" w:eastAsia="宋体" w:hAnsi="宋体" w:cs="Times New Roman"/>
+          <w:sz w:val="24"/>
+          <w:szCs w:val="24"/>
+        </w:rPr>
+        <w:t>)</w:t>
+      </w:r>
+      <w:r>
+        <w:rPr>
+          <w:rFonts w:ascii="宋体" w:eastAsia="宋体" w:hAnsi="宋体" w:cs="Times New Roman"/>
+          <w:sz w:val="24"/>
+          <w:szCs w:val="24"/>
+        </w:rPr>
+        <w:t>#</w:t>
+      </w:r>
+      <w:r>
+        <w:rPr>
+          <w:rFonts w:ascii="宋体" w:eastAsia="宋体" w:hAnsi="宋体" w:cs="Times New Roman" w:hint="eastAsia"/>
+          <w:sz w:val="24"/>
+          <w:szCs w:val="24"/>
+        </w:rPr>
+        <w:t>打印结果为：</w:t>
+      </w:r>
+    </w:p>
+    <w:p>
+      <w:pPr>
+        <w:rPr>
+          <w:rFonts w:ascii="宋体" w:eastAsia="宋体" w:hAnsi="宋体" w:cs="Times New Roman"/>
+          <w:sz w:val="24"/>
+          <w:szCs w:val="24"/>
+        </w:rPr>
+      </w:pPr>
+    </w:p>
+    <w:p>
+      <w:pPr>
+        <w:rPr>
+          <w:rFonts w:ascii="Times New Roman" w:hAnsi="Times New Roman" w:cs="Times New Roman" w:hint="eastAsia"/>
+          <w:sz w:val="24"/>
+          <w:szCs w:val="24"/>
+        </w:rPr>
+      </w:pPr>
+    </w:p>
+    <w:p>
+      <w:pPr>
+        <w:rPr>
+          <w:rFonts w:ascii="Times New Roman" w:hAnsi="Times New Roman" w:cs="Times New Roman" w:hint="eastAsia"/>
+          <w:sz w:val="24"/>
+          <w:szCs w:val="24"/>
+        </w:rPr>
+      </w:pPr>
+    </w:p>
+    <w:p>
+      <w:pPr>
+        <w:rPr>
+          <w:rFonts w:ascii="Times New Roman" w:hAnsi="Times New Roman" w:cs="Times New Roman"/>
+          <w:sz w:val="24"/>
+          <w:szCs w:val="24"/>
+        </w:rPr>
+      </w:pPr>
+      <w:r>
+        <w:rPr>
+          <w:rFonts w:ascii="Times New Roman" w:hAnsi="Times New Roman" w:cs="Times New Roman"/>
+          <w:sz w:val="24"/>
+          <w:szCs w:val="24"/>
+        </w:rPr>
         <w:t>编写</w:t>
       </w:r>
       <w:r>
@@ -35,6 +113,7 @@
           <w:szCs w:val="24"/>
         </w:rPr>
       </w:pPr>
+      <w:proofErr w:type="spellStart"/>
       <w:r>
         <w:rPr>
           <w:rFonts w:ascii="Times New Roman" w:hAnsi="Times New Roman" w:cs="Times New Roman"/>
@@ -43,6 +122,7 @@
         </w:rPr>
         <w:t>VCFutil.VCF_Data</w:t>
       </w:r>
+      <w:proofErr w:type="spellEnd"/>
     </w:p>
     <w:p>
       <w:pPr>
@@ -257,6 +337,7 @@
             </w:pPr>
             <w:bookmarkStart w:id="0" w:name="OLE_LINK1"/>
             <w:bookmarkStart w:id="1" w:name="OLE_LINK2"/>
+            <w:proofErr w:type="spellStart"/>
             <w:r>
               <w:rPr>
                 <w:rFonts w:ascii="Times New Roman" w:hAnsi="Times New Roman" w:cs="Times New Roman"/>
@@ -271,7 +352,16 @@
                 <w:sz w:val="24"/>
                 <w:szCs w:val="24"/>
               </w:rPr>
-              <w:t>a()</w:t>
+              <w:t>a</w:t>
+            </w:r>
+            <w:proofErr w:type="spellEnd"/>
+            <w:r>
+              <w:rPr>
+                <w:rFonts w:ascii="Times New Roman" w:hAnsi="Times New Roman" w:cs="Times New Roman"/>
+                <w:sz w:val="24"/>
+                <w:szCs w:val="24"/>
+              </w:rPr>
+              <w:t>()</w:t>
             </w:r>
             <w:bookmarkEnd w:id="0"/>
             <w:bookmarkEnd w:id="1"/>
@@ -311,8 +401,18 @@
                 <w:sz w:val="24"/>
                 <w:szCs w:val="24"/>
               </w:rPr>
-              <w:t xml:space="preserve">from NGS.BasicUtil import </w:t>
-            </w:r>
+              <w:t xml:space="preserve">from </w:t>
+            </w:r>
+            <w:proofErr w:type="spellStart"/>
+            <w:r>
+              <w:rPr>
+                <w:rFonts w:ascii="Times New Roman" w:hAnsi="Times New Roman" w:cs="Times New Roman"/>
+                <w:sz w:val="24"/>
+                <w:szCs w:val="24"/>
+              </w:rPr>
+              <w:t>NGS.BasicUtil</w:t>
+            </w:r>
+            <w:proofErr w:type="spellEnd"/>
             <w:r>
               <w:rPr>
                 <w:rFonts w:ascii="Times New Roman" w:hAnsi="Times New Roman" w:cs="Times New Roman"/>
@@ -321,6 +421,24 @@
               </w:rPr>
               <w:t xml:space="preserve"> </w:t>
             </w:r>
+            <w:proofErr w:type="gramStart"/>
+            <w:r>
+              <w:rPr>
+                <w:rFonts w:ascii="Times New Roman" w:hAnsi="Times New Roman" w:cs="Times New Roman"/>
+                <w:sz w:val="24"/>
+                <w:szCs w:val="24"/>
+              </w:rPr>
+              <w:t xml:space="preserve">import </w:t>
+            </w:r>
+            <w:r>
+              <w:rPr>
+                <w:rFonts w:ascii="Times New Roman" w:hAnsi="Times New Roman" w:cs="Times New Roman"/>
+                <w:sz w:val="24"/>
+                <w:szCs w:val="24"/>
+              </w:rPr>
+              <w:t xml:space="preserve"> </w:t>
+            </w:r>
+            <w:proofErr w:type="spellStart"/>
             <w:r>
               <w:rPr>
                 <w:rFonts w:ascii="Times New Roman" w:hAnsi="Times New Roman" w:cs="Times New Roman"/>
@@ -329,6 +447,8 @@
               </w:rPr>
               <w:t>VCFutil</w:t>
             </w:r>
+            <w:proofErr w:type="spellEnd"/>
+            <w:proofErr w:type="gramEnd"/>
           </w:p>
         </w:tc>
         <w:tc>
@@ -351,6 +471,7 @@
               </w:rPr>
               <w:t>初始化参数为</w:t>
             </w:r>
+            <w:proofErr w:type="spellStart"/>
             <w:r>
               <w:rPr>
                 <w:rFonts w:ascii="Times New Roman" w:hAnsi="Times New Roman" w:cs="Times New Roman" w:hint="eastAsia"/>
@@ -367,6 +488,7 @@
               </w:rPr>
               <w:t>cf</w:t>
             </w:r>
+            <w:proofErr w:type="spellEnd"/>
             <w:r>
               <w:rPr>
                 <w:rFonts w:ascii="Times New Roman" w:hAnsi="Times New Roman" w:cs="Times New Roman" w:hint="eastAsia"/>
@@ -397,6 +519,7 @@
               </w:rPr>
               <w:t>将</w:t>
             </w:r>
+            <w:proofErr w:type="spellStart"/>
             <w:r>
               <w:rPr>
                 <w:rFonts w:ascii="Times New Roman" w:hAnsi="Times New Roman" w:cs="Times New Roman" w:hint="eastAsia"/>
@@ -413,6 +536,7 @@
               </w:rPr>
               <w:t>cf</w:t>
             </w:r>
+            <w:proofErr w:type="spellEnd"/>
             <w:r>
               <w:rPr>
                 <w:rFonts w:ascii="Times New Roman" w:hAnsi="Times New Roman" w:cs="Times New Roman" w:hint="eastAsia"/>
@@ -421,6 +545,7 @@
               </w:rPr>
               <w:t>文件加载到内存，如果第一次加载某个</w:t>
             </w:r>
+            <w:proofErr w:type="spellStart"/>
             <w:r>
               <w:rPr>
                 <w:rFonts w:ascii="Times New Roman" w:hAnsi="Times New Roman" w:cs="Times New Roman" w:hint="eastAsia"/>
@@ -437,6 +562,7 @@
               </w:rPr>
               <w:t>cf</w:t>
             </w:r>
+            <w:proofErr w:type="spellEnd"/>
             <w:r>
               <w:rPr>
                 <w:rFonts w:ascii="Times New Roman" w:hAnsi="Times New Roman" w:cs="Times New Roman" w:hint="eastAsia"/>
@@ -445,6 +571,7 @@
               </w:rPr>
               <w:t>文件会自动简历索引文件，要求</w:t>
             </w:r>
+            <w:proofErr w:type="spellStart"/>
             <w:r>
               <w:rPr>
                 <w:rFonts w:ascii="Times New Roman" w:hAnsi="Times New Roman" w:cs="Times New Roman" w:hint="eastAsia"/>
@@ -461,6 +588,7 @@
               </w:rPr>
               <w:t>cf</w:t>
             </w:r>
+            <w:proofErr w:type="spellEnd"/>
             <w:r>
               <w:rPr>
                 <w:rFonts w:ascii="Times New Roman" w:hAnsi="Times New Roman" w:cs="Times New Roman" w:hint="eastAsia"/>
@@ -504,6 +632,7 @@
                 <w:szCs w:val="24"/>
               </w:rPr>
             </w:pPr>
+            <w:proofErr w:type="spellStart"/>
             <w:r>
               <w:rPr>
                 <w:rFonts w:ascii="Times New Roman" w:hAnsi="Times New Roman" w:cs="Times New Roman"/>
@@ -512,6 +641,7 @@
               </w:rPr>
               <w:t>getVcfListByChrom</w:t>
             </w:r>
+            <w:proofErr w:type="spellEnd"/>
           </w:p>
         </w:tc>
         <w:tc>
@@ -534,6 +664,7 @@
               </w:rPr>
               <w:t>通过</w:t>
             </w:r>
+            <w:proofErr w:type="spellStart"/>
             <w:r>
               <w:rPr>
                 <w:rFonts w:ascii="Times New Roman" w:hAnsi="Times New Roman" w:cs="Times New Roman"/>
@@ -542,6 +673,7 @@
               </w:rPr>
               <w:t>VCF_Data</w:t>
             </w:r>
+            <w:proofErr w:type="spellEnd"/>
             <w:r>
               <w:rPr>
                 <w:rFonts w:ascii="Times New Roman" w:hAnsi="Times New Roman" w:cs="Times New Roman" w:hint="eastAsia"/>
@@ -564,6 +696,7 @@
                 <w:szCs w:val="24"/>
               </w:rPr>
             </w:pPr>
+            <w:proofErr w:type="spellStart"/>
             <w:r>
               <w:rPr>
                 <w:rFonts w:ascii="Times New Roman" w:hAnsi="Times New Roman" w:cs="Times New Roman" w:hint="eastAsia"/>
@@ -580,6 +713,7 @@
               </w:rPr>
               <w:t>hrom</w:t>
             </w:r>
+            <w:proofErr w:type="spellEnd"/>
             <w:r>
               <w:rPr>
                 <w:rFonts w:ascii="Times New Roman" w:hAnsi="Times New Roman" w:cs="Times New Roman" w:hint="eastAsia"/>
@@ -602,7 +736,25 @@
                 <w:sz w:val="24"/>
                 <w:szCs w:val="24"/>
               </w:rPr>
-              <w:t>,startpos=</w:t>
+              <w:t>,</w:t>
+            </w:r>
+            <w:proofErr w:type="spellStart"/>
+            <w:r>
+              <w:rPr>
+                <w:rFonts w:ascii="Times New Roman" w:hAnsi="Times New Roman" w:cs="Times New Roman"/>
+                <w:sz w:val="24"/>
+                <w:szCs w:val="24"/>
+              </w:rPr>
+              <w:t>startpos</w:t>
+            </w:r>
+            <w:proofErr w:type="spellEnd"/>
+            <w:r>
+              <w:rPr>
+                <w:rFonts w:ascii="Times New Roman" w:hAnsi="Times New Roman" w:cs="Times New Roman"/>
+                <w:sz w:val="24"/>
+                <w:szCs w:val="24"/>
+              </w:rPr>
+              <w:t>=</w:t>
             </w:r>
             <w:r>
               <w:rPr>
@@ -634,7 +786,25 @@
                 <w:sz w:val="24"/>
                 <w:szCs w:val="24"/>
               </w:rPr>
-              <w:t>,endpos=</w:t>
+              <w:t>,</w:t>
+            </w:r>
+            <w:proofErr w:type="spellStart"/>
+            <w:r>
+              <w:rPr>
+                <w:rFonts w:ascii="Times New Roman" w:hAnsi="Times New Roman" w:cs="Times New Roman"/>
+                <w:sz w:val="24"/>
+                <w:szCs w:val="24"/>
+              </w:rPr>
+              <w:t>endpos</w:t>
+            </w:r>
+            <w:proofErr w:type="spellEnd"/>
+            <w:r>
+              <w:rPr>
+                <w:rFonts w:ascii="Times New Roman" w:hAnsi="Times New Roman" w:cs="Times New Roman"/>
+                <w:sz w:val="24"/>
+                <w:szCs w:val="24"/>
+              </w:rPr>
+              <w:t>=</w:t>
             </w:r>
             <w:r>
               <w:rPr>
@@ -682,7 +852,25 @@
                 <w:sz w:val="24"/>
                 <w:szCs w:val="24"/>
               </w:rPr>
-              <w:t>, dilutetodensity=</w:t>
+              <w:t xml:space="preserve">, </w:t>
+            </w:r>
+            <w:proofErr w:type="spellStart"/>
+            <w:r>
+              <w:rPr>
+                <w:rFonts w:ascii="Times New Roman" w:hAnsi="Times New Roman" w:cs="Times New Roman"/>
+                <w:sz w:val="24"/>
+                <w:szCs w:val="24"/>
+              </w:rPr>
+              <w:t>dilutetodensity</w:t>
+            </w:r>
+            <w:proofErr w:type="spellEnd"/>
+            <w:r>
+              <w:rPr>
+                <w:rFonts w:ascii="Times New Roman" w:hAnsi="Times New Roman" w:cs="Times New Roman"/>
+                <w:sz w:val="24"/>
+                <w:szCs w:val="24"/>
+              </w:rPr>
+              <w:t>=</w:t>
             </w:r>
             <w:r>
               <w:rPr>
@@ -754,15 +942,60 @@
                 <w:sz w:val="24"/>
                 <w:szCs w:val="24"/>
               </w:rPr>
-              <w:t>参数只有一个允许为非默认值）</w:t>
-            </w:r>
-            <w:r>
-              <w:rPr>
-                <w:rFonts w:ascii="Times New Roman" w:hAnsi="Times New Roman" w:cs="Times New Roman"/>
-                <w:sz w:val="24"/>
-                <w:szCs w:val="24"/>
-              </w:rPr>
-              <w:t>, posUniq=True, considerINDELandmultpleallele=</w:t>
+              <w:t>参数只有一个允许为非默</w:t>
+            </w:r>
+            <w:r>
+              <w:rPr>
+                <w:rFonts w:ascii="Times New Roman" w:hAnsi="Times New Roman" w:cs="Times New Roman" w:hint="eastAsia"/>
+                <w:sz w:val="24"/>
+                <w:szCs w:val="24"/>
+              </w:rPr>
+              <w:lastRenderedPageBreak/>
+              <w:t>认值）</w:t>
+            </w:r>
+            <w:r>
+              <w:rPr>
+                <w:rFonts w:ascii="Times New Roman" w:hAnsi="Times New Roman" w:cs="Times New Roman"/>
+                <w:sz w:val="24"/>
+                <w:szCs w:val="24"/>
+              </w:rPr>
+              <w:t xml:space="preserve">, </w:t>
+            </w:r>
+            <w:proofErr w:type="spellStart"/>
+            <w:r>
+              <w:rPr>
+                <w:rFonts w:ascii="Times New Roman" w:hAnsi="Times New Roman" w:cs="Times New Roman"/>
+                <w:sz w:val="24"/>
+                <w:szCs w:val="24"/>
+              </w:rPr>
+              <w:t>posUniq</w:t>
+            </w:r>
+            <w:proofErr w:type="spellEnd"/>
+            <w:r>
+              <w:rPr>
+                <w:rFonts w:ascii="Times New Roman" w:hAnsi="Times New Roman" w:cs="Times New Roman"/>
+                <w:sz w:val="24"/>
+                <w:szCs w:val="24"/>
+              </w:rPr>
+              <w:t xml:space="preserve">=True, </w:t>
+            </w:r>
+            <w:proofErr w:type="spellStart"/>
+            <w:r>
+              <w:rPr>
+                <w:rFonts w:ascii="Times New Roman" w:hAnsi="Times New Roman" w:cs="Times New Roman"/>
+                <w:sz w:val="24"/>
+                <w:szCs w:val="24"/>
+              </w:rPr>
+              <w:t>considerINDELandmultpleallele</w:t>
+            </w:r>
+            <w:proofErr w:type="spellEnd"/>
+            <w:r>
+              <w:rPr>
+                <w:rFonts w:ascii="Times New Roman" w:hAnsi="Times New Roman" w:cs="Times New Roman"/>
+                <w:sz w:val="24"/>
+                <w:szCs w:val="24"/>
+              </w:rPr>
+              <w:t>=</w:t>
             </w:r>
             <w:r>
               <w:rPr>
@@ -802,7 +1035,25 @@
                 <w:sz w:val="24"/>
                 <w:szCs w:val="24"/>
               </w:rPr>
-              <w:t>,MQfilter=</w:t>
+              <w:t>,</w:t>
+            </w:r>
+            <w:proofErr w:type="spellStart"/>
+            <w:r>
+              <w:rPr>
+                <w:rFonts w:ascii="Times New Roman" w:hAnsi="Times New Roman" w:cs="Times New Roman"/>
+                <w:sz w:val="24"/>
+                <w:szCs w:val="24"/>
+              </w:rPr>
+              <w:t>MQfilter</w:t>
+            </w:r>
+            <w:proofErr w:type="spellEnd"/>
+            <w:r>
+              <w:rPr>
+                <w:rFonts w:ascii="Times New Roman" w:hAnsi="Times New Roman" w:cs="Times New Roman"/>
+                <w:sz w:val="24"/>
+                <w:szCs w:val="24"/>
+              </w:rPr>
+              <w:t>=</w:t>
             </w:r>
             <w:r>
               <w:rPr>
@@ -840,8 +1091,10 @@
                 <w:sz w:val="24"/>
                 <w:szCs w:val="24"/>
               </w:rPr>
+              <w:lastRenderedPageBreak/>
               <w:t>返回该</w:t>
             </w:r>
+            <w:proofErr w:type="spellStart"/>
             <w:r>
               <w:rPr>
                 <w:rFonts w:ascii="Times New Roman" w:hAnsi="Times New Roman" w:cs="Times New Roman" w:hint="eastAsia"/>
@@ -858,14 +1111,34 @@
               </w:rPr>
               <w:t>cf</w:t>
             </w:r>
-            <w:r>
-              <w:rPr>
-                <w:rFonts w:ascii="Times New Roman" w:hAnsi="Times New Roman" w:cs="Times New Roman" w:hint="eastAsia"/>
-                <w:sz w:val="24"/>
-                <w:szCs w:val="24"/>
-              </w:rPr>
-              <w:t>文件的的某一条染色体的全部记录或某一区段的记录，返回值为列表，元素为</w:t>
-            </w:r>
+            <w:proofErr w:type="spellEnd"/>
+            <w:r>
+              <w:rPr>
+                <w:rFonts w:ascii="Times New Roman" w:hAnsi="Times New Roman" w:cs="Times New Roman" w:hint="eastAsia"/>
+                <w:sz w:val="24"/>
+                <w:szCs w:val="24"/>
+              </w:rPr>
+              <w:t>文件的</w:t>
+            </w:r>
+            <w:proofErr w:type="gramStart"/>
+            <w:r>
+              <w:rPr>
+                <w:rFonts w:ascii="Times New Roman" w:hAnsi="Times New Roman" w:cs="Times New Roman" w:hint="eastAsia"/>
+                <w:sz w:val="24"/>
+                <w:szCs w:val="24"/>
+              </w:rPr>
+              <w:t>的</w:t>
+            </w:r>
+            <w:proofErr w:type="gramEnd"/>
+            <w:r>
+              <w:rPr>
+                <w:rFonts w:ascii="Times New Roman" w:hAnsi="Times New Roman" w:cs="Times New Roman" w:hint="eastAsia"/>
+                <w:sz w:val="24"/>
+                <w:szCs w:val="24"/>
+              </w:rPr>
+              <w:t>某一条染色体的全部记录或某一区段的记录，返回值为列表，元素为</w:t>
+            </w:r>
+            <w:proofErr w:type="spellStart"/>
             <w:r>
               <w:rPr>
                 <w:rFonts w:ascii="Times New Roman" w:hAnsi="Times New Roman" w:cs="Times New Roman" w:hint="eastAsia"/>
@@ -882,6 +1155,7 @@
               </w:rPr>
               <w:t>cf</w:t>
             </w:r>
+            <w:proofErr w:type="spellEnd"/>
             <w:r>
               <w:rPr>
                 <w:rFonts w:ascii="Times New Roman" w:hAnsi="Times New Roman" w:cs="Times New Roman" w:hint="eastAsia"/>
@@ -915,7 +1189,6 @@
                 <w:sz w:val="24"/>
                 <w:szCs w:val="24"/>
               </w:rPr>
-              <w:lastRenderedPageBreak/>
               <w:t>Window</w:t>
             </w:r>
             <w:r>
@@ -954,7 +1227,25 @@
                 <w:sz w:val="24"/>
                 <w:szCs w:val="24"/>
               </w:rPr>
-              <w:t>from NGS.BasicUtil import</w:t>
+              <w:t xml:space="preserve">from </w:t>
+            </w:r>
+            <w:proofErr w:type="spellStart"/>
+            <w:r>
+              <w:rPr>
+                <w:rFonts w:ascii="Times New Roman" w:hAnsi="Times New Roman" w:cs="Times New Roman"/>
+                <w:sz w:val="24"/>
+                <w:szCs w:val="24"/>
+              </w:rPr>
+              <w:t>NGS.BasicUtil</w:t>
+            </w:r>
+            <w:proofErr w:type="spellEnd"/>
+            <w:r>
+              <w:rPr>
+                <w:rFonts w:ascii="Times New Roman" w:hAnsi="Times New Roman" w:cs="Times New Roman"/>
+                <w:sz w:val="24"/>
+                <w:szCs w:val="24"/>
+              </w:rPr>
+              <w:t xml:space="preserve"> import</w:t>
             </w:r>
             <w:r>
               <w:rPr>
@@ -1014,8 +1305,18 @@
                 <w:sz w:val="24"/>
                 <w:szCs w:val="24"/>
               </w:rPr>
-              <w:t>该实例化对象可以用来调用相关函数进行滑窗操作</w:t>
-            </w:r>
+              <w:t>该实例化对象可以用来调用相关函数进行</w:t>
+            </w:r>
+            <w:proofErr w:type="gramStart"/>
+            <w:r>
+              <w:rPr>
+                <w:rFonts w:ascii="Times New Roman" w:hAnsi="Times New Roman" w:cs="Times New Roman" w:hint="eastAsia"/>
+                <w:sz w:val="24"/>
+                <w:szCs w:val="24"/>
+              </w:rPr>
+              <w:t>滑窗操作</w:t>
+            </w:r>
+            <w:proofErr w:type="gramEnd"/>
           </w:p>
         </w:tc>
       </w:tr>
@@ -1035,6 +1336,7 @@
                 <w:szCs w:val="24"/>
               </w:rPr>
             </w:pPr>
+            <w:proofErr w:type="spellStart"/>
             <w:r>
               <w:rPr>
                 <w:rFonts w:ascii="Times New Roman" w:hAnsi="Times New Roman" w:cs="Times New Roman"/>
@@ -1043,6 +1345,7 @@
               </w:rPr>
               <w:t>slidWindowOverlap</w:t>
             </w:r>
+            <w:proofErr w:type="spellEnd"/>
           </w:p>
         </w:tc>
         <w:tc>
@@ -1127,6 +1430,7 @@
               </w:rPr>
               <w:t>顺序排列的列表（如：</w:t>
             </w:r>
+            <w:proofErr w:type="spellStart"/>
             <w:r>
               <w:rPr>
                 <w:rFonts w:ascii="Times New Roman" w:hAnsi="Times New Roman" w:cs="Times New Roman"/>
@@ -1135,6 +1439,7 @@
               </w:rPr>
               <w:t>getVcfListByChrom</w:t>
             </w:r>
+            <w:proofErr w:type="spellEnd"/>
             <w:r>
               <w:rPr>
                 <w:rFonts w:ascii="Times New Roman" w:hAnsi="Times New Roman" w:cs="Times New Roman" w:hint="eastAsia"/>
@@ -1149,8 +1454,18 @@
                 <w:sz w:val="24"/>
                 <w:szCs w:val="24"/>
               </w:rPr>
-              <w:t>, L_End_Pos</w:t>
-            </w:r>
+              <w:t xml:space="preserve">, </w:t>
+            </w:r>
+            <w:proofErr w:type="spellStart"/>
+            <w:r>
+              <w:rPr>
+                <w:rFonts w:ascii="Times New Roman" w:hAnsi="Times New Roman" w:cs="Times New Roman"/>
+                <w:sz w:val="24"/>
+                <w:szCs w:val="24"/>
+              </w:rPr>
+              <w:t>L_End_Pos</w:t>
+            </w:r>
+            <w:proofErr w:type="spellEnd"/>
             <w:r>
               <w:rPr>
                 <w:rFonts w:ascii="Times New Roman" w:hAnsi="Times New Roman" w:cs="Times New Roman" w:hint="eastAsia"/>
@@ -1173,8 +1488,18 @@
                 <w:sz w:val="24"/>
                 <w:szCs w:val="24"/>
               </w:rPr>
-              <w:t>, windowWidth</w:t>
-            </w:r>
+              <w:t xml:space="preserve">, </w:t>
+            </w:r>
+            <w:proofErr w:type="spellStart"/>
+            <w:r>
+              <w:rPr>
+                <w:rFonts w:ascii="Times New Roman" w:hAnsi="Times New Roman" w:cs="Times New Roman"/>
+                <w:sz w:val="24"/>
+                <w:szCs w:val="24"/>
+              </w:rPr>
+              <w:t>windowWidth</w:t>
+            </w:r>
+            <w:proofErr w:type="spellEnd"/>
             <w:r>
               <w:rPr>
                 <w:rFonts w:ascii="Times New Roman" w:hAnsi="Times New Roman" w:cs="Times New Roman" w:hint="eastAsia"/>
@@ -1197,8 +1522,18 @@
                 <w:sz w:val="24"/>
                 <w:szCs w:val="24"/>
               </w:rPr>
-              <w:t>, slideSize</w:t>
-            </w:r>
+              <w:t xml:space="preserve">, </w:t>
+            </w:r>
+            <w:proofErr w:type="spellStart"/>
+            <w:r>
+              <w:rPr>
+                <w:rFonts w:ascii="Times New Roman" w:hAnsi="Times New Roman" w:cs="Times New Roman"/>
+                <w:sz w:val="24"/>
+                <w:szCs w:val="24"/>
+              </w:rPr>
+              <w:t>slideSize</w:t>
+            </w:r>
+            <w:proofErr w:type="spellEnd"/>
             <w:r>
               <w:rPr>
                 <w:rFonts w:ascii="Times New Roman" w:hAnsi="Times New Roman" w:cs="Times New Roman" w:hint="eastAsia"/>
@@ -1221,8 +1556,18 @@
                 <w:sz w:val="24"/>
                 <w:szCs w:val="24"/>
               </w:rPr>
-              <w:t>, Caculator</w:t>
-            </w:r>
+              <w:t xml:space="preserve">, </w:t>
+            </w:r>
+            <w:proofErr w:type="spellStart"/>
+            <w:r>
+              <w:rPr>
+                <w:rFonts w:ascii="Times New Roman" w:hAnsi="Times New Roman" w:cs="Times New Roman"/>
+                <w:sz w:val="24"/>
+                <w:szCs w:val="24"/>
+              </w:rPr>
+              <w:t>Caculator</w:t>
+            </w:r>
+            <w:proofErr w:type="spellEnd"/>
             <w:r>
               <w:rPr>
                 <w:rFonts w:ascii="Times New Roman" w:hAnsi="Times New Roman" w:cs="Times New Roman" w:hint="eastAsia"/>
@@ -1245,7 +1590,25 @@
                 <w:sz w:val="24"/>
                 <w:szCs w:val="24"/>
               </w:rPr>
-              <w:t>,L_Start_Pos=</w:t>
+              <w:t>,</w:t>
+            </w:r>
+            <w:proofErr w:type="spellStart"/>
+            <w:r>
+              <w:rPr>
+                <w:rFonts w:ascii="Times New Roman" w:hAnsi="Times New Roman" w:cs="Times New Roman"/>
+                <w:sz w:val="24"/>
+                <w:szCs w:val="24"/>
+              </w:rPr>
+              <w:t>L_Start_Pos</w:t>
+            </w:r>
+            <w:proofErr w:type="spellEnd"/>
+            <w:r>
+              <w:rPr>
+                <w:rFonts w:ascii="Times New Roman" w:hAnsi="Times New Roman" w:cs="Times New Roman"/>
+                <w:sz w:val="24"/>
+                <w:szCs w:val="24"/>
+              </w:rPr>
+              <w:t>=</w:t>
             </w:r>
             <w:r>
               <w:rPr>
@@ -1333,6 +1696,7 @@
               </w:rPr>
               <w:t>按照参数指定方式滑窗，计算每个窗口的值，计算方法有</w:t>
             </w:r>
+            <w:proofErr w:type="spellStart"/>
             <w:r>
               <w:rPr>
                 <w:rFonts w:ascii="Times New Roman" w:hAnsi="Times New Roman" w:cs="Times New Roman" w:hint="eastAsia"/>
@@ -1349,6 +1713,7 @@
               </w:rPr>
               <w:t>ulator</w:t>
             </w:r>
+            <w:proofErr w:type="spellEnd"/>
             <w:r>
               <w:rPr>
                 <w:rFonts w:ascii="Times New Roman" w:hAnsi="Times New Roman" w:cs="Times New Roman" w:hint="eastAsia"/>
@@ -1416,6 +1781,7 @@
                 <w:szCs w:val="24"/>
               </w:rPr>
             </w:pPr>
+            <w:proofErr w:type="spellStart"/>
             <w:r>
               <w:rPr>
                 <w:rFonts w:ascii="Times New Roman" w:hAnsi="Times New Roman" w:cs="Times New Roman"/>
@@ -1424,6 +1790,7 @@
               </w:rPr>
               <w:t>CaculatorToFindTAGs</w:t>
             </w:r>
+            <w:proofErr w:type="spellEnd"/>
             <w:r>
               <w:rPr>
                 <w:rFonts w:ascii="Times New Roman" w:hAnsi="Times New Roman" w:cs="Times New Roman"/>
@@ -1670,15 +2037,16 @@
           <w:szCs w:val="24"/>
         </w:rPr>
       </w:pPr>
-      <w:r>
-        <w:rPr>
-          <w:rFonts w:ascii="Times New Roman" w:eastAsia="宋体" w:hAnsi="Times New Roman" w:cs="Times New Roman"/>
-          <w:sz w:val="24"/>
-          <w:szCs w:val="24"/>
-        </w:rPr>
-        <w:lastRenderedPageBreak/>
+      <w:proofErr w:type="spellStart"/>
+      <w:r>
+        <w:rPr>
+          <w:rFonts w:ascii="Times New Roman" w:eastAsia="宋体" w:hAnsi="Times New Roman" w:cs="Times New Roman"/>
+          <w:sz w:val="24"/>
+          <w:szCs w:val="24"/>
+        </w:rPr>
         <w:t>alinmultPopSnpPos</w:t>
       </w:r>
+      <w:proofErr w:type="spellEnd"/>
       <w:r>
         <w:rPr>
           <w:rFonts w:ascii="Times New Roman" w:eastAsia="宋体" w:hAnsi="Times New Roman" w:cs="Times New Roman"/>
@@ -1765,13 +2133,23 @@
         </w:rPr>
         <w:t>参数：</w:t>
       </w:r>
-      <w:r>
-        <w:rPr>
-          <w:rFonts w:ascii="Times New Roman" w:eastAsia="宋体" w:hAnsi="Times New Roman" w:cs="Times New Roman"/>
-          <w:sz w:val="24"/>
-          <w:szCs w:val="24"/>
-        </w:rPr>
-        <w:t>vcfMaplist=</w:t>
+      <w:proofErr w:type="spellStart"/>
+      <w:r>
+        <w:rPr>
+          <w:rFonts w:ascii="Times New Roman" w:eastAsia="宋体" w:hAnsi="Times New Roman" w:cs="Times New Roman"/>
+          <w:sz w:val="24"/>
+          <w:szCs w:val="24"/>
+        </w:rPr>
+        <w:t>vcfMaplist</w:t>
+      </w:r>
+      <w:proofErr w:type="spellEnd"/>
+      <w:r>
+        <w:rPr>
+          <w:rFonts w:ascii="Times New Roman" w:eastAsia="宋体" w:hAnsi="Times New Roman" w:cs="Times New Roman"/>
+          <w:sz w:val="24"/>
+          <w:szCs w:val="24"/>
+        </w:rPr>
+        <w:t>=</w:t>
       </w:r>
       <w:r>
         <w:rPr>
@@ -1805,13 +2183,23 @@
         </w:rPr>
         <w:t>数据，</w:t>
       </w:r>
-      <w:r>
-        <w:rPr>
-          <w:rFonts w:ascii="Times New Roman" w:eastAsia="宋体" w:hAnsi="Times New Roman" w:cs="Times New Roman"/>
-          <w:sz w:val="24"/>
-          <w:szCs w:val="24"/>
-        </w:rPr>
-        <w:t>jointmode=</w:t>
+      <w:proofErr w:type="spellStart"/>
+      <w:r>
+        <w:rPr>
+          <w:rFonts w:ascii="Times New Roman" w:eastAsia="宋体" w:hAnsi="Times New Roman" w:cs="Times New Roman"/>
+          <w:sz w:val="24"/>
+          <w:szCs w:val="24"/>
+        </w:rPr>
+        <w:t>jointmode</w:t>
+      </w:r>
+      <w:proofErr w:type="spellEnd"/>
+      <w:r>
+        <w:rPr>
+          <w:rFonts w:ascii="Times New Roman" w:eastAsia="宋体" w:hAnsi="Times New Roman" w:cs="Times New Roman"/>
+          <w:sz w:val="24"/>
+          <w:szCs w:val="24"/>
+        </w:rPr>
+        <w:t>=</w:t>
       </w:r>
       <w:r>
         <w:rPr>
@@ -1827,7 +2215,25 @@
           <w:sz w:val="24"/>
           <w:szCs w:val="24"/>
         </w:rPr>
-        <w:t>“o”/“i”</w:t>
+        <w:t>“o”/“</w:t>
+      </w:r>
+      <w:proofErr w:type="spellStart"/>
+      <w:r>
+        <w:rPr>
+          <w:rFonts w:ascii="Times New Roman" w:eastAsia="宋体" w:hAnsi="Times New Roman" w:cs="Times New Roman"/>
+          <w:sz w:val="24"/>
+          <w:szCs w:val="24"/>
+        </w:rPr>
+        <w:t>i</w:t>
+      </w:r>
+      <w:proofErr w:type="spellEnd"/>
+      <w:r>
+        <w:rPr>
+          <w:rFonts w:ascii="Times New Roman" w:eastAsia="宋体" w:hAnsi="Times New Roman" w:cs="Times New Roman"/>
+          <w:sz w:val="24"/>
+          <w:szCs w:val="24"/>
+        </w:rPr>
+        <w:t>”</w:t>
       </w:r>
       <w:r>
         <w:rPr>
@@ -1917,7 +2323,25 @@
           <w:sz w:val="24"/>
           <w:szCs w:val="24"/>
         </w:rPr>
-        <w:t>vcffile1,vcffle2,vcffile3…</w:t>
+        <w:t>vcffile</w:t>
+      </w:r>
+      <w:proofErr w:type="gramStart"/>
+      <w:r>
+        <w:rPr>
+          <w:rFonts w:ascii="Times New Roman" w:eastAsia="宋体" w:hAnsi="Times New Roman" w:cs="Times New Roman"/>
+          <w:sz w:val="24"/>
+          <w:szCs w:val="24"/>
+        </w:rPr>
+        <w:t>1,vcffle</w:t>
+      </w:r>
+      <w:proofErr w:type="gramEnd"/>
+      <w:r>
+        <w:rPr>
+          <w:rFonts w:ascii="Times New Roman" w:eastAsia="宋体" w:hAnsi="Times New Roman" w:cs="Times New Roman"/>
+          <w:sz w:val="24"/>
+          <w:szCs w:val="24"/>
+        </w:rPr>
+        <w:t>2,vcffile3…</w:t>
       </w:r>
       <w:r>
         <w:rPr>
@@ -2000,7 +2424,25 @@
           <w:sz w:val="24"/>
           <w:szCs w:val="24"/>
         </w:rPr>
-        <w:t>[chrNo:[</w:t>
+        <w:t>[</w:t>
+      </w:r>
+      <w:proofErr w:type="spellStart"/>
+      <w:r>
+        <w:rPr>
+          <w:rFonts w:ascii="Times New Roman" w:eastAsia="宋体" w:hAnsi="Times New Roman" w:cs="Times New Roman"/>
+          <w:sz w:val="24"/>
+          <w:szCs w:val="24"/>
+        </w:rPr>
+        <w:t>chrNo</w:t>
+      </w:r>
+      <w:proofErr w:type="spellEnd"/>
+      <w:r>
+        <w:rPr>
+          <w:rFonts w:ascii="Times New Roman" w:eastAsia="宋体" w:hAnsi="Times New Roman" w:cs="Times New Roman"/>
+          <w:sz w:val="24"/>
+          <w:szCs w:val="24"/>
+        </w:rPr>
+        <w:t>:[</w:t>
       </w:r>
       <w:r>
         <w:rPr>
@@ -2018,6 +2460,7 @@
         </w:rPr>
         <w:t>中</w:t>
       </w:r>
+      <w:proofErr w:type="spellStart"/>
       <w:r>
         <w:rPr>
           <w:rFonts w:ascii="Times New Roman" w:eastAsia="宋体" w:hAnsi="Times New Roman" w:cs="Times New Roman"/>
@@ -2026,6 +2469,7 @@
         </w:rPr>
         <w:t>chrNo</w:t>
       </w:r>
+      <w:proofErr w:type="spellEnd"/>
       <w:r>
         <w:rPr>
           <w:rFonts w:ascii="Times New Roman" w:eastAsia="宋体" w:hAnsi="Times New Roman" w:cs="Times New Roman"/>
@@ -2040,7 +2484,25 @@
           <w:sz w:val="24"/>
           <w:szCs w:val="24"/>
         </w:rPr>
-        <w:t>],{chrNo:[</w:t>
+        <w:t>],{</w:t>
+      </w:r>
+      <w:proofErr w:type="spellStart"/>
+      <w:r>
+        <w:rPr>
+          <w:rFonts w:ascii="Times New Roman" w:eastAsia="宋体" w:hAnsi="Times New Roman" w:cs="Times New Roman"/>
+          <w:sz w:val="24"/>
+          <w:szCs w:val="24"/>
+        </w:rPr>
+        <w:t>chrNo</w:t>
+      </w:r>
+      <w:proofErr w:type="spellEnd"/>
+      <w:r>
+        <w:rPr>
+          <w:rFonts w:ascii="Times New Roman" w:eastAsia="宋体" w:hAnsi="Times New Roman" w:cs="Times New Roman"/>
+          <w:sz w:val="24"/>
+          <w:szCs w:val="24"/>
+        </w:rPr>
+        <w:t>:[</w:t>
       </w:r>
       <w:r>
         <w:rPr>
@@ -2058,6 +2520,7 @@
         </w:rPr>
         <w:t>中</w:t>
       </w:r>
+      <w:proofErr w:type="spellStart"/>
       <w:r>
         <w:rPr>
           <w:rFonts w:ascii="Times New Roman" w:eastAsia="宋体" w:hAnsi="Times New Roman" w:cs="Times New Roman"/>
@@ -2066,6 +2529,7 @@
         </w:rPr>
         <w:t>chrNo</w:t>
       </w:r>
+      <w:proofErr w:type="spellEnd"/>
       <w:r>
         <w:rPr>
           <w:rFonts w:ascii="Times New Roman" w:eastAsia="宋体" w:hAnsi="Times New Roman" w:cs="Times New Roman"/>
@@ -2106,6 +2570,7 @@
         </w:rPr>
         <w:t>文件的对应</w:t>
       </w:r>
+      <w:proofErr w:type="spellStart"/>
       <w:r>
         <w:rPr>
           <w:rFonts w:ascii="Times New Roman" w:eastAsia="宋体" w:hAnsi="Times New Roman" w:cs="Times New Roman"/>
@@ -2114,6 +2579,7 @@
         </w:rPr>
         <w:t>chrNo</w:t>
       </w:r>
+      <w:proofErr w:type="spellEnd"/>
       <w:r>
         <w:rPr>
           <w:rFonts w:ascii="Times New Roman" w:eastAsia="宋体" w:hAnsi="Times New Roman" w:cs="Times New Roman"/>
@@ -2130,13 +2596,23 @@
         </w:rPr>
         <w:t>的</w:t>
       </w:r>
-      <w:r>
-        <w:rPr>
-          <w:rFonts w:ascii="Times New Roman" w:eastAsia="宋体" w:hAnsi="Times New Roman" w:cs="Times New Roman"/>
-          <w:sz w:val="24"/>
-          <w:szCs w:val="24"/>
-        </w:rPr>
-        <w:t>VCF_Data()</w:t>
+      <w:proofErr w:type="spellStart"/>
+      <w:r>
+        <w:rPr>
+          <w:rFonts w:ascii="Times New Roman" w:eastAsia="宋体" w:hAnsi="Times New Roman" w:cs="Times New Roman"/>
+          <w:sz w:val="24"/>
+          <w:szCs w:val="24"/>
+        </w:rPr>
+        <w:t>VCF_Data</w:t>
+      </w:r>
+      <w:proofErr w:type="spellEnd"/>
+      <w:r>
+        <w:rPr>
+          <w:rFonts w:ascii="Times New Roman" w:eastAsia="宋体" w:hAnsi="Times New Roman" w:cs="Times New Roman"/>
+          <w:sz w:val="24"/>
+          <w:szCs w:val="24"/>
+        </w:rPr>
+        <w:t>()</w:t>
       </w:r>
       <w:r>
         <w:rPr>
@@ -2146,6 +2622,7 @@
         </w:rPr>
         <w:t>类的</w:t>
       </w:r>
+      <w:proofErr w:type="spellStart"/>
       <w:r>
         <w:rPr>
           <w:rFonts w:ascii="Times New Roman" w:eastAsia="宋体" w:hAnsi="Times New Roman" w:cs="Times New Roman"/>
@@ -2154,6 +2631,7 @@
         </w:rPr>
         <w:t>getVcfListByChrom</w:t>
       </w:r>
+      <w:proofErr w:type="spellEnd"/>
       <w:r>
         <w:rPr>
           <w:rFonts w:ascii="Times New Roman" w:eastAsia="宋体" w:hAnsi="Times New Roman" w:cs="Times New Roman"/>
@@ -2187,7 +2665,25 @@
           <w:sz w:val="24"/>
           <w:szCs w:val="24"/>
         </w:rPr>
-        <w:t xml:space="preserve">[chrNo:[(pos,REF,ALT,INFO,FORMAT,sample,...),(pos,REF,ALT,INFO,FORMAT,sample,...),,,,,],{chrNo:[]},,,,,,] </w:t>
+        <w:t>[</w:t>
+      </w:r>
+      <w:proofErr w:type="gramStart"/>
+      <w:r>
+        <w:rPr>
+          <w:rFonts w:ascii="Times New Roman" w:eastAsia="宋体" w:hAnsi="Times New Roman" w:cs="Times New Roman"/>
+          <w:sz w:val="24"/>
+          <w:szCs w:val="24"/>
+        </w:rPr>
+        <w:t>chrNo:[</w:t>
+      </w:r>
+      <w:proofErr w:type="gramEnd"/>
+      <w:r>
+        <w:rPr>
+          <w:rFonts w:ascii="Times New Roman" w:eastAsia="宋体" w:hAnsi="Times New Roman" w:cs="Times New Roman"/>
+          <w:sz w:val="24"/>
+          <w:szCs w:val="24"/>
+        </w:rPr>
+        <w:t xml:space="preserve">(pos,REF,ALT,INFO,FORMAT,sample,...),(pos,REF,ALT,INFO,FORMAT,sample,...),,,,,],{chrNo:[]},,,,,,] </w:t>
       </w:r>
       <w:r>
         <w:rPr>
@@ -2397,7 +2893,25 @@
           <w:szCs w:val="24"/>
         </w:rPr>
         <w:tab/>
-        <w:t xml:space="preserve">  [pos2,REF,ALT,(              ), </w:t>
+        <w:t xml:space="preserve">  [pos</w:t>
+      </w:r>
+      <w:proofErr w:type="gramStart"/>
+      <w:r>
+        <w:rPr>
+          <w:rFonts w:ascii="Times New Roman" w:eastAsia="宋体" w:hAnsi="Times New Roman" w:cs="Times New Roman"/>
+          <w:sz w:val="24"/>
+          <w:szCs w:val="24"/>
+        </w:rPr>
+        <w:t>2,REF</w:t>
+      </w:r>
+      <w:proofErr w:type="gramEnd"/>
+      <w:r>
+        <w:rPr>
+          <w:rFonts w:ascii="Times New Roman" w:eastAsia="宋体" w:hAnsi="Times New Roman" w:cs="Times New Roman"/>
+          <w:sz w:val="24"/>
+          <w:szCs w:val="24"/>
+        </w:rPr>
+        <w:t xml:space="preserve">,ALT,(              ), </w:t>
       </w:r>
       <w:r>
         <w:rPr>
@@ -2533,6 +3047,7 @@
         </w:rPr>
         <w:t>外连接方式合并，若某</w:t>
       </w:r>
+      <w:proofErr w:type="spellStart"/>
       <w:r>
         <w:rPr>
           <w:rFonts w:ascii="Times New Roman" w:eastAsia="宋体" w:hAnsi="Times New Roman" w:cs="Times New Roman" w:hint="eastAsia"/>
@@ -2549,6 +3064,7 @@
         </w:rPr>
         <w:t>cf</w:t>
       </w:r>
+      <w:proofErr w:type="spellEnd"/>
       <w:r>
         <w:rPr>
           <w:rFonts w:ascii="Times New Roman" w:eastAsia="宋体" w:hAnsi="Times New Roman" w:cs="Times New Roman" w:hint="eastAsia"/>
@@ -2605,6 +3121,7 @@
         </w:rPr>
         <w:t>。</w:t>
       </w:r>
+      <w:proofErr w:type="gramStart"/>
       <w:r>
         <w:rPr>
           <w:rFonts w:ascii="Times New Roman" w:eastAsia="宋体" w:hAnsi="Times New Roman" w:cs="Times New Roman" w:hint="eastAsia"/>
@@ -2621,6 +3138,8 @@
         </w:rPr>
         <w:t>各</w:t>
       </w:r>
+      <w:proofErr w:type="spellStart"/>
+      <w:proofErr w:type="gramEnd"/>
       <w:r>
         <w:rPr>
           <w:rFonts w:ascii="Times New Roman" w:eastAsia="宋体" w:hAnsi="Times New Roman" w:cs="Times New Roman" w:hint="eastAsia"/>
@@ -2637,6 +3156,7 @@
         </w:rPr>
         <w:t>cffile</w:t>
       </w:r>
+      <w:proofErr w:type="spellEnd"/>
       <w:r>
         <w:rPr>
           <w:rFonts w:ascii="Times New Roman" w:eastAsia="宋体" w:hAnsi="Times New Roman" w:cs="Times New Roman" w:hint="eastAsia"/>
@@ -2710,6 +3230,7 @@
           <w:szCs w:val="21"/>
         </w:rPr>
       </w:pPr>
+      <w:proofErr w:type="spellStart"/>
       <w:r>
         <w:rPr>
           <w:rFonts w:ascii="Consolas" w:hAnsi="Consolas" w:cs="Consolas" w:hint="eastAsia"/>
@@ -2721,6 +3242,7 @@
         <w:lastRenderedPageBreak/>
         <w:t>vcf</w:t>
       </w:r>
+      <w:proofErr w:type="spellEnd"/>
       <w:r>
         <w:rPr>
           <w:rFonts w:ascii="Consolas" w:hAnsi="Consolas" w:cs="Consolas" w:hint="eastAsia"/>
@@ -2731,6 +3253,7 @@
         </w:rPr>
         <w:t>数据表标准为：五列必须列，分别为</w:t>
       </w:r>
+      <w:proofErr w:type="spellStart"/>
       <w:r>
         <w:rPr>
           <w:rFonts w:ascii="Consolas" w:hAnsi="Consolas" w:cs="Consolas" w:hint="eastAsia"/>
@@ -2741,6 +3264,7 @@
         </w:rPr>
         <w:t>chrID</w:t>
       </w:r>
+      <w:proofErr w:type="spellEnd"/>
       <w:r>
         <w:rPr>
           <w:rFonts w:ascii="Consolas" w:hAnsi="Consolas" w:cs="Consolas" w:hint="eastAsia"/>
@@ -2751,6 +3275,7 @@
         </w:rPr>
         <w:t>，</w:t>
       </w:r>
+      <w:proofErr w:type="spellStart"/>
       <w:r>
         <w:rPr>
           <w:rFonts w:ascii="Consolas" w:hAnsi="Consolas" w:cs="Consolas" w:hint="eastAsia"/>
@@ -2761,6 +3286,7 @@
         </w:rPr>
         <w:t>snp_pos,snpID,ref_base,alt_base</w:t>
       </w:r>
+      <w:proofErr w:type="spellEnd"/>
       <w:r>
         <w:rPr>
           <w:rFonts w:ascii="Consolas" w:hAnsi="Consolas" w:cs="Consolas" w:hint="eastAsia"/>
@@ -2780,6 +3306,7 @@
           <w:szCs w:val="21"/>
         </w:rPr>
       </w:pPr>
+      <w:proofErr w:type="spellStart"/>
       <w:r>
         <w:rPr>
           <w:rFonts w:ascii="Consolas" w:hAnsi="Consolas" w:cs="Consolas" w:hint="eastAsia"/>
@@ -2788,8 +3315,9 @@
           <w:kern w:val="0"/>
           <w:szCs w:val="21"/>
         </w:rPr>
-        <w:t>toplevel vcf</w:t>
-      </w:r>
+        <w:t>toplevel</w:t>
+      </w:r>
+      <w:proofErr w:type="spellEnd"/>
       <w:r>
         <w:rPr>
           <w:rFonts w:ascii="Consolas" w:hAnsi="Consolas" w:cs="Consolas" w:hint="eastAsia"/>
@@ -2798,8 +3326,31 @@
           <w:kern w:val="0"/>
           <w:szCs w:val="21"/>
         </w:rPr>
+        <w:t xml:space="preserve"> </w:t>
+      </w:r>
+      <w:proofErr w:type="spellStart"/>
+      <w:r>
+        <w:rPr>
+          <w:rFonts w:ascii="Consolas" w:hAnsi="Consolas" w:cs="Consolas" w:hint="eastAsia"/>
+          <w:bCs/>
+          <w:color w:val="000000"/>
+          <w:kern w:val="0"/>
+          <w:szCs w:val="21"/>
+        </w:rPr>
+        <w:t>vcf</w:t>
+      </w:r>
+      <w:proofErr w:type="spellEnd"/>
+      <w:r>
+        <w:rPr>
+          <w:rFonts w:ascii="Consolas" w:hAnsi="Consolas" w:cs="Consolas" w:hint="eastAsia"/>
+          <w:bCs/>
+          <w:color w:val="000000"/>
+          <w:kern w:val="0"/>
+          <w:szCs w:val="21"/>
+        </w:rPr>
         <w:t>数据表为</w:t>
       </w:r>
+      <w:proofErr w:type="spellStart"/>
       <w:r>
         <w:rPr>
           <w:rFonts w:ascii="Consolas" w:hAnsi="Consolas" w:cs="Consolas" w:hint="eastAsia"/>
@@ -2810,6 +3361,7 @@
         </w:rPr>
         <w:t>chrID</w:t>
       </w:r>
+      <w:proofErr w:type="spellEnd"/>
       <w:r>
         <w:rPr>
           <w:rFonts w:ascii="Consolas" w:hAnsi="Consolas" w:cs="Consolas" w:hint="eastAsia"/>
@@ -2820,6 +3372,7 @@
         </w:rPr>
         <w:t>，</w:t>
       </w:r>
+      <w:proofErr w:type="spellStart"/>
       <w:r>
         <w:rPr>
           <w:rFonts w:ascii="Consolas" w:hAnsi="Consolas" w:cs="Consolas" w:hint="eastAsia"/>
@@ -2830,6 +3383,7 @@
         </w:rPr>
         <w:t>snp_pos,snpID,ref_base,alt_base</w:t>
       </w:r>
+      <w:proofErr w:type="spellEnd"/>
       <w:r>
         <w:rPr>
           <w:rFonts w:ascii="Consolas" w:hAnsi="Consolas" w:cs="Consolas" w:hint="eastAsia"/>
@@ -2856,6 +3410,7 @@
         </w:rPr>
         <w:t xml:space="preserve"> </w:t>
       </w:r>
+      <w:proofErr w:type="spellStart"/>
       <w:r>
         <w:rPr>
           <w:rFonts w:ascii="Consolas" w:hAnsi="Consolas" w:cs="Consolas"/>
@@ -2866,6 +3421,7 @@
         </w:rPr>
         <w:t>wegeon_indvd_SNV_vcf_alt</w:t>
       </w:r>
+      <w:proofErr w:type="spellEnd"/>
       <w:r>
         <w:rPr>
           <w:rFonts w:ascii="Consolas" w:hAnsi="Consolas" w:cs="Consolas" w:hint="eastAsia"/>
@@ -2882,6 +3438,7 @@
         </w:rPr>
         <w:t xml:space="preserve"> </w:t>
       </w:r>
+      <w:proofErr w:type="spellStart"/>
       <w:r>
         <w:rPr>
           <w:rFonts w:ascii="Consolas" w:hAnsi="Consolas" w:cs="Consolas"/>
@@ -2892,6 +3449,7 @@
         </w:rPr>
         <w:t>wegeon_indvd_SNV_vcf_dep</w:t>
       </w:r>
+      <w:proofErr w:type="spellEnd"/>
       <w:r>
         <w:rPr>
           <w:rFonts w:ascii="Consolas" w:hAnsi="Consolas" w:cs="Consolas" w:hint="eastAsia"/>
@@ -2925,12 +3483,14 @@
           <w:numId w:val="3"/>
         </w:numPr>
       </w:pPr>
+      <w:proofErr w:type="spellStart"/>
       <w:r>
         <w:rPr>
           <w:bCs/>
         </w:rPr>
         <w:t>getRefSeqBypos</w:t>
       </w:r>
+      <w:proofErr w:type="spellEnd"/>
       <w:r>
         <w:rPr>
           <w:rFonts w:hint="eastAsia"/>
@@ -2953,6 +3513,7 @@
           <w:numId w:val="3"/>
         </w:numPr>
       </w:pPr>
+      <w:proofErr w:type="spellStart"/>
       <w:r>
         <w:rPr>
           <w:rFonts w:ascii="Consolas" w:hAnsi="Consolas" w:cs="Consolas"/>
@@ -2966,6 +3527,7 @@
         </w:rPr>
         <w:t>generateFasterRefIndex</w:t>
       </w:r>
+      <w:proofErr w:type="spellEnd"/>
       <w:r>
         <w:rPr>
           <w:rFonts w:ascii="Consolas" w:hAnsi="Consolas" w:cs="Consolas"/>
@@ -2989,7 +3551,35 @@
           <w:szCs w:val="20"/>
           <w:highlight w:val="yellow"/>
         </w:rPr>
-        <w:t>这个函数怎么处理染色体名的回去好好查查看看</w:t>
+        <w:t>这个函数怎么处理染色体名的回去好好查</w:t>
+      </w:r>
+      <w:proofErr w:type="gramStart"/>
+      <w:r>
+        <w:rPr>
+          <w:rFonts w:ascii="Consolas" w:hAnsi="Consolas" w:cs="Consolas" w:hint="eastAsia"/>
+          <w:b/>
+          <w:bCs/>
+          <w:color w:val="000000"/>
+          <w:kern w:val="0"/>
+          <w:sz w:val="20"/>
+          <w:szCs w:val="20"/>
+          <w:highlight w:val="yellow"/>
+        </w:rPr>
+        <w:t>查看</w:t>
+      </w:r>
+      <w:proofErr w:type="gramEnd"/>
+      <w:r>
+        <w:rPr>
+          <w:rFonts w:ascii="Consolas" w:hAnsi="Consolas" w:cs="Consolas" w:hint="eastAsia"/>
+          <w:b/>
+          <w:bCs/>
+          <w:color w:val="000000"/>
+          <w:kern w:val="0"/>
+          <w:sz w:val="20"/>
+          <w:szCs w:val="20"/>
+          <w:highlight w:val="yellow"/>
+        </w:rPr>
+        <w:t>看</w:t>
       </w:r>
     </w:p>
     <w:p>
@@ -2999,6 +3589,7 @@
           <w:numId w:val="3"/>
         </w:numPr>
       </w:pPr>
+      <w:proofErr w:type="spellStart"/>
       <w:r>
         <w:rPr>
           <w:rFonts w:ascii="Consolas" w:hAnsi="Consolas" w:cs="Consolas"/>
@@ -3010,6 +3601,7 @@
         </w:rPr>
         <w:t>getRefSeqBypos_faster</w:t>
       </w:r>
+      <w:proofErr w:type="spellEnd"/>
     </w:p>
     <w:p>
       <w:pPr>
@@ -3032,7 +3624,178 @@
           <w:sz w:val="18"/>
           <w:szCs w:val="18"/>
         </w:rPr>
-        <w:t>def getRefSeqBypos_faster(refFastahandle, fasterrefindex, currentChromNO, startpos, endpos,  currentChromNOlen=None, seektuple=()):</w:t>
+        <w:t xml:space="preserve">def </w:t>
+      </w:r>
+      <w:proofErr w:type="spellStart"/>
+      <w:r>
+        <w:rPr>
+          <w:rFonts w:ascii="Microsoft YaHei UI" w:eastAsia="Microsoft YaHei UI" w:cs="Microsoft YaHei UI"/>
+          <w:kern w:val="0"/>
+          <w:sz w:val="18"/>
+          <w:szCs w:val="18"/>
+        </w:rPr>
+        <w:t>getRefSeqBypos_</w:t>
+      </w:r>
+      <w:proofErr w:type="gramStart"/>
+      <w:r>
+        <w:rPr>
+          <w:rFonts w:ascii="Microsoft YaHei UI" w:eastAsia="Microsoft YaHei UI" w:cs="Microsoft YaHei UI"/>
+          <w:kern w:val="0"/>
+          <w:sz w:val="18"/>
+          <w:szCs w:val="18"/>
+        </w:rPr>
+        <w:t>faster</w:t>
+      </w:r>
+      <w:proofErr w:type="spellEnd"/>
+      <w:r>
+        <w:rPr>
+          <w:rFonts w:ascii="Microsoft YaHei UI" w:eastAsia="Microsoft YaHei UI" w:cs="Microsoft YaHei UI"/>
+          <w:kern w:val="0"/>
+          <w:sz w:val="18"/>
+          <w:szCs w:val="18"/>
+        </w:rPr>
+        <w:t>(</w:t>
+      </w:r>
+      <w:proofErr w:type="spellStart"/>
+      <w:proofErr w:type="gramEnd"/>
+      <w:r>
+        <w:rPr>
+          <w:rFonts w:ascii="Microsoft YaHei UI" w:eastAsia="Microsoft YaHei UI" w:cs="Microsoft YaHei UI"/>
+          <w:kern w:val="0"/>
+          <w:sz w:val="18"/>
+          <w:szCs w:val="18"/>
+        </w:rPr>
+        <w:t>refFastahandle</w:t>
+      </w:r>
+      <w:proofErr w:type="spellEnd"/>
+      <w:r>
+        <w:rPr>
+          <w:rFonts w:ascii="Microsoft YaHei UI" w:eastAsia="Microsoft YaHei UI" w:cs="Microsoft YaHei UI"/>
+          <w:kern w:val="0"/>
+          <w:sz w:val="18"/>
+          <w:szCs w:val="18"/>
+        </w:rPr>
+        <w:t xml:space="preserve">, </w:t>
+      </w:r>
+      <w:proofErr w:type="spellStart"/>
+      <w:r>
+        <w:rPr>
+          <w:rFonts w:ascii="Microsoft YaHei UI" w:eastAsia="Microsoft YaHei UI" w:cs="Microsoft YaHei UI"/>
+          <w:kern w:val="0"/>
+          <w:sz w:val="18"/>
+          <w:szCs w:val="18"/>
+        </w:rPr>
+        <w:t>fasterrefindex</w:t>
+      </w:r>
+      <w:proofErr w:type="spellEnd"/>
+      <w:r>
+        <w:rPr>
+          <w:rFonts w:ascii="Microsoft YaHei UI" w:eastAsia="Microsoft YaHei UI" w:cs="Microsoft YaHei UI"/>
+          <w:kern w:val="0"/>
+          <w:sz w:val="18"/>
+          <w:szCs w:val="18"/>
+        </w:rPr>
+        <w:t xml:space="preserve">, </w:t>
+      </w:r>
+      <w:proofErr w:type="spellStart"/>
+      <w:r>
+        <w:rPr>
+          <w:rFonts w:ascii="Microsoft YaHei UI" w:eastAsia="Microsoft YaHei UI" w:cs="Microsoft YaHei UI"/>
+          <w:kern w:val="0"/>
+          <w:sz w:val="18"/>
+          <w:szCs w:val="18"/>
+        </w:rPr>
+        <w:t>currentChromNO</w:t>
+      </w:r>
+      <w:proofErr w:type="spellEnd"/>
+      <w:r>
+        <w:rPr>
+          <w:rFonts w:ascii="Microsoft YaHei UI" w:eastAsia="Microsoft YaHei UI" w:cs="Microsoft YaHei UI"/>
+          <w:kern w:val="0"/>
+          <w:sz w:val="18"/>
+          <w:szCs w:val="18"/>
+        </w:rPr>
+        <w:t xml:space="preserve">, </w:t>
+      </w:r>
+      <w:proofErr w:type="spellStart"/>
+      <w:r>
+        <w:rPr>
+          <w:rFonts w:ascii="Microsoft YaHei UI" w:eastAsia="Microsoft YaHei UI" w:cs="Microsoft YaHei UI"/>
+          <w:kern w:val="0"/>
+          <w:sz w:val="18"/>
+          <w:szCs w:val="18"/>
+        </w:rPr>
+        <w:t>startpos</w:t>
+      </w:r>
+      <w:proofErr w:type="spellEnd"/>
+      <w:r>
+        <w:rPr>
+          <w:rFonts w:ascii="Microsoft YaHei UI" w:eastAsia="Microsoft YaHei UI" w:cs="Microsoft YaHei UI"/>
+          <w:kern w:val="0"/>
+          <w:sz w:val="18"/>
+          <w:szCs w:val="18"/>
+        </w:rPr>
+        <w:t xml:space="preserve">, </w:t>
+      </w:r>
+      <w:proofErr w:type="spellStart"/>
+      <w:r>
+        <w:rPr>
+          <w:rFonts w:ascii="Microsoft YaHei UI" w:eastAsia="Microsoft YaHei UI" w:cs="Microsoft YaHei UI"/>
+          <w:kern w:val="0"/>
+          <w:sz w:val="18"/>
+          <w:szCs w:val="18"/>
+        </w:rPr>
+        <w:t>endpos</w:t>
+      </w:r>
+      <w:proofErr w:type="spellEnd"/>
+      <w:r>
+        <w:rPr>
+          <w:rFonts w:ascii="Microsoft YaHei UI" w:eastAsia="Microsoft YaHei UI" w:cs="Microsoft YaHei UI"/>
+          <w:kern w:val="0"/>
+          <w:sz w:val="18"/>
+          <w:szCs w:val="18"/>
+        </w:rPr>
+        <w:t xml:space="preserve">,  </w:t>
+      </w:r>
+      <w:proofErr w:type="spellStart"/>
+      <w:r>
+        <w:rPr>
+          <w:rFonts w:ascii="Microsoft YaHei UI" w:eastAsia="Microsoft YaHei UI" w:cs="Microsoft YaHei UI"/>
+          <w:kern w:val="0"/>
+          <w:sz w:val="18"/>
+          <w:szCs w:val="18"/>
+        </w:rPr>
+        <w:t>currentChromNOlen</w:t>
+      </w:r>
+      <w:proofErr w:type="spellEnd"/>
+      <w:r>
+        <w:rPr>
+          <w:rFonts w:ascii="Microsoft YaHei UI" w:eastAsia="Microsoft YaHei UI" w:cs="Microsoft YaHei UI"/>
+          <w:kern w:val="0"/>
+          <w:sz w:val="18"/>
+          <w:szCs w:val="18"/>
+        </w:rPr>
+        <w:t xml:space="preserve">=None, </w:t>
+      </w:r>
+      <w:proofErr w:type="spellStart"/>
+      <w:r>
+        <w:rPr>
+          <w:rFonts w:ascii="Microsoft YaHei UI" w:eastAsia="Microsoft YaHei UI" w:cs="Microsoft YaHei UI"/>
+          <w:kern w:val="0"/>
+          <w:sz w:val="18"/>
+          <w:szCs w:val="18"/>
+        </w:rPr>
+        <w:t>seektuple</w:t>
+      </w:r>
+      <w:proofErr w:type="spellEnd"/>
+      <w:r>
+        <w:rPr>
+          <w:rFonts w:ascii="Microsoft YaHei UI" w:eastAsia="Microsoft YaHei UI" w:cs="Microsoft YaHei UI"/>
+          <w:kern w:val="0"/>
+          <w:sz w:val="18"/>
+          <w:szCs w:val="18"/>
+        </w:rPr>
+        <w:t>=()):</w:t>
       </w:r>
     </w:p>
     <w:p>
@@ -3104,7 +3867,49 @@
           <w:sz w:val="18"/>
           <w:szCs w:val="18"/>
         </w:rPr>
-        <w:t xml:space="preserve">    seektuple=(filepos,basesbeforefilepos)</w:t>
+        <w:t xml:space="preserve">    </w:t>
+      </w:r>
+      <w:proofErr w:type="spellStart"/>
+      <w:r>
+        <w:rPr>
+          <w:rFonts w:ascii="Microsoft YaHei UI" w:eastAsia="Microsoft YaHei UI" w:cs="Microsoft YaHei UI"/>
+          <w:kern w:val="0"/>
+          <w:sz w:val="18"/>
+          <w:szCs w:val="18"/>
+        </w:rPr>
+        <w:t>seektuple</w:t>
+      </w:r>
+      <w:proofErr w:type="spellEnd"/>
+      <w:r>
+        <w:rPr>
+          <w:rFonts w:ascii="Microsoft YaHei UI" w:eastAsia="Microsoft YaHei UI" w:cs="Microsoft YaHei UI"/>
+          <w:kern w:val="0"/>
+          <w:sz w:val="18"/>
+          <w:szCs w:val="18"/>
+        </w:rPr>
+        <w:t>=(</w:t>
+      </w:r>
+      <w:proofErr w:type="spellStart"/>
+      <w:proofErr w:type="gramStart"/>
+      <w:r>
+        <w:rPr>
+          <w:rFonts w:ascii="Microsoft YaHei UI" w:eastAsia="Microsoft YaHei UI" w:cs="Microsoft YaHei UI"/>
+          <w:kern w:val="0"/>
+          <w:sz w:val="18"/>
+          <w:szCs w:val="18"/>
+        </w:rPr>
+        <w:t>filepos,basesbeforefilepos</w:t>
+      </w:r>
+      <w:proofErr w:type="spellEnd"/>
+      <w:proofErr w:type="gramEnd"/>
+      <w:r>
+        <w:rPr>
+          <w:rFonts w:ascii="Microsoft YaHei UI" w:eastAsia="Microsoft YaHei UI" w:cs="Microsoft YaHei UI"/>
+          <w:kern w:val="0"/>
+          <w:sz w:val="18"/>
+          <w:szCs w:val="18"/>
+        </w:rPr>
+        <w:t>)</w:t>
       </w:r>
     </w:p>
     <w:p>
@@ -3128,7 +3933,27 @@
           <w:sz w:val="18"/>
           <w:szCs w:val="18"/>
         </w:rPr>
-        <w:t xml:space="preserve">    the refSeqMap has only one chromosome's sequence</w:t>
+        <w:t xml:space="preserve">    the </w:t>
+      </w:r>
+      <w:proofErr w:type="spellStart"/>
+      <w:r>
+        <w:rPr>
+          <w:rFonts w:ascii="Microsoft YaHei UI" w:eastAsia="Microsoft YaHei UI" w:cs="Microsoft YaHei UI"/>
+          <w:kern w:val="0"/>
+          <w:sz w:val="18"/>
+          <w:szCs w:val="18"/>
+        </w:rPr>
+        <w:t>refSeqMap</w:t>
+      </w:r>
+      <w:proofErr w:type="spellEnd"/>
+      <w:r>
+        <w:rPr>
+          <w:rFonts w:ascii="Microsoft YaHei UI" w:eastAsia="Microsoft YaHei UI" w:cs="Microsoft YaHei UI"/>
+          <w:kern w:val="0"/>
+          <w:sz w:val="18"/>
+          <w:szCs w:val="18"/>
+        </w:rPr>
+        <w:t xml:space="preserve"> has only one chromosome's sequence</w:t>
       </w:r>
     </w:p>
     <w:p>
@@ -3152,8 +3977,19 @@
           <w:sz w:val="18"/>
           <w:szCs w:val="18"/>
         </w:rPr>
-        <w:t xml:space="preserve">    There is no restriction on refFastahander</w:t>
-      </w:r>
+        <w:t xml:space="preserve">    There is no restriction on </w:t>
+      </w:r>
+      <w:proofErr w:type="spellStart"/>
+      <w:r>
+        <w:rPr>
+          <w:rFonts w:ascii="Microsoft YaHei UI" w:eastAsia="Microsoft YaHei UI" w:cs="Microsoft YaHei UI"/>
+          <w:kern w:val="0"/>
+          <w:sz w:val="18"/>
+          <w:szCs w:val="18"/>
+        </w:rPr>
+        <w:t>refFastahander</w:t>
+      </w:r>
+      <w:proofErr w:type="spellEnd"/>
     </w:p>
     <w:p>
       <w:pPr>
@@ -3176,8 +4012,29 @@
           <w:sz w:val="18"/>
           <w:szCs w:val="18"/>
         </w:rPr>
-        <w:t xml:space="preserve">    refindex must indexed by </w:t>
-      </w:r>
+        <w:t xml:space="preserve">    </w:t>
+      </w:r>
+      <w:proofErr w:type="spellStart"/>
+      <w:r>
+        <w:rPr>
+          <w:rFonts w:ascii="Microsoft YaHei UI" w:eastAsia="Microsoft YaHei UI" w:cs="Microsoft YaHei UI"/>
+          <w:kern w:val="0"/>
+          <w:sz w:val="18"/>
+          <w:szCs w:val="18"/>
+        </w:rPr>
+        <w:t>refindex</w:t>
+      </w:r>
+      <w:proofErr w:type="spellEnd"/>
+      <w:r>
+        <w:rPr>
+          <w:rFonts w:ascii="Microsoft YaHei UI" w:eastAsia="Microsoft YaHei UI" w:cs="Microsoft YaHei UI"/>
+          <w:kern w:val="0"/>
+          <w:sz w:val="18"/>
+          <w:szCs w:val="18"/>
+        </w:rPr>
+        <w:t xml:space="preserve"> must indexed by </w:t>
+      </w:r>
+      <w:proofErr w:type="spellStart"/>
       <w:r>
         <w:rPr>
           <w:rFonts w:ascii="Microsoft YaHei UI" w:eastAsia="Microsoft YaHei UI" w:cs="Microsoft YaHei UI"/>
@@ -3186,17 +4043,30 @@
           <w:sz w:val="18"/>
           <w:szCs w:val="18"/>
         </w:rPr>
-        <w:t xml:space="preserve">generateFasterRefIndex </w:t>
-      </w:r>
+        <w:t>generateFasterRefIndex</w:t>
+      </w:r>
+      <w:proofErr w:type="spellEnd"/>
       <w:r>
         <w:rPr>
           <w:rFonts w:ascii="Microsoft YaHei UI" w:eastAsia="Microsoft YaHei UI" w:cs="Microsoft YaHei UI"/>
+          <w:color w:val="FF0000"/>
           <w:kern w:val="0"/>
           <w:sz w:val="18"/>
           <w:szCs w:val="18"/>
         </w:rPr>
+        <w:t xml:space="preserve"> </w:t>
+      </w:r>
+      <w:proofErr w:type="spellStart"/>
+      <w:r>
+        <w:rPr>
+          <w:rFonts w:ascii="Microsoft YaHei UI" w:eastAsia="Microsoft YaHei UI" w:cs="Microsoft YaHei UI"/>
+          <w:kern w:val="0"/>
+          <w:sz w:val="18"/>
+          <w:szCs w:val="18"/>
+        </w:rPr>
         <w:t>func</w:t>
       </w:r>
+      <w:proofErr w:type="spellEnd"/>
     </w:p>
     <w:p>
       <w:pPr>
@@ -3275,6 +4145,7 @@
           <w:numId w:val="3"/>
         </w:numPr>
       </w:pPr>
+      <w:proofErr w:type="spellStart"/>
       <w:r>
         <w:rPr>
           <w:rFonts w:ascii="Consolas" w:hAnsi="Consolas" w:cs="Consolas"/>
@@ -3285,6 +4156,7 @@
         </w:rPr>
         <w:t>getdepthByPos</w:t>
       </w:r>
+      <w:proofErr w:type="spellEnd"/>
       <w:r>
         <w:rPr>
           <w:rFonts w:ascii="Consolas" w:hAnsi="Consolas" w:cs="Consolas" w:hint="eastAsia"/>
@@ -3324,6 +4196,7 @@
         </w:rPr>
         <w:t>，所以</w:t>
       </w:r>
+      <w:proofErr w:type="spellStart"/>
       <w:r>
         <w:rPr>
           <w:rFonts w:ascii="Consolas" w:hAnsi="Consolas" w:cs="Consolas"/>
@@ -3334,6 +4207,7 @@
         </w:rPr>
         <w:t>getdepthByPos</w:t>
       </w:r>
+      <w:proofErr w:type="spellEnd"/>
       <w:r>
         <w:rPr>
           <w:rFonts w:ascii="Consolas" w:hAnsi="Consolas" w:cs="Consolas" w:hint="eastAsia"/>
@@ -3392,7 +4266,51 @@
           <w:sz w:val="20"/>
           <w:szCs w:val="20"/>
         </w:rPr>
-        <w:t>]*len(self.title)</w:t>
+        <w:t>]*</w:t>
+      </w:r>
+      <w:proofErr w:type="spellStart"/>
+      <w:r>
+        <w:rPr>
+          <w:rFonts w:ascii="Consolas" w:hAnsi="Consolas" w:cs="Consolas" w:hint="eastAsia"/>
+          <w:bCs/>
+          <w:kern w:val="0"/>
+          <w:sz w:val="20"/>
+          <w:szCs w:val="20"/>
+        </w:rPr>
+        <w:t>len</w:t>
+      </w:r>
+      <w:proofErr w:type="spellEnd"/>
+      <w:r>
+        <w:rPr>
+          <w:rFonts w:ascii="Consolas" w:hAnsi="Consolas" w:cs="Consolas" w:hint="eastAsia"/>
+          <w:bCs/>
+          <w:kern w:val="0"/>
+          <w:sz w:val="20"/>
+          <w:szCs w:val="20"/>
+        </w:rPr>
+        <w:t>(</w:t>
+      </w:r>
+      <w:proofErr w:type="spellStart"/>
+      <w:r>
+        <w:rPr>
+          <w:rFonts w:ascii="Consolas" w:hAnsi="Consolas" w:cs="Consolas" w:hint="eastAsia"/>
+          <w:bCs/>
+          <w:kern w:val="0"/>
+          <w:sz w:val="20"/>
+          <w:szCs w:val="20"/>
+        </w:rPr>
+        <w:t>self.title</w:t>
+      </w:r>
+      <w:proofErr w:type="spellEnd"/>
+      <w:r>
+        <w:rPr>
+          <w:rFonts w:ascii="Consolas" w:hAnsi="Consolas" w:cs="Consolas" w:hint="eastAsia"/>
+          <w:bCs/>
+          <w:kern w:val="0"/>
+          <w:sz w:val="20"/>
+          <w:szCs w:val="20"/>
+        </w:rPr>
+        <w:t>)</w:t>
       </w:r>
       <w:r>
         <w:rPr>
@@ -3414,6 +4332,7 @@
         </w:numPr>
         <w:ind w:firstLineChars="0"/>
       </w:pPr>
+      <w:proofErr w:type="spellStart"/>
       <w:r>
         <w:rPr>
           <w:rFonts w:ascii="Consolas" w:hAnsi="Consolas" w:cs="Consolas"/>
@@ -3425,6 +4344,7 @@
         </w:rPr>
         <w:t>GATK_depthfile</w:t>
       </w:r>
+      <w:proofErr w:type="spellEnd"/>
       <w:r>
         <w:rPr>
           <w:rFonts w:ascii="Consolas" w:hAnsi="Consolas" w:cs="Consolas" w:hint="eastAsia"/>
@@ -3436,6 +4356,7 @@
         </w:rPr>
         <w:t>函数中的</w:t>
       </w:r>
+      <w:proofErr w:type="spellStart"/>
       <w:r>
         <w:rPr>
           <w:rFonts w:ascii="Consolas" w:hAnsi="Consolas" w:cs="Consolas"/>
@@ -3447,6 +4368,7 @@
         </w:rPr>
         <w:t>getdepthByPos_optimized</w:t>
       </w:r>
+      <w:proofErr w:type="spellEnd"/>
       <w:r>
         <w:rPr>
           <w:rFonts w:ascii="Consolas" w:hAnsi="Consolas" w:cs="Consolas" w:hint="eastAsia"/>
@@ -3458,6 +4380,7 @@
         </w:rPr>
         <w:t>方法为</w:t>
       </w:r>
+      <w:proofErr w:type="spellStart"/>
       <w:r>
         <w:rPr>
           <w:rFonts w:ascii="Consolas" w:hAnsi="Consolas" w:cs="Consolas"/>
@@ -3468,6 +4391,7 @@
         </w:rPr>
         <w:t>getdepthByPos</w:t>
       </w:r>
+      <w:proofErr w:type="spellEnd"/>
       <w:r>
         <w:rPr>
           <w:rFonts w:ascii="Consolas" w:hAnsi="Consolas" w:cs="Consolas" w:hint="eastAsia"/>
@@ -3492,7 +4416,35 @@
         <w:rPr>
           <w:rFonts w:hint="eastAsia"/>
         </w:rPr>
-        <w:t>读入方式改为read()读入内存，在其中结构化为位置作为键的map，然后再该map中查找位置，而非readline()的方式从硬盘查找位置</w:t>
+        <w:t>读入方式改为read()读入内存，在其中结构化为位置作为键的map，</w:t>
+      </w:r>
+      <w:proofErr w:type="gramStart"/>
+      <w:r>
+        <w:rPr>
+          <w:rFonts w:hint="eastAsia"/>
+        </w:rPr>
+        <w:t>然后再该</w:t>
+      </w:r>
+      <w:proofErr w:type="gramEnd"/>
+      <w:r>
+        <w:rPr>
+          <w:rFonts w:hint="eastAsia"/>
+        </w:rPr>
+        <w:t>map中查找位置，而非</w:t>
+      </w:r>
+      <w:proofErr w:type="spellStart"/>
+      <w:r>
+        <w:rPr>
+          <w:rFonts w:hint="eastAsia"/>
+        </w:rPr>
+        <w:t>readline</w:t>
+      </w:r>
+      <w:proofErr w:type="spellEnd"/>
+      <w:r>
+        <w:rPr>
+          <w:rFonts w:hint="eastAsia"/>
+        </w:rPr>
+        <w:t>()的方式从硬盘查找位置</w:t>
       </w:r>
     </w:p>
     <w:p>
@@ -3508,7 +4460,35 @@
         <w:rPr>
           <w:rFonts w:hint="eastAsia"/>
         </w:rPr>
-        <w:t>多次实例化GATK_depthfile类时，可能都是对一个gatkdepth文件经行实例化，那么用这样的逻辑来避免多次生成map，由于每次查找某个染色体的某个位置都一定要把这个染色体的depth都加载到内存，而单线程程序一般会生成多个实例，而且处理的时候同时处理同一个染色体，所以如果这几个实例都使用一个depth文件，则可以加载一次内存就够了。而多线程程序中不同线程不一定会在同一个时间处理同一个染色体，所以一定要为每个对象加载一次。是否加载通过如下逻辑判断，如果是多线程 或者 还没有加载 或者 将加载不同文件，</w:t>
+        <w:t>多次实例化</w:t>
+      </w:r>
+      <w:proofErr w:type="spellStart"/>
+      <w:r>
+        <w:rPr>
+          <w:rFonts w:hint="eastAsia"/>
+        </w:rPr>
+        <w:t>GATK_depthfile</w:t>
+      </w:r>
+      <w:proofErr w:type="spellEnd"/>
+      <w:r>
+        <w:rPr>
+          <w:rFonts w:hint="eastAsia"/>
+        </w:rPr>
+        <w:t>类时，可能都是对一个</w:t>
+      </w:r>
+      <w:proofErr w:type="spellStart"/>
+      <w:r>
+        <w:rPr>
+          <w:rFonts w:hint="eastAsia"/>
+        </w:rPr>
+        <w:t>gatkdepth</w:t>
+      </w:r>
+      <w:proofErr w:type="spellEnd"/>
+      <w:r>
+        <w:rPr>
+          <w:rFonts w:hint="eastAsia"/>
+        </w:rPr>
+        <w:t>文件经行实例化，那么用这样的逻辑来避免多次生成map，由于每次查找某个染色体的某个位置都一定要把这个染色体的depth都加载到内存，而单线程程序一般会生成多个实例，而且处理的时候同时处理同一个染色体，所以如果这几个实例都使用一个depth文件，则可以加载一次内存就够了。而多线程程序中不同线程不一定会在同一个时间处理同一个染色体，所以一定要为每个对象加载一次。是否加载通过如下逻辑判断，如果是多线程 或者 还没有加载 或者 将加载不同文件，</w:t>
       </w:r>
       <w:r>
         <w:rPr>
@@ -3581,6 +4561,7 @@
           <w:szCs w:val="21"/>
         </w:rPr>
       </w:pPr>
+      <w:proofErr w:type="spellStart"/>
       <w:r>
         <w:rPr>
           <w:rFonts w:ascii="Consolas" w:hAnsi="Consolas" w:cs="Consolas" w:hint="eastAsia"/>
@@ -3601,6 +4582,7 @@
         </w:rPr>
         <w:t>etflankseqs</w:t>
       </w:r>
+      <w:proofErr w:type="spellEnd"/>
       <w:r>
         <w:rPr>
           <w:rFonts w:ascii="Consolas" w:hAnsi="Consolas" w:cs="Consolas" w:hint="eastAsia"/>
@@ -3611,6 +4593,7 @@
         </w:rPr>
         <w:t>函数，对</w:t>
       </w:r>
+      <w:proofErr w:type="spellStart"/>
       <w:r>
         <w:rPr>
           <w:rFonts w:ascii="Consolas" w:hAnsi="Consolas" w:cs="Consolas" w:hint="eastAsia"/>
@@ -3621,6 +4604,7 @@
         </w:rPr>
         <w:t>vcf</w:t>
       </w:r>
+      <w:proofErr w:type="spellEnd"/>
       <w:r>
         <w:rPr>
           <w:rFonts w:ascii="Consolas" w:hAnsi="Consolas" w:cs="Consolas" w:hint="eastAsia"/>
@@ -3631,6 +4615,7 @@
         </w:rPr>
         <w:t>数据表中（一般为</w:t>
       </w:r>
+      <w:proofErr w:type="spellStart"/>
       <w:r>
         <w:rPr>
           <w:rFonts w:ascii="Consolas" w:hAnsi="Consolas" w:cs="Consolas" w:hint="eastAsia"/>
@@ -3639,8 +4624,9 @@
           <w:kern w:val="0"/>
           <w:szCs w:val="21"/>
         </w:rPr>
-        <w:t>toplevel vcf</w:t>
-      </w:r>
+        <w:t>toplevel</w:t>
+      </w:r>
+      <w:proofErr w:type="spellEnd"/>
       <w:r>
         <w:rPr>
           <w:rFonts w:ascii="Consolas" w:hAnsi="Consolas" w:cs="Consolas" w:hint="eastAsia"/>
@@ -3649,8 +4635,31 @@
           <w:kern w:val="0"/>
           <w:szCs w:val="21"/>
         </w:rPr>
+        <w:t xml:space="preserve"> </w:t>
+      </w:r>
+      <w:proofErr w:type="spellStart"/>
+      <w:r>
+        <w:rPr>
+          <w:rFonts w:ascii="Consolas" w:hAnsi="Consolas" w:cs="Consolas" w:hint="eastAsia"/>
+          <w:bCs/>
+          <w:color w:val="000000"/>
+          <w:kern w:val="0"/>
+          <w:szCs w:val="21"/>
+        </w:rPr>
+        <w:t>vcf</w:t>
+      </w:r>
+      <w:proofErr w:type="spellEnd"/>
+      <w:r>
+        <w:rPr>
+          <w:rFonts w:ascii="Consolas" w:hAnsi="Consolas" w:cs="Consolas" w:hint="eastAsia"/>
+          <w:bCs/>
+          <w:color w:val="000000"/>
+          <w:kern w:val="0"/>
+          <w:szCs w:val="21"/>
+        </w:rPr>
         <w:t>表），的某个染色体号的所有</w:t>
       </w:r>
+      <w:proofErr w:type="spellStart"/>
       <w:r>
         <w:rPr>
           <w:rFonts w:ascii="Consolas" w:hAnsi="Consolas" w:cs="Consolas" w:hint="eastAsia"/>
@@ -3661,6 +4670,7 @@
         </w:rPr>
         <w:t>snp</w:t>
       </w:r>
+      <w:proofErr w:type="spellEnd"/>
       <w:r>
         <w:rPr>
           <w:rFonts w:ascii="Consolas" w:hAnsi="Consolas" w:cs="Consolas" w:hint="eastAsia"/>
@@ -3691,6 +4701,7 @@
         </w:rPr>
         <w:t>项为该</w:t>
       </w:r>
+      <w:proofErr w:type="spellStart"/>
       <w:r>
         <w:rPr>
           <w:rFonts w:ascii="Consolas" w:hAnsi="Consolas" w:cs="Consolas" w:hint="eastAsia"/>
@@ -3701,6 +4712,7 @@
         </w:rPr>
         <w:t>snp</w:t>
       </w:r>
+      <w:proofErr w:type="spellEnd"/>
       <w:r>
         <w:rPr>
           <w:rFonts w:ascii="Consolas" w:hAnsi="Consolas" w:cs="Consolas" w:hint="eastAsia"/>
@@ -3734,6 +4746,7 @@
         </w:rPr>
         <w:t>输入参数为：染色体号，染色体长度，</w:t>
       </w:r>
+      <w:proofErr w:type="spellStart"/>
       <w:r>
         <w:rPr>
           <w:rFonts w:ascii="Consolas" w:hAnsi="Consolas" w:cs="Consolas" w:hint="eastAsia"/>
@@ -3744,6 +4757,7 @@
         </w:rPr>
         <w:t>yao</w:t>
       </w:r>
+      <w:proofErr w:type="spellEnd"/>
     </w:p>
     <w:p>
       <w:pPr>
@@ -3776,7 +4790,21 @@
         <w:rPr>
           <w:rFonts w:hint="eastAsia"/>
         </w:rPr>
-        <w:t>控制在计算fst时，是否考虑差异固定；</w:t>
+        <w:t>控制在计算</w:t>
+      </w:r>
+      <w:proofErr w:type="spellStart"/>
+      <w:r>
+        <w:rPr>
+          <w:rFonts w:hint="eastAsia"/>
+        </w:rPr>
+        <w:t>fst</w:t>
+      </w:r>
+      <w:proofErr w:type="spellEnd"/>
+      <w:r>
+        <w:rPr>
+          <w:rFonts w:hint="eastAsia"/>
+        </w:rPr>
+        <w:t>时，是否考虑差异固定；</w:t>
       </w:r>
     </w:p>
     <w:p>
@@ -3792,42 +4820,296 @@
         <w:rPr>
           <w:rFonts w:hint="eastAsia"/>
         </w:rPr>
-        <w:t>总的来讲，当某个种群所有被测个体都是一种等位基因时，则该位点当做在该种群中固定，否则不当做固定位点。</w:t>
-      </w:r>
-    </w:p>
-    <w:p>
-      <w:r>
-        <w:rPr>
-          <w:rFonts w:hint="eastAsia"/>
-        </w:rPr>
-        <w:t>那么，具体来讲，判断根据两个文件（或者仅根据vcf），一个是vcf中的depth，当vcf没有该位点时根据GATK.depth文件判断：</w:t>
-      </w:r>
-    </w:p>
-    <w:p>
-      <w:r>
-        <w:rPr>
-          <w:rFonts w:hint="eastAsia"/>
-        </w:rPr>
-        <w:t>如果是pool的数据，vcf中的depth，与GATK.depth文件中的depth等同，判断是否固定的深度标准是GATK.depth.summary中的</w:t>
-      </w:r>
+        <w:t>总的来讲，当某个种群所有被测个体都是一种等位基因时，则该位点</w:t>
+      </w:r>
+      <w:proofErr w:type="gramStart"/>
+      <w:r>
+        <w:rPr>
+          <w:rFonts w:hint="eastAsia"/>
+        </w:rPr>
+        <w:t>当做</w:t>
+      </w:r>
+      <w:proofErr w:type="gramEnd"/>
+      <w:r>
+        <w:rPr>
+          <w:rFonts w:hint="eastAsia"/>
+        </w:rPr>
+        <w:t>在该种群中固定，否则不</w:t>
+      </w:r>
+      <w:proofErr w:type="gramStart"/>
+      <w:r>
+        <w:rPr>
+          <w:rFonts w:hint="eastAsia"/>
+        </w:rPr>
+        <w:t>当做</w:t>
+      </w:r>
+      <w:proofErr w:type="gramEnd"/>
+      <w:r>
+        <w:rPr>
+          <w:rFonts w:hint="eastAsia"/>
+        </w:rPr>
+        <w:t>固定位点。</w:t>
+      </w:r>
+    </w:p>
+    <w:p>
+      <w:r>
+        <w:rPr>
+          <w:rFonts w:hint="eastAsia"/>
+        </w:rPr>
+        <w:t>那么，具体来讲，判断根据两个文件（或者仅根据</w:t>
+      </w:r>
+      <w:proofErr w:type="spellStart"/>
+      <w:r>
+        <w:rPr>
+          <w:rFonts w:hint="eastAsia"/>
+        </w:rPr>
+        <w:t>vcf</w:t>
+      </w:r>
+      <w:proofErr w:type="spellEnd"/>
+      <w:r>
+        <w:rPr>
+          <w:rFonts w:hint="eastAsia"/>
+        </w:rPr>
+        <w:t>），一个是</w:t>
+      </w:r>
+      <w:proofErr w:type="spellStart"/>
+      <w:r>
+        <w:rPr>
+          <w:rFonts w:hint="eastAsia"/>
+        </w:rPr>
+        <w:t>vcf</w:t>
+      </w:r>
+      <w:proofErr w:type="spellEnd"/>
+      <w:r>
+        <w:rPr>
+          <w:rFonts w:hint="eastAsia"/>
+        </w:rPr>
+        <w:t>中的depth，当</w:t>
+      </w:r>
+      <w:proofErr w:type="spellStart"/>
+      <w:r>
+        <w:rPr>
+          <w:rFonts w:hint="eastAsia"/>
+        </w:rPr>
+        <w:t>vcf</w:t>
+      </w:r>
+      <w:proofErr w:type="spellEnd"/>
+      <w:r>
+        <w:rPr>
+          <w:rFonts w:hint="eastAsia"/>
+        </w:rPr>
+        <w:t>没有该位点时根据</w:t>
+      </w:r>
+      <w:proofErr w:type="spellStart"/>
+      <w:r>
+        <w:rPr>
+          <w:rFonts w:hint="eastAsia"/>
+        </w:rPr>
+        <w:t>GATK.depth</w:t>
+      </w:r>
+      <w:proofErr w:type="spellEnd"/>
+      <w:r>
+        <w:rPr>
+          <w:rFonts w:hint="eastAsia"/>
+        </w:rPr>
+        <w:t>文件判断：</w:t>
+      </w:r>
+    </w:p>
+    <w:p>
+      <w:r>
+        <w:rPr>
+          <w:rFonts w:hint="eastAsia"/>
+        </w:rPr>
+        <w:t>如果是pool的数据，</w:t>
+      </w:r>
+      <w:proofErr w:type="spellStart"/>
+      <w:r>
+        <w:rPr>
+          <w:rFonts w:hint="eastAsia"/>
+        </w:rPr>
+        <w:t>vcf</w:t>
+      </w:r>
+      <w:proofErr w:type="spellEnd"/>
+      <w:r>
+        <w:rPr>
+          <w:rFonts w:hint="eastAsia"/>
+        </w:rPr>
+        <w:t>中的depth，与</w:t>
+      </w:r>
+      <w:proofErr w:type="spellStart"/>
+      <w:r>
+        <w:rPr>
+          <w:rFonts w:hint="eastAsia"/>
+        </w:rPr>
+        <w:t>GATK.depth</w:t>
+      </w:r>
+      <w:proofErr w:type="spellEnd"/>
+      <w:r>
+        <w:rPr>
+          <w:rFonts w:hint="eastAsia"/>
+        </w:rPr>
+        <w:t>文件中的depth等同，判断是否固定的深度标准是</w:t>
+      </w:r>
+      <w:proofErr w:type="spellStart"/>
+      <w:r>
+        <w:rPr>
+          <w:rFonts w:hint="eastAsia"/>
+        </w:rPr>
+        <w:t>GATK.depth.summary</w:t>
+      </w:r>
+      <w:proofErr w:type="spellEnd"/>
+      <w:r>
+        <w:rPr>
+          <w:rFonts w:hint="eastAsia"/>
+        </w:rPr>
+        <w:t>中的</w:t>
+      </w:r>
+      <w:proofErr w:type="spellStart"/>
       <w:r>
         <w:t>granular_median</w:t>
       </w:r>
-    </w:p>
-    <w:p>
-      <w:r>
-        <w:rPr>
-          <w:rFonts w:hint="eastAsia"/>
-        </w:rPr>
-        <w:t>如果是indvd的数据，则总共多少个个体的信息从vcf的title中得知，在vcf中，测到的AC等于个体数的话则判断固定为alt，如果vcf中没有该位点，GATK.depth文件中每个个体的深度如果超过4，则判定为固定位该位点。</w:t>
-      </w:r>
-    </w:p>
-    <w:p>
-      <w:r>
-        <w:rPr>
-          <w:rFonts w:hint="eastAsia"/>
-        </w:rPr>
-        <w:t>如果没有depth文件，则仅从vcf中是否判定为固定（pool的话就是ref为0，indvd的话就是ac=个体数），或有无该位点判断固定。</w:t>
+      <w:proofErr w:type="spellEnd"/>
+    </w:p>
+    <w:p>
+      <w:r>
+        <w:rPr>
+          <w:rFonts w:hint="eastAsia"/>
+        </w:rPr>
+        <w:t>如果是</w:t>
+      </w:r>
+      <w:proofErr w:type="spellStart"/>
+      <w:r>
+        <w:rPr>
+          <w:rFonts w:hint="eastAsia"/>
+        </w:rPr>
+        <w:t>indvd</w:t>
+      </w:r>
+      <w:proofErr w:type="spellEnd"/>
+      <w:r>
+        <w:rPr>
+          <w:rFonts w:hint="eastAsia"/>
+        </w:rPr>
+        <w:t>的数据，则总共多少个个体的信息从</w:t>
+      </w:r>
+      <w:proofErr w:type="spellStart"/>
+      <w:r>
+        <w:rPr>
+          <w:rFonts w:hint="eastAsia"/>
+        </w:rPr>
+        <w:t>vcf</w:t>
+      </w:r>
+      <w:proofErr w:type="spellEnd"/>
+      <w:r>
+        <w:rPr>
+          <w:rFonts w:hint="eastAsia"/>
+        </w:rPr>
+        <w:t>的title中得知，在</w:t>
+      </w:r>
+      <w:proofErr w:type="spellStart"/>
+      <w:r>
+        <w:rPr>
+          <w:rFonts w:hint="eastAsia"/>
+        </w:rPr>
+        <w:t>vcf</w:t>
+      </w:r>
+      <w:proofErr w:type="spellEnd"/>
+      <w:r>
+        <w:rPr>
+          <w:rFonts w:hint="eastAsia"/>
+        </w:rPr>
+        <w:t>中，测到的AC等于个体数的话</w:t>
+      </w:r>
+      <w:proofErr w:type="gramStart"/>
+      <w:r>
+        <w:rPr>
+          <w:rFonts w:hint="eastAsia"/>
+        </w:rPr>
+        <w:t>则判断</w:t>
+      </w:r>
+      <w:proofErr w:type="gramEnd"/>
+      <w:r>
+        <w:rPr>
+          <w:rFonts w:hint="eastAsia"/>
+        </w:rPr>
+        <w:t>固定为alt，如果</w:t>
+      </w:r>
+      <w:proofErr w:type="spellStart"/>
+      <w:r>
+        <w:rPr>
+          <w:rFonts w:hint="eastAsia"/>
+        </w:rPr>
+        <w:t>vcf</w:t>
+      </w:r>
+      <w:proofErr w:type="spellEnd"/>
+      <w:r>
+        <w:rPr>
+          <w:rFonts w:hint="eastAsia"/>
+        </w:rPr>
+        <w:t>中没有该位点，</w:t>
+      </w:r>
+      <w:proofErr w:type="spellStart"/>
+      <w:r>
+        <w:rPr>
+          <w:rFonts w:hint="eastAsia"/>
+        </w:rPr>
+        <w:t>GATK.depth</w:t>
+      </w:r>
+      <w:proofErr w:type="spellEnd"/>
+      <w:r>
+        <w:rPr>
+          <w:rFonts w:hint="eastAsia"/>
+        </w:rPr>
+        <w:t>文件中每个个体的深度如果超过4，则判定为</w:t>
+      </w:r>
+      <w:proofErr w:type="gramStart"/>
+      <w:r>
+        <w:rPr>
+          <w:rFonts w:hint="eastAsia"/>
+        </w:rPr>
+        <w:t>固定位该</w:t>
+      </w:r>
+      <w:proofErr w:type="gramEnd"/>
+      <w:r>
+        <w:rPr>
+          <w:rFonts w:hint="eastAsia"/>
+        </w:rPr>
+        <w:t>位点。</w:t>
+      </w:r>
+    </w:p>
+    <w:p>
+      <w:r>
+        <w:rPr>
+          <w:rFonts w:hint="eastAsia"/>
+        </w:rPr>
+        <w:t>如果没有depth文件，则仅从</w:t>
+      </w:r>
+      <w:proofErr w:type="spellStart"/>
+      <w:r>
+        <w:rPr>
+          <w:rFonts w:hint="eastAsia"/>
+        </w:rPr>
+        <w:t>vcf</w:t>
+      </w:r>
+      <w:proofErr w:type="spellEnd"/>
+      <w:r>
+        <w:rPr>
+          <w:rFonts w:hint="eastAsia"/>
+        </w:rPr>
+        <w:t>中是否判定为固定（pool的话就是ref为0，</w:t>
+      </w:r>
+      <w:proofErr w:type="spellStart"/>
+      <w:r>
+        <w:rPr>
+          <w:rFonts w:hint="eastAsia"/>
+        </w:rPr>
+        <w:t>indvd</w:t>
+      </w:r>
+      <w:proofErr w:type="spellEnd"/>
+      <w:r>
+        <w:rPr>
+          <w:rFonts w:hint="eastAsia"/>
+        </w:rPr>
+        <w:t>的话就是ac=个体数），或有无该位点判断固定。</w:t>
       </w:r>
     </w:p>
     <w:p>
@@ -3855,53 +5137,131 @@
           <w:rFonts w:hint="eastAsia"/>
           <w:b/>
         </w:rPr>
-        <w:t>临时性添加了Caculate_df的功能，此种情况下只提供一个vcf文件，但要提供两个群体名列表文件，对应vcf文件的title。当不指定-f 参数时则不影响原来计算hp的功能。</w:t>
-      </w:r>
-    </w:p>
-    <w:p>
-      <w:pPr>
-        <w:rPr>
+        <w:t>临时性添加了</w:t>
+      </w:r>
+      <w:proofErr w:type="spellStart"/>
+      <w:r>
+        <w:rPr>
+          <w:rFonts w:hint="eastAsia"/>
           <w:b/>
         </w:rPr>
-      </w:pPr>
-    </w:p>
-    <w:p>
-      <w:pPr>
-        <w:rPr>
+        <w:t>Caculate_df</w:t>
+      </w:r>
+      <w:proofErr w:type="spellEnd"/>
+      <w:r>
+        <w:rPr>
+          <w:rFonts w:hint="eastAsia"/>
           <w:b/>
         </w:rPr>
-      </w:pPr>
+        <w:t>的功能，此种情况下只提供一个</w:t>
+      </w:r>
+      <w:proofErr w:type="spellStart"/>
       <w:r>
         <w:rPr>
           <w:rFonts w:hint="eastAsia"/>
           <w:b/>
         </w:rPr>
-        <w:t>使用多sql的示例</w:t>
-      </w:r>
-    </w:p>
-    <w:p>
-      <w:pPr>
-        <w:rPr>
+        <w:t>vcf</w:t>
+      </w:r>
+      <w:proofErr w:type="spellEnd"/>
+      <w:r>
+        <w:rPr>
+          <w:rFonts w:hint="eastAsia"/>
           <w:b/>
         </w:rPr>
-      </w:pPr>
-      <w:r>
-        <w:rPr>
+        <w:t>文件，但要提供两个群体名列表文件，对应</w:t>
+      </w:r>
+      <w:proofErr w:type="spellStart"/>
+      <w:r>
+        <w:rPr>
+          <w:rFonts w:hint="eastAsia"/>
           <w:b/>
         </w:rPr>
-        <w:t>&gt;&gt;&gt; dbvariantstools.operateDB("insert",*l,data=[('KB742382.1',26,".","AAA","bbb","p"),('KB742382.1',27,".","f","l","123,0")])</w:t>
-      </w:r>
-    </w:p>
-    <w:p>
-      <w:pPr>
-        <w:rPr>
+        <w:t>vcf</w:t>
+      </w:r>
+      <w:proofErr w:type="spellEnd"/>
+      <w:r>
+        <w:rPr>
+          <w:rFonts w:hint="eastAsia"/>
           <w:b/>
         </w:rPr>
-      </w:pPr>
-      <w:r>
+        <w:t>文件的title。当不指定-f 参数时则不影响原来计算hp的功能。</w:t>
+      </w:r>
+    </w:p>
+    <w:p>
+      <w:pPr>
         <w:rPr>
           <w:b/>
         </w:rPr>
+      </w:pPr>
+    </w:p>
+    <w:p>
+      <w:pPr>
+        <w:rPr>
+          <w:b/>
+        </w:rPr>
+      </w:pPr>
+      <w:r>
+        <w:rPr>
+          <w:rFonts w:hint="eastAsia"/>
+          <w:b/>
+        </w:rPr>
+        <w:t>使用多</w:t>
+      </w:r>
+      <w:proofErr w:type="spellStart"/>
+      <w:r>
+        <w:rPr>
+          <w:rFonts w:hint="eastAsia"/>
+          <w:b/>
+        </w:rPr>
+        <w:t>sql</w:t>
+      </w:r>
+      <w:proofErr w:type="spellEnd"/>
+      <w:r>
+        <w:rPr>
+          <w:rFonts w:hint="eastAsia"/>
+          <w:b/>
+        </w:rPr>
+        <w:t>的示例</w:t>
+      </w:r>
+    </w:p>
+    <w:p>
+      <w:pPr>
+        <w:rPr>
+          <w:b/>
+        </w:rPr>
+      </w:pPr>
+      <w:r>
+        <w:rPr>
+          <w:b/>
+        </w:rPr>
+        <w:t xml:space="preserve">&gt;&gt;&gt; </w:t>
+      </w:r>
+      <w:proofErr w:type="gramStart"/>
+      <w:r>
+        <w:rPr>
+          <w:b/>
+        </w:rPr>
+        <w:t>dbvariantstools.operateDB</w:t>
+      </w:r>
+      <w:proofErr w:type="gramEnd"/>
+      <w:r>
+        <w:rPr>
+          <w:b/>
+        </w:rPr>
+        <w:t>("insert",*l,data=[('KB742382.1',26,".","AAA","bbb","p"),('KB742382.1',27,".","f","l","123,0")])</w:t>
+      </w:r>
+    </w:p>
+    <w:p>
+      <w:pPr>
+        <w:rPr>
+          <w:b/>
+        </w:rPr>
+      </w:pPr>
+      <w:r>
+        <w:rPr>
+          <w:b/>
+        </w:rPr>
         <w:t>0</w:t>
       </w:r>
     </w:p>
@@ -3915,7 +5275,49 @@
         <w:rPr>
           <w:b/>
         </w:rPr>
-        <w:t>&gt;&gt;&gt; l=["insert into mspsgjlksy10pop_toplevel_pekingduckref_new(chrID,snp_pos,snpID,ref_base,alt_base,wegeon__pool_withindel_vcf_alt) VALUES(%s,%s,%s,%s,%s,%s)","insert into mspsgjlksy10pop_toplevel_pekingduckref_new(chrID,snp_pos,snpID,ref_base,alt_base,wegeon__pool_withindel_vcf_dep) VALUES(%s,%s,%s,%s,%s,%s)"]</w:t>
+        <w:t>&gt;&gt;&gt; l</w:t>
+      </w:r>
+      <w:proofErr w:type="gramStart"/>
+      <w:r>
+        <w:rPr>
+          <w:b/>
+        </w:rPr>
+        <w:t>=[</w:t>
+      </w:r>
+      <w:proofErr w:type="gramEnd"/>
+      <w:r>
+        <w:rPr>
+          <w:b/>
+        </w:rPr>
+        <w:t>"insert into mspsgjlksy10pop_toplevel_pekingduckref_new(chrID,snp_pos,snpID,ref_base,alt_base,wegeon__pool_withindel_vcf_alt) VALUES(%</w:t>
+      </w:r>
+      <w:proofErr w:type="spellStart"/>
+      <w:r>
+        <w:rPr>
+          <w:b/>
+        </w:rPr>
+        <w:t>s,%s,%s,%s,%s,%s</w:t>
+      </w:r>
+      <w:proofErr w:type="spellEnd"/>
+      <w:r>
+        <w:rPr>
+          <w:b/>
+        </w:rPr>
+        <w:t>)","insert into mspsgjlksy10pop_toplevel_pekingduckref_new(chrID,snp_pos,snpID,ref_base,alt_base,wegeon__pool_withindel_vcf_dep) VALUES(%</w:t>
+      </w:r>
+      <w:proofErr w:type="spellStart"/>
+      <w:r>
+        <w:rPr>
+          <w:b/>
+        </w:rPr>
+        <w:t>s,%s,%s,%s,%s,%s</w:t>
+      </w:r>
+      <w:proofErr w:type="spellEnd"/>
+      <w:r>
+        <w:rPr>
+          <w:b/>
+        </w:rPr>
+        <w:t>)"]</w:t>
       </w:r>
     </w:p>
     <w:p>
@@ -3924,6 +5326,7 @@
           <w:color w:val="000000" w:themeColor="text1"/>
         </w:rPr>
       </w:pPr>
+      <w:proofErr w:type="spellStart"/>
       <w:r>
         <w:rPr>
           <w:rFonts w:ascii="Consolas" w:hAnsi="Consolas" w:cs="Consolas"/>
@@ -3936,6 +5339,7 @@
         <w:lastRenderedPageBreak/>
         <w:t>generateIndexByChrom</w:t>
       </w:r>
+      <w:proofErr w:type="spellEnd"/>
       <w:r>
         <w:rPr>
           <w:rFonts w:ascii="Consolas" w:hAnsi="Consolas" w:cs="Consolas" w:hint="eastAsia"/>
@@ -3969,6 +5373,7 @@
         </w:rPr>
         <w:t xml:space="preserve"> </w:t>
       </w:r>
+      <w:proofErr w:type="spellStart"/>
       <w:r>
         <w:rPr>
           <w:rFonts w:ascii="Consolas" w:hAnsi="Consolas" w:cs="Consolas"/>
@@ -3980,6 +5385,7 @@
         </w:rPr>
         <w:t>generateFasterRefIndex</w:t>
       </w:r>
+      <w:proofErr w:type="spellEnd"/>
       <w:r>
         <w:rPr>
           <w:rFonts w:ascii="Consolas" w:hAnsi="Consolas" w:cs="Consolas" w:hint="eastAsia"/>

</xml_diff>

<commit_message>
correct, not cope with the subtree issues,then extract necessary info
</commit_message>
<xml_diff>
--- a/life文档.docx
+++ b/life文档.docx
@@ -5,6 +5,23 @@
     <w:p>
       <w:pPr>
         <w:rPr>
+          <w:rFonts w:ascii="Times New Roman" w:hAnsi="Times New Roman" w:cs="Times New Roman"/>
+          <w:sz w:val="24"/>
+          <w:szCs w:val="24"/>
+        </w:rPr>
+      </w:pPr>
+      <w:r>
+        <w:rPr>
+          <w:rFonts w:ascii="Times New Roman" w:hAnsi="Times New Roman" w:cs="Times New Roman"/>
+          <w:sz w:val="24"/>
+          <w:szCs w:val="24"/>
+        </w:rPr>
+        <w:t>seq_rec=AlignIO.parse(sf,'phylip').__next__()</w:t>
+      </w:r>
+    </w:p>
+    <w:p>
+      <w:pPr>
+        <w:rPr>
           <w:rFonts w:ascii="宋体" w:eastAsia="宋体" w:hAnsi="宋体" w:cs="Times New Roman"/>
           <w:sz w:val="24"/>
           <w:szCs w:val="24"/>
@@ -16,51 +33,198 @@
           <w:sz w:val="24"/>
           <w:szCs w:val="24"/>
         </w:rPr>
-        <w:t>print(</w:t>
-      </w:r>
-      <w:proofErr w:type="spellStart"/>
-      <w:r>
+        <w:t>print(seq_rec,CD_sites_idx</w:t>
+      </w:r>
+      <w:r>
+        <w:rPr>
+          <w:rFonts w:ascii="宋体" w:eastAsia="宋体" w:hAnsi="宋体" w:cs="Times New Roman"/>
+          <w:sz w:val="24"/>
+          <w:szCs w:val="24"/>
+        </w:rPr>
+        <w:t>)</w:t>
+      </w:r>
+      <w:r>
+        <w:rPr>
+          <w:rFonts w:ascii="宋体" w:eastAsia="宋体" w:hAnsi="宋体" w:cs="Times New Roman"/>
+          <w:sz w:val="24"/>
+          <w:szCs w:val="24"/>
+        </w:rPr>
+        <w:t>#</w:t>
+      </w:r>
+      <w:r>
+        <w:rPr>
+          <w:rFonts w:ascii="宋体" w:eastAsia="宋体" w:hAnsi="宋体" w:cs="Times New Roman" w:hint="eastAsia"/>
+          <w:sz w:val="24"/>
+          <w:szCs w:val="24"/>
+        </w:rPr>
+        <w:t>打印结果为：</w:t>
+      </w:r>
+    </w:p>
+    <w:p>
+      <w:pPr>
+        <w:rPr>
+          <w:rFonts w:ascii="宋体" w:eastAsia="宋体" w:hAnsi="宋体" w:cs="Times New Roman" w:hint="eastAsia"/>
+          <w:sz w:val="24"/>
+          <w:szCs w:val="24"/>
+        </w:rPr>
+      </w:pPr>
+      <w:r>
+        <w:rPr>
+          <w:noProof/>
+        </w:rPr>
+        <w:drawing>
+          <wp:inline distT="0" distB="0" distL="0" distR="0" wp14:anchorId="7E6908F8" wp14:editId="248E75B7">
+            <wp:extent cx="8863330" cy="2503170"/>
+            <wp:effectExtent l="0" t="0" r="0" b="0"/>
+            <wp:docPr id="1" name="图片 1"/>
+            <wp:cNvGraphicFramePr>
+              <a:graphicFrameLocks xmlns:a="http://schemas.openxmlformats.org/drawingml/2006/main" noChangeAspect="1"/>
+            </wp:cNvGraphicFramePr>
+            <a:graphic xmlns:a="http://schemas.openxmlformats.org/drawingml/2006/main">
+              <a:graphicData uri="http://schemas.openxmlformats.org/drawingml/2006/picture">
+                <pic:pic xmlns:pic="http://schemas.openxmlformats.org/drawingml/2006/picture">
+                  <pic:nvPicPr>
+                    <pic:cNvPr id="1" name=""/>
+                    <pic:cNvPicPr/>
+                  </pic:nvPicPr>
+                  <pic:blipFill>
+                    <a:blip r:embed="rId8"/>
+                    <a:stretch>
+                      <a:fillRect/>
+                    </a:stretch>
+                  </pic:blipFill>
+                  <pic:spPr>
+                    <a:xfrm>
+                      <a:off x="0" y="0"/>
+                      <a:ext cx="8863330" cy="2503170"/>
+                    </a:xfrm>
+                    <a:prstGeom prst="rect">
+                      <a:avLst/>
+                    </a:prstGeom>
+                  </pic:spPr>
+                </pic:pic>
+              </a:graphicData>
+            </a:graphic>
+          </wp:inline>
+        </w:drawing>
+      </w:r>
+    </w:p>
+    <w:p>
+      <w:pPr>
+        <w:rPr>
+          <w:rFonts w:ascii="宋体" w:eastAsia="宋体" w:hAnsi="宋体" w:cs="Times New Roman"/>
+          <w:sz w:val="24"/>
+          <w:szCs w:val="24"/>
+        </w:rPr>
+      </w:pPr>
+    </w:p>
+    <w:p>
+      <w:pPr>
+        <w:rPr>
+          <w:rFonts w:ascii="宋体" w:eastAsia="宋体" w:hAnsi="宋体" w:cs="Times New Roman"/>
+          <w:sz w:val="24"/>
+          <w:szCs w:val="24"/>
+        </w:rPr>
+      </w:pPr>
+    </w:p>
+    <w:p>
+      <w:pPr>
+        <w:rPr>
+          <w:rFonts w:ascii="宋体" w:eastAsia="宋体" w:hAnsi="宋体" w:cs="Times New Roman"/>
+          <w:sz w:val="24"/>
+          <w:szCs w:val="24"/>
+        </w:rPr>
+      </w:pPr>
+    </w:p>
+    <w:p>
+      <w:pPr>
+        <w:rPr>
+          <w:rFonts w:ascii="宋体" w:eastAsia="宋体" w:hAnsi="宋体" w:cs="Times New Roman"/>
+          <w:sz w:val="24"/>
+          <w:szCs w:val="24"/>
+        </w:rPr>
+      </w:pPr>
+    </w:p>
+    <w:p>
+      <w:pPr>
+        <w:rPr>
+          <w:rFonts w:ascii="宋体" w:eastAsia="宋体" w:hAnsi="宋体" w:cs="Times New Roman"/>
+          <w:sz w:val="24"/>
+          <w:szCs w:val="24"/>
+        </w:rPr>
+      </w:pPr>
+    </w:p>
+    <w:p>
+      <w:pPr>
+        <w:rPr>
+          <w:rFonts w:ascii="宋体" w:eastAsia="宋体" w:hAnsi="宋体" w:cs="Times New Roman"/>
+          <w:sz w:val="24"/>
+          <w:szCs w:val="24"/>
+        </w:rPr>
+      </w:pPr>
+    </w:p>
+    <w:p>
+      <w:pPr>
+        <w:rPr>
+          <w:rFonts w:ascii="宋体" w:eastAsia="宋体" w:hAnsi="宋体" w:cs="Times New Roman"/>
+          <w:sz w:val="24"/>
+          <w:szCs w:val="24"/>
+        </w:rPr>
+      </w:pPr>
+    </w:p>
+    <w:p>
+      <w:pPr>
+        <w:rPr>
+          <w:rFonts w:ascii="宋体" w:eastAsia="宋体" w:hAnsi="宋体" w:cs="Times New Roman"/>
+          <w:sz w:val="24"/>
+          <w:szCs w:val="24"/>
+        </w:rPr>
+      </w:pPr>
+    </w:p>
+    <w:p>
+      <w:pPr>
+        <w:rPr>
+          <w:rFonts w:ascii="宋体" w:eastAsia="宋体" w:hAnsi="宋体" w:cs="Times New Roman"/>
+          <w:sz w:val="24"/>
+          <w:szCs w:val="24"/>
+        </w:rPr>
+      </w:pPr>
+    </w:p>
+    <w:p>
+      <w:pPr>
+        <w:rPr>
+          <w:rFonts w:ascii="宋体" w:eastAsia="宋体" w:hAnsi="宋体" w:cs="Times New Roman"/>
+          <w:sz w:val="24"/>
+          <w:szCs w:val="24"/>
+        </w:rPr>
+      </w:pPr>
+    </w:p>
+    <w:p>
+      <w:pPr>
+        <w:rPr>
+          <w:rFonts w:ascii="宋体" w:eastAsia="宋体" w:hAnsi="宋体" w:cs="Times New Roman" w:hint="eastAsia"/>
+          <w:sz w:val="24"/>
+          <w:szCs w:val="24"/>
+        </w:rPr>
+      </w:pPr>
+    </w:p>
+    <w:p>
+      <w:pPr>
         <w:rPr>
           <w:rFonts w:ascii="Times New Roman" w:hAnsi="Times New Roman" w:cs="Times New Roman"/>
           <w:sz w:val="24"/>
           <w:szCs w:val="24"/>
         </w:rPr>
-        <w:t>seq_rec,CD_sites_idx</w:t>
-      </w:r>
-      <w:proofErr w:type="spellEnd"/>
-      <w:r>
-        <w:rPr>
-          <w:rFonts w:ascii="宋体" w:eastAsia="宋体" w:hAnsi="宋体" w:cs="Times New Roman"/>
-          <w:sz w:val="24"/>
-          <w:szCs w:val="24"/>
-        </w:rPr>
-        <w:t>)</w:t>
-      </w:r>
-      <w:r>
-        <w:rPr>
-          <w:rFonts w:ascii="宋体" w:eastAsia="宋体" w:hAnsi="宋体" w:cs="Times New Roman"/>
-          <w:sz w:val="24"/>
-          <w:szCs w:val="24"/>
-        </w:rPr>
-        <w:t>#</w:t>
-      </w:r>
-      <w:r>
-        <w:rPr>
-          <w:rFonts w:ascii="宋体" w:eastAsia="宋体" w:hAnsi="宋体" w:cs="Times New Roman" w:hint="eastAsia"/>
-          <w:sz w:val="24"/>
-          <w:szCs w:val="24"/>
-        </w:rPr>
-        <w:t>打印结果为：</w:t>
-      </w:r>
-    </w:p>
-    <w:p>
-      <w:pPr>
-        <w:rPr>
-          <w:rFonts w:ascii="宋体" w:eastAsia="宋体" w:hAnsi="宋体" w:cs="Times New Roman"/>
-          <w:sz w:val="24"/>
-          <w:szCs w:val="24"/>
-        </w:rPr>
-      </w:pPr>
+      </w:pPr>
+      <w:r>
+        <w:rPr>
+          <w:rFonts w:ascii="Times New Roman" w:hAnsi="Times New Roman" w:cs="Times New Roman"/>
+          <w:sz w:val="24"/>
+          <w:szCs w:val="24"/>
+        </w:rPr>
+        <w:lastRenderedPageBreak/>
+        <w:t>tlist.append(list(treeWithNodeLables.find_clades(name=r"\d*_"+targetSpeciesName))[0])</w:t>
+      </w:r>
     </w:p>
     <w:p>
       <w:pPr>
@@ -70,6 +234,46 @@
           <w:szCs w:val="24"/>
         </w:rPr>
       </w:pPr>
+      <w:r>
+        <w:rPr>
+          <w:noProof/>
+        </w:rPr>
+        <w:drawing>
+          <wp:inline distT="0" distB="0" distL="0" distR="0" wp14:anchorId="759B3A55" wp14:editId="69987137">
+            <wp:extent cx="8863330" cy="3240405"/>
+            <wp:effectExtent l="0" t="0" r="0" b="0"/>
+            <wp:docPr id="2" name="图片 2"/>
+            <wp:cNvGraphicFramePr>
+              <a:graphicFrameLocks xmlns:a="http://schemas.openxmlformats.org/drawingml/2006/main" noChangeAspect="1"/>
+            </wp:cNvGraphicFramePr>
+            <a:graphic xmlns:a="http://schemas.openxmlformats.org/drawingml/2006/main">
+              <a:graphicData uri="http://schemas.openxmlformats.org/drawingml/2006/picture">
+                <pic:pic xmlns:pic="http://schemas.openxmlformats.org/drawingml/2006/picture">
+                  <pic:nvPicPr>
+                    <pic:cNvPr id="1" name=""/>
+                    <pic:cNvPicPr/>
+                  </pic:nvPicPr>
+                  <pic:blipFill>
+                    <a:blip r:embed="rId9"/>
+                    <a:stretch>
+                      <a:fillRect/>
+                    </a:stretch>
+                  </pic:blipFill>
+                  <pic:spPr>
+                    <a:xfrm>
+                      <a:off x="0" y="0"/>
+                      <a:ext cx="8863330" cy="3240405"/>
+                    </a:xfrm>
+                    <a:prstGeom prst="rect">
+                      <a:avLst/>
+                    </a:prstGeom>
+                  </pic:spPr>
+                </pic:pic>
+              </a:graphicData>
+            </a:graphic>
+          </wp:inline>
+        </w:drawing>
+      </w:r>
     </w:p>
     <w:p>
       <w:pPr>
@@ -79,6 +283,46 @@
           <w:szCs w:val="24"/>
         </w:rPr>
       </w:pPr>
+      <w:r>
+        <w:rPr>
+          <w:noProof/>
+        </w:rPr>
+        <w:drawing>
+          <wp:inline distT="0" distB="0" distL="0" distR="0" wp14:anchorId="147CFB08" wp14:editId="5C3D705C">
+            <wp:extent cx="8863330" cy="1282065"/>
+            <wp:effectExtent l="0" t="0" r="0" b="0"/>
+            <wp:docPr id="3" name="图片 3"/>
+            <wp:cNvGraphicFramePr>
+              <a:graphicFrameLocks xmlns:a="http://schemas.openxmlformats.org/drawingml/2006/main" noChangeAspect="1"/>
+            </wp:cNvGraphicFramePr>
+            <a:graphic xmlns:a="http://schemas.openxmlformats.org/drawingml/2006/main">
+              <a:graphicData uri="http://schemas.openxmlformats.org/drawingml/2006/picture">
+                <pic:pic xmlns:pic="http://schemas.openxmlformats.org/drawingml/2006/picture">
+                  <pic:nvPicPr>
+                    <pic:cNvPr id="1" name=""/>
+                    <pic:cNvPicPr/>
+                  </pic:nvPicPr>
+                  <pic:blipFill>
+                    <a:blip r:embed="rId10"/>
+                    <a:stretch>
+                      <a:fillRect/>
+                    </a:stretch>
+                  </pic:blipFill>
+                  <pic:spPr>
+                    <a:xfrm>
+                      <a:off x="0" y="0"/>
+                      <a:ext cx="8863330" cy="1282065"/>
+                    </a:xfrm>
+                    <a:prstGeom prst="rect">
+                      <a:avLst/>
+                    </a:prstGeom>
+                  </pic:spPr>
+                </pic:pic>
+              </a:graphicData>
+            </a:graphic>
+          </wp:inline>
+        </w:drawing>
+      </w:r>
     </w:p>
     <w:p>
       <w:pPr>
@@ -113,16 +357,15 @@
           <w:szCs w:val="24"/>
         </w:rPr>
       </w:pPr>
-      <w:proofErr w:type="spellStart"/>
       <w:r>
         <w:rPr>
           <w:rFonts w:ascii="Times New Roman" w:hAnsi="Times New Roman" w:cs="Times New Roman"/>
           <w:sz w:val="24"/>
           <w:szCs w:val="24"/>
         </w:rPr>
+        <w:lastRenderedPageBreak/>
         <w:t>VCFutil.VCF_Data</w:t>
       </w:r>
-      <w:proofErr w:type="spellEnd"/>
     </w:p>
     <w:p>
       <w:pPr>
@@ -337,7 +580,6 @@
             </w:pPr>
             <w:bookmarkStart w:id="0" w:name="OLE_LINK1"/>
             <w:bookmarkStart w:id="1" w:name="OLE_LINK2"/>
-            <w:proofErr w:type="spellStart"/>
             <w:r>
               <w:rPr>
                 <w:rFonts w:ascii="Times New Roman" w:hAnsi="Times New Roman" w:cs="Times New Roman"/>
@@ -352,16 +594,7 @@
                 <w:sz w:val="24"/>
                 <w:szCs w:val="24"/>
               </w:rPr>
-              <w:t>a</w:t>
-            </w:r>
-            <w:proofErr w:type="spellEnd"/>
-            <w:r>
-              <w:rPr>
-                <w:rFonts w:ascii="Times New Roman" w:hAnsi="Times New Roman" w:cs="Times New Roman"/>
-                <w:sz w:val="24"/>
-                <w:szCs w:val="24"/>
-              </w:rPr>
-              <w:t>()</w:t>
+              <w:t>a()</w:t>
             </w:r>
             <w:bookmarkEnd w:id="0"/>
             <w:bookmarkEnd w:id="1"/>
@@ -401,18 +634,8 @@
                 <w:sz w:val="24"/>
                 <w:szCs w:val="24"/>
               </w:rPr>
-              <w:t xml:space="preserve">from </w:t>
-            </w:r>
-            <w:proofErr w:type="spellStart"/>
-            <w:r>
-              <w:rPr>
-                <w:rFonts w:ascii="Times New Roman" w:hAnsi="Times New Roman" w:cs="Times New Roman"/>
-                <w:sz w:val="24"/>
-                <w:szCs w:val="24"/>
-              </w:rPr>
-              <w:t>NGS.BasicUtil</w:t>
-            </w:r>
-            <w:proofErr w:type="spellEnd"/>
+              <w:t xml:space="preserve">from NGS.BasicUtil import </w:t>
+            </w:r>
             <w:r>
               <w:rPr>
                 <w:rFonts w:ascii="Times New Roman" w:hAnsi="Times New Roman" w:cs="Times New Roman"/>
@@ -421,24 +644,6 @@
               </w:rPr>
               <w:t xml:space="preserve"> </w:t>
             </w:r>
-            <w:proofErr w:type="gramStart"/>
-            <w:r>
-              <w:rPr>
-                <w:rFonts w:ascii="Times New Roman" w:hAnsi="Times New Roman" w:cs="Times New Roman"/>
-                <w:sz w:val="24"/>
-                <w:szCs w:val="24"/>
-              </w:rPr>
-              <w:t xml:space="preserve">import </w:t>
-            </w:r>
-            <w:r>
-              <w:rPr>
-                <w:rFonts w:ascii="Times New Roman" w:hAnsi="Times New Roman" w:cs="Times New Roman"/>
-                <w:sz w:val="24"/>
-                <w:szCs w:val="24"/>
-              </w:rPr>
-              <w:t xml:space="preserve"> </w:t>
-            </w:r>
-            <w:proofErr w:type="spellStart"/>
             <w:r>
               <w:rPr>
                 <w:rFonts w:ascii="Times New Roman" w:hAnsi="Times New Roman" w:cs="Times New Roman"/>
@@ -447,8 +652,6 @@
               </w:rPr>
               <w:t>VCFutil</w:t>
             </w:r>
-            <w:proofErr w:type="spellEnd"/>
-            <w:proofErr w:type="gramEnd"/>
           </w:p>
         </w:tc>
         <w:tc>
@@ -471,7 +674,6 @@
               </w:rPr>
               <w:t>初始化参数为</w:t>
             </w:r>
-            <w:proofErr w:type="spellStart"/>
             <w:r>
               <w:rPr>
                 <w:rFonts w:ascii="Times New Roman" w:hAnsi="Times New Roman" w:cs="Times New Roman" w:hint="eastAsia"/>
@@ -488,7 +690,6 @@
               </w:rPr>
               <w:t>cf</w:t>
             </w:r>
-            <w:proofErr w:type="spellEnd"/>
             <w:r>
               <w:rPr>
                 <w:rFonts w:ascii="Times New Roman" w:hAnsi="Times New Roman" w:cs="Times New Roman" w:hint="eastAsia"/>
@@ -519,7 +720,6 @@
               </w:rPr>
               <w:t>将</w:t>
             </w:r>
-            <w:proofErr w:type="spellStart"/>
             <w:r>
               <w:rPr>
                 <w:rFonts w:ascii="Times New Roman" w:hAnsi="Times New Roman" w:cs="Times New Roman" w:hint="eastAsia"/>
@@ -536,7 +736,6 @@
               </w:rPr>
               <w:t>cf</w:t>
             </w:r>
-            <w:proofErr w:type="spellEnd"/>
             <w:r>
               <w:rPr>
                 <w:rFonts w:ascii="Times New Roman" w:hAnsi="Times New Roman" w:cs="Times New Roman" w:hint="eastAsia"/>
@@ -545,7 +744,6 @@
               </w:rPr>
               <w:t>文件加载到内存，如果第一次加载某个</w:t>
             </w:r>
-            <w:proofErr w:type="spellStart"/>
             <w:r>
               <w:rPr>
                 <w:rFonts w:ascii="Times New Roman" w:hAnsi="Times New Roman" w:cs="Times New Roman" w:hint="eastAsia"/>
@@ -562,7 +760,6 @@
               </w:rPr>
               <w:t>cf</w:t>
             </w:r>
-            <w:proofErr w:type="spellEnd"/>
             <w:r>
               <w:rPr>
                 <w:rFonts w:ascii="Times New Roman" w:hAnsi="Times New Roman" w:cs="Times New Roman" w:hint="eastAsia"/>
@@ -571,7 +768,6 @@
               </w:rPr>
               <w:t>文件会自动简历索引文件，要求</w:t>
             </w:r>
-            <w:proofErr w:type="spellStart"/>
             <w:r>
               <w:rPr>
                 <w:rFonts w:ascii="Times New Roman" w:hAnsi="Times New Roman" w:cs="Times New Roman" w:hint="eastAsia"/>
@@ -588,7 +784,6 @@
               </w:rPr>
               <w:t>cf</w:t>
             </w:r>
-            <w:proofErr w:type="spellEnd"/>
             <w:r>
               <w:rPr>
                 <w:rFonts w:ascii="Times New Roman" w:hAnsi="Times New Roman" w:cs="Times New Roman" w:hint="eastAsia"/>
@@ -632,7 +827,6 @@
                 <w:szCs w:val="24"/>
               </w:rPr>
             </w:pPr>
-            <w:proofErr w:type="spellStart"/>
             <w:r>
               <w:rPr>
                 <w:rFonts w:ascii="Times New Roman" w:hAnsi="Times New Roman" w:cs="Times New Roman"/>
@@ -641,7 +835,6 @@
               </w:rPr>
               <w:t>getVcfListByChrom</w:t>
             </w:r>
-            <w:proofErr w:type="spellEnd"/>
           </w:p>
         </w:tc>
         <w:tc>
@@ -664,7 +857,6 @@
               </w:rPr>
               <w:t>通过</w:t>
             </w:r>
-            <w:proofErr w:type="spellStart"/>
             <w:r>
               <w:rPr>
                 <w:rFonts w:ascii="Times New Roman" w:hAnsi="Times New Roman" w:cs="Times New Roman"/>
@@ -673,7 +865,6 @@
               </w:rPr>
               <w:t>VCF_Data</w:t>
             </w:r>
-            <w:proofErr w:type="spellEnd"/>
             <w:r>
               <w:rPr>
                 <w:rFonts w:ascii="Times New Roman" w:hAnsi="Times New Roman" w:cs="Times New Roman" w:hint="eastAsia"/>
@@ -696,7 +887,6 @@
                 <w:szCs w:val="24"/>
               </w:rPr>
             </w:pPr>
-            <w:proofErr w:type="spellStart"/>
             <w:r>
               <w:rPr>
                 <w:rFonts w:ascii="Times New Roman" w:hAnsi="Times New Roman" w:cs="Times New Roman" w:hint="eastAsia"/>
@@ -713,7 +903,6 @@
               </w:rPr>
               <w:t>hrom</w:t>
             </w:r>
-            <w:proofErr w:type="spellEnd"/>
             <w:r>
               <w:rPr>
                 <w:rFonts w:ascii="Times New Roman" w:hAnsi="Times New Roman" w:cs="Times New Roman" w:hint="eastAsia"/>
@@ -736,25 +925,7 @@
                 <w:sz w:val="24"/>
                 <w:szCs w:val="24"/>
               </w:rPr>
-              <w:t>,</w:t>
-            </w:r>
-            <w:proofErr w:type="spellStart"/>
-            <w:r>
-              <w:rPr>
-                <w:rFonts w:ascii="Times New Roman" w:hAnsi="Times New Roman" w:cs="Times New Roman"/>
-                <w:sz w:val="24"/>
-                <w:szCs w:val="24"/>
-              </w:rPr>
-              <w:t>startpos</w:t>
-            </w:r>
-            <w:proofErr w:type="spellEnd"/>
-            <w:r>
-              <w:rPr>
-                <w:rFonts w:ascii="Times New Roman" w:hAnsi="Times New Roman" w:cs="Times New Roman"/>
-                <w:sz w:val="24"/>
-                <w:szCs w:val="24"/>
-              </w:rPr>
-              <w:t>=</w:t>
+              <w:t>,startpos=</w:t>
             </w:r>
             <w:r>
               <w:rPr>
@@ -786,25 +957,7 @@
                 <w:sz w:val="24"/>
                 <w:szCs w:val="24"/>
               </w:rPr>
-              <w:t>,</w:t>
-            </w:r>
-            <w:proofErr w:type="spellStart"/>
-            <w:r>
-              <w:rPr>
-                <w:rFonts w:ascii="Times New Roman" w:hAnsi="Times New Roman" w:cs="Times New Roman"/>
-                <w:sz w:val="24"/>
-                <w:szCs w:val="24"/>
-              </w:rPr>
-              <w:t>endpos</w:t>
-            </w:r>
-            <w:proofErr w:type="spellEnd"/>
-            <w:r>
-              <w:rPr>
-                <w:rFonts w:ascii="Times New Roman" w:hAnsi="Times New Roman" w:cs="Times New Roman"/>
-                <w:sz w:val="24"/>
-                <w:szCs w:val="24"/>
-              </w:rPr>
-              <w:t>=</w:t>
+              <w:t>,endpos=</w:t>
             </w:r>
             <w:r>
               <w:rPr>
@@ -852,25 +1005,7 @@
                 <w:sz w:val="24"/>
                 <w:szCs w:val="24"/>
               </w:rPr>
-              <w:t xml:space="preserve">, </w:t>
-            </w:r>
-            <w:proofErr w:type="spellStart"/>
-            <w:r>
-              <w:rPr>
-                <w:rFonts w:ascii="Times New Roman" w:hAnsi="Times New Roman" w:cs="Times New Roman"/>
-                <w:sz w:val="24"/>
-                <w:szCs w:val="24"/>
-              </w:rPr>
-              <w:t>dilutetodensity</w:t>
-            </w:r>
-            <w:proofErr w:type="spellEnd"/>
-            <w:r>
-              <w:rPr>
-                <w:rFonts w:ascii="Times New Roman" w:hAnsi="Times New Roman" w:cs="Times New Roman"/>
-                <w:sz w:val="24"/>
-                <w:szCs w:val="24"/>
-              </w:rPr>
-              <w:t>=</w:t>
+              <w:t>, dilutetodensity=</w:t>
             </w:r>
             <w:r>
               <w:rPr>
@@ -942,60 +1077,15 @@
                 <w:sz w:val="24"/>
                 <w:szCs w:val="24"/>
               </w:rPr>
-              <w:t>参数只有一个允许为非默</w:t>
-            </w:r>
-            <w:r>
-              <w:rPr>
-                <w:rFonts w:ascii="Times New Roman" w:hAnsi="Times New Roman" w:cs="Times New Roman" w:hint="eastAsia"/>
-                <w:sz w:val="24"/>
-                <w:szCs w:val="24"/>
-              </w:rPr>
-              <w:lastRenderedPageBreak/>
-              <w:t>认值）</w:t>
-            </w:r>
-            <w:r>
-              <w:rPr>
-                <w:rFonts w:ascii="Times New Roman" w:hAnsi="Times New Roman" w:cs="Times New Roman"/>
-                <w:sz w:val="24"/>
-                <w:szCs w:val="24"/>
-              </w:rPr>
-              <w:t xml:space="preserve">, </w:t>
-            </w:r>
-            <w:proofErr w:type="spellStart"/>
-            <w:r>
-              <w:rPr>
-                <w:rFonts w:ascii="Times New Roman" w:hAnsi="Times New Roman" w:cs="Times New Roman"/>
-                <w:sz w:val="24"/>
-                <w:szCs w:val="24"/>
-              </w:rPr>
-              <w:t>posUniq</w:t>
-            </w:r>
-            <w:proofErr w:type="spellEnd"/>
-            <w:r>
-              <w:rPr>
-                <w:rFonts w:ascii="Times New Roman" w:hAnsi="Times New Roman" w:cs="Times New Roman"/>
-                <w:sz w:val="24"/>
-                <w:szCs w:val="24"/>
-              </w:rPr>
-              <w:t xml:space="preserve">=True, </w:t>
-            </w:r>
-            <w:proofErr w:type="spellStart"/>
-            <w:r>
-              <w:rPr>
-                <w:rFonts w:ascii="Times New Roman" w:hAnsi="Times New Roman" w:cs="Times New Roman"/>
-                <w:sz w:val="24"/>
-                <w:szCs w:val="24"/>
-              </w:rPr>
-              <w:t>considerINDELandmultpleallele</w:t>
-            </w:r>
-            <w:proofErr w:type="spellEnd"/>
-            <w:r>
-              <w:rPr>
-                <w:rFonts w:ascii="Times New Roman" w:hAnsi="Times New Roman" w:cs="Times New Roman"/>
-                <w:sz w:val="24"/>
-                <w:szCs w:val="24"/>
-              </w:rPr>
-              <w:t>=</w:t>
+              <w:t>参数只有一个允许为非默认值）</w:t>
+            </w:r>
+            <w:r>
+              <w:rPr>
+                <w:rFonts w:ascii="Times New Roman" w:hAnsi="Times New Roman" w:cs="Times New Roman"/>
+                <w:sz w:val="24"/>
+                <w:szCs w:val="24"/>
+              </w:rPr>
+              <w:t>, posUniq=True, considerINDELandmultpleallele=</w:t>
             </w:r>
             <w:r>
               <w:rPr>
@@ -1035,25 +1125,7 @@
                 <w:sz w:val="24"/>
                 <w:szCs w:val="24"/>
               </w:rPr>
-              <w:t>,</w:t>
-            </w:r>
-            <w:proofErr w:type="spellStart"/>
-            <w:r>
-              <w:rPr>
-                <w:rFonts w:ascii="Times New Roman" w:hAnsi="Times New Roman" w:cs="Times New Roman"/>
-                <w:sz w:val="24"/>
-                <w:szCs w:val="24"/>
-              </w:rPr>
-              <w:t>MQfilter</w:t>
-            </w:r>
-            <w:proofErr w:type="spellEnd"/>
-            <w:r>
-              <w:rPr>
-                <w:rFonts w:ascii="Times New Roman" w:hAnsi="Times New Roman" w:cs="Times New Roman"/>
-                <w:sz w:val="24"/>
-                <w:szCs w:val="24"/>
-              </w:rPr>
-              <w:t>=</w:t>
+              <w:t>,MQfilter=</w:t>
             </w:r>
             <w:r>
               <w:rPr>
@@ -1091,10 +1163,8 @@
                 <w:sz w:val="24"/>
                 <w:szCs w:val="24"/>
               </w:rPr>
-              <w:lastRenderedPageBreak/>
               <w:t>返回该</w:t>
             </w:r>
-            <w:proofErr w:type="spellStart"/>
             <w:r>
               <w:rPr>
                 <w:rFonts w:ascii="Times New Roman" w:hAnsi="Times New Roman" w:cs="Times New Roman" w:hint="eastAsia"/>
@@ -1111,34 +1181,14 @@
               </w:rPr>
               <w:t>cf</w:t>
             </w:r>
-            <w:proofErr w:type="spellEnd"/>
-            <w:r>
-              <w:rPr>
-                <w:rFonts w:ascii="Times New Roman" w:hAnsi="Times New Roman" w:cs="Times New Roman" w:hint="eastAsia"/>
-                <w:sz w:val="24"/>
-                <w:szCs w:val="24"/>
-              </w:rPr>
-              <w:t>文件的</w:t>
-            </w:r>
-            <w:proofErr w:type="gramStart"/>
-            <w:r>
-              <w:rPr>
-                <w:rFonts w:ascii="Times New Roman" w:hAnsi="Times New Roman" w:cs="Times New Roman" w:hint="eastAsia"/>
-                <w:sz w:val="24"/>
-                <w:szCs w:val="24"/>
-              </w:rPr>
-              <w:t>的</w:t>
-            </w:r>
-            <w:proofErr w:type="gramEnd"/>
-            <w:r>
-              <w:rPr>
-                <w:rFonts w:ascii="Times New Roman" w:hAnsi="Times New Roman" w:cs="Times New Roman" w:hint="eastAsia"/>
-                <w:sz w:val="24"/>
-                <w:szCs w:val="24"/>
-              </w:rPr>
-              <w:t>某一条染色体的全部记录或某一区段的记录，返回值为列表，元素为</w:t>
-            </w:r>
-            <w:proofErr w:type="spellStart"/>
+            <w:r>
+              <w:rPr>
+                <w:rFonts w:ascii="Times New Roman" w:hAnsi="Times New Roman" w:cs="Times New Roman" w:hint="eastAsia"/>
+                <w:sz w:val="24"/>
+                <w:szCs w:val="24"/>
+              </w:rPr>
+              <w:t>文件的的某一条染色体的全部记录或某一区段的记录，返回值为列表，元素为</w:t>
+            </w:r>
             <w:r>
               <w:rPr>
                 <w:rFonts w:ascii="Times New Roman" w:hAnsi="Times New Roman" w:cs="Times New Roman" w:hint="eastAsia"/>
@@ -1155,7 +1205,6 @@
               </w:rPr>
               <w:t>cf</w:t>
             </w:r>
-            <w:proofErr w:type="spellEnd"/>
             <w:r>
               <w:rPr>
                 <w:rFonts w:ascii="Times New Roman" w:hAnsi="Times New Roman" w:cs="Times New Roman" w:hint="eastAsia"/>
@@ -1227,25 +1276,16 @@
                 <w:sz w:val="24"/>
                 <w:szCs w:val="24"/>
               </w:rPr>
-              <w:t xml:space="preserve">from </w:t>
-            </w:r>
-            <w:proofErr w:type="spellStart"/>
-            <w:r>
-              <w:rPr>
-                <w:rFonts w:ascii="Times New Roman" w:hAnsi="Times New Roman" w:cs="Times New Roman"/>
-                <w:sz w:val="24"/>
-                <w:szCs w:val="24"/>
-              </w:rPr>
-              <w:t>NGS.BasicUtil</w:t>
-            </w:r>
-            <w:proofErr w:type="spellEnd"/>
-            <w:r>
-              <w:rPr>
-                <w:rFonts w:ascii="Times New Roman" w:hAnsi="Times New Roman" w:cs="Times New Roman"/>
-                <w:sz w:val="24"/>
-                <w:szCs w:val="24"/>
-              </w:rPr>
-              <w:t xml:space="preserve"> import</w:t>
+              <w:t xml:space="preserve">from NGS.BasicUtil </w:t>
+            </w:r>
+            <w:r>
+              <w:rPr>
+                <w:rFonts w:ascii="Times New Roman" w:hAnsi="Times New Roman" w:cs="Times New Roman"/>
+                <w:sz w:val="24"/>
+                <w:szCs w:val="24"/>
+              </w:rPr>
+              <w:lastRenderedPageBreak/>
+              <w:t>import</w:t>
             </w:r>
             <w:r>
               <w:rPr>
@@ -1305,18 +1345,17 @@
                 <w:sz w:val="24"/>
                 <w:szCs w:val="24"/>
               </w:rPr>
-              <w:t>该实例化对象可以用来调用相关函数进行</w:t>
-            </w:r>
-            <w:proofErr w:type="gramStart"/>
-            <w:r>
-              <w:rPr>
-                <w:rFonts w:ascii="Times New Roman" w:hAnsi="Times New Roman" w:cs="Times New Roman" w:hint="eastAsia"/>
-                <w:sz w:val="24"/>
-                <w:szCs w:val="24"/>
-              </w:rPr>
-              <w:t>滑窗操作</w:t>
-            </w:r>
-            <w:proofErr w:type="gramEnd"/>
+              <w:t>该实例化对象可以用来调用相关</w:t>
+            </w:r>
+            <w:r>
+              <w:rPr>
+                <w:rFonts w:ascii="Times New Roman" w:hAnsi="Times New Roman" w:cs="Times New Roman" w:hint="eastAsia"/>
+                <w:sz w:val="24"/>
+                <w:szCs w:val="24"/>
+              </w:rPr>
+              <w:lastRenderedPageBreak/>
+              <w:t>函数进行滑窗操作</w:t>
+            </w:r>
           </w:p>
         </w:tc>
       </w:tr>
@@ -1336,16 +1375,15 @@
                 <w:szCs w:val="24"/>
               </w:rPr>
             </w:pPr>
-            <w:proofErr w:type="spellStart"/>
-            <w:r>
-              <w:rPr>
-                <w:rFonts w:ascii="Times New Roman" w:hAnsi="Times New Roman" w:cs="Times New Roman"/>
-                <w:sz w:val="24"/>
-                <w:szCs w:val="24"/>
-              </w:rPr>
+            <w:r>
+              <w:rPr>
+                <w:rFonts w:ascii="Times New Roman" w:hAnsi="Times New Roman" w:cs="Times New Roman"/>
+                <w:sz w:val="24"/>
+                <w:szCs w:val="24"/>
+              </w:rPr>
+              <w:lastRenderedPageBreak/>
               <w:t>slidWindowOverlap</w:t>
             </w:r>
-            <w:proofErr w:type="spellEnd"/>
           </w:p>
         </w:tc>
         <w:tc>
@@ -1430,7 +1468,6 @@
               </w:rPr>
               <w:t>顺序排列的列表（如：</w:t>
             </w:r>
-            <w:proofErr w:type="spellStart"/>
             <w:r>
               <w:rPr>
                 <w:rFonts w:ascii="Times New Roman" w:hAnsi="Times New Roman" w:cs="Times New Roman"/>
@@ -1439,7 +1476,6 @@
               </w:rPr>
               <w:t>getVcfListByChrom</w:t>
             </w:r>
-            <w:proofErr w:type="spellEnd"/>
             <w:r>
               <w:rPr>
                 <w:rFonts w:ascii="Times New Roman" w:hAnsi="Times New Roman" w:cs="Times New Roman" w:hint="eastAsia"/>
@@ -1454,18 +1490,8 @@
                 <w:sz w:val="24"/>
                 <w:szCs w:val="24"/>
               </w:rPr>
-              <w:t xml:space="preserve">, </w:t>
-            </w:r>
-            <w:proofErr w:type="spellStart"/>
-            <w:r>
-              <w:rPr>
-                <w:rFonts w:ascii="Times New Roman" w:hAnsi="Times New Roman" w:cs="Times New Roman"/>
-                <w:sz w:val="24"/>
-                <w:szCs w:val="24"/>
-              </w:rPr>
-              <w:t>L_End_Pos</w:t>
-            </w:r>
-            <w:proofErr w:type="spellEnd"/>
+              <w:t>, L_End_Pos</w:t>
+            </w:r>
             <w:r>
               <w:rPr>
                 <w:rFonts w:ascii="Times New Roman" w:hAnsi="Times New Roman" w:cs="Times New Roman" w:hint="eastAsia"/>
@@ -1488,18 +1514,8 @@
                 <w:sz w:val="24"/>
                 <w:szCs w:val="24"/>
               </w:rPr>
-              <w:t xml:space="preserve">, </w:t>
-            </w:r>
-            <w:proofErr w:type="spellStart"/>
-            <w:r>
-              <w:rPr>
-                <w:rFonts w:ascii="Times New Roman" w:hAnsi="Times New Roman" w:cs="Times New Roman"/>
-                <w:sz w:val="24"/>
-                <w:szCs w:val="24"/>
-              </w:rPr>
-              <w:t>windowWidth</w:t>
-            </w:r>
-            <w:proofErr w:type="spellEnd"/>
+              <w:t>, windowWidth</w:t>
+            </w:r>
             <w:r>
               <w:rPr>
                 <w:rFonts w:ascii="Times New Roman" w:hAnsi="Times New Roman" w:cs="Times New Roman" w:hint="eastAsia"/>
@@ -1522,18 +1538,8 @@
                 <w:sz w:val="24"/>
                 <w:szCs w:val="24"/>
               </w:rPr>
-              <w:t xml:space="preserve">, </w:t>
-            </w:r>
-            <w:proofErr w:type="spellStart"/>
-            <w:r>
-              <w:rPr>
-                <w:rFonts w:ascii="Times New Roman" w:hAnsi="Times New Roman" w:cs="Times New Roman"/>
-                <w:sz w:val="24"/>
-                <w:szCs w:val="24"/>
-              </w:rPr>
-              <w:t>slideSize</w:t>
-            </w:r>
-            <w:proofErr w:type="spellEnd"/>
+              <w:t>, slideSize</w:t>
+            </w:r>
             <w:r>
               <w:rPr>
                 <w:rFonts w:ascii="Times New Roman" w:hAnsi="Times New Roman" w:cs="Times New Roman" w:hint="eastAsia"/>
@@ -1556,18 +1562,8 @@
                 <w:sz w:val="24"/>
                 <w:szCs w:val="24"/>
               </w:rPr>
-              <w:t xml:space="preserve">, </w:t>
-            </w:r>
-            <w:proofErr w:type="spellStart"/>
-            <w:r>
-              <w:rPr>
-                <w:rFonts w:ascii="Times New Roman" w:hAnsi="Times New Roman" w:cs="Times New Roman"/>
-                <w:sz w:val="24"/>
-                <w:szCs w:val="24"/>
-              </w:rPr>
-              <w:t>Caculator</w:t>
-            </w:r>
-            <w:proofErr w:type="spellEnd"/>
+              <w:t>, Caculator</w:t>
+            </w:r>
             <w:r>
               <w:rPr>
                 <w:rFonts w:ascii="Times New Roman" w:hAnsi="Times New Roman" w:cs="Times New Roman" w:hint="eastAsia"/>
@@ -1590,25 +1586,7 @@
                 <w:sz w:val="24"/>
                 <w:szCs w:val="24"/>
               </w:rPr>
-              <w:t>,</w:t>
-            </w:r>
-            <w:proofErr w:type="spellStart"/>
-            <w:r>
-              <w:rPr>
-                <w:rFonts w:ascii="Times New Roman" w:hAnsi="Times New Roman" w:cs="Times New Roman"/>
-                <w:sz w:val="24"/>
-                <w:szCs w:val="24"/>
-              </w:rPr>
-              <w:t>L_Start_Pos</w:t>
-            </w:r>
-            <w:proofErr w:type="spellEnd"/>
-            <w:r>
-              <w:rPr>
-                <w:rFonts w:ascii="Times New Roman" w:hAnsi="Times New Roman" w:cs="Times New Roman"/>
-                <w:sz w:val="24"/>
-                <w:szCs w:val="24"/>
-              </w:rPr>
-              <w:t>=</w:t>
+              <w:t>,L_Start_Pos=</w:t>
             </w:r>
             <w:r>
               <w:rPr>
@@ -1696,7 +1674,6 @@
               </w:rPr>
               <w:t>按照参数指定方式滑窗，计算每个窗口的值，计算方法有</w:t>
             </w:r>
-            <w:proofErr w:type="spellStart"/>
             <w:r>
               <w:rPr>
                 <w:rFonts w:ascii="Times New Roman" w:hAnsi="Times New Roman" w:cs="Times New Roman" w:hint="eastAsia"/>
@@ -1713,7 +1690,6 @@
               </w:rPr>
               <w:t>ulator</w:t>
             </w:r>
-            <w:proofErr w:type="spellEnd"/>
             <w:r>
               <w:rPr>
                 <w:rFonts w:ascii="Times New Roman" w:hAnsi="Times New Roman" w:cs="Times New Roman" w:hint="eastAsia"/>
@@ -1781,7 +1757,6 @@
                 <w:szCs w:val="24"/>
               </w:rPr>
             </w:pPr>
-            <w:proofErr w:type="spellStart"/>
             <w:r>
               <w:rPr>
                 <w:rFonts w:ascii="Times New Roman" w:hAnsi="Times New Roman" w:cs="Times New Roman"/>
@@ -1790,7 +1765,6 @@
               </w:rPr>
               <w:t>CaculatorToFindTAGs</w:t>
             </w:r>
-            <w:proofErr w:type="spellEnd"/>
             <w:r>
               <w:rPr>
                 <w:rFonts w:ascii="Times New Roman" w:hAnsi="Times New Roman" w:cs="Times New Roman"/>
@@ -2037,7 +2011,6 @@
           <w:szCs w:val="24"/>
         </w:rPr>
       </w:pPr>
-      <w:proofErr w:type="spellStart"/>
       <w:r>
         <w:rPr>
           <w:rFonts w:ascii="Times New Roman" w:eastAsia="宋体" w:hAnsi="Times New Roman" w:cs="Times New Roman"/>
@@ -2046,7 +2019,6 @@
         </w:rPr>
         <w:t>alinmultPopSnpPos</w:t>
       </w:r>
-      <w:proofErr w:type="spellEnd"/>
       <w:r>
         <w:rPr>
           <w:rFonts w:ascii="Times New Roman" w:eastAsia="宋体" w:hAnsi="Times New Roman" w:cs="Times New Roman"/>
@@ -2076,6 +2048,7 @@
           <w:sz w:val="24"/>
           <w:szCs w:val="24"/>
         </w:rPr>
+        <w:lastRenderedPageBreak/>
         <w:t>实现功能：将两个或两个以上的</w:t>
       </w:r>
       <w:r>
@@ -2133,23 +2106,13 @@
         </w:rPr>
         <w:t>参数：</w:t>
       </w:r>
-      <w:proofErr w:type="spellStart"/>
-      <w:r>
-        <w:rPr>
-          <w:rFonts w:ascii="Times New Roman" w:eastAsia="宋体" w:hAnsi="Times New Roman" w:cs="Times New Roman"/>
-          <w:sz w:val="24"/>
-          <w:szCs w:val="24"/>
-        </w:rPr>
-        <w:t>vcfMaplist</w:t>
-      </w:r>
-      <w:proofErr w:type="spellEnd"/>
-      <w:r>
-        <w:rPr>
-          <w:rFonts w:ascii="Times New Roman" w:eastAsia="宋体" w:hAnsi="Times New Roman" w:cs="Times New Roman"/>
-          <w:sz w:val="24"/>
-          <w:szCs w:val="24"/>
-        </w:rPr>
-        <w:t>=</w:t>
+      <w:r>
+        <w:rPr>
+          <w:rFonts w:ascii="Times New Roman" w:eastAsia="宋体" w:hAnsi="Times New Roman" w:cs="Times New Roman"/>
+          <w:sz w:val="24"/>
+          <w:szCs w:val="24"/>
+        </w:rPr>
+        <w:t>vcfMaplist=</w:t>
       </w:r>
       <w:r>
         <w:rPr>
@@ -2183,23 +2146,13 @@
         </w:rPr>
         <w:t>数据，</w:t>
       </w:r>
-      <w:proofErr w:type="spellStart"/>
-      <w:r>
-        <w:rPr>
-          <w:rFonts w:ascii="Times New Roman" w:eastAsia="宋体" w:hAnsi="Times New Roman" w:cs="Times New Roman"/>
-          <w:sz w:val="24"/>
-          <w:szCs w:val="24"/>
-        </w:rPr>
-        <w:t>jointmode</w:t>
-      </w:r>
-      <w:proofErr w:type="spellEnd"/>
-      <w:r>
-        <w:rPr>
-          <w:rFonts w:ascii="Times New Roman" w:eastAsia="宋体" w:hAnsi="Times New Roman" w:cs="Times New Roman"/>
-          <w:sz w:val="24"/>
-          <w:szCs w:val="24"/>
-        </w:rPr>
-        <w:t>=</w:t>
+      <w:r>
+        <w:rPr>
+          <w:rFonts w:ascii="Times New Roman" w:eastAsia="宋体" w:hAnsi="Times New Roman" w:cs="Times New Roman"/>
+          <w:sz w:val="24"/>
+          <w:szCs w:val="24"/>
+        </w:rPr>
+        <w:t>jointmode=</w:t>
       </w:r>
       <w:r>
         <w:rPr>
@@ -2215,25 +2168,7 @@
           <w:sz w:val="24"/>
           <w:szCs w:val="24"/>
         </w:rPr>
-        <w:t>“o”/“</w:t>
-      </w:r>
-      <w:proofErr w:type="spellStart"/>
-      <w:r>
-        <w:rPr>
-          <w:rFonts w:ascii="Times New Roman" w:eastAsia="宋体" w:hAnsi="Times New Roman" w:cs="Times New Roman"/>
-          <w:sz w:val="24"/>
-          <w:szCs w:val="24"/>
-        </w:rPr>
-        <w:t>i</w:t>
-      </w:r>
-      <w:proofErr w:type="spellEnd"/>
-      <w:r>
-        <w:rPr>
-          <w:rFonts w:ascii="Times New Roman" w:eastAsia="宋体" w:hAnsi="Times New Roman" w:cs="Times New Roman"/>
-          <w:sz w:val="24"/>
-          <w:szCs w:val="24"/>
-        </w:rPr>
-        <w:t>”</w:t>
+        <w:t>“o”/“i”</w:t>
       </w:r>
       <w:r>
         <w:rPr>
@@ -2323,25 +2258,7 @@
           <w:sz w:val="24"/>
           <w:szCs w:val="24"/>
         </w:rPr>
-        <w:t>vcffile</w:t>
-      </w:r>
-      <w:proofErr w:type="gramStart"/>
-      <w:r>
-        <w:rPr>
-          <w:rFonts w:ascii="Times New Roman" w:eastAsia="宋体" w:hAnsi="Times New Roman" w:cs="Times New Roman"/>
-          <w:sz w:val="24"/>
-          <w:szCs w:val="24"/>
-        </w:rPr>
-        <w:t>1,vcffle</w:t>
-      </w:r>
-      <w:proofErr w:type="gramEnd"/>
-      <w:r>
-        <w:rPr>
-          <w:rFonts w:ascii="Times New Roman" w:eastAsia="宋体" w:hAnsi="Times New Roman" w:cs="Times New Roman"/>
-          <w:sz w:val="24"/>
-          <w:szCs w:val="24"/>
-        </w:rPr>
-        <w:t>2,vcffile3…</w:t>
+        <w:t>vcffile1,vcffle2,vcffile3…</w:t>
       </w:r>
       <w:r>
         <w:rPr>
@@ -2424,9 +2341,24 @@
           <w:sz w:val="24"/>
           <w:szCs w:val="24"/>
         </w:rPr>
-        <w:t>[</w:t>
-      </w:r>
-      <w:proofErr w:type="spellStart"/>
+        <w:t>[chrNo:[</w:t>
+      </w:r>
+      <w:r>
+        <w:rPr>
+          <w:rFonts w:ascii="Times New Roman" w:eastAsia="宋体" w:hAnsi="Times New Roman" w:cs="Times New Roman"/>
+          <w:sz w:val="24"/>
+          <w:szCs w:val="24"/>
+        </w:rPr>
+        <w:t>vcffile1</w:t>
+      </w:r>
+      <w:r>
+        <w:rPr>
+          <w:rFonts w:ascii="Times New Roman" w:eastAsia="宋体" w:hAnsi="Times New Roman" w:cs="Times New Roman"/>
+          <w:sz w:val="24"/>
+          <w:szCs w:val="24"/>
+        </w:rPr>
+        <w:t>中</w:t>
+      </w:r>
       <w:r>
         <w:rPr>
           <w:rFonts w:ascii="Times New Roman" w:eastAsia="宋体" w:hAnsi="Times New Roman" w:cs="Times New Roman"/>
@@ -2435,22 +2367,29 @@
         </w:rPr>
         <w:t>chrNo</w:t>
       </w:r>
-      <w:proofErr w:type="spellEnd"/>
-      <w:r>
-        <w:rPr>
-          <w:rFonts w:ascii="Times New Roman" w:eastAsia="宋体" w:hAnsi="Times New Roman" w:cs="Times New Roman"/>
-          <w:sz w:val="24"/>
-          <w:szCs w:val="24"/>
-        </w:rPr>
-        <w:t>:[</w:t>
-      </w:r>
-      <w:r>
-        <w:rPr>
-          <w:rFonts w:ascii="Times New Roman" w:eastAsia="宋体" w:hAnsi="Times New Roman" w:cs="Times New Roman"/>
-          <w:sz w:val="24"/>
-          <w:szCs w:val="24"/>
-        </w:rPr>
-        <w:t>vcffile1</w:t>
+      <w:r>
+        <w:rPr>
+          <w:rFonts w:ascii="Times New Roman" w:eastAsia="宋体" w:hAnsi="Times New Roman" w:cs="Times New Roman"/>
+          <w:sz w:val="24"/>
+          <w:szCs w:val="24"/>
+        </w:rPr>
+        <w:t>的记录</w:t>
+      </w:r>
+      <w:r>
+        <w:rPr>
+          <w:rFonts w:ascii="Times New Roman" w:eastAsia="宋体" w:hAnsi="Times New Roman" w:cs="Times New Roman"/>
+          <w:sz w:val="24"/>
+          <w:szCs w:val="24"/>
+        </w:rPr>
+        <w:t>],{chrNo:[</w:t>
+      </w:r>
+      <w:r>
+        <w:rPr>
+          <w:rFonts w:ascii="Times New Roman" w:eastAsia="宋体" w:hAnsi="Times New Roman" w:cs="Times New Roman"/>
+          <w:sz w:val="24"/>
+          <w:szCs w:val="24"/>
+        </w:rPr>
+        <w:t xml:space="preserve"> vcffile2</w:t>
       </w:r>
       <w:r>
         <w:rPr>
@@ -2460,7 +2399,6 @@
         </w:rPr>
         <w:t>中</w:t>
       </w:r>
-      <w:proofErr w:type="spellStart"/>
       <w:r>
         <w:rPr>
           <w:rFonts w:ascii="Times New Roman" w:eastAsia="宋体" w:hAnsi="Times New Roman" w:cs="Times New Roman"/>
@@ -2469,7 +2407,6 @@
         </w:rPr>
         <w:t>chrNo</w:t>
       </w:r>
-      <w:proofErr w:type="spellEnd"/>
       <w:r>
         <w:rPr>
           <w:rFonts w:ascii="Times New Roman" w:eastAsia="宋体" w:hAnsi="Times New Roman" w:cs="Times New Roman"/>
@@ -2484,9 +2421,32 @@
           <w:sz w:val="24"/>
           <w:szCs w:val="24"/>
         </w:rPr>
-        <w:t>],{</w:t>
-      </w:r>
-      <w:proofErr w:type="spellStart"/>
+        <w:t>]},,,,,,]</w:t>
+      </w:r>
+      <w:r>
+        <w:rPr>
+          <w:rFonts w:ascii="Times New Roman" w:eastAsia="宋体" w:hAnsi="Times New Roman" w:cs="Times New Roman"/>
+          <w:sz w:val="24"/>
+          <w:szCs w:val="24"/>
+        </w:rPr>
+        <w:t>。每个</w:t>
+      </w:r>
+      <w:r>
+        <w:rPr>
+          <w:rFonts w:ascii="Times New Roman" w:eastAsia="宋体" w:hAnsi="Times New Roman" w:cs="Times New Roman"/>
+          <w:sz w:val="24"/>
+          <w:szCs w:val="24"/>
+        </w:rPr>
+        <w:t>VCF</w:t>
+      </w:r>
+      <w:r>
+        <w:rPr>
+          <w:rFonts w:ascii="Times New Roman" w:eastAsia="宋体" w:hAnsi="Times New Roman" w:cs="Times New Roman"/>
+          <w:sz w:val="24"/>
+          <w:szCs w:val="24"/>
+        </w:rPr>
+        <w:t>文件的对应</w:t>
+      </w:r>
       <w:r>
         <w:rPr>
           <w:rFonts w:ascii="Times New Roman" w:eastAsia="宋体" w:hAnsi="Times New Roman" w:cs="Times New Roman"/>
@@ -2495,91 +2455,6 @@
         </w:rPr>
         <w:t>chrNo</w:t>
       </w:r>
-      <w:proofErr w:type="spellEnd"/>
-      <w:r>
-        <w:rPr>
-          <w:rFonts w:ascii="Times New Roman" w:eastAsia="宋体" w:hAnsi="Times New Roman" w:cs="Times New Roman"/>
-          <w:sz w:val="24"/>
-          <w:szCs w:val="24"/>
-        </w:rPr>
-        <w:t>:[</w:t>
-      </w:r>
-      <w:r>
-        <w:rPr>
-          <w:rFonts w:ascii="Times New Roman" w:eastAsia="宋体" w:hAnsi="Times New Roman" w:cs="Times New Roman"/>
-          <w:sz w:val="24"/>
-          <w:szCs w:val="24"/>
-        </w:rPr>
-        <w:t xml:space="preserve"> vcffile2</w:t>
-      </w:r>
-      <w:r>
-        <w:rPr>
-          <w:rFonts w:ascii="Times New Roman" w:eastAsia="宋体" w:hAnsi="Times New Roman" w:cs="Times New Roman"/>
-          <w:sz w:val="24"/>
-          <w:szCs w:val="24"/>
-        </w:rPr>
-        <w:t>中</w:t>
-      </w:r>
-      <w:proofErr w:type="spellStart"/>
-      <w:r>
-        <w:rPr>
-          <w:rFonts w:ascii="Times New Roman" w:eastAsia="宋体" w:hAnsi="Times New Roman" w:cs="Times New Roman"/>
-          <w:sz w:val="24"/>
-          <w:szCs w:val="24"/>
-        </w:rPr>
-        <w:t>chrNo</w:t>
-      </w:r>
-      <w:proofErr w:type="spellEnd"/>
-      <w:r>
-        <w:rPr>
-          <w:rFonts w:ascii="Times New Roman" w:eastAsia="宋体" w:hAnsi="Times New Roman" w:cs="Times New Roman"/>
-          <w:sz w:val="24"/>
-          <w:szCs w:val="24"/>
-        </w:rPr>
-        <w:t>的记录</w:t>
-      </w:r>
-      <w:r>
-        <w:rPr>
-          <w:rFonts w:ascii="Times New Roman" w:eastAsia="宋体" w:hAnsi="Times New Roman" w:cs="Times New Roman"/>
-          <w:sz w:val="24"/>
-          <w:szCs w:val="24"/>
-        </w:rPr>
-        <w:t>]},,,,,,]</w:t>
-      </w:r>
-      <w:r>
-        <w:rPr>
-          <w:rFonts w:ascii="Times New Roman" w:eastAsia="宋体" w:hAnsi="Times New Roman" w:cs="Times New Roman"/>
-          <w:sz w:val="24"/>
-          <w:szCs w:val="24"/>
-        </w:rPr>
-        <w:t>。每个</w:t>
-      </w:r>
-      <w:r>
-        <w:rPr>
-          <w:rFonts w:ascii="Times New Roman" w:eastAsia="宋体" w:hAnsi="Times New Roman" w:cs="Times New Roman"/>
-          <w:sz w:val="24"/>
-          <w:szCs w:val="24"/>
-        </w:rPr>
-        <w:t>VCF</w:t>
-      </w:r>
-      <w:r>
-        <w:rPr>
-          <w:rFonts w:ascii="Times New Roman" w:eastAsia="宋体" w:hAnsi="Times New Roman" w:cs="Times New Roman"/>
-          <w:sz w:val="24"/>
-          <w:szCs w:val="24"/>
-        </w:rPr>
-        <w:t>文件的对应</w:t>
-      </w:r>
-      <w:proofErr w:type="spellStart"/>
-      <w:r>
-        <w:rPr>
-          <w:rFonts w:ascii="Times New Roman" w:eastAsia="宋体" w:hAnsi="Times New Roman" w:cs="Times New Roman"/>
-          <w:sz w:val="24"/>
-          <w:szCs w:val="24"/>
-        </w:rPr>
-        <w:t>chrNo</w:t>
-      </w:r>
-      <w:proofErr w:type="spellEnd"/>
       <w:r>
         <w:rPr>
           <w:rFonts w:ascii="Times New Roman" w:eastAsia="宋体" w:hAnsi="Times New Roman" w:cs="Times New Roman"/>
@@ -2596,23 +2471,13 @@
         </w:rPr>
         <w:t>的</w:t>
       </w:r>
-      <w:proofErr w:type="spellStart"/>
-      <w:r>
-        <w:rPr>
-          <w:rFonts w:ascii="Times New Roman" w:eastAsia="宋体" w:hAnsi="Times New Roman" w:cs="Times New Roman"/>
-          <w:sz w:val="24"/>
-          <w:szCs w:val="24"/>
-        </w:rPr>
-        <w:t>VCF_Data</w:t>
-      </w:r>
-      <w:proofErr w:type="spellEnd"/>
-      <w:r>
-        <w:rPr>
-          <w:rFonts w:ascii="Times New Roman" w:eastAsia="宋体" w:hAnsi="Times New Roman" w:cs="Times New Roman"/>
-          <w:sz w:val="24"/>
-          <w:szCs w:val="24"/>
-        </w:rPr>
-        <w:t>()</w:t>
+      <w:r>
+        <w:rPr>
+          <w:rFonts w:ascii="Times New Roman" w:eastAsia="宋体" w:hAnsi="Times New Roman" w:cs="Times New Roman"/>
+          <w:sz w:val="24"/>
+          <w:szCs w:val="24"/>
+        </w:rPr>
+        <w:t>VCF_Data()</w:t>
       </w:r>
       <w:r>
         <w:rPr>
@@ -2622,7 +2487,6 @@
         </w:rPr>
         <w:t>类的</w:t>
       </w:r>
-      <w:proofErr w:type="spellStart"/>
       <w:r>
         <w:rPr>
           <w:rFonts w:ascii="Times New Roman" w:eastAsia="宋体" w:hAnsi="Times New Roman" w:cs="Times New Roman"/>
@@ -2631,7 +2495,6 @@
         </w:rPr>
         <w:t>getVcfListByChrom</w:t>
       </w:r>
-      <w:proofErr w:type="spellEnd"/>
       <w:r>
         <w:rPr>
           <w:rFonts w:ascii="Times New Roman" w:eastAsia="宋体" w:hAnsi="Times New Roman" w:cs="Times New Roman"/>
@@ -2665,25 +2528,7 @@
           <w:sz w:val="24"/>
           <w:szCs w:val="24"/>
         </w:rPr>
-        <w:t>[</w:t>
-      </w:r>
-      <w:proofErr w:type="gramStart"/>
-      <w:r>
-        <w:rPr>
-          <w:rFonts w:ascii="Times New Roman" w:eastAsia="宋体" w:hAnsi="Times New Roman" w:cs="Times New Roman"/>
-          <w:sz w:val="24"/>
-          <w:szCs w:val="24"/>
-        </w:rPr>
-        <w:t>chrNo:[</w:t>
-      </w:r>
-      <w:proofErr w:type="gramEnd"/>
-      <w:r>
-        <w:rPr>
-          <w:rFonts w:ascii="Times New Roman" w:eastAsia="宋体" w:hAnsi="Times New Roman" w:cs="Times New Roman"/>
-          <w:sz w:val="24"/>
-          <w:szCs w:val="24"/>
-        </w:rPr>
-        <w:t xml:space="preserve">(pos,REF,ALT,INFO,FORMAT,sample,...),(pos,REF,ALT,INFO,FORMAT,sample,...),,,,,],{chrNo:[]},,,,,,] </w:t>
+        <w:t xml:space="preserve">[chrNo:[(pos,REF,ALT,INFO,FORMAT,sample,...),(pos,REF,ALT,INFO,FORMAT,sample,...),,,,,],{chrNo:[]},,,,,,] </w:t>
       </w:r>
       <w:r>
         <w:rPr>
@@ -2893,25 +2738,7 @@
           <w:szCs w:val="24"/>
         </w:rPr>
         <w:tab/>
-        <w:t xml:space="preserve">  [pos</w:t>
-      </w:r>
-      <w:proofErr w:type="gramStart"/>
-      <w:r>
-        <w:rPr>
-          <w:rFonts w:ascii="Times New Roman" w:eastAsia="宋体" w:hAnsi="Times New Roman" w:cs="Times New Roman"/>
-          <w:sz w:val="24"/>
-          <w:szCs w:val="24"/>
-        </w:rPr>
-        <w:t>2,REF</w:t>
-      </w:r>
-      <w:proofErr w:type="gramEnd"/>
-      <w:r>
-        <w:rPr>
-          <w:rFonts w:ascii="Times New Roman" w:eastAsia="宋体" w:hAnsi="Times New Roman" w:cs="Times New Roman"/>
-          <w:sz w:val="24"/>
-          <w:szCs w:val="24"/>
-        </w:rPr>
-        <w:t xml:space="preserve">,ALT,(              ), </w:t>
+        <w:t xml:space="preserve">  [pos2,REF,ALT,(              ), </w:t>
       </w:r>
       <w:r>
         <w:rPr>
@@ -3047,7 +2874,6 @@
         </w:rPr>
         <w:t>外连接方式合并，若某</w:t>
       </w:r>
-      <w:proofErr w:type="spellStart"/>
       <w:r>
         <w:rPr>
           <w:rFonts w:ascii="Times New Roman" w:eastAsia="宋体" w:hAnsi="Times New Roman" w:cs="Times New Roman" w:hint="eastAsia"/>
@@ -3064,7 +2890,6 @@
         </w:rPr>
         <w:t>cf</w:t>
       </w:r>
-      <w:proofErr w:type="spellEnd"/>
       <w:r>
         <w:rPr>
           <w:rFonts w:ascii="Times New Roman" w:eastAsia="宋体" w:hAnsi="Times New Roman" w:cs="Times New Roman" w:hint="eastAsia"/>
@@ -3121,7 +2946,6 @@
         </w:rPr>
         <w:t>。</w:t>
       </w:r>
-      <w:proofErr w:type="gramStart"/>
       <w:r>
         <w:rPr>
           <w:rFonts w:ascii="Times New Roman" w:eastAsia="宋体" w:hAnsi="Times New Roman" w:cs="Times New Roman" w:hint="eastAsia"/>
@@ -3138,8 +2962,6 @@
         </w:rPr>
         <w:t>各</w:t>
       </w:r>
-      <w:proofErr w:type="spellStart"/>
-      <w:proofErr w:type="gramEnd"/>
       <w:r>
         <w:rPr>
           <w:rFonts w:ascii="Times New Roman" w:eastAsia="宋体" w:hAnsi="Times New Roman" w:cs="Times New Roman" w:hint="eastAsia"/>
@@ -3156,7 +2978,6 @@
         </w:rPr>
         <w:t>cffile</w:t>
       </w:r>
-      <w:proofErr w:type="spellEnd"/>
       <w:r>
         <w:rPr>
           <w:rFonts w:ascii="Times New Roman" w:eastAsia="宋体" w:hAnsi="Times New Roman" w:cs="Times New Roman" w:hint="eastAsia"/>
@@ -3230,7 +3051,6 @@
           <w:szCs w:val="21"/>
         </w:rPr>
       </w:pPr>
-      <w:proofErr w:type="spellStart"/>
       <w:r>
         <w:rPr>
           <w:rFonts w:ascii="Consolas" w:hAnsi="Consolas" w:cs="Consolas" w:hint="eastAsia"/>
@@ -3242,7 +3062,6 @@
         <w:lastRenderedPageBreak/>
         <w:t>vcf</w:t>
       </w:r>
-      <w:proofErr w:type="spellEnd"/>
       <w:r>
         <w:rPr>
           <w:rFonts w:ascii="Consolas" w:hAnsi="Consolas" w:cs="Consolas" w:hint="eastAsia"/>
@@ -3253,7 +3072,6 @@
         </w:rPr>
         <w:t>数据表标准为：五列必须列，分别为</w:t>
       </w:r>
-      <w:proofErr w:type="spellStart"/>
       <w:r>
         <w:rPr>
           <w:rFonts w:ascii="Consolas" w:hAnsi="Consolas" w:cs="Consolas" w:hint="eastAsia"/>
@@ -3264,7 +3082,6 @@
         </w:rPr>
         <w:t>chrID</w:t>
       </w:r>
-      <w:proofErr w:type="spellEnd"/>
       <w:r>
         <w:rPr>
           <w:rFonts w:ascii="Consolas" w:hAnsi="Consolas" w:cs="Consolas" w:hint="eastAsia"/>
@@ -3275,7 +3092,6 @@
         </w:rPr>
         <w:t>，</w:t>
       </w:r>
-      <w:proofErr w:type="spellStart"/>
       <w:r>
         <w:rPr>
           <w:rFonts w:ascii="Consolas" w:hAnsi="Consolas" w:cs="Consolas" w:hint="eastAsia"/>
@@ -3286,7 +3102,6 @@
         </w:rPr>
         <w:t>snp_pos,snpID,ref_base,alt_base</w:t>
       </w:r>
-      <w:proofErr w:type="spellEnd"/>
       <w:r>
         <w:rPr>
           <w:rFonts w:ascii="Consolas" w:hAnsi="Consolas" w:cs="Consolas" w:hint="eastAsia"/>
@@ -3306,7 +3121,6 @@
           <w:szCs w:val="21"/>
         </w:rPr>
       </w:pPr>
-      <w:proofErr w:type="spellStart"/>
       <w:r>
         <w:rPr>
           <w:rFonts w:ascii="Consolas" w:hAnsi="Consolas" w:cs="Consolas" w:hint="eastAsia"/>
@@ -3315,9 +3129,8 @@
           <w:kern w:val="0"/>
           <w:szCs w:val="21"/>
         </w:rPr>
-        <w:t>toplevel</w:t>
-      </w:r>
-      <w:proofErr w:type="spellEnd"/>
+        <w:t>toplevel vcf</w:t>
+      </w:r>
       <w:r>
         <w:rPr>
           <w:rFonts w:ascii="Consolas" w:hAnsi="Consolas" w:cs="Consolas" w:hint="eastAsia"/>
@@ -3326,9 +3139,74 @@
           <w:kern w:val="0"/>
           <w:szCs w:val="21"/>
         </w:rPr>
+        <w:t>数据表为</w:t>
+      </w:r>
+      <w:r>
+        <w:rPr>
+          <w:rFonts w:ascii="Consolas" w:hAnsi="Consolas" w:cs="Consolas" w:hint="eastAsia"/>
+          <w:bCs/>
+          <w:color w:val="000000"/>
+          <w:kern w:val="0"/>
+          <w:szCs w:val="21"/>
+        </w:rPr>
+        <w:t>chrID</w:t>
+      </w:r>
+      <w:r>
+        <w:rPr>
+          <w:rFonts w:ascii="Consolas" w:hAnsi="Consolas" w:cs="Consolas" w:hint="eastAsia"/>
+          <w:bCs/>
+          <w:color w:val="000000"/>
+          <w:kern w:val="0"/>
+          <w:szCs w:val="21"/>
+        </w:rPr>
+        <w:t>，</w:t>
+      </w:r>
+      <w:r>
+        <w:rPr>
+          <w:rFonts w:ascii="Consolas" w:hAnsi="Consolas" w:cs="Consolas" w:hint="eastAsia"/>
+          <w:bCs/>
+          <w:color w:val="000000"/>
+          <w:kern w:val="0"/>
+          <w:szCs w:val="21"/>
+        </w:rPr>
+        <w:t>snp_pos,snpID,ref_base,alt_base</w:t>
+      </w:r>
+      <w:r>
+        <w:rPr>
+          <w:rFonts w:ascii="Consolas" w:hAnsi="Consolas" w:cs="Consolas" w:hint="eastAsia"/>
+          <w:bCs/>
+          <w:color w:val="000000"/>
+          <w:kern w:val="0"/>
+          <w:szCs w:val="21"/>
+        </w:rPr>
+        <w:t>，</w:t>
+      </w:r>
+      <w:r>
+        <w:rPr>
+          <w:rFonts w:ascii="Consolas" w:hAnsi="Consolas" w:cs="Consolas" w:hint="eastAsia"/>
+          <w:bCs/>
+          <w:color w:val="000000"/>
+          <w:kern w:val="0"/>
+          <w:szCs w:val="21"/>
+        </w:rPr>
+        <w:t>context,</w:t>
+      </w:r>
+      <w:r>
+        <w:rPr>
+          <w:szCs w:val="21"/>
+        </w:rPr>
         <w:t xml:space="preserve"> </w:t>
       </w:r>
-      <w:proofErr w:type="spellStart"/>
+      <w:r>
+        <w:rPr>
+          <w:rFonts w:ascii="Consolas" w:hAnsi="Consolas" w:cs="Consolas"/>
+          <w:bCs/>
+          <w:color w:val="000000"/>
+          <w:kern w:val="0"/>
+          <w:szCs w:val="21"/>
+        </w:rPr>
+        <w:t>wegeon_indvd_SNV_vcf_alt</w:t>
+      </w:r>
       <w:r>
         <w:rPr>
           <w:rFonts w:ascii="Consolas" w:hAnsi="Consolas" w:cs="Consolas" w:hint="eastAsia"/>
@@ -3337,119 +3215,24 @@
           <w:kern w:val="0"/>
           <w:szCs w:val="21"/>
         </w:rPr>
-        <w:t>vcf</w:t>
-      </w:r>
-      <w:proofErr w:type="spellEnd"/>
-      <w:r>
-        <w:rPr>
-          <w:rFonts w:ascii="Consolas" w:hAnsi="Consolas" w:cs="Consolas" w:hint="eastAsia"/>
+        <w:t>,</w:t>
+      </w:r>
+      <w:r>
+        <w:rPr>
+          <w:szCs w:val="21"/>
+        </w:rPr>
+        <w:t xml:space="preserve"> </w:t>
+      </w:r>
+      <w:r>
+        <w:rPr>
+          <w:rFonts w:ascii="Consolas" w:hAnsi="Consolas" w:cs="Consolas"/>
           <w:bCs/>
           <w:color w:val="000000"/>
           <w:kern w:val="0"/>
           <w:szCs w:val="21"/>
         </w:rPr>
-        <w:t>数据表为</w:t>
-      </w:r>
-      <w:proofErr w:type="spellStart"/>
-      <w:r>
-        <w:rPr>
-          <w:rFonts w:ascii="Consolas" w:hAnsi="Consolas" w:cs="Consolas" w:hint="eastAsia"/>
-          <w:bCs/>
-          <w:color w:val="000000"/>
-          <w:kern w:val="0"/>
-          <w:szCs w:val="21"/>
-        </w:rPr>
-        <w:t>chrID</w:t>
-      </w:r>
-      <w:proofErr w:type="spellEnd"/>
-      <w:r>
-        <w:rPr>
-          <w:rFonts w:ascii="Consolas" w:hAnsi="Consolas" w:cs="Consolas" w:hint="eastAsia"/>
-          <w:bCs/>
-          <w:color w:val="000000"/>
-          <w:kern w:val="0"/>
-          <w:szCs w:val="21"/>
-        </w:rPr>
-        <w:t>，</w:t>
-      </w:r>
-      <w:proofErr w:type="spellStart"/>
-      <w:r>
-        <w:rPr>
-          <w:rFonts w:ascii="Consolas" w:hAnsi="Consolas" w:cs="Consolas" w:hint="eastAsia"/>
-          <w:bCs/>
-          <w:color w:val="000000"/>
-          <w:kern w:val="0"/>
-          <w:szCs w:val="21"/>
-        </w:rPr>
-        <w:t>snp_pos,snpID,ref_base,alt_base</w:t>
-      </w:r>
-      <w:proofErr w:type="spellEnd"/>
-      <w:r>
-        <w:rPr>
-          <w:rFonts w:ascii="Consolas" w:hAnsi="Consolas" w:cs="Consolas" w:hint="eastAsia"/>
-          <w:bCs/>
-          <w:color w:val="000000"/>
-          <w:kern w:val="0"/>
-          <w:szCs w:val="21"/>
-        </w:rPr>
-        <w:t>，</w:t>
-      </w:r>
-      <w:r>
-        <w:rPr>
-          <w:rFonts w:ascii="Consolas" w:hAnsi="Consolas" w:cs="Consolas" w:hint="eastAsia"/>
-          <w:bCs/>
-          <w:color w:val="000000"/>
-          <w:kern w:val="0"/>
-          <w:szCs w:val="21"/>
-        </w:rPr>
-        <w:t>context,</w:t>
-      </w:r>
-      <w:r>
-        <w:rPr>
-          <w:szCs w:val="21"/>
-        </w:rPr>
-        <w:t xml:space="preserve"> </w:t>
-      </w:r>
-      <w:proofErr w:type="spellStart"/>
-      <w:r>
-        <w:rPr>
-          <w:rFonts w:ascii="Consolas" w:hAnsi="Consolas" w:cs="Consolas"/>
-          <w:bCs/>
-          <w:color w:val="000000"/>
-          <w:kern w:val="0"/>
-          <w:szCs w:val="21"/>
-        </w:rPr>
-        <w:t>wegeon_indvd_SNV_vcf_alt</w:t>
-      </w:r>
-      <w:proofErr w:type="spellEnd"/>
-      <w:r>
-        <w:rPr>
-          <w:rFonts w:ascii="Consolas" w:hAnsi="Consolas" w:cs="Consolas" w:hint="eastAsia"/>
-          <w:bCs/>
-          <w:color w:val="000000"/>
-          <w:kern w:val="0"/>
-          <w:szCs w:val="21"/>
-        </w:rPr>
-        <w:t>,</w:t>
-      </w:r>
-      <w:r>
-        <w:rPr>
-          <w:szCs w:val="21"/>
-        </w:rPr>
-        <w:t xml:space="preserve"> </w:t>
-      </w:r>
-      <w:proofErr w:type="spellStart"/>
-      <w:r>
-        <w:rPr>
-          <w:rFonts w:ascii="Consolas" w:hAnsi="Consolas" w:cs="Consolas"/>
-          <w:bCs/>
-          <w:color w:val="000000"/>
-          <w:kern w:val="0"/>
-          <w:szCs w:val="21"/>
-        </w:rPr>
         <w:t>wegeon_indvd_SNV_vcf_dep</w:t>
       </w:r>
-      <w:proofErr w:type="spellEnd"/>
       <w:r>
         <w:rPr>
           <w:rFonts w:ascii="Consolas" w:hAnsi="Consolas" w:cs="Consolas" w:hint="eastAsia"/>
@@ -3483,14 +3266,12 @@
           <w:numId w:val="3"/>
         </w:numPr>
       </w:pPr>
-      <w:proofErr w:type="spellStart"/>
       <w:r>
         <w:rPr>
           <w:bCs/>
         </w:rPr>
         <w:t>getRefSeqBypos</w:t>
       </w:r>
-      <w:proofErr w:type="spellEnd"/>
       <w:r>
         <w:rPr>
           <w:rFonts w:hint="eastAsia"/>
@@ -3513,7 +3294,6 @@
           <w:numId w:val="3"/>
         </w:numPr>
       </w:pPr>
-      <w:proofErr w:type="spellStart"/>
       <w:r>
         <w:rPr>
           <w:rFonts w:ascii="Consolas" w:hAnsi="Consolas" w:cs="Consolas"/>
@@ -3527,7 +3307,6 @@
         </w:rPr>
         <w:t>generateFasterRefIndex</w:t>
       </w:r>
-      <w:proofErr w:type="spellEnd"/>
       <w:r>
         <w:rPr>
           <w:rFonts w:ascii="Consolas" w:hAnsi="Consolas" w:cs="Consolas"/>
@@ -3551,35 +3330,7 @@
           <w:szCs w:val="20"/>
           <w:highlight w:val="yellow"/>
         </w:rPr>
-        <w:t>这个函数怎么处理染色体名的回去好好查</w:t>
-      </w:r>
-      <w:proofErr w:type="gramStart"/>
-      <w:r>
-        <w:rPr>
-          <w:rFonts w:ascii="Consolas" w:hAnsi="Consolas" w:cs="Consolas" w:hint="eastAsia"/>
-          <w:b/>
-          <w:bCs/>
-          <w:color w:val="000000"/>
-          <w:kern w:val="0"/>
-          <w:sz w:val="20"/>
-          <w:szCs w:val="20"/>
-          <w:highlight w:val="yellow"/>
-        </w:rPr>
-        <w:t>查看</w:t>
-      </w:r>
-      <w:proofErr w:type="gramEnd"/>
-      <w:r>
-        <w:rPr>
-          <w:rFonts w:ascii="Consolas" w:hAnsi="Consolas" w:cs="Consolas" w:hint="eastAsia"/>
-          <w:b/>
-          <w:bCs/>
-          <w:color w:val="000000"/>
-          <w:kern w:val="0"/>
-          <w:sz w:val="20"/>
-          <w:szCs w:val="20"/>
-          <w:highlight w:val="yellow"/>
-        </w:rPr>
-        <w:t>看</w:t>
+        <w:t>这个函数怎么处理染色体名的回去好好查查看看</w:t>
       </w:r>
     </w:p>
     <w:p>
@@ -3589,7 +3340,6 @@
           <w:numId w:val="3"/>
         </w:numPr>
       </w:pPr>
-      <w:proofErr w:type="spellStart"/>
       <w:r>
         <w:rPr>
           <w:rFonts w:ascii="Consolas" w:hAnsi="Consolas" w:cs="Consolas"/>
@@ -3601,7 +3351,6 @@
         </w:rPr>
         <w:t>getRefSeqBypos_faster</w:t>
       </w:r>
-      <w:proofErr w:type="spellEnd"/>
     </w:p>
     <w:p>
       <w:pPr>
@@ -3624,178 +3373,7 @@
           <w:sz w:val="18"/>
           <w:szCs w:val="18"/>
         </w:rPr>
-        <w:t xml:space="preserve">def </w:t>
-      </w:r>
-      <w:proofErr w:type="spellStart"/>
-      <w:r>
-        <w:rPr>
-          <w:rFonts w:ascii="Microsoft YaHei UI" w:eastAsia="Microsoft YaHei UI" w:cs="Microsoft YaHei UI"/>
-          <w:kern w:val="0"/>
-          <w:sz w:val="18"/>
-          <w:szCs w:val="18"/>
-        </w:rPr>
-        <w:t>getRefSeqBypos_</w:t>
-      </w:r>
-      <w:proofErr w:type="gramStart"/>
-      <w:r>
-        <w:rPr>
-          <w:rFonts w:ascii="Microsoft YaHei UI" w:eastAsia="Microsoft YaHei UI" w:cs="Microsoft YaHei UI"/>
-          <w:kern w:val="0"/>
-          <w:sz w:val="18"/>
-          <w:szCs w:val="18"/>
-        </w:rPr>
-        <w:t>faster</w:t>
-      </w:r>
-      <w:proofErr w:type="spellEnd"/>
-      <w:r>
-        <w:rPr>
-          <w:rFonts w:ascii="Microsoft YaHei UI" w:eastAsia="Microsoft YaHei UI" w:cs="Microsoft YaHei UI"/>
-          <w:kern w:val="0"/>
-          <w:sz w:val="18"/>
-          <w:szCs w:val="18"/>
-        </w:rPr>
-        <w:t>(</w:t>
-      </w:r>
-      <w:proofErr w:type="spellStart"/>
-      <w:proofErr w:type="gramEnd"/>
-      <w:r>
-        <w:rPr>
-          <w:rFonts w:ascii="Microsoft YaHei UI" w:eastAsia="Microsoft YaHei UI" w:cs="Microsoft YaHei UI"/>
-          <w:kern w:val="0"/>
-          <w:sz w:val="18"/>
-          <w:szCs w:val="18"/>
-        </w:rPr>
-        <w:t>refFastahandle</w:t>
-      </w:r>
-      <w:proofErr w:type="spellEnd"/>
-      <w:r>
-        <w:rPr>
-          <w:rFonts w:ascii="Microsoft YaHei UI" w:eastAsia="Microsoft YaHei UI" w:cs="Microsoft YaHei UI"/>
-          <w:kern w:val="0"/>
-          <w:sz w:val="18"/>
-          <w:szCs w:val="18"/>
-        </w:rPr>
-        <w:t xml:space="preserve">, </w:t>
-      </w:r>
-      <w:proofErr w:type="spellStart"/>
-      <w:r>
-        <w:rPr>
-          <w:rFonts w:ascii="Microsoft YaHei UI" w:eastAsia="Microsoft YaHei UI" w:cs="Microsoft YaHei UI"/>
-          <w:kern w:val="0"/>
-          <w:sz w:val="18"/>
-          <w:szCs w:val="18"/>
-        </w:rPr>
-        <w:t>fasterrefindex</w:t>
-      </w:r>
-      <w:proofErr w:type="spellEnd"/>
-      <w:r>
-        <w:rPr>
-          <w:rFonts w:ascii="Microsoft YaHei UI" w:eastAsia="Microsoft YaHei UI" w:cs="Microsoft YaHei UI"/>
-          <w:kern w:val="0"/>
-          <w:sz w:val="18"/>
-          <w:szCs w:val="18"/>
-        </w:rPr>
-        <w:t xml:space="preserve">, </w:t>
-      </w:r>
-      <w:proofErr w:type="spellStart"/>
-      <w:r>
-        <w:rPr>
-          <w:rFonts w:ascii="Microsoft YaHei UI" w:eastAsia="Microsoft YaHei UI" w:cs="Microsoft YaHei UI"/>
-          <w:kern w:val="0"/>
-          <w:sz w:val="18"/>
-          <w:szCs w:val="18"/>
-        </w:rPr>
-        <w:t>currentChromNO</w:t>
-      </w:r>
-      <w:proofErr w:type="spellEnd"/>
-      <w:r>
-        <w:rPr>
-          <w:rFonts w:ascii="Microsoft YaHei UI" w:eastAsia="Microsoft YaHei UI" w:cs="Microsoft YaHei UI"/>
-          <w:kern w:val="0"/>
-          <w:sz w:val="18"/>
-          <w:szCs w:val="18"/>
-        </w:rPr>
-        <w:t xml:space="preserve">, </w:t>
-      </w:r>
-      <w:proofErr w:type="spellStart"/>
-      <w:r>
-        <w:rPr>
-          <w:rFonts w:ascii="Microsoft YaHei UI" w:eastAsia="Microsoft YaHei UI" w:cs="Microsoft YaHei UI"/>
-          <w:kern w:val="0"/>
-          <w:sz w:val="18"/>
-          <w:szCs w:val="18"/>
-        </w:rPr>
-        <w:t>startpos</w:t>
-      </w:r>
-      <w:proofErr w:type="spellEnd"/>
-      <w:r>
-        <w:rPr>
-          <w:rFonts w:ascii="Microsoft YaHei UI" w:eastAsia="Microsoft YaHei UI" w:cs="Microsoft YaHei UI"/>
-          <w:kern w:val="0"/>
-          <w:sz w:val="18"/>
-          <w:szCs w:val="18"/>
-        </w:rPr>
-        <w:t xml:space="preserve">, </w:t>
-      </w:r>
-      <w:proofErr w:type="spellStart"/>
-      <w:r>
-        <w:rPr>
-          <w:rFonts w:ascii="Microsoft YaHei UI" w:eastAsia="Microsoft YaHei UI" w:cs="Microsoft YaHei UI"/>
-          <w:kern w:val="0"/>
-          <w:sz w:val="18"/>
-          <w:szCs w:val="18"/>
-        </w:rPr>
-        <w:t>endpos</w:t>
-      </w:r>
-      <w:proofErr w:type="spellEnd"/>
-      <w:r>
-        <w:rPr>
-          <w:rFonts w:ascii="Microsoft YaHei UI" w:eastAsia="Microsoft YaHei UI" w:cs="Microsoft YaHei UI"/>
-          <w:kern w:val="0"/>
-          <w:sz w:val="18"/>
-          <w:szCs w:val="18"/>
-        </w:rPr>
-        <w:t xml:space="preserve">,  </w:t>
-      </w:r>
-      <w:proofErr w:type="spellStart"/>
-      <w:r>
-        <w:rPr>
-          <w:rFonts w:ascii="Microsoft YaHei UI" w:eastAsia="Microsoft YaHei UI" w:cs="Microsoft YaHei UI"/>
-          <w:kern w:val="0"/>
-          <w:sz w:val="18"/>
-          <w:szCs w:val="18"/>
-        </w:rPr>
-        <w:t>currentChromNOlen</w:t>
-      </w:r>
-      <w:proofErr w:type="spellEnd"/>
-      <w:r>
-        <w:rPr>
-          <w:rFonts w:ascii="Microsoft YaHei UI" w:eastAsia="Microsoft YaHei UI" w:cs="Microsoft YaHei UI"/>
-          <w:kern w:val="0"/>
-          <w:sz w:val="18"/>
-          <w:szCs w:val="18"/>
-        </w:rPr>
-        <w:t xml:space="preserve">=None, </w:t>
-      </w:r>
-      <w:proofErr w:type="spellStart"/>
-      <w:r>
-        <w:rPr>
-          <w:rFonts w:ascii="Microsoft YaHei UI" w:eastAsia="Microsoft YaHei UI" w:cs="Microsoft YaHei UI"/>
-          <w:kern w:val="0"/>
-          <w:sz w:val="18"/>
-          <w:szCs w:val="18"/>
-        </w:rPr>
-        <w:t>seektuple</w:t>
-      </w:r>
-      <w:proofErr w:type="spellEnd"/>
-      <w:r>
-        <w:rPr>
-          <w:rFonts w:ascii="Microsoft YaHei UI" w:eastAsia="Microsoft YaHei UI" w:cs="Microsoft YaHei UI"/>
-          <w:kern w:val="0"/>
-          <w:sz w:val="18"/>
-          <w:szCs w:val="18"/>
-        </w:rPr>
-        <w:t>=()):</w:t>
+        <w:t>def getRefSeqBypos_faster(refFastahandle, fasterrefindex, currentChromNO, startpos, endpos,  currentChromNOlen=None, seektuple=()):</w:t>
       </w:r>
     </w:p>
     <w:p>
@@ -3867,49 +3445,7 @@
           <w:sz w:val="18"/>
           <w:szCs w:val="18"/>
         </w:rPr>
-        <w:t xml:space="preserve">    </w:t>
-      </w:r>
-      <w:proofErr w:type="spellStart"/>
-      <w:r>
-        <w:rPr>
-          <w:rFonts w:ascii="Microsoft YaHei UI" w:eastAsia="Microsoft YaHei UI" w:cs="Microsoft YaHei UI"/>
-          <w:kern w:val="0"/>
-          <w:sz w:val="18"/>
-          <w:szCs w:val="18"/>
-        </w:rPr>
-        <w:t>seektuple</w:t>
-      </w:r>
-      <w:proofErr w:type="spellEnd"/>
-      <w:r>
-        <w:rPr>
-          <w:rFonts w:ascii="Microsoft YaHei UI" w:eastAsia="Microsoft YaHei UI" w:cs="Microsoft YaHei UI"/>
-          <w:kern w:val="0"/>
-          <w:sz w:val="18"/>
-          <w:szCs w:val="18"/>
-        </w:rPr>
-        <w:t>=(</w:t>
-      </w:r>
-      <w:proofErr w:type="spellStart"/>
-      <w:proofErr w:type="gramStart"/>
-      <w:r>
-        <w:rPr>
-          <w:rFonts w:ascii="Microsoft YaHei UI" w:eastAsia="Microsoft YaHei UI" w:cs="Microsoft YaHei UI"/>
-          <w:kern w:val="0"/>
-          <w:sz w:val="18"/>
-          <w:szCs w:val="18"/>
-        </w:rPr>
-        <w:t>filepos,basesbeforefilepos</w:t>
-      </w:r>
-      <w:proofErr w:type="spellEnd"/>
-      <w:proofErr w:type="gramEnd"/>
-      <w:r>
-        <w:rPr>
-          <w:rFonts w:ascii="Microsoft YaHei UI" w:eastAsia="Microsoft YaHei UI" w:cs="Microsoft YaHei UI"/>
-          <w:kern w:val="0"/>
-          <w:sz w:val="18"/>
-          <w:szCs w:val="18"/>
-        </w:rPr>
-        <w:t>)</w:t>
+        <w:t xml:space="preserve">    seektuple=(filepos,basesbeforefilepos)</w:t>
       </w:r>
     </w:p>
     <w:p>
@@ -3933,27 +3469,7 @@
           <w:sz w:val="18"/>
           <w:szCs w:val="18"/>
         </w:rPr>
-        <w:t xml:space="preserve">    the </w:t>
-      </w:r>
-      <w:proofErr w:type="spellStart"/>
-      <w:r>
-        <w:rPr>
-          <w:rFonts w:ascii="Microsoft YaHei UI" w:eastAsia="Microsoft YaHei UI" w:cs="Microsoft YaHei UI"/>
-          <w:kern w:val="0"/>
-          <w:sz w:val="18"/>
-          <w:szCs w:val="18"/>
-        </w:rPr>
-        <w:t>refSeqMap</w:t>
-      </w:r>
-      <w:proofErr w:type="spellEnd"/>
-      <w:r>
-        <w:rPr>
-          <w:rFonts w:ascii="Microsoft YaHei UI" w:eastAsia="Microsoft YaHei UI" w:cs="Microsoft YaHei UI"/>
-          <w:kern w:val="0"/>
-          <w:sz w:val="18"/>
-          <w:szCs w:val="18"/>
-        </w:rPr>
-        <w:t xml:space="preserve"> has only one chromosome's sequence</w:t>
+        <w:t xml:space="preserve">    the refSeqMap has only one chromosome's sequence</w:t>
       </w:r>
     </w:p>
     <w:p>
@@ -3977,19 +3493,8 @@
           <w:sz w:val="18"/>
           <w:szCs w:val="18"/>
         </w:rPr>
-        <w:t xml:space="preserve">    There is no restriction on </w:t>
-      </w:r>
-      <w:proofErr w:type="spellStart"/>
-      <w:r>
-        <w:rPr>
-          <w:rFonts w:ascii="Microsoft YaHei UI" w:eastAsia="Microsoft YaHei UI" w:cs="Microsoft YaHei UI"/>
-          <w:kern w:val="0"/>
-          <w:sz w:val="18"/>
-          <w:szCs w:val="18"/>
-        </w:rPr>
-        <w:t>refFastahander</w:t>
-      </w:r>
-      <w:proofErr w:type="spellEnd"/>
+        <w:t xml:space="preserve">    There is no restriction on refFastahander</w:t>
+      </w:r>
     </w:p>
     <w:p>
       <w:pPr>
@@ -4012,19 +3517,18 @@
           <w:sz w:val="18"/>
           <w:szCs w:val="18"/>
         </w:rPr>
-        <w:t xml:space="preserve">    </w:t>
-      </w:r>
-      <w:proofErr w:type="spellStart"/>
+        <w:t xml:space="preserve">    refindex must indexed by </w:t>
+      </w:r>
       <w:r>
         <w:rPr>
           <w:rFonts w:ascii="Microsoft YaHei UI" w:eastAsia="Microsoft YaHei UI" w:cs="Microsoft YaHei UI"/>
+          <w:color w:val="FF0000"/>
           <w:kern w:val="0"/>
           <w:sz w:val="18"/>
           <w:szCs w:val="18"/>
         </w:rPr>
-        <w:t>refindex</w:t>
-      </w:r>
-      <w:proofErr w:type="spellEnd"/>
+        <w:t xml:space="preserve">generateFasterRefIndex </w:t>
+      </w:r>
       <w:r>
         <w:rPr>
           <w:rFonts w:ascii="Microsoft YaHei UI" w:eastAsia="Microsoft YaHei UI" w:cs="Microsoft YaHei UI"/>
@@ -4032,41 +3536,8 @@
           <w:sz w:val="18"/>
           <w:szCs w:val="18"/>
         </w:rPr>
-        <w:t xml:space="preserve"> must indexed by </w:t>
-      </w:r>
-      <w:proofErr w:type="spellStart"/>
-      <w:r>
-        <w:rPr>
-          <w:rFonts w:ascii="Microsoft YaHei UI" w:eastAsia="Microsoft YaHei UI" w:cs="Microsoft YaHei UI"/>
-          <w:color w:val="FF0000"/>
-          <w:kern w:val="0"/>
-          <w:sz w:val="18"/>
-          <w:szCs w:val="18"/>
-        </w:rPr>
-        <w:t>generateFasterRefIndex</w:t>
-      </w:r>
-      <w:proofErr w:type="spellEnd"/>
-      <w:r>
-        <w:rPr>
-          <w:rFonts w:ascii="Microsoft YaHei UI" w:eastAsia="Microsoft YaHei UI" w:cs="Microsoft YaHei UI"/>
-          <w:color w:val="FF0000"/>
-          <w:kern w:val="0"/>
-          <w:sz w:val="18"/>
-          <w:szCs w:val="18"/>
-        </w:rPr>
-        <w:t xml:space="preserve"> </w:t>
-      </w:r>
-      <w:proofErr w:type="spellStart"/>
-      <w:r>
-        <w:rPr>
-          <w:rFonts w:ascii="Microsoft YaHei UI" w:eastAsia="Microsoft YaHei UI" w:cs="Microsoft YaHei UI"/>
-          <w:kern w:val="0"/>
-          <w:sz w:val="18"/>
-          <w:szCs w:val="18"/>
-        </w:rPr>
         <w:t>func</w:t>
       </w:r>
-      <w:proofErr w:type="spellEnd"/>
     </w:p>
     <w:p>
       <w:pPr>
@@ -4145,7 +3616,6 @@
           <w:numId w:val="3"/>
         </w:numPr>
       </w:pPr>
-      <w:proofErr w:type="spellStart"/>
       <w:r>
         <w:rPr>
           <w:rFonts w:ascii="Consolas" w:hAnsi="Consolas" w:cs="Consolas"/>
@@ -4156,7 +3626,6 @@
         </w:rPr>
         <w:t>getdepthByPos</w:t>
       </w:r>
-      <w:proofErr w:type="spellEnd"/>
       <w:r>
         <w:rPr>
           <w:rFonts w:ascii="Consolas" w:hAnsi="Consolas" w:cs="Consolas" w:hint="eastAsia"/>
@@ -4196,7 +3665,6 @@
         </w:rPr>
         <w:t>，所以</w:t>
       </w:r>
-      <w:proofErr w:type="spellStart"/>
       <w:r>
         <w:rPr>
           <w:rFonts w:ascii="Consolas" w:hAnsi="Consolas" w:cs="Consolas"/>
@@ -4207,7 +3675,6 @@
         </w:rPr>
         <w:t>getdepthByPos</w:t>
       </w:r>
-      <w:proofErr w:type="spellEnd"/>
       <w:r>
         <w:rPr>
           <w:rFonts w:ascii="Consolas" w:hAnsi="Consolas" w:cs="Consolas" w:hint="eastAsia"/>
@@ -4266,51 +3733,7 @@
           <w:sz w:val="20"/>
           <w:szCs w:val="20"/>
         </w:rPr>
-        <w:t>]*</w:t>
-      </w:r>
-      <w:proofErr w:type="spellStart"/>
-      <w:r>
-        <w:rPr>
-          <w:rFonts w:ascii="Consolas" w:hAnsi="Consolas" w:cs="Consolas" w:hint="eastAsia"/>
-          <w:bCs/>
-          <w:kern w:val="0"/>
-          <w:sz w:val="20"/>
-          <w:szCs w:val="20"/>
-        </w:rPr>
-        <w:t>len</w:t>
-      </w:r>
-      <w:proofErr w:type="spellEnd"/>
-      <w:r>
-        <w:rPr>
-          <w:rFonts w:ascii="Consolas" w:hAnsi="Consolas" w:cs="Consolas" w:hint="eastAsia"/>
-          <w:bCs/>
-          <w:kern w:val="0"/>
-          <w:sz w:val="20"/>
-          <w:szCs w:val="20"/>
-        </w:rPr>
-        <w:t>(</w:t>
-      </w:r>
-      <w:proofErr w:type="spellStart"/>
-      <w:r>
-        <w:rPr>
-          <w:rFonts w:ascii="Consolas" w:hAnsi="Consolas" w:cs="Consolas" w:hint="eastAsia"/>
-          <w:bCs/>
-          <w:kern w:val="0"/>
-          <w:sz w:val="20"/>
-          <w:szCs w:val="20"/>
-        </w:rPr>
-        <w:t>self.title</w:t>
-      </w:r>
-      <w:proofErr w:type="spellEnd"/>
-      <w:r>
-        <w:rPr>
-          <w:rFonts w:ascii="Consolas" w:hAnsi="Consolas" w:cs="Consolas" w:hint="eastAsia"/>
-          <w:bCs/>
-          <w:kern w:val="0"/>
-          <w:sz w:val="20"/>
-          <w:szCs w:val="20"/>
-        </w:rPr>
-        <w:t>)</w:t>
+        <w:t>]*len(self.title)</w:t>
       </w:r>
       <w:r>
         <w:rPr>
@@ -4332,7 +3755,6 @@
         </w:numPr>
         <w:ind w:firstLineChars="0"/>
       </w:pPr>
-      <w:proofErr w:type="spellStart"/>
       <w:r>
         <w:rPr>
           <w:rFonts w:ascii="Consolas" w:hAnsi="Consolas" w:cs="Consolas"/>
@@ -4344,7 +3766,6 @@
         </w:rPr>
         <w:t>GATK_depthfile</w:t>
       </w:r>
-      <w:proofErr w:type="spellEnd"/>
       <w:r>
         <w:rPr>
           <w:rFonts w:ascii="Consolas" w:hAnsi="Consolas" w:cs="Consolas" w:hint="eastAsia"/>
@@ -4356,7 +3777,6 @@
         </w:rPr>
         <w:t>函数中的</w:t>
       </w:r>
-      <w:proofErr w:type="spellStart"/>
       <w:r>
         <w:rPr>
           <w:rFonts w:ascii="Consolas" w:hAnsi="Consolas" w:cs="Consolas"/>
@@ -4368,7 +3788,6 @@
         </w:rPr>
         <w:t>getdepthByPos_optimized</w:t>
       </w:r>
-      <w:proofErr w:type="spellEnd"/>
       <w:r>
         <w:rPr>
           <w:rFonts w:ascii="Consolas" w:hAnsi="Consolas" w:cs="Consolas" w:hint="eastAsia"/>
@@ -4380,7 +3799,6 @@
         </w:rPr>
         <w:t>方法为</w:t>
       </w:r>
-      <w:proofErr w:type="spellStart"/>
       <w:r>
         <w:rPr>
           <w:rFonts w:ascii="Consolas" w:hAnsi="Consolas" w:cs="Consolas"/>
@@ -4391,7 +3809,6 @@
         </w:rPr>
         <w:t>getdepthByPos</w:t>
       </w:r>
-      <w:proofErr w:type="spellEnd"/>
       <w:r>
         <w:rPr>
           <w:rFonts w:ascii="Consolas" w:hAnsi="Consolas" w:cs="Consolas" w:hint="eastAsia"/>
@@ -4416,35 +3833,7 @@
         <w:rPr>
           <w:rFonts w:hint="eastAsia"/>
         </w:rPr>
-        <w:t>读入方式改为read()读入内存，在其中结构化为位置作为键的map，</w:t>
-      </w:r>
-      <w:proofErr w:type="gramStart"/>
-      <w:r>
-        <w:rPr>
-          <w:rFonts w:hint="eastAsia"/>
-        </w:rPr>
-        <w:t>然后再该</w:t>
-      </w:r>
-      <w:proofErr w:type="gramEnd"/>
-      <w:r>
-        <w:rPr>
-          <w:rFonts w:hint="eastAsia"/>
-        </w:rPr>
-        <w:t>map中查找位置，而非</w:t>
-      </w:r>
-      <w:proofErr w:type="spellStart"/>
-      <w:r>
-        <w:rPr>
-          <w:rFonts w:hint="eastAsia"/>
-        </w:rPr>
-        <w:t>readline</w:t>
-      </w:r>
-      <w:proofErr w:type="spellEnd"/>
-      <w:r>
-        <w:rPr>
-          <w:rFonts w:hint="eastAsia"/>
-        </w:rPr>
-        <w:t>()的方式从硬盘查找位置</w:t>
+        <w:t>读入方式改为read()读入内存，在其中结构化为位置作为键的map，然后再该map中查找位置，而非readline()的方式从硬盘查找位置</w:t>
       </w:r>
     </w:p>
     <w:p>
@@ -4460,35 +3849,7 @@
         <w:rPr>
           <w:rFonts w:hint="eastAsia"/>
         </w:rPr>
-        <w:t>多次实例化</w:t>
-      </w:r>
-      <w:proofErr w:type="spellStart"/>
-      <w:r>
-        <w:rPr>
-          <w:rFonts w:hint="eastAsia"/>
-        </w:rPr>
-        <w:t>GATK_depthfile</w:t>
-      </w:r>
-      <w:proofErr w:type="spellEnd"/>
-      <w:r>
-        <w:rPr>
-          <w:rFonts w:hint="eastAsia"/>
-        </w:rPr>
-        <w:t>类时，可能都是对一个</w:t>
-      </w:r>
-      <w:proofErr w:type="spellStart"/>
-      <w:r>
-        <w:rPr>
-          <w:rFonts w:hint="eastAsia"/>
-        </w:rPr>
-        <w:t>gatkdepth</w:t>
-      </w:r>
-      <w:proofErr w:type="spellEnd"/>
-      <w:r>
-        <w:rPr>
-          <w:rFonts w:hint="eastAsia"/>
-        </w:rPr>
-        <w:t>文件经行实例化，那么用这样的逻辑来避免多次生成map，由于每次查找某个染色体的某个位置都一定要把这个染色体的depth都加载到内存，而单线程程序一般会生成多个实例，而且处理的时候同时处理同一个染色体，所以如果这几个实例都使用一个depth文件，则可以加载一次内存就够了。而多线程程序中不同线程不一定会在同一个时间处理同一个染色体，所以一定要为每个对象加载一次。是否加载通过如下逻辑判断，如果是多线程 或者 还没有加载 或者 将加载不同文件，</w:t>
+        <w:t>多次实例化GATK_depthfile类时，可能都是对一个gatkdepth文件经行实例化，那么用这样的逻辑来避免多次生成map，由于每次查找某个染色体的某个位置都一定要把这个染色体的depth都加载到内存，而单线程程序一般会生成多个实例，而且处理的时候同时处理同一个染色体，所以如果这几个实例都使用一个depth文件，则可以加载一次内存就够了。而多线程程序中不同线程不一定会在同一个时间处理同一个染色体，所以一定要为每个对象加载一次。是否加载通过如下逻辑判断，如果是多线程 或者 还没有加载 或者 将加载不同文件，</w:t>
       </w:r>
       <w:r>
         <w:rPr>
@@ -4561,7 +3922,6 @@
           <w:szCs w:val="21"/>
         </w:rPr>
       </w:pPr>
-      <w:proofErr w:type="spellStart"/>
       <w:r>
         <w:rPr>
           <w:rFonts w:ascii="Consolas" w:hAnsi="Consolas" w:cs="Consolas" w:hint="eastAsia"/>
@@ -4582,7 +3942,6 @@
         </w:rPr>
         <w:t>etflankseqs</w:t>
       </w:r>
-      <w:proofErr w:type="spellEnd"/>
       <w:r>
         <w:rPr>
           <w:rFonts w:ascii="Consolas" w:hAnsi="Consolas" w:cs="Consolas" w:hint="eastAsia"/>
@@ -4593,7 +3952,6 @@
         </w:rPr>
         <w:t>函数，对</w:t>
       </w:r>
-      <w:proofErr w:type="spellStart"/>
       <w:r>
         <w:rPr>
           <w:rFonts w:ascii="Consolas" w:hAnsi="Consolas" w:cs="Consolas" w:hint="eastAsia"/>
@@ -4604,7 +3962,6 @@
         </w:rPr>
         <w:t>vcf</w:t>
       </w:r>
-      <w:proofErr w:type="spellEnd"/>
       <w:r>
         <w:rPr>
           <w:rFonts w:ascii="Consolas" w:hAnsi="Consolas" w:cs="Consolas" w:hint="eastAsia"/>
@@ -4615,7 +3972,6 @@
         </w:rPr>
         <w:t>数据表中（一般为</w:t>
       </w:r>
-      <w:proofErr w:type="spellStart"/>
       <w:r>
         <w:rPr>
           <w:rFonts w:ascii="Consolas" w:hAnsi="Consolas" w:cs="Consolas" w:hint="eastAsia"/>
@@ -4624,9 +3980,8 @@
           <w:kern w:val="0"/>
           <w:szCs w:val="21"/>
         </w:rPr>
-        <w:t>toplevel</w:t>
-      </w:r>
-      <w:proofErr w:type="spellEnd"/>
+        <w:t>toplevel vcf</w:t>
+      </w:r>
       <w:r>
         <w:rPr>
           <w:rFonts w:ascii="Consolas" w:hAnsi="Consolas" w:cs="Consolas" w:hint="eastAsia"/>
@@ -4635,9 +3990,8 @@
           <w:kern w:val="0"/>
           <w:szCs w:val="21"/>
         </w:rPr>
-        <w:t xml:space="preserve"> </w:t>
-      </w:r>
-      <w:proofErr w:type="spellStart"/>
+        <w:t>表），的某个染色体号的所有</w:t>
+      </w:r>
       <w:r>
         <w:rPr>
           <w:rFonts w:ascii="Consolas" w:hAnsi="Consolas" w:cs="Consolas" w:hint="eastAsia"/>
@@ -4646,9 +4000,8 @@
           <w:kern w:val="0"/>
           <w:szCs w:val="21"/>
         </w:rPr>
-        <w:t>vcf</w:t>
-      </w:r>
-      <w:proofErr w:type="spellEnd"/>
+        <w:t>snp</w:t>
+      </w:r>
       <w:r>
         <w:rPr>
           <w:rFonts w:ascii="Consolas" w:hAnsi="Consolas" w:cs="Consolas" w:hint="eastAsia"/>
@@ -4657,9 +4010,8 @@
           <w:kern w:val="0"/>
           <w:szCs w:val="21"/>
         </w:rPr>
-        <w:t>表），的某个染色体号的所有</w:t>
-      </w:r>
-      <w:proofErr w:type="spellStart"/>
+        <w:t>，输出其上下游的序列，并且填充表中的</w:t>
+      </w:r>
       <w:r>
         <w:rPr>
           <w:rFonts w:ascii="Consolas" w:hAnsi="Consolas" w:cs="Consolas" w:hint="eastAsia"/>
@@ -4668,51 +4020,28 @@
           <w:kern w:val="0"/>
           <w:szCs w:val="21"/>
         </w:rPr>
+        <w:t>context</w:t>
+      </w:r>
+      <w:r>
+        <w:rPr>
+          <w:rFonts w:ascii="Consolas" w:hAnsi="Consolas" w:cs="Consolas" w:hint="eastAsia"/>
+          <w:bCs/>
+          <w:color w:val="000000"/>
+          <w:kern w:val="0"/>
+          <w:szCs w:val="21"/>
+        </w:rPr>
+        <w:t>项为该</w:t>
+      </w:r>
+      <w:r>
+        <w:rPr>
+          <w:rFonts w:ascii="Consolas" w:hAnsi="Consolas" w:cs="Consolas" w:hint="eastAsia"/>
+          <w:bCs/>
+          <w:color w:val="000000"/>
+          <w:kern w:val="0"/>
+          <w:szCs w:val="21"/>
+        </w:rPr>
         <w:t>snp</w:t>
       </w:r>
-      <w:proofErr w:type="spellEnd"/>
-      <w:r>
-        <w:rPr>
-          <w:rFonts w:ascii="Consolas" w:hAnsi="Consolas" w:cs="Consolas" w:hint="eastAsia"/>
-          <w:bCs/>
-          <w:color w:val="000000"/>
-          <w:kern w:val="0"/>
-          <w:szCs w:val="21"/>
-        </w:rPr>
-        <w:t>，输出其上下游的序列，并且填充表中的</w:t>
-      </w:r>
-      <w:r>
-        <w:rPr>
-          <w:rFonts w:ascii="Consolas" w:hAnsi="Consolas" w:cs="Consolas" w:hint="eastAsia"/>
-          <w:bCs/>
-          <w:color w:val="000000"/>
-          <w:kern w:val="0"/>
-          <w:szCs w:val="21"/>
-        </w:rPr>
-        <w:t>context</w:t>
-      </w:r>
-      <w:r>
-        <w:rPr>
-          <w:rFonts w:ascii="Consolas" w:hAnsi="Consolas" w:cs="Consolas" w:hint="eastAsia"/>
-          <w:bCs/>
-          <w:color w:val="000000"/>
-          <w:kern w:val="0"/>
-          <w:szCs w:val="21"/>
-        </w:rPr>
-        <w:t>项为该</w:t>
-      </w:r>
-      <w:proofErr w:type="spellStart"/>
-      <w:r>
-        <w:rPr>
-          <w:rFonts w:ascii="Consolas" w:hAnsi="Consolas" w:cs="Consolas" w:hint="eastAsia"/>
-          <w:bCs/>
-          <w:color w:val="000000"/>
-          <w:kern w:val="0"/>
-          <w:szCs w:val="21"/>
-        </w:rPr>
-        <w:t>snp</w:t>
-      </w:r>
-      <w:proofErr w:type="spellEnd"/>
       <w:r>
         <w:rPr>
           <w:rFonts w:ascii="Consolas" w:hAnsi="Consolas" w:cs="Consolas" w:hint="eastAsia"/>
@@ -4746,7 +4075,6 @@
         </w:rPr>
         <w:t>输入参数为：染色体号，染色体长度，</w:t>
       </w:r>
-      <w:proofErr w:type="spellStart"/>
       <w:r>
         <w:rPr>
           <w:rFonts w:ascii="Consolas" w:hAnsi="Consolas" w:cs="Consolas" w:hint="eastAsia"/>
@@ -4757,7 +4085,6 @@
         </w:rPr>
         <w:t>yao</w:t>
       </w:r>
-      <w:proofErr w:type="spellEnd"/>
     </w:p>
     <w:p>
       <w:pPr>
@@ -4790,21 +4117,23 @@
         <w:rPr>
           <w:rFonts w:hint="eastAsia"/>
         </w:rPr>
-        <w:t>控制在计算</w:t>
-      </w:r>
-      <w:proofErr w:type="spellStart"/>
+        <w:t>控制在计算fst时，是否考虑差异固定；</w:t>
+      </w:r>
+    </w:p>
+    <w:p>
       <w:r>
         <w:rPr>
           <w:rFonts w:hint="eastAsia"/>
         </w:rPr>
-        <w:t>fst</w:t>
-      </w:r>
-      <w:proofErr w:type="spellEnd"/>
+        <w:t>当判断是否某个位点在该种群中固定时，用如下思路：</w:t>
+      </w:r>
+    </w:p>
+    <w:p>
       <w:r>
         <w:rPr>
           <w:rFonts w:hint="eastAsia"/>
         </w:rPr>
-        <w:t>时，是否考虑差异固定；</w:t>
+        <w:t>总的来讲，当某个种群所有被测个体都是一种等位基因时，则该位点当做在该种群中固定，否则不当做固定位点。</w:t>
       </w:r>
     </w:p>
     <w:p>
@@ -4812,7 +4141,7 @@
         <w:rPr>
           <w:rFonts w:hint="eastAsia"/>
         </w:rPr>
-        <w:t>当判断是否某个位点在该种群中固定时，用如下思路：</w:t>
+        <w:t>那么，具体来讲，判断根据两个文件（或者仅根据vcf），一个是vcf中的depth，当vcf没有该位点时根据GATK.depth文件判断：</w:t>
       </w:r>
     </w:p>
     <w:p>
@@ -4820,296 +4149,26 @@
         <w:rPr>
           <w:rFonts w:hint="eastAsia"/>
         </w:rPr>
-        <w:t>总的来讲，当某个种群所有被测个体都是一种等位基因时，则该位点</w:t>
-      </w:r>
-      <w:proofErr w:type="gramStart"/>
+        <w:t>如果是pool的数据，vcf中的depth，与GATK.depth文件中的depth等同，判断是否固定的深度标准是GATK.depth.summary中的</w:t>
+      </w:r>
+      <w:r>
+        <w:t>granular_median</w:t>
+      </w:r>
+    </w:p>
+    <w:p>
       <w:r>
         <w:rPr>
           <w:rFonts w:hint="eastAsia"/>
         </w:rPr>
-        <w:t>当做</w:t>
-      </w:r>
-      <w:proofErr w:type="gramEnd"/>
+        <w:t>如果是indvd的数据，则总共多少个个体的信息从vcf的title中得知，在vcf中，测到的AC等于个体数的话则判断固定为alt，如果vcf中没有该位点，GATK.depth文件中每个个体的深度如果超过4，则判定为固定位该位点。</w:t>
+      </w:r>
+    </w:p>
+    <w:p>
       <w:r>
         <w:rPr>
           <w:rFonts w:hint="eastAsia"/>
         </w:rPr>
-        <w:t>在该种群中固定，否则不</w:t>
-      </w:r>
-      <w:proofErr w:type="gramStart"/>
-      <w:r>
-        <w:rPr>
-          <w:rFonts w:hint="eastAsia"/>
-        </w:rPr>
-        <w:t>当做</w:t>
-      </w:r>
-      <w:proofErr w:type="gramEnd"/>
-      <w:r>
-        <w:rPr>
-          <w:rFonts w:hint="eastAsia"/>
-        </w:rPr>
-        <w:t>固定位点。</w:t>
-      </w:r>
-    </w:p>
-    <w:p>
-      <w:r>
-        <w:rPr>
-          <w:rFonts w:hint="eastAsia"/>
-        </w:rPr>
-        <w:t>那么，具体来讲，判断根据两个文件（或者仅根据</w:t>
-      </w:r>
-      <w:proofErr w:type="spellStart"/>
-      <w:r>
-        <w:rPr>
-          <w:rFonts w:hint="eastAsia"/>
-        </w:rPr>
-        <w:t>vcf</w:t>
-      </w:r>
-      <w:proofErr w:type="spellEnd"/>
-      <w:r>
-        <w:rPr>
-          <w:rFonts w:hint="eastAsia"/>
-        </w:rPr>
-        <w:t>），一个是</w:t>
-      </w:r>
-      <w:proofErr w:type="spellStart"/>
-      <w:r>
-        <w:rPr>
-          <w:rFonts w:hint="eastAsia"/>
-        </w:rPr>
-        <w:t>vcf</w:t>
-      </w:r>
-      <w:proofErr w:type="spellEnd"/>
-      <w:r>
-        <w:rPr>
-          <w:rFonts w:hint="eastAsia"/>
-        </w:rPr>
-        <w:t>中的depth，当</w:t>
-      </w:r>
-      <w:proofErr w:type="spellStart"/>
-      <w:r>
-        <w:rPr>
-          <w:rFonts w:hint="eastAsia"/>
-        </w:rPr>
-        <w:t>vcf</w:t>
-      </w:r>
-      <w:proofErr w:type="spellEnd"/>
-      <w:r>
-        <w:rPr>
-          <w:rFonts w:hint="eastAsia"/>
-        </w:rPr>
-        <w:t>没有该位点时根据</w:t>
-      </w:r>
-      <w:proofErr w:type="spellStart"/>
-      <w:r>
-        <w:rPr>
-          <w:rFonts w:hint="eastAsia"/>
-        </w:rPr>
-        <w:t>GATK.depth</w:t>
-      </w:r>
-      <w:proofErr w:type="spellEnd"/>
-      <w:r>
-        <w:rPr>
-          <w:rFonts w:hint="eastAsia"/>
-        </w:rPr>
-        <w:t>文件判断：</w:t>
-      </w:r>
-    </w:p>
-    <w:p>
-      <w:r>
-        <w:rPr>
-          <w:rFonts w:hint="eastAsia"/>
-        </w:rPr>
-        <w:t>如果是pool的数据，</w:t>
-      </w:r>
-      <w:proofErr w:type="spellStart"/>
-      <w:r>
-        <w:rPr>
-          <w:rFonts w:hint="eastAsia"/>
-        </w:rPr>
-        <w:t>vcf</w:t>
-      </w:r>
-      <w:proofErr w:type="spellEnd"/>
-      <w:r>
-        <w:rPr>
-          <w:rFonts w:hint="eastAsia"/>
-        </w:rPr>
-        <w:t>中的depth，与</w:t>
-      </w:r>
-      <w:proofErr w:type="spellStart"/>
-      <w:r>
-        <w:rPr>
-          <w:rFonts w:hint="eastAsia"/>
-        </w:rPr>
-        <w:t>GATK.depth</w:t>
-      </w:r>
-      <w:proofErr w:type="spellEnd"/>
-      <w:r>
-        <w:rPr>
-          <w:rFonts w:hint="eastAsia"/>
-        </w:rPr>
-        <w:t>文件中的depth等同，判断是否固定的深度标准是</w:t>
-      </w:r>
-      <w:proofErr w:type="spellStart"/>
-      <w:r>
-        <w:rPr>
-          <w:rFonts w:hint="eastAsia"/>
-        </w:rPr>
-        <w:t>GATK.depth.summary</w:t>
-      </w:r>
-      <w:proofErr w:type="spellEnd"/>
-      <w:r>
-        <w:rPr>
-          <w:rFonts w:hint="eastAsia"/>
-        </w:rPr>
-        <w:t>中的</w:t>
-      </w:r>
-      <w:proofErr w:type="spellStart"/>
-      <w:r>
-        <w:t>granular_median</w:t>
-      </w:r>
-      <w:proofErr w:type="spellEnd"/>
-    </w:p>
-    <w:p>
-      <w:r>
-        <w:rPr>
-          <w:rFonts w:hint="eastAsia"/>
-        </w:rPr>
-        <w:t>如果是</w:t>
-      </w:r>
-      <w:proofErr w:type="spellStart"/>
-      <w:r>
-        <w:rPr>
-          <w:rFonts w:hint="eastAsia"/>
-        </w:rPr>
-        <w:t>indvd</w:t>
-      </w:r>
-      <w:proofErr w:type="spellEnd"/>
-      <w:r>
-        <w:rPr>
-          <w:rFonts w:hint="eastAsia"/>
-        </w:rPr>
-        <w:t>的数据，则总共多少个个体的信息从</w:t>
-      </w:r>
-      <w:proofErr w:type="spellStart"/>
-      <w:r>
-        <w:rPr>
-          <w:rFonts w:hint="eastAsia"/>
-        </w:rPr>
-        <w:t>vcf</w:t>
-      </w:r>
-      <w:proofErr w:type="spellEnd"/>
-      <w:r>
-        <w:rPr>
-          <w:rFonts w:hint="eastAsia"/>
-        </w:rPr>
-        <w:t>的title中得知，在</w:t>
-      </w:r>
-      <w:proofErr w:type="spellStart"/>
-      <w:r>
-        <w:rPr>
-          <w:rFonts w:hint="eastAsia"/>
-        </w:rPr>
-        <w:t>vcf</w:t>
-      </w:r>
-      <w:proofErr w:type="spellEnd"/>
-      <w:r>
-        <w:rPr>
-          <w:rFonts w:hint="eastAsia"/>
-        </w:rPr>
-        <w:t>中，测到的AC等于个体数的话</w:t>
-      </w:r>
-      <w:proofErr w:type="gramStart"/>
-      <w:r>
-        <w:rPr>
-          <w:rFonts w:hint="eastAsia"/>
-        </w:rPr>
-        <w:t>则判断</w:t>
-      </w:r>
-      <w:proofErr w:type="gramEnd"/>
-      <w:r>
-        <w:rPr>
-          <w:rFonts w:hint="eastAsia"/>
-        </w:rPr>
-        <w:t>固定为alt，如果</w:t>
-      </w:r>
-      <w:proofErr w:type="spellStart"/>
-      <w:r>
-        <w:rPr>
-          <w:rFonts w:hint="eastAsia"/>
-        </w:rPr>
-        <w:t>vcf</w:t>
-      </w:r>
-      <w:proofErr w:type="spellEnd"/>
-      <w:r>
-        <w:rPr>
-          <w:rFonts w:hint="eastAsia"/>
-        </w:rPr>
-        <w:t>中没有该位点，</w:t>
-      </w:r>
-      <w:proofErr w:type="spellStart"/>
-      <w:r>
-        <w:rPr>
-          <w:rFonts w:hint="eastAsia"/>
-        </w:rPr>
-        <w:t>GATK.depth</w:t>
-      </w:r>
-      <w:proofErr w:type="spellEnd"/>
-      <w:r>
-        <w:rPr>
-          <w:rFonts w:hint="eastAsia"/>
-        </w:rPr>
-        <w:t>文件中每个个体的深度如果超过4，则判定为</w:t>
-      </w:r>
-      <w:proofErr w:type="gramStart"/>
-      <w:r>
-        <w:rPr>
-          <w:rFonts w:hint="eastAsia"/>
-        </w:rPr>
-        <w:t>固定位该</w:t>
-      </w:r>
-      <w:proofErr w:type="gramEnd"/>
-      <w:r>
-        <w:rPr>
-          <w:rFonts w:hint="eastAsia"/>
-        </w:rPr>
-        <w:t>位点。</w:t>
-      </w:r>
-    </w:p>
-    <w:p>
-      <w:r>
-        <w:rPr>
-          <w:rFonts w:hint="eastAsia"/>
-        </w:rPr>
-        <w:t>如果没有depth文件，则仅从</w:t>
-      </w:r>
-      <w:proofErr w:type="spellStart"/>
-      <w:r>
-        <w:rPr>
-          <w:rFonts w:hint="eastAsia"/>
-        </w:rPr>
-        <w:t>vcf</w:t>
-      </w:r>
-      <w:proofErr w:type="spellEnd"/>
-      <w:r>
-        <w:rPr>
-          <w:rFonts w:hint="eastAsia"/>
-        </w:rPr>
-        <w:t>中是否判定为固定（pool的话就是ref为0，</w:t>
-      </w:r>
-      <w:proofErr w:type="spellStart"/>
-      <w:r>
-        <w:rPr>
-          <w:rFonts w:hint="eastAsia"/>
-        </w:rPr>
-        <w:t>indvd</w:t>
-      </w:r>
-      <w:proofErr w:type="spellEnd"/>
-      <w:r>
-        <w:rPr>
-          <w:rFonts w:hint="eastAsia"/>
-        </w:rPr>
-        <w:t>的话就是ac=个体数），或有无该位点判断固定。</w:t>
+        <w:t>如果没有depth文件，则仅从vcf中是否判定为固定（pool的话就是ref为0，indvd的话就是ac=个体数），或有无该位点判断固定。</w:t>
       </w:r>
     </w:p>
     <w:p>
@@ -5137,187 +4196,67 @@
           <w:rFonts w:hint="eastAsia"/>
           <w:b/>
         </w:rPr>
-        <w:t>临时性添加了</w:t>
-      </w:r>
-      <w:proofErr w:type="spellStart"/>
+        <w:t>临时性添加了Caculate_df的功能，此种情况下只提供一个vcf文件，但要提供两个群体名列表文件，对应vcf文件的title。当不指定-f 参数时则不影响原来计算hp的功能。</w:t>
+      </w:r>
+    </w:p>
+    <w:p>
+      <w:pPr>
+        <w:rPr>
+          <w:b/>
+        </w:rPr>
+      </w:pPr>
+    </w:p>
+    <w:p>
+      <w:pPr>
+        <w:rPr>
+          <w:b/>
+        </w:rPr>
+      </w:pPr>
       <w:r>
         <w:rPr>
           <w:rFonts w:hint="eastAsia"/>
           <w:b/>
         </w:rPr>
-        <w:t>Caculate_df</w:t>
-      </w:r>
-      <w:proofErr w:type="spellEnd"/>
-      <w:r>
-        <w:rPr>
-          <w:rFonts w:hint="eastAsia"/>
+        <w:t>使用多sql的示例</w:t>
+      </w:r>
+    </w:p>
+    <w:p>
+      <w:pPr>
+        <w:rPr>
           <w:b/>
         </w:rPr>
-        <w:t>的功能，此种情况下只提供一个</w:t>
-      </w:r>
-      <w:proofErr w:type="spellStart"/>
-      <w:r>
-        <w:rPr>
-          <w:rFonts w:hint="eastAsia"/>
+      </w:pPr>
+      <w:r>
+        <w:rPr>
           <w:b/>
         </w:rPr>
-        <w:t>vcf</w:t>
-      </w:r>
-      <w:proofErr w:type="spellEnd"/>
-      <w:r>
-        <w:rPr>
-          <w:rFonts w:hint="eastAsia"/>
+        <w:t>&gt;&gt;&gt; dbvariantstools.operateDB("insert",*l,data=[('KB742382.1',26,".","AAA","bbb","p"),('KB742382.1',27,".","f","l","123,0")])</w:t>
+      </w:r>
+    </w:p>
+    <w:p>
+      <w:pPr>
+        <w:rPr>
           <w:b/>
         </w:rPr>
-        <w:t>文件，但要提供两个群体名列表文件，对应</w:t>
-      </w:r>
-      <w:proofErr w:type="spellStart"/>
-      <w:r>
-        <w:rPr>
-          <w:rFonts w:hint="eastAsia"/>
+      </w:pPr>
+      <w:r>
+        <w:rPr>
           <w:b/>
         </w:rPr>
-        <w:t>vcf</w:t>
-      </w:r>
-      <w:proofErr w:type="spellEnd"/>
-      <w:r>
-        <w:rPr>
-          <w:rFonts w:hint="eastAsia"/>
+        <w:t>0</w:t>
+      </w:r>
+    </w:p>
+    <w:p>
+      <w:pPr>
+        <w:rPr>
           <w:b/>
         </w:rPr>
-        <w:t>文件的title。当不指定-f 参数时则不影响原来计算hp的功能。</w:t>
-      </w:r>
-    </w:p>
-    <w:p>
-      <w:pPr>
+      </w:pPr>
+      <w:r>
         <w:rPr>
           <w:b/>
         </w:rPr>
-      </w:pPr>
-    </w:p>
-    <w:p>
-      <w:pPr>
-        <w:rPr>
-          <w:b/>
-        </w:rPr>
-      </w:pPr>
-      <w:r>
-        <w:rPr>
-          <w:rFonts w:hint="eastAsia"/>
-          <w:b/>
-        </w:rPr>
-        <w:t>使用多</w:t>
-      </w:r>
-      <w:proofErr w:type="spellStart"/>
-      <w:r>
-        <w:rPr>
-          <w:rFonts w:hint="eastAsia"/>
-          <w:b/>
-        </w:rPr>
-        <w:t>sql</w:t>
-      </w:r>
-      <w:proofErr w:type="spellEnd"/>
-      <w:r>
-        <w:rPr>
-          <w:rFonts w:hint="eastAsia"/>
-          <w:b/>
-        </w:rPr>
-        <w:t>的示例</w:t>
-      </w:r>
-    </w:p>
-    <w:p>
-      <w:pPr>
-        <w:rPr>
-          <w:b/>
-        </w:rPr>
-      </w:pPr>
-      <w:r>
-        <w:rPr>
-          <w:b/>
-        </w:rPr>
-        <w:t xml:space="preserve">&gt;&gt;&gt; </w:t>
-      </w:r>
-      <w:proofErr w:type="gramStart"/>
-      <w:r>
-        <w:rPr>
-          <w:b/>
-        </w:rPr>
-        <w:t>dbvariantstools.operateDB</w:t>
-      </w:r>
-      <w:proofErr w:type="gramEnd"/>
-      <w:r>
-        <w:rPr>
-          <w:b/>
-        </w:rPr>
-        <w:t>("insert",*l,data=[('KB742382.1',26,".","AAA","bbb","p"),('KB742382.1',27,".","f","l","123,0")])</w:t>
-      </w:r>
-    </w:p>
-    <w:p>
-      <w:pPr>
-        <w:rPr>
-          <w:b/>
-        </w:rPr>
-      </w:pPr>
-      <w:r>
-        <w:rPr>
-          <w:b/>
-        </w:rPr>
-        <w:t>0</w:t>
-      </w:r>
-    </w:p>
-    <w:p>
-      <w:pPr>
-        <w:rPr>
-          <w:b/>
-        </w:rPr>
-      </w:pPr>
-      <w:r>
-        <w:rPr>
-          <w:b/>
-        </w:rPr>
-        <w:t>&gt;&gt;&gt; l</w:t>
-      </w:r>
-      <w:proofErr w:type="gramStart"/>
-      <w:r>
-        <w:rPr>
-          <w:b/>
-        </w:rPr>
-        <w:t>=[</w:t>
-      </w:r>
-      <w:proofErr w:type="gramEnd"/>
-      <w:r>
-        <w:rPr>
-          <w:b/>
-        </w:rPr>
-        <w:t>"insert into mspsgjlksy10pop_toplevel_pekingduckref_new(chrID,snp_pos,snpID,ref_base,alt_base,wegeon__pool_withindel_vcf_alt) VALUES(%</w:t>
-      </w:r>
-      <w:proofErr w:type="spellStart"/>
-      <w:r>
-        <w:rPr>
-          <w:b/>
-        </w:rPr>
-        <w:t>s,%s,%s,%s,%s,%s</w:t>
-      </w:r>
-      <w:proofErr w:type="spellEnd"/>
-      <w:r>
-        <w:rPr>
-          <w:b/>
-        </w:rPr>
-        <w:t>)","insert into mspsgjlksy10pop_toplevel_pekingduckref_new(chrID,snp_pos,snpID,ref_base,alt_base,wegeon__pool_withindel_vcf_dep) VALUES(%</w:t>
-      </w:r>
-      <w:proofErr w:type="spellStart"/>
-      <w:r>
-        <w:rPr>
-          <w:b/>
-        </w:rPr>
-        <w:t>s,%s,%s,%s,%s,%s</w:t>
-      </w:r>
-      <w:proofErr w:type="spellEnd"/>
-      <w:r>
-        <w:rPr>
-          <w:b/>
-        </w:rPr>
-        <w:t>)"]</w:t>
+        <w:t>&gt;&gt;&gt; l=["insert into mspsgjlksy10pop_toplevel_pekingduckref_new(chrID,snp_pos,snpID,ref_base,alt_base,wegeon__pool_withindel_vcf_alt) VALUES(%s,%s,%s,%s,%s,%s)","insert into mspsgjlksy10pop_toplevel_pekingduckref_new(chrID,snp_pos,snpID,ref_base,alt_base,wegeon__pool_withindel_vcf_dep) VALUES(%s,%s,%s,%s,%s,%s)"]</w:t>
       </w:r>
     </w:p>
     <w:p>
@@ -5326,7 +4265,6 @@
           <w:color w:val="000000" w:themeColor="text1"/>
         </w:rPr>
       </w:pPr>
-      <w:proofErr w:type="spellStart"/>
       <w:r>
         <w:rPr>
           <w:rFonts w:ascii="Consolas" w:hAnsi="Consolas" w:cs="Consolas"/>
@@ -5339,7 +4277,6 @@
         <w:lastRenderedPageBreak/>
         <w:t>generateIndexByChrom</w:t>
       </w:r>
-      <w:proofErr w:type="spellEnd"/>
       <w:r>
         <w:rPr>
           <w:rFonts w:ascii="Consolas" w:hAnsi="Consolas" w:cs="Consolas" w:hint="eastAsia"/>
@@ -5373,7 +4310,6 @@
         </w:rPr>
         <w:t xml:space="preserve"> </w:t>
       </w:r>
-      <w:proofErr w:type="spellStart"/>
       <w:r>
         <w:rPr>
           <w:rFonts w:ascii="Consolas" w:hAnsi="Consolas" w:cs="Consolas"/>
@@ -5385,7 +4321,6 @@
         </w:rPr>
         <w:t>generateFasterRefIndex</w:t>
       </w:r>
-      <w:proofErr w:type="spellEnd"/>
       <w:r>
         <w:rPr>
           <w:rFonts w:ascii="Consolas" w:hAnsi="Consolas" w:cs="Consolas" w:hint="eastAsia"/>

</xml_diff>

<commit_message>
modified the error/bug/problem that: pos_i_pathMrcaToTargetACorBD collect the AA not as the order of foroneTargetTmrca_ids now it seems correct
</commit_message>
<xml_diff>
--- a/life文档.docx
+++ b/life文档.docx
@@ -16,7 +16,114 @@
           <w:sz w:val="24"/>
           <w:szCs w:val="24"/>
         </w:rPr>
-        <w:t>seq_rec=AlignIO.parse(sf,'phylip').__next__()</w:t>
+        <w:t>from ete3 import Tree</w:t>
+      </w:r>
+    </w:p>
+    <w:p>
+      <w:pPr>
+        <w:rPr>
+          <w:rFonts w:ascii="Times New Roman" w:hAnsi="Times New Roman" w:cs="Times New Roman"/>
+          <w:sz w:val="24"/>
+          <w:szCs w:val="24"/>
+        </w:rPr>
+      </w:pPr>
+      <w:r>
+        <w:rPr>
+          <w:rFonts w:ascii="Times New Roman" w:hAnsi="Times New Roman" w:cs="Times New Roman"/>
+          <w:sz w:val="24"/>
+          <w:szCs w:val="24"/>
+        </w:rPr>
+        <w:t>t=Tree("/home/lrui/specieslist14example_NAMED.nwk.txt",format=1)</w:t>
+      </w:r>
+    </w:p>
+    <w:p>
+      <w:pPr>
+        <w:rPr>
+          <w:rFonts w:ascii="Times New Roman" w:hAnsi="Times New Roman" w:cs="Times New Roman"/>
+          <w:sz w:val="24"/>
+          <w:szCs w:val="24"/>
+        </w:rPr>
+      </w:pPr>
+    </w:p>
+    <w:p>
+      <w:pPr>
+        <w:rPr>
+          <w:rFonts w:ascii="Times New Roman" w:hAnsi="Times New Roman" w:cs="Times New Roman"/>
+          <w:sz w:val="24"/>
+          <w:szCs w:val="24"/>
+        </w:rPr>
+      </w:pPr>
+      <w:proofErr w:type="spellStart"/>
+      <w:r>
+        <w:rPr>
+          <w:rFonts w:ascii="Times New Roman" w:hAnsi="Times New Roman" w:cs="Times New Roman"/>
+          <w:sz w:val="24"/>
+          <w:szCs w:val="24"/>
+        </w:rPr>
+        <w:t>seq_rec</w:t>
+      </w:r>
+      <w:proofErr w:type="spellEnd"/>
+      <w:r>
+        <w:rPr>
+          <w:rFonts w:ascii="Times New Roman" w:hAnsi="Times New Roman" w:cs="Times New Roman"/>
+          <w:sz w:val="24"/>
+          <w:szCs w:val="24"/>
+        </w:rPr>
+        <w:t>=</w:t>
+      </w:r>
+      <w:proofErr w:type="spellStart"/>
+      <w:r>
+        <w:rPr>
+          <w:rFonts w:ascii="Times New Roman" w:hAnsi="Times New Roman" w:cs="Times New Roman"/>
+          <w:sz w:val="24"/>
+          <w:szCs w:val="24"/>
+        </w:rPr>
+        <w:t>AlignIO.parse</w:t>
+      </w:r>
+      <w:proofErr w:type="spellEnd"/>
+      <w:r>
+        <w:rPr>
+          <w:rFonts w:ascii="Times New Roman" w:hAnsi="Times New Roman" w:cs="Times New Roman"/>
+          <w:sz w:val="24"/>
+          <w:szCs w:val="24"/>
+        </w:rPr>
+        <w:t>(sf,'</w:t>
+      </w:r>
+      <w:proofErr w:type="spellStart"/>
+      <w:r>
+        <w:rPr>
+          <w:rFonts w:ascii="Times New Roman" w:hAnsi="Times New Roman" w:cs="Times New Roman"/>
+          <w:sz w:val="24"/>
+          <w:szCs w:val="24"/>
+        </w:rPr>
+        <w:t>phylip</w:t>
+      </w:r>
+      <w:proofErr w:type="spellEnd"/>
+      <w:r>
+        <w:rPr>
+          <w:rFonts w:ascii="Times New Roman" w:hAnsi="Times New Roman" w:cs="Times New Roman"/>
+          <w:sz w:val="24"/>
+          <w:szCs w:val="24"/>
+        </w:rPr>
+        <w:t>'</w:t>
+      </w:r>
+      <w:proofErr w:type="gramStart"/>
+      <w:r>
+        <w:rPr>
+          <w:rFonts w:ascii="Times New Roman" w:hAnsi="Times New Roman" w:cs="Times New Roman"/>
+          <w:sz w:val="24"/>
+          <w:szCs w:val="24"/>
+        </w:rPr>
+        <w:t>)._</w:t>
+      </w:r>
+      <w:proofErr w:type="gramEnd"/>
+      <w:r>
+        <w:rPr>
+          <w:rFonts w:ascii="Times New Roman" w:hAnsi="Times New Roman" w:cs="Times New Roman"/>
+          <w:sz w:val="24"/>
+          <w:szCs w:val="24"/>
+        </w:rPr>
+        <w:t>_next__()</w:t>
       </w:r>
     </w:p>
     <w:p>
@@ -33,37 +140,39 @@
           <w:sz w:val="24"/>
           <w:szCs w:val="24"/>
         </w:rPr>
-        <w:t>print(seq_rec,CD_sites_idx</w:t>
-      </w:r>
+        <w:t>print(</w:t>
+      </w:r>
+      <w:proofErr w:type="spellStart"/>
+      <w:r>
+        <w:rPr>
+          <w:rFonts w:ascii="Times New Roman" w:hAnsi="Times New Roman" w:cs="Times New Roman"/>
+          <w:sz w:val="24"/>
+          <w:szCs w:val="24"/>
+        </w:rPr>
+        <w:t>seq_rec,CD_sites_idx</w:t>
+      </w:r>
+      <w:proofErr w:type="spellEnd"/>
       <w:r>
         <w:rPr>
           <w:rFonts w:ascii="宋体" w:eastAsia="宋体" w:hAnsi="宋体" w:cs="Times New Roman"/>
           <w:sz w:val="24"/>
           <w:szCs w:val="24"/>
         </w:rPr>
-        <w:t>)</w:t>
-      </w:r>
-      <w:r>
+        <w:t>)#</w:t>
+      </w:r>
+      <w:r>
+        <w:rPr>
+          <w:rFonts w:ascii="宋体" w:eastAsia="宋体" w:hAnsi="宋体" w:cs="Times New Roman" w:hint="eastAsia"/>
+          <w:sz w:val="24"/>
+          <w:szCs w:val="24"/>
+        </w:rPr>
+        <w:t>打印结果为：</w:t>
+      </w:r>
+    </w:p>
+    <w:p>
+      <w:pPr>
         <w:rPr>
           <w:rFonts w:ascii="宋体" w:eastAsia="宋体" w:hAnsi="宋体" w:cs="Times New Roman"/>
-          <w:sz w:val="24"/>
-          <w:szCs w:val="24"/>
-        </w:rPr>
-        <w:t>#</w:t>
-      </w:r>
-      <w:r>
-        <w:rPr>
-          <w:rFonts w:ascii="宋体" w:eastAsia="宋体" w:hAnsi="宋体" w:cs="Times New Roman" w:hint="eastAsia"/>
-          <w:sz w:val="24"/>
-          <w:szCs w:val="24"/>
-        </w:rPr>
-        <w:t>打印结果为：</w:t>
-      </w:r>
-    </w:p>
-    <w:p>
-      <w:pPr>
-        <w:rPr>
-          <w:rFonts w:ascii="宋体" w:eastAsia="宋体" w:hAnsi="宋体" w:cs="Times New Roman" w:hint="eastAsia"/>
           <w:sz w:val="24"/>
           <w:szCs w:val="24"/>
         </w:rPr>
@@ -202,7 +311,7 @@
     <w:p>
       <w:pPr>
         <w:rPr>
-          <w:rFonts w:ascii="宋体" w:eastAsia="宋体" w:hAnsi="宋体" w:cs="Times New Roman" w:hint="eastAsia"/>
+          <w:rFonts w:ascii="宋体" w:eastAsia="宋体" w:hAnsi="宋体" w:cs="Times New Roman"/>
           <w:sz w:val="24"/>
           <w:szCs w:val="24"/>
         </w:rPr>
@@ -216,20 +325,29 @@
           <w:szCs w:val="24"/>
         </w:rPr>
       </w:pPr>
+      <w:proofErr w:type="gramStart"/>
       <w:r>
         <w:rPr>
           <w:rFonts w:ascii="Times New Roman" w:hAnsi="Times New Roman" w:cs="Times New Roman"/>
           <w:sz w:val="24"/>
           <w:szCs w:val="24"/>
         </w:rPr>
-        <w:lastRenderedPageBreak/>
-        <w:t>tlist.append(list(treeWithNodeLables.find_clades(name=r"\d*_"+targetSpeciesName))[0])</w:t>
-      </w:r>
-    </w:p>
-    <w:p>
-      <w:pPr>
-        <w:rPr>
-          <w:rFonts w:ascii="Times New Roman" w:hAnsi="Times New Roman" w:cs="Times New Roman" w:hint="eastAsia"/>
+        <w:t>tlist.append</w:t>
+      </w:r>
+      <w:proofErr w:type="gramEnd"/>
+      <w:r>
+        <w:rPr>
+          <w:rFonts w:ascii="Times New Roman" w:hAnsi="Times New Roman" w:cs="Times New Roman"/>
+          <w:sz w:val="24"/>
+          <w:szCs w:val="24"/>
+        </w:rPr>
+        <w:t>(list(treeWithNodeLables.find_clades(name=r"\d*_"+targetSpeciesName))[0])</w:t>
+      </w:r>
+    </w:p>
+    <w:p>
+      <w:pPr>
+        <w:rPr>
+          <w:rFonts w:ascii="Times New Roman" w:hAnsi="Times New Roman" w:cs="Times New Roman"/>
           <w:sz w:val="24"/>
           <w:szCs w:val="24"/>
         </w:rPr>
@@ -278,7 +396,7 @@
     <w:p>
       <w:pPr>
         <w:rPr>
-          <w:rFonts w:ascii="Times New Roman" w:hAnsi="Times New Roman" w:cs="Times New Roman" w:hint="eastAsia"/>
+          <w:rFonts w:ascii="Times New Roman" w:hAnsi="Times New Roman" w:cs="Times New Roman"/>
           <w:sz w:val="24"/>
           <w:szCs w:val="24"/>
         </w:rPr>
@@ -287,6 +405,7 @@
         <w:rPr>
           <w:noProof/>
         </w:rPr>
+        <w:lastRenderedPageBreak/>
         <w:drawing>
           <wp:inline distT="0" distB="0" distL="0" distR="0" wp14:anchorId="147CFB08" wp14:editId="5C3D705C">
             <wp:extent cx="8863330" cy="1282065"/>
@@ -357,15 +476,16 @@
           <w:szCs w:val="24"/>
         </w:rPr>
       </w:pPr>
+      <w:proofErr w:type="spellStart"/>
       <w:r>
         <w:rPr>
           <w:rFonts w:ascii="Times New Roman" w:hAnsi="Times New Roman" w:cs="Times New Roman"/>
           <w:sz w:val="24"/>
           <w:szCs w:val="24"/>
         </w:rPr>
-        <w:lastRenderedPageBreak/>
         <w:t>VCFutil.VCF_Data</w:t>
       </w:r>
+      <w:proofErr w:type="spellEnd"/>
     </w:p>
     <w:p>
       <w:pPr>
@@ -580,6 +700,7 @@
             </w:pPr>
             <w:bookmarkStart w:id="0" w:name="OLE_LINK1"/>
             <w:bookmarkStart w:id="1" w:name="OLE_LINK2"/>
+            <w:proofErr w:type="spellStart"/>
             <w:r>
               <w:rPr>
                 <w:rFonts w:ascii="Times New Roman" w:hAnsi="Times New Roman" w:cs="Times New Roman"/>
@@ -594,7 +715,16 @@
                 <w:sz w:val="24"/>
                 <w:szCs w:val="24"/>
               </w:rPr>
-              <w:t>a()</w:t>
+              <w:t>a</w:t>
+            </w:r>
+            <w:proofErr w:type="spellEnd"/>
+            <w:r>
+              <w:rPr>
+                <w:rFonts w:ascii="Times New Roman" w:hAnsi="Times New Roman" w:cs="Times New Roman"/>
+                <w:sz w:val="24"/>
+                <w:szCs w:val="24"/>
+              </w:rPr>
+              <w:t>()</w:t>
             </w:r>
             <w:bookmarkEnd w:id="0"/>
             <w:bookmarkEnd w:id="1"/>
@@ -634,8 +764,18 @@
                 <w:sz w:val="24"/>
                 <w:szCs w:val="24"/>
               </w:rPr>
-              <w:t xml:space="preserve">from NGS.BasicUtil import </w:t>
-            </w:r>
+              <w:t xml:space="preserve">from </w:t>
+            </w:r>
+            <w:proofErr w:type="spellStart"/>
+            <w:r>
+              <w:rPr>
+                <w:rFonts w:ascii="Times New Roman" w:hAnsi="Times New Roman" w:cs="Times New Roman"/>
+                <w:sz w:val="24"/>
+                <w:szCs w:val="24"/>
+              </w:rPr>
+              <w:t>NGS.BasicUtil</w:t>
+            </w:r>
+            <w:proofErr w:type="spellEnd"/>
             <w:r>
               <w:rPr>
                 <w:rFonts w:ascii="Times New Roman" w:hAnsi="Times New Roman" w:cs="Times New Roman"/>
@@ -644,6 +784,24 @@
               </w:rPr>
               <w:t xml:space="preserve"> </w:t>
             </w:r>
+            <w:proofErr w:type="gramStart"/>
+            <w:r>
+              <w:rPr>
+                <w:rFonts w:ascii="Times New Roman" w:hAnsi="Times New Roman" w:cs="Times New Roman"/>
+                <w:sz w:val="24"/>
+                <w:szCs w:val="24"/>
+              </w:rPr>
+              <w:t xml:space="preserve">import </w:t>
+            </w:r>
+            <w:r>
+              <w:rPr>
+                <w:rFonts w:ascii="Times New Roman" w:hAnsi="Times New Roman" w:cs="Times New Roman"/>
+                <w:sz w:val="24"/>
+                <w:szCs w:val="24"/>
+              </w:rPr>
+              <w:t xml:space="preserve"> </w:t>
+            </w:r>
+            <w:proofErr w:type="spellStart"/>
             <w:r>
               <w:rPr>
                 <w:rFonts w:ascii="Times New Roman" w:hAnsi="Times New Roman" w:cs="Times New Roman"/>
@@ -652,6 +810,8 @@
               </w:rPr>
               <w:t>VCFutil</w:t>
             </w:r>
+            <w:proofErr w:type="spellEnd"/>
+            <w:proofErr w:type="gramEnd"/>
           </w:p>
         </w:tc>
         <w:tc>
@@ -674,6 +834,7 @@
               </w:rPr>
               <w:t>初始化参数为</w:t>
             </w:r>
+            <w:proofErr w:type="spellStart"/>
             <w:r>
               <w:rPr>
                 <w:rFonts w:ascii="Times New Roman" w:hAnsi="Times New Roman" w:cs="Times New Roman" w:hint="eastAsia"/>
@@ -690,6 +851,7 @@
               </w:rPr>
               <w:t>cf</w:t>
             </w:r>
+            <w:proofErr w:type="spellEnd"/>
             <w:r>
               <w:rPr>
                 <w:rFonts w:ascii="Times New Roman" w:hAnsi="Times New Roman" w:cs="Times New Roman" w:hint="eastAsia"/>
@@ -720,6 +882,7 @@
               </w:rPr>
               <w:t>将</w:t>
             </w:r>
+            <w:proofErr w:type="spellStart"/>
             <w:r>
               <w:rPr>
                 <w:rFonts w:ascii="Times New Roman" w:hAnsi="Times New Roman" w:cs="Times New Roman" w:hint="eastAsia"/>
@@ -736,6 +899,7 @@
               </w:rPr>
               <w:t>cf</w:t>
             </w:r>
+            <w:proofErr w:type="spellEnd"/>
             <w:r>
               <w:rPr>
                 <w:rFonts w:ascii="Times New Roman" w:hAnsi="Times New Roman" w:cs="Times New Roman" w:hint="eastAsia"/>
@@ -744,6 +908,7 @@
               </w:rPr>
               <w:t>文件加载到内存，如果第一次加载某个</w:t>
             </w:r>
+            <w:proofErr w:type="spellStart"/>
             <w:r>
               <w:rPr>
                 <w:rFonts w:ascii="Times New Roman" w:hAnsi="Times New Roman" w:cs="Times New Roman" w:hint="eastAsia"/>
@@ -760,6 +925,7 @@
               </w:rPr>
               <w:t>cf</w:t>
             </w:r>
+            <w:proofErr w:type="spellEnd"/>
             <w:r>
               <w:rPr>
                 <w:rFonts w:ascii="Times New Roman" w:hAnsi="Times New Roman" w:cs="Times New Roman" w:hint="eastAsia"/>
@@ -768,6 +934,7 @@
               </w:rPr>
               <w:t>文件会自动简历索引文件，要求</w:t>
             </w:r>
+            <w:proofErr w:type="spellStart"/>
             <w:r>
               <w:rPr>
                 <w:rFonts w:ascii="Times New Roman" w:hAnsi="Times New Roman" w:cs="Times New Roman" w:hint="eastAsia"/>
@@ -784,6 +951,7 @@
               </w:rPr>
               <w:t>cf</w:t>
             </w:r>
+            <w:proofErr w:type="spellEnd"/>
             <w:r>
               <w:rPr>
                 <w:rFonts w:ascii="Times New Roman" w:hAnsi="Times New Roman" w:cs="Times New Roman" w:hint="eastAsia"/>
@@ -827,6 +995,7 @@
                 <w:szCs w:val="24"/>
               </w:rPr>
             </w:pPr>
+            <w:proofErr w:type="spellStart"/>
             <w:r>
               <w:rPr>
                 <w:rFonts w:ascii="Times New Roman" w:hAnsi="Times New Roman" w:cs="Times New Roman"/>
@@ -835,6 +1004,7 @@
               </w:rPr>
               <w:t>getVcfListByChrom</w:t>
             </w:r>
+            <w:proofErr w:type="spellEnd"/>
           </w:p>
         </w:tc>
         <w:tc>
@@ -857,6 +1027,7 @@
               </w:rPr>
               <w:t>通过</w:t>
             </w:r>
+            <w:proofErr w:type="spellStart"/>
             <w:r>
               <w:rPr>
                 <w:rFonts w:ascii="Times New Roman" w:hAnsi="Times New Roman" w:cs="Times New Roman"/>
@@ -865,13 +1036,23 @@
               </w:rPr>
               <w:t>VCF_Data</w:t>
             </w:r>
-            <w:r>
-              <w:rPr>
-                <w:rFonts w:ascii="Times New Roman" w:hAnsi="Times New Roman" w:cs="Times New Roman" w:hint="eastAsia"/>
-                <w:sz w:val="24"/>
-                <w:szCs w:val="24"/>
-              </w:rPr>
-              <w:t>实例调用该函数</w:t>
+            <w:proofErr w:type="spellEnd"/>
+            <w:r>
+              <w:rPr>
+                <w:rFonts w:ascii="Times New Roman" w:hAnsi="Times New Roman" w:cs="Times New Roman" w:hint="eastAsia"/>
+                <w:sz w:val="24"/>
+                <w:szCs w:val="24"/>
+              </w:rPr>
+              <w:t>实</w:t>
+            </w:r>
+            <w:r>
+              <w:rPr>
+                <w:rFonts w:ascii="Times New Roman" w:hAnsi="Times New Roman" w:cs="Times New Roman" w:hint="eastAsia"/>
+                <w:sz w:val="24"/>
+                <w:szCs w:val="24"/>
+              </w:rPr>
+              <w:lastRenderedPageBreak/>
+              <w:t>例调用该函数</w:t>
             </w:r>
           </w:p>
         </w:tc>
@@ -887,12 +1068,14 @@
                 <w:szCs w:val="24"/>
               </w:rPr>
             </w:pPr>
-            <w:r>
-              <w:rPr>
-                <w:rFonts w:ascii="Times New Roman" w:hAnsi="Times New Roman" w:cs="Times New Roman" w:hint="eastAsia"/>
-                <w:sz w:val="24"/>
-                <w:szCs w:val="24"/>
-              </w:rPr>
+            <w:proofErr w:type="spellStart"/>
+            <w:r>
+              <w:rPr>
+                <w:rFonts w:ascii="Times New Roman" w:hAnsi="Times New Roman" w:cs="Times New Roman" w:hint="eastAsia"/>
+                <w:sz w:val="24"/>
+                <w:szCs w:val="24"/>
+              </w:rPr>
+              <w:lastRenderedPageBreak/>
               <w:t>c</w:t>
             </w:r>
             <w:r>
@@ -903,6 +1086,7 @@
               </w:rPr>
               <w:t>hrom</w:t>
             </w:r>
+            <w:proofErr w:type="spellEnd"/>
             <w:r>
               <w:rPr>
                 <w:rFonts w:ascii="Times New Roman" w:hAnsi="Times New Roman" w:cs="Times New Roman" w:hint="eastAsia"/>
@@ -925,7 +1109,25 @@
                 <w:sz w:val="24"/>
                 <w:szCs w:val="24"/>
               </w:rPr>
-              <w:t>,startpos=</w:t>
+              <w:t>,</w:t>
+            </w:r>
+            <w:proofErr w:type="spellStart"/>
+            <w:r>
+              <w:rPr>
+                <w:rFonts w:ascii="Times New Roman" w:hAnsi="Times New Roman" w:cs="Times New Roman"/>
+                <w:sz w:val="24"/>
+                <w:szCs w:val="24"/>
+              </w:rPr>
+              <w:t>startpos</w:t>
+            </w:r>
+            <w:proofErr w:type="spellEnd"/>
+            <w:r>
+              <w:rPr>
+                <w:rFonts w:ascii="Times New Roman" w:hAnsi="Times New Roman" w:cs="Times New Roman"/>
+                <w:sz w:val="24"/>
+                <w:szCs w:val="24"/>
+              </w:rPr>
+              <w:t>=</w:t>
             </w:r>
             <w:r>
               <w:rPr>
@@ -957,7 +1159,25 @@
                 <w:sz w:val="24"/>
                 <w:szCs w:val="24"/>
               </w:rPr>
-              <w:t>,endpos=</w:t>
+              <w:t>,</w:t>
+            </w:r>
+            <w:proofErr w:type="spellStart"/>
+            <w:r>
+              <w:rPr>
+                <w:rFonts w:ascii="Times New Roman" w:hAnsi="Times New Roman" w:cs="Times New Roman"/>
+                <w:sz w:val="24"/>
+                <w:szCs w:val="24"/>
+              </w:rPr>
+              <w:t>endpos</w:t>
+            </w:r>
+            <w:proofErr w:type="spellEnd"/>
+            <w:r>
+              <w:rPr>
+                <w:rFonts w:ascii="Times New Roman" w:hAnsi="Times New Roman" w:cs="Times New Roman"/>
+                <w:sz w:val="24"/>
+                <w:szCs w:val="24"/>
+              </w:rPr>
+              <w:t>=</w:t>
             </w:r>
             <w:r>
               <w:rPr>
@@ -981,7 +1201,16 @@
                 <w:sz w:val="24"/>
                 <w:szCs w:val="24"/>
               </w:rPr>
-              <w:t>稀释比例（默认</w:t>
+              <w:t>稀释比</w:t>
+            </w:r>
+            <w:r>
+              <w:rPr>
+                <w:rFonts w:ascii="Times New Roman" w:hAnsi="Times New Roman" w:cs="Times New Roman" w:hint="eastAsia"/>
+                <w:sz w:val="24"/>
+                <w:szCs w:val="24"/>
+              </w:rPr>
+              <w:lastRenderedPageBreak/>
+              <w:t>例（默认</w:t>
             </w:r>
             <w:r>
               <w:rPr>
@@ -1005,7 +1234,25 @@
                 <w:sz w:val="24"/>
                 <w:szCs w:val="24"/>
               </w:rPr>
-              <w:t>, dilutetodensity=</w:t>
+              <w:t xml:space="preserve">, </w:t>
+            </w:r>
+            <w:proofErr w:type="spellStart"/>
+            <w:r>
+              <w:rPr>
+                <w:rFonts w:ascii="Times New Roman" w:hAnsi="Times New Roman" w:cs="Times New Roman"/>
+                <w:sz w:val="24"/>
+                <w:szCs w:val="24"/>
+              </w:rPr>
+              <w:t>dilutetodensity</w:t>
+            </w:r>
+            <w:proofErr w:type="spellEnd"/>
+            <w:r>
+              <w:rPr>
+                <w:rFonts w:ascii="Times New Roman" w:hAnsi="Times New Roman" w:cs="Times New Roman"/>
+                <w:sz w:val="24"/>
+                <w:szCs w:val="24"/>
+              </w:rPr>
+              <w:t>=</w:t>
             </w:r>
             <w:r>
               <w:rPr>
@@ -1085,7 +1332,43 @@
                 <w:sz w:val="24"/>
                 <w:szCs w:val="24"/>
               </w:rPr>
-              <w:t>, posUniq=True, considerINDELandmultpleallele=</w:t>
+              <w:t xml:space="preserve">, </w:t>
+            </w:r>
+            <w:proofErr w:type="spellStart"/>
+            <w:r>
+              <w:rPr>
+                <w:rFonts w:ascii="Times New Roman" w:hAnsi="Times New Roman" w:cs="Times New Roman"/>
+                <w:sz w:val="24"/>
+                <w:szCs w:val="24"/>
+              </w:rPr>
+              <w:t>posUniq</w:t>
+            </w:r>
+            <w:proofErr w:type="spellEnd"/>
+            <w:r>
+              <w:rPr>
+                <w:rFonts w:ascii="Times New Roman" w:hAnsi="Times New Roman" w:cs="Times New Roman"/>
+                <w:sz w:val="24"/>
+                <w:szCs w:val="24"/>
+              </w:rPr>
+              <w:t xml:space="preserve">=True, </w:t>
+            </w:r>
+            <w:proofErr w:type="spellStart"/>
+            <w:r>
+              <w:rPr>
+                <w:rFonts w:ascii="Times New Roman" w:hAnsi="Times New Roman" w:cs="Times New Roman"/>
+                <w:sz w:val="24"/>
+                <w:szCs w:val="24"/>
+              </w:rPr>
+              <w:t>considerINDELandmultpleallele</w:t>
+            </w:r>
+            <w:proofErr w:type="spellEnd"/>
+            <w:r>
+              <w:rPr>
+                <w:rFonts w:ascii="Times New Roman" w:hAnsi="Times New Roman" w:cs="Times New Roman"/>
+                <w:sz w:val="24"/>
+                <w:szCs w:val="24"/>
+              </w:rPr>
+              <w:t>=</w:t>
             </w:r>
             <w:r>
               <w:rPr>
@@ -1125,7 +1408,25 @@
                 <w:sz w:val="24"/>
                 <w:szCs w:val="24"/>
               </w:rPr>
-              <w:t>,MQfilter=</w:t>
+              <w:t>,</w:t>
+            </w:r>
+            <w:proofErr w:type="spellStart"/>
+            <w:r>
+              <w:rPr>
+                <w:rFonts w:ascii="Times New Roman" w:hAnsi="Times New Roman" w:cs="Times New Roman"/>
+                <w:sz w:val="24"/>
+                <w:szCs w:val="24"/>
+              </w:rPr>
+              <w:t>MQfilter</w:t>
+            </w:r>
+            <w:proofErr w:type="spellEnd"/>
+            <w:r>
+              <w:rPr>
+                <w:rFonts w:ascii="Times New Roman" w:hAnsi="Times New Roman" w:cs="Times New Roman"/>
+                <w:sz w:val="24"/>
+                <w:szCs w:val="24"/>
+              </w:rPr>
+              <w:t>=</w:t>
             </w:r>
             <w:r>
               <w:rPr>
@@ -1163,8 +1464,10 @@
                 <w:sz w:val="24"/>
                 <w:szCs w:val="24"/>
               </w:rPr>
+              <w:lastRenderedPageBreak/>
               <w:t>返回该</w:t>
             </w:r>
+            <w:proofErr w:type="spellStart"/>
             <w:r>
               <w:rPr>
                 <w:rFonts w:ascii="Times New Roman" w:hAnsi="Times New Roman" w:cs="Times New Roman" w:hint="eastAsia"/>
@@ -1181,14 +1484,43 @@
               </w:rPr>
               <w:t>cf</w:t>
             </w:r>
-            <w:r>
-              <w:rPr>
-                <w:rFonts w:ascii="Times New Roman" w:hAnsi="Times New Roman" w:cs="Times New Roman" w:hint="eastAsia"/>
-                <w:sz w:val="24"/>
-                <w:szCs w:val="24"/>
-              </w:rPr>
-              <w:t>文件的的某一条染色体的全部记录或某一区段的记录，返回值为列表，元素为</w:t>
-            </w:r>
+            <w:proofErr w:type="spellEnd"/>
+            <w:r>
+              <w:rPr>
+                <w:rFonts w:ascii="Times New Roman" w:hAnsi="Times New Roman" w:cs="Times New Roman" w:hint="eastAsia"/>
+                <w:sz w:val="24"/>
+                <w:szCs w:val="24"/>
+              </w:rPr>
+              <w:t>文件的</w:t>
+            </w:r>
+            <w:proofErr w:type="gramStart"/>
+            <w:r>
+              <w:rPr>
+                <w:rFonts w:ascii="Times New Roman" w:hAnsi="Times New Roman" w:cs="Times New Roman" w:hint="eastAsia"/>
+                <w:sz w:val="24"/>
+                <w:szCs w:val="24"/>
+              </w:rPr>
+              <w:t>的</w:t>
+            </w:r>
+            <w:proofErr w:type="gramEnd"/>
+            <w:r>
+              <w:rPr>
+                <w:rFonts w:ascii="Times New Roman" w:hAnsi="Times New Roman" w:cs="Times New Roman" w:hint="eastAsia"/>
+                <w:sz w:val="24"/>
+                <w:szCs w:val="24"/>
+              </w:rPr>
+              <w:t>某一条染色体的全部记录或某一区段的记录，返</w:t>
+            </w:r>
+            <w:r>
+              <w:rPr>
+                <w:rFonts w:ascii="Times New Roman" w:hAnsi="Times New Roman" w:cs="Times New Roman" w:hint="eastAsia"/>
+                <w:sz w:val="24"/>
+                <w:szCs w:val="24"/>
+              </w:rPr>
+              <w:lastRenderedPageBreak/>
+              <w:t>回值为列表，元素为</w:t>
+            </w:r>
+            <w:proofErr w:type="spellStart"/>
             <w:r>
               <w:rPr>
                 <w:rFonts w:ascii="Times New Roman" w:hAnsi="Times New Roman" w:cs="Times New Roman" w:hint="eastAsia"/>
@@ -1205,6 +1537,7 @@
               </w:rPr>
               <w:t>cf</w:t>
             </w:r>
+            <w:proofErr w:type="spellEnd"/>
             <w:r>
               <w:rPr>
                 <w:rFonts w:ascii="Times New Roman" w:hAnsi="Times New Roman" w:cs="Times New Roman" w:hint="eastAsia"/>
@@ -1238,6 +1571,7 @@
                 <w:sz w:val="24"/>
                 <w:szCs w:val="24"/>
               </w:rPr>
+              <w:lastRenderedPageBreak/>
               <w:t>Window</w:t>
             </w:r>
             <w:r>
@@ -1276,16 +1610,25 @@
                 <w:sz w:val="24"/>
                 <w:szCs w:val="24"/>
               </w:rPr>
-              <w:t xml:space="preserve">from NGS.BasicUtil </w:t>
-            </w:r>
-            <w:r>
-              <w:rPr>
-                <w:rFonts w:ascii="Times New Roman" w:hAnsi="Times New Roman" w:cs="Times New Roman"/>
-                <w:sz w:val="24"/>
-                <w:szCs w:val="24"/>
-              </w:rPr>
-              <w:lastRenderedPageBreak/>
-              <w:t>import</w:t>
+              <w:t xml:space="preserve">from </w:t>
+            </w:r>
+            <w:proofErr w:type="spellStart"/>
+            <w:r>
+              <w:rPr>
+                <w:rFonts w:ascii="Times New Roman" w:hAnsi="Times New Roman" w:cs="Times New Roman"/>
+                <w:sz w:val="24"/>
+                <w:szCs w:val="24"/>
+              </w:rPr>
+              <w:t>NGS.BasicUtil</w:t>
+            </w:r>
+            <w:proofErr w:type="spellEnd"/>
+            <w:r>
+              <w:rPr>
+                <w:rFonts w:ascii="Times New Roman" w:hAnsi="Times New Roman" w:cs="Times New Roman"/>
+                <w:sz w:val="24"/>
+                <w:szCs w:val="24"/>
+              </w:rPr>
+              <w:t xml:space="preserve"> import</w:t>
             </w:r>
             <w:r>
               <w:rPr>
@@ -1345,17 +1688,18 @@
                 <w:sz w:val="24"/>
                 <w:szCs w:val="24"/>
               </w:rPr>
-              <w:t>该实例化对象可以用来调用相关</w:t>
-            </w:r>
-            <w:r>
-              <w:rPr>
-                <w:rFonts w:ascii="Times New Roman" w:hAnsi="Times New Roman" w:cs="Times New Roman" w:hint="eastAsia"/>
-                <w:sz w:val="24"/>
-                <w:szCs w:val="24"/>
-              </w:rPr>
-              <w:lastRenderedPageBreak/>
-              <w:t>函数进行滑窗操作</w:t>
-            </w:r>
+              <w:t>该实例化对象可以用来调用相关函数进行</w:t>
+            </w:r>
+            <w:proofErr w:type="gramStart"/>
+            <w:r>
+              <w:rPr>
+                <w:rFonts w:ascii="Times New Roman" w:hAnsi="Times New Roman" w:cs="Times New Roman" w:hint="eastAsia"/>
+                <w:sz w:val="24"/>
+                <w:szCs w:val="24"/>
+              </w:rPr>
+              <w:t>滑窗操作</w:t>
+            </w:r>
+            <w:proofErr w:type="gramEnd"/>
           </w:p>
         </w:tc>
       </w:tr>
@@ -1375,15 +1719,16 @@
                 <w:szCs w:val="24"/>
               </w:rPr>
             </w:pPr>
-            <w:r>
-              <w:rPr>
-                <w:rFonts w:ascii="Times New Roman" w:hAnsi="Times New Roman" w:cs="Times New Roman"/>
-                <w:sz w:val="24"/>
-                <w:szCs w:val="24"/>
-              </w:rPr>
-              <w:lastRenderedPageBreak/>
+            <w:proofErr w:type="spellStart"/>
+            <w:r>
+              <w:rPr>
+                <w:rFonts w:ascii="Times New Roman" w:hAnsi="Times New Roman" w:cs="Times New Roman"/>
+                <w:sz w:val="24"/>
+                <w:szCs w:val="24"/>
+              </w:rPr>
               <w:t>slidWindowOverlap</w:t>
             </w:r>
+            <w:proofErr w:type="spellEnd"/>
           </w:p>
         </w:tc>
         <w:tc>
@@ -1468,6 +1813,7 @@
               </w:rPr>
               <w:t>顺序排列的列表（如：</w:t>
             </w:r>
+            <w:proofErr w:type="spellStart"/>
             <w:r>
               <w:rPr>
                 <w:rFonts w:ascii="Times New Roman" w:hAnsi="Times New Roman" w:cs="Times New Roman"/>
@@ -1476,6 +1822,7 @@
               </w:rPr>
               <w:t>getVcfListByChrom</w:t>
             </w:r>
+            <w:proofErr w:type="spellEnd"/>
             <w:r>
               <w:rPr>
                 <w:rFonts w:ascii="Times New Roman" w:hAnsi="Times New Roman" w:cs="Times New Roman" w:hint="eastAsia"/>
@@ -1490,8 +1837,18 @@
                 <w:sz w:val="24"/>
                 <w:szCs w:val="24"/>
               </w:rPr>
-              <w:t>, L_End_Pos</w:t>
-            </w:r>
+              <w:t xml:space="preserve">, </w:t>
+            </w:r>
+            <w:proofErr w:type="spellStart"/>
+            <w:r>
+              <w:rPr>
+                <w:rFonts w:ascii="Times New Roman" w:hAnsi="Times New Roman" w:cs="Times New Roman"/>
+                <w:sz w:val="24"/>
+                <w:szCs w:val="24"/>
+              </w:rPr>
+              <w:t>L_End_Pos</w:t>
+            </w:r>
+            <w:proofErr w:type="spellEnd"/>
             <w:r>
               <w:rPr>
                 <w:rFonts w:ascii="Times New Roman" w:hAnsi="Times New Roman" w:cs="Times New Roman" w:hint="eastAsia"/>
@@ -1514,8 +1871,18 @@
                 <w:sz w:val="24"/>
                 <w:szCs w:val="24"/>
               </w:rPr>
-              <w:t>, windowWidth</w:t>
-            </w:r>
+              <w:t xml:space="preserve">, </w:t>
+            </w:r>
+            <w:proofErr w:type="spellStart"/>
+            <w:r>
+              <w:rPr>
+                <w:rFonts w:ascii="Times New Roman" w:hAnsi="Times New Roman" w:cs="Times New Roman"/>
+                <w:sz w:val="24"/>
+                <w:szCs w:val="24"/>
+              </w:rPr>
+              <w:t>windowWidth</w:t>
+            </w:r>
+            <w:proofErr w:type="spellEnd"/>
             <w:r>
               <w:rPr>
                 <w:rFonts w:ascii="Times New Roman" w:hAnsi="Times New Roman" w:cs="Times New Roman" w:hint="eastAsia"/>
@@ -1538,8 +1905,18 @@
                 <w:sz w:val="24"/>
                 <w:szCs w:val="24"/>
               </w:rPr>
-              <w:t>, slideSize</w:t>
-            </w:r>
+              <w:t xml:space="preserve">, </w:t>
+            </w:r>
+            <w:proofErr w:type="spellStart"/>
+            <w:r>
+              <w:rPr>
+                <w:rFonts w:ascii="Times New Roman" w:hAnsi="Times New Roman" w:cs="Times New Roman"/>
+                <w:sz w:val="24"/>
+                <w:szCs w:val="24"/>
+              </w:rPr>
+              <w:t>slideSize</w:t>
+            </w:r>
+            <w:proofErr w:type="spellEnd"/>
             <w:r>
               <w:rPr>
                 <w:rFonts w:ascii="Times New Roman" w:hAnsi="Times New Roman" w:cs="Times New Roman" w:hint="eastAsia"/>
@@ -1562,8 +1939,18 @@
                 <w:sz w:val="24"/>
                 <w:szCs w:val="24"/>
               </w:rPr>
-              <w:t>, Caculator</w:t>
-            </w:r>
+              <w:t xml:space="preserve">, </w:t>
+            </w:r>
+            <w:proofErr w:type="spellStart"/>
+            <w:r>
+              <w:rPr>
+                <w:rFonts w:ascii="Times New Roman" w:hAnsi="Times New Roman" w:cs="Times New Roman"/>
+                <w:sz w:val="24"/>
+                <w:szCs w:val="24"/>
+              </w:rPr>
+              <w:t>Caculator</w:t>
+            </w:r>
+            <w:proofErr w:type="spellEnd"/>
             <w:r>
               <w:rPr>
                 <w:rFonts w:ascii="Times New Roman" w:hAnsi="Times New Roman" w:cs="Times New Roman" w:hint="eastAsia"/>
@@ -1586,7 +1973,25 @@
                 <w:sz w:val="24"/>
                 <w:szCs w:val="24"/>
               </w:rPr>
-              <w:t>,L_Start_Pos=</w:t>
+              <w:t>,</w:t>
+            </w:r>
+            <w:proofErr w:type="spellStart"/>
+            <w:r>
+              <w:rPr>
+                <w:rFonts w:ascii="Times New Roman" w:hAnsi="Times New Roman" w:cs="Times New Roman"/>
+                <w:sz w:val="24"/>
+                <w:szCs w:val="24"/>
+              </w:rPr>
+              <w:t>L_Start_Pos</w:t>
+            </w:r>
+            <w:proofErr w:type="spellEnd"/>
+            <w:r>
+              <w:rPr>
+                <w:rFonts w:ascii="Times New Roman" w:hAnsi="Times New Roman" w:cs="Times New Roman"/>
+                <w:sz w:val="24"/>
+                <w:szCs w:val="24"/>
+              </w:rPr>
+              <w:t>=</w:t>
             </w:r>
             <w:r>
               <w:rPr>
@@ -1674,6 +2079,7 @@
               </w:rPr>
               <w:t>按照参数指定方式滑窗，计算每个窗口的值，计算方法有</w:t>
             </w:r>
+            <w:proofErr w:type="spellStart"/>
             <w:r>
               <w:rPr>
                 <w:rFonts w:ascii="Times New Roman" w:hAnsi="Times New Roman" w:cs="Times New Roman" w:hint="eastAsia"/>
@@ -1690,6 +2096,7 @@
               </w:rPr>
               <w:t>ulator</w:t>
             </w:r>
+            <w:proofErr w:type="spellEnd"/>
             <w:r>
               <w:rPr>
                 <w:rFonts w:ascii="Times New Roman" w:hAnsi="Times New Roman" w:cs="Times New Roman" w:hint="eastAsia"/>
@@ -1757,14 +2164,25 @@
                 <w:szCs w:val="24"/>
               </w:rPr>
             </w:pPr>
-            <w:r>
-              <w:rPr>
-                <w:rFonts w:ascii="Times New Roman" w:hAnsi="Times New Roman" w:cs="Times New Roman"/>
-                <w:sz w:val="24"/>
-                <w:szCs w:val="24"/>
-              </w:rPr>
-              <w:t>CaculatorToFindTAGs</w:t>
-            </w:r>
+            <w:proofErr w:type="spellStart"/>
+            <w:r>
+              <w:rPr>
+                <w:rFonts w:ascii="Times New Roman" w:hAnsi="Times New Roman" w:cs="Times New Roman"/>
+                <w:sz w:val="24"/>
+                <w:szCs w:val="24"/>
+              </w:rPr>
+              <w:t>CaculatorToFindTA</w:t>
+            </w:r>
+            <w:r>
+              <w:rPr>
+                <w:rFonts w:ascii="Times New Roman" w:hAnsi="Times New Roman" w:cs="Times New Roman"/>
+                <w:sz w:val="24"/>
+                <w:szCs w:val="24"/>
+              </w:rPr>
+              <w:lastRenderedPageBreak/>
+              <w:t>Gs</w:t>
+            </w:r>
+            <w:proofErr w:type="spellEnd"/>
             <w:r>
               <w:rPr>
                 <w:rFonts w:ascii="Times New Roman" w:hAnsi="Times New Roman" w:cs="Times New Roman"/>
@@ -2011,6 +2429,7 @@
           <w:szCs w:val="24"/>
         </w:rPr>
       </w:pPr>
+      <w:proofErr w:type="spellStart"/>
       <w:r>
         <w:rPr>
           <w:rFonts w:ascii="Times New Roman" w:eastAsia="宋体" w:hAnsi="Times New Roman" w:cs="Times New Roman"/>
@@ -2019,6 +2438,7 @@
         </w:rPr>
         <w:t>alinmultPopSnpPos</w:t>
       </w:r>
+      <w:proofErr w:type="spellEnd"/>
       <w:r>
         <w:rPr>
           <w:rFonts w:ascii="Times New Roman" w:eastAsia="宋体" w:hAnsi="Times New Roman" w:cs="Times New Roman"/>
@@ -2048,7 +2468,6 @@
           <w:sz w:val="24"/>
           <w:szCs w:val="24"/>
         </w:rPr>
-        <w:lastRenderedPageBreak/>
         <w:t>实现功能：将两个或两个以上的</w:t>
       </w:r>
       <w:r>
@@ -2106,13 +2525,23 @@
         </w:rPr>
         <w:t>参数：</w:t>
       </w:r>
-      <w:r>
-        <w:rPr>
-          <w:rFonts w:ascii="Times New Roman" w:eastAsia="宋体" w:hAnsi="Times New Roman" w:cs="Times New Roman"/>
-          <w:sz w:val="24"/>
-          <w:szCs w:val="24"/>
-        </w:rPr>
-        <w:t>vcfMaplist=</w:t>
+      <w:proofErr w:type="spellStart"/>
+      <w:r>
+        <w:rPr>
+          <w:rFonts w:ascii="Times New Roman" w:eastAsia="宋体" w:hAnsi="Times New Roman" w:cs="Times New Roman"/>
+          <w:sz w:val="24"/>
+          <w:szCs w:val="24"/>
+        </w:rPr>
+        <w:t>vcfMaplist</w:t>
+      </w:r>
+      <w:proofErr w:type="spellEnd"/>
+      <w:r>
+        <w:rPr>
+          <w:rFonts w:ascii="Times New Roman" w:eastAsia="宋体" w:hAnsi="Times New Roman" w:cs="Times New Roman"/>
+          <w:sz w:val="24"/>
+          <w:szCs w:val="24"/>
+        </w:rPr>
+        <w:t>=</w:t>
       </w:r>
       <w:r>
         <w:rPr>
@@ -2146,13 +2575,23 @@
         </w:rPr>
         <w:t>数据，</w:t>
       </w:r>
-      <w:r>
-        <w:rPr>
-          <w:rFonts w:ascii="Times New Roman" w:eastAsia="宋体" w:hAnsi="Times New Roman" w:cs="Times New Roman"/>
-          <w:sz w:val="24"/>
-          <w:szCs w:val="24"/>
-        </w:rPr>
-        <w:t>jointmode=</w:t>
+      <w:proofErr w:type="spellStart"/>
+      <w:r>
+        <w:rPr>
+          <w:rFonts w:ascii="Times New Roman" w:eastAsia="宋体" w:hAnsi="Times New Roman" w:cs="Times New Roman"/>
+          <w:sz w:val="24"/>
+          <w:szCs w:val="24"/>
+        </w:rPr>
+        <w:t>jointmode</w:t>
+      </w:r>
+      <w:proofErr w:type="spellEnd"/>
+      <w:r>
+        <w:rPr>
+          <w:rFonts w:ascii="Times New Roman" w:eastAsia="宋体" w:hAnsi="Times New Roman" w:cs="Times New Roman"/>
+          <w:sz w:val="24"/>
+          <w:szCs w:val="24"/>
+        </w:rPr>
+        <w:t>=</w:t>
       </w:r>
       <w:r>
         <w:rPr>
@@ -2168,7 +2607,25 @@
           <w:sz w:val="24"/>
           <w:szCs w:val="24"/>
         </w:rPr>
-        <w:t>“o”/“i”</w:t>
+        <w:t>“o”/“</w:t>
+      </w:r>
+      <w:proofErr w:type="spellStart"/>
+      <w:r>
+        <w:rPr>
+          <w:rFonts w:ascii="Times New Roman" w:eastAsia="宋体" w:hAnsi="Times New Roman" w:cs="Times New Roman"/>
+          <w:sz w:val="24"/>
+          <w:szCs w:val="24"/>
+        </w:rPr>
+        <w:t>i</w:t>
+      </w:r>
+      <w:proofErr w:type="spellEnd"/>
+      <w:r>
+        <w:rPr>
+          <w:rFonts w:ascii="Times New Roman" w:eastAsia="宋体" w:hAnsi="Times New Roman" w:cs="Times New Roman"/>
+          <w:sz w:val="24"/>
+          <w:szCs w:val="24"/>
+        </w:rPr>
+        <w:t>”</w:t>
       </w:r>
       <w:r>
         <w:rPr>
@@ -2258,7 +2715,25 @@
           <w:sz w:val="24"/>
           <w:szCs w:val="24"/>
         </w:rPr>
-        <w:t>vcffile1,vcffle2,vcffile3…</w:t>
+        <w:t>vcffile</w:t>
+      </w:r>
+      <w:proofErr w:type="gramStart"/>
+      <w:r>
+        <w:rPr>
+          <w:rFonts w:ascii="Times New Roman" w:eastAsia="宋体" w:hAnsi="Times New Roman" w:cs="Times New Roman"/>
+          <w:sz w:val="24"/>
+          <w:szCs w:val="24"/>
+        </w:rPr>
+        <w:t>1,vcffle</w:t>
+      </w:r>
+      <w:proofErr w:type="gramEnd"/>
+      <w:r>
+        <w:rPr>
+          <w:rFonts w:ascii="Times New Roman" w:eastAsia="宋体" w:hAnsi="Times New Roman" w:cs="Times New Roman"/>
+          <w:sz w:val="24"/>
+          <w:szCs w:val="24"/>
+        </w:rPr>
+        <w:t>2,vcffile3…</w:t>
       </w:r>
       <w:r>
         <w:rPr>
@@ -2341,7 +2816,25 @@
           <w:sz w:val="24"/>
           <w:szCs w:val="24"/>
         </w:rPr>
-        <w:t>[chrNo:[</w:t>
+        <w:t>[</w:t>
+      </w:r>
+      <w:proofErr w:type="spellStart"/>
+      <w:r>
+        <w:rPr>
+          <w:rFonts w:ascii="Times New Roman" w:eastAsia="宋体" w:hAnsi="Times New Roman" w:cs="Times New Roman"/>
+          <w:sz w:val="24"/>
+          <w:szCs w:val="24"/>
+        </w:rPr>
+        <w:t>chrNo</w:t>
+      </w:r>
+      <w:proofErr w:type="spellEnd"/>
+      <w:r>
+        <w:rPr>
+          <w:rFonts w:ascii="Times New Roman" w:eastAsia="宋体" w:hAnsi="Times New Roman" w:cs="Times New Roman"/>
+          <w:sz w:val="24"/>
+          <w:szCs w:val="24"/>
+        </w:rPr>
+        <w:t>:[</w:t>
       </w:r>
       <w:r>
         <w:rPr>
@@ -2359,6 +2852,7 @@
         </w:rPr>
         <w:t>中</w:t>
       </w:r>
+      <w:proofErr w:type="spellStart"/>
       <w:r>
         <w:rPr>
           <w:rFonts w:ascii="Times New Roman" w:eastAsia="宋体" w:hAnsi="Times New Roman" w:cs="Times New Roman"/>
@@ -2367,6 +2861,7 @@
         </w:rPr>
         <w:t>chrNo</w:t>
       </w:r>
+      <w:proofErr w:type="spellEnd"/>
       <w:r>
         <w:rPr>
           <w:rFonts w:ascii="Times New Roman" w:eastAsia="宋体" w:hAnsi="Times New Roman" w:cs="Times New Roman"/>
@@ -2381,7 +2876,25 @@
           <w:sz w:val="24"/>
           <w:szCs w:val="24"/>
         </w:rPr>
-        <w:t>],{chrNo:[</w:t>
+        <w:t>],{</w:t>
+      </w:r>
+      <w:proofErr w:type="spellStart"/>
+      <w:r>
+        <w:rPr>
+          <w:rFonts w:ascii="Times New Roman" w:eastAsia="宋体" w:hAnsi="Times New Roman" w:cs="Times New Roman"/>
+          <w:sz w:val="24"/>
+          <w:szCs w:val="24"/>
+        </w:rPr>
+        <w:t>chrNo</w:t>
+      </w:r>
+      <w:proofErr w:type="spellEnd"/>
+      <w:r>
+        <w:rPr>
+          <w:rFonts w:ascii="Times New Roman" w:eastAsia="宋体" w:hAnsi="Times New Roman" w:cs="Times New Roman"/>
+          <w:sz w:val="24"/>
+          <w:szCs w:val="24"/>
+        </w:rPr>
+        <w:t>:[</w:t>
       </w:r>
       <w:r>
         <w:rPr>
@@ -2399,6 +2912,7 @@
         </w:rPr>
         <w:t>中</w:t>
       </w:r>
+      <w:proofErr w:type="spellStart"/>
       <w:r>
         <w:rPr>
           <w:rFonts w:ascii="Times New Roman" w:eastAsia="宋体" w:hAnsi="Times New Roman" w:cs="Times New Roman"/>
@@ -2407,6 +2921,7 @@
         </w:rPr>
         <w:t>chrNo</w:t>
       </w:r>
+      <w:proofErr w:type="spellEnd"/>
       <w:r>
         <w:rPr>
           <w:rFonts w:ascii="Times New Roman" w:eastAsia="宋体" w:hAnsi="Times New Roman" w:cs="Times New Roman"/>
@@ -2447,6 +2962,7 @@
         </w:rPr>
         <w:t>文件的对应</w:t>
       </w:r>
+      <w:proofErr w:type="spellStart"/>
       <w:r>
         <w:rPr>
           <w:rFonts w:ascii="Times New Roman" w:eastAsia="宋体" w:hAnsi="Times New Roman" w:cs="Times New Roman"/>
@@ -2455,6 +2971,7 @@
         </w:rPr>
         <w:t>chrNo</w:t>
       </w:r>
+      <w:proofErr w:type="spellEnd"/>
       <w:r>
         <w:rPr>
           <w:rFonts w:ascii="Times New Roman" w:eastAsia="宋体" w:hAnsi="Times New Roman" w:cs="Times New Roman"/>
@@ -2471,13 +2988,23 @@
         </w:rPr>
         <w:t>的</w:t>
       </w:r>
-      <w:r>
-        <w:rPr>
-          <w:rFonts w:ascii="Times New Roman" w:eastAsia="宋体" w:hAnsi="Times New Roman" w:cs="Times New Roman"/>
-          <w:sz w:val="24"/>
-          <w:szCs w:val="24"/>
-        </w:rPr>
-        <w:t>VCF_Data()</w:t>
+      <w:proofErr w:type="spellStart"/>
+      <w:r>
+        <w:rPr>
+          <w:rFonts w:ascii="Times New Roman" w:eastAsia="宋体" w:hAnsi="Times New Roman" w:cs="Times New Roman"/>
+          <w:sz w:val="24"/>
+          <w:szCs w:val="24"/>
+        </w:rPr>
+        <w:t>VCF_Data</w:t>
+      </w:r>
+      <w:proofErr w:type="spellEnd"/>
+      <w:r>
+        <w:rPr>
+          <w:rFonts w:ascii="Times New Roman" w:eastAsia="宋体" w:hAnsi="Times New Roman" w:cs="Times New Roman"/>
+          <w:sz w:val="24"/>
+          <w:szCs w:val="24"/>
+        </w:rPr>
+        <w:t>()</w:t>
       </w:r>
       <w:r>
         <w:rPr>
@@ -2487,6 +3014,7 @@
         </w:rPr>
         <w:t>类的</w:t>
       </w:r>
+      <w:proofErr w:type="spellStart"/>
       <w:r>
         <w:rPr>
           <w:rFonts w:ascii="Times New Roman" w:eastAsia="宋体" w:hAnsi="Times New Roman" w:cs="Times New Roman"/>
@@ -2495,6 +3023,7 @@
         </w:rPr>
         <w:t>getVcfListByChrom</w:t>
       </w:r>
+      <w:proofErr w:type="spellEnd"/>
       <w:r>
         <w:rPr>
           <w:rFonts w:ascii="Times New Roman" w:eastAsia="宋体" w:hAnsi="Times New Roman" w:cs="Times New Roman"/>
@@ -2528,7 +3057,25 @@
           <w:sz w:val="24"/>
           <w:szCs w:val="24"/>
         </w:rPr>
-        <w:t xml:space="preserve">[chrNo:[(pos,REF,ALT,INFO,FORMAT,sample,...),(pos,REF,ALT,INFO,FORMAT,sample,...),,,,,],{chrNo:[]},,,,,,] </w:t>
+        <w:t>[</w:t>
+      </w:r>
+      <w:proofErr w:type="gramStart"/>
+      <w:r>
+        <w:rPr>
+          <w:rFonts w:ascii="Times New Roman" w:eastAsia="宋体" w:hAnsi="Times New Roman" w:cs="Times New Roman"/>
+          <w:sz w:val="24"/>
+          <w:szCs w:val="24"/>
+        </w:rPr>
+        <w:t>chrNo:[</w:t>
+      </w:r>
+      <w:proofErr w:type="gramEnd"/>
+      <w:r>
+        <w:rPr>
+          <w:rFonts w:ascii="Times New Roman" w:eastAsia="宋体" w:hAnsi="Times New Roman" w:cs="Times New Roman"/>
+          <w:sz w:val="24"/>
+          <w:szCs w:val="24"/>
+        </w:rPr>
+        <w:t xml:space="preserve">(pos,REF,ALT,INFO,FORMAT,sample,...),(pos,REF,ALT,INFO,FORMAT,sample,...),,,,,],{chrNo:[]},,,,,,] </w:t>
       </w:r>
       <w:r>
         <w:rPr>
@@ -2738,7 +3285,25 @@
           <w:szCs w:val="24"/>
         </w:rPr>
         <w:tab/>
-        <w:t xml:space="preserve">  [pos2,REF,ALT,(              ), </w:t>
+        <w:t xml:space="preserve">  [pos</w:t>
+      </w:r>
+      <w:proofErr w:type="gramStart"/>
+      <w:r>
+        <w:rPr>
+          <w:rFonts w:ascii="Times New Roman" w:eastAsia="宋体" w:hAnsi="Times New Roman" w:cs="Times New Roman"/>
+          <w:sz w:val="24"/>
+          <w:szCs w:val="24"/>
+        </w:rPr>
+        <w:t>2,REF</w:t>
+      </w:r>
+      <w:proofErr w:type="gramEnd"/>
+      <w:r>
+        <w:rPr>
+          <w:rFonts w:ascii="Times New Roman" w:eastAsia="宋体" w:hAnsi="Times New Roman" w:cs="Times New Roman"/>
+          <w:sz w:val="24"/>
+          <w:szCs w:val="24"/>
+        </w:rPr>
+        <w:t xml:space="preserve">,ALT,(              ), </w:t>
       </w:r>
       <w:r>
         <w:rPr>
@@ -2874,6 +3439,7 @@
         </w:rPr>
         <w:t>外连接方式合并，若某</w:t>
       </w:r>
+      <w:proofErr w:type="spellStart"/>
       <w:r>
         <w:rPr>
           <w:rFonts w:ascii="Times New Roman" w:eastAsia="宋体" w:hAnsi="Times New Roman" w:cs="Times New Roman" w:hint="eastAsia"/>
@@ -2890,6 +3456,7 @@
         </w:rPr>
         <w:t>cf</w:t>
       </w:r>
+      <w:proofErr w:type="spellEnd"/>
       <w:r>
         <w:rPr>
           <w:rFonts w:ascii="Times New Roman" w:eastAsia="宋体" w:hAnsi="Times New Roman" w:cs="Times New Roman" w:hint="eastAsia"/>
@@ -2946,6 +3513,7 @@
         </w:rPr>
         <w:t>。</w:t>
       </w:r>
+      <w:proofErr w:type="gramStart"/>
       <w:r>
         <w:rPr>
           <w:rFonts w:ascii="Times New Roman" w:eastAsia="宋体" w:hAnsi="Times New Roman" w:cs="Times New Roman" w:hint="eastAsia"/>
@@ -2962,6 +3530,8 @@
         </w:rPr>
         <w:t>各</w:t>
       </w:r>
+      <w:proofErr w:type="spellStart"/>
+      <w:proofErr w:type="gramEnd"/>
       <w:r>
         <w:rPr>
           <w:rFonts w:ascii="Times New Roman" w:eastAsia="宋体" w:hAnsi="Times New Roman" w:cs="Times New Roman" w:hint="eastAsia"/>
@@ -2978,6 +3548,7 @@
         </w:rPr>
         <w:t>cffile</w:t>
       </w:r>
+      <w:proofErr w:type="spellEnd"/>
       <w:r>
         <w:rPr>
           <w:rFonts w:ascii="Times New Roman" w:eastAsia="宋体" w:hAnsi="Times New Roman" w:cs="Times New Roman" w:hint="eastAsia"/>
@@ -3051,6 +3622,7 @@
           <w:szCs w:val="21"/>
         </w:rPr>
       </w:pPr>
+      <w:proofErr w:type="spellStart"/>
       <w:r>
         <w:rPr>
           <w:rFonts w:ascii="Consolas" w:hAnsi="Consolas" w:cs="Consolas" w:hint="eastAsia"/>
@@ -3062,6 +3634,7 @@
         <w:lastRenderedPageBreak/>
         <w:t>vcf</w:t>
       </w:r>
+      <w:proofErr w:type="spellEnd"/>
       <w:r>
         <w:rPr>
           <w:rFonts w:ascii="Consolas" w:hAnsi="Consolas" w:cs="Consolas" w:hint="eastAsia"/>
@@ -3072,6 +3645,7 @@
         </w:rPr>
         <w:t>数据表标准为：五列必须列，分别为</w:t>
       </w:r>
+      <w:proofErr w:type="spellStart"/>
       <w:r>
         <w:rPr>
           <w:rFonts w:ascii="Consolas" w:hAnsi="Consolas" w:cs="Consolas" w:hint="eastAsia"/>
@@ -3082,6 +3656,7 @@
         </w:rPr>
         <w:t>chrID</w:t>
       </w:r>
+      <w:proofErr w:type="spellEnd"/>
       <w:r>
         <w:rPr>
           <w:rFonts w:ascii="Consolas" w:hAnsi="Consolas" w:cs="Consolas" w:hint="eastAsia"/>
@@ -3092,6 +3667,7 @@
         </w:rPr>
         <w:t>，</w:t>
       </w:r>
+      <w:proofErr w:type="spellStart"/>
       <w:r>
         <w:rPr>
           <w:rFonts w:ascii="Consolas" w:hAnsi="Consolas" w:cs="Consolas" w:hint="eastAsia"/>
@@ -3102,6 +3678,7 @@
         </w:rPr>
         <w:t>snp_pos,snpID,ref_base,alt_base</w:t>
       </w:r>
+      <w:proofErr w:type="spellEnd"/>
       <w:r>
         <w:rPr>
           <w:rFonts w:ascii="Consolas" w:hAnsi="Consolas" w:cs="Consolas" w:hint="eastAsia"/>
@@ -3121,6 +3698,7 @@
           <w:szCs w:val="21"/>
         </w:rPr>
       </w:pPr>
+      <w:proofErr w:type="spellStart"/>
       <w:r>
         <w:rPr>
           <w:rFonts w:ascii="Consolas" w:hAnsi="Consolas" w:cs="Consolas" w:hint="eastAsia"/>
@@ -3129,8 +3707,9 @@
           <w:kern w:val="0"/>
           <w:szCs w:val="21"/>
         </w:rPr>
-        <w:t>toplevel vcf</w:t>
-      </w:r>
+        <w:t>toplevel</w:t>
+      </w:r>
+      <w:proofErr w:type="spellEnd"/>
       <w:r>
         <w:rPr>
           <w:rFonts w:ascii="Consolas" w:hAnsi="Consolas" w:cs="Consolas" w:hint="eastAsia"/>
@@ -3139,8 +3718,31 @@
           <w:kern w:val="0"/>
           <w:szCs w:val="21"/>
         </w:rPr>
+        <w:t xml:space="preserve"> </w:t>
+      </w:r>
+      <w:proofErr w:type="spellStart"/>
+      <w:r>
+        <w:rPr>
+          <w:rFonts w:ascii="Consolas" w:hAnsi="Consolas" w:cs="Consolas" w:hint="eastAsia"/>
+          <w:bCs/>
+          <w:color w:val="000000"/>
+          <w:kern w:val="0"/>
+          <w:szCs w:val="21"/>
+        </w:rPr>
+        <w:t>vcf</w:t>
+      </w:r>
+      <w:proofErr w:type="spellEnd"/>
+      <w:r>
+        <w:rPr>
+          <w:rFonts w:ascii="Consolas" w:hAnsi="Consolas" w:cs="Consolas" w:hint="eastAsia"/>
+          <w:bCs/>
+          <w:color w:val="000000"/>
+          <w:kern w:val="0"/>
+          <w:szCs w:val="21"/>
+        </w:rPr>
         <w:t>数据表为</w:t>
       </w:r>
+      <w:proofErr w:type="spellStart"/>
       <w:r>
         <w:rPr>
           <w:rFonts w:ascii="Consolas" w:hAnsi="Consolas" w:cs="Consolas" w:hint="eastAsia"/>
@@ -3151,6 +3753,7 @@
         </w:rPr>
         <w:t>chrID</w:t>
       </w:r>
+      <w:proofErr w:type="spellEnd"/>
       <w:r>
         <w:rPr>
           <w:rFonts w:ascii="Consolas" w:hAnsi="Consolas" w:cs="Consolas" w:hint="eastAsia"/>
@@ -3161,6 +3764,7 @@
         </w:rPr>
         <w:t>，</w:t>
       </w:r>
+      <w:proofErr w:type="spellStart"/>
       <w:r>
         <w:rPr>
           <w:rFonts w:ascii="Consolas" w:hAnsi="Consolas" w:cs="Consolas" w:hint="eastAsia"/>
@@ -3171,6 +3775,7 @@
         </w:rPr>
         <w:t>snp_pos,snpID,ref_base,alt_base</w:t>
       </w:r>
+      <w:proofErr w:type="spellEnd"/>
       <w:r>
         <w:rPr>
           <w:rFonts w:ascii="Consolas" w:hAnsi="Consolas" w:cs="Consolas" w:hint="eastAsia"/>
@@ -3197,6 +3802,7 @@
         </w:rPr>
         <w:t xml:space="preserve"> </w:t>
       </w:r>
+      <w:proofErr w:type="spellStart"/>
       <w:r>
         <w:rPr>
           <w:rFonts w:ascii="Consolas" w:hAnsi="Consolas" w:cs="Consolas"/>
@@ -3207,6 +3813,7 @@
         </w:rPr>
         <w:t>wegeon_indvd_SNV_vcf_alt</w:t>
       </w:r>
+      <w:proofErr w:type="spellEnd"/>
       <w:r>
         <w:rPr>
           <w:rFonts w:ascii="Consolas" w:hAnsi="Consolas" w:cs="Consolas" w:hint="eastAsia"/>
@@ -3223,6 +3830,7 @@
         </w:rPr>
         <w:t xml:space="preserve"> </w:t>
       </w:r>
+      <w:proofErr w:type="spellStart"/>
       <w:r>
         <w:rPr>
           <w:rFonts w:ascii="Consolas" w:hAnsi="Consolas" w:cs="Consolas"/>
@@ -3233,6 +3841,7 @@
         </w:rPr>
         <w:t>wegeon_indvd_SNV_vcf_dep</w:t>
       </w:r>
+      <w:proofErr w:type="spellEnd"/>
       <w:r>
         <w:rPr>
           <w:rFonts w:ascii="Consolas" w:hAnsi="Consolas" w:cs="Consolas" w:hint="eastAsia"/>
@@ -3266,12 +3875,14 @@
           <w:numId w:val="3"/>
         </w:numPr>
       </w:pPr>
+      <w:proofErr w:type="spellStart"/>
       <w:r>
         <w:rPr>
           <w:bCs/>
         </w:rPr>
         <w:t>getRefSeqBypos</w:t>
       </w:r>
+      <w:proofErr w:type="spellEnd"/>
       <w:r>
         <w:rPr>
           <w:rFonts w:hint="eastAsia"/>
@@ -3294,6 +3905,7 @@
           <w:numId w:val="3"/>
         </w:numPr>
       </w:pPr>
+      <w:proofErr w:type="spellStart"/>
       <w:r>
         <w:rPr>
           <w:rFonts w:ascii="Consolas" w:hAnsi="Consolas" w:cs="Consolas"/>
@@ -3307,6 +3919,7 @@
         </w:rPr>
         <w:t>generateFasterRefIndex</w:t>
       </w:r>
+      <w:proofErr w:type="spellEnd"/>
       <w:r>
         <w:rPr>
           <w:rFonts w:ascii="Consolas" w:hAnsi="Consolas" w:cs="Consolas"/>
@@ -3330,7 +3943,35 @@
           <w:szCs w:val="20"/>
           <w:highlight w:val="yellow"/>
         </w:rPr>
-        <w:t>这个函数怎么处理染色体名的回去好好查查看看</w:t>
+        <w:t>这个函数怎么处理染色体名的回去好好查</w:t>
+      </w:r>
+      <w:proofErr w:type="gramStart"/>
+      <w:r>
+        <w:rPr>
+          <w:rFonts w:ascii="Consolas" w:hAnsi="Consolas" w:cs="Consolas" w:hint="eastAsia"/>
+          <w:b/>
+          <w:bCs/>
+          <w:color w:val="000000"/>
+          <w:kern w:val="0"/>
+          <w:sz w:val="20"/>
+          <w:szCs w:val="20"/>
+          <w:highlight w:val="yellow"/>
+        </w:rPr>
+        <w:t>查看</w:t>
+      </w:r>
+      <w:proofErr w:type="gramEnd"/>
+      <w:r>
+        <w:rPr>
+          <w:rFonts w:ascii="Consolas" w:hAnsi="Consolas" w:cs="Consolas" w:hint="eastAsia"/>
+          <w:b/>
+          <w:bCs/>
+          <w:color w:val="000000"/>
+          <w:kern w:val="0"/>
+          <w:sz w:val="20"/>
+          <w:szCs w:val="20"/>
+          <w:highlight w:val="yellow"/>
+        </w:rPr>
+        <w:t>看</w:t>
       </w:r>
     </w:p>
     <w:p>
@@ -3340,6 +3981,7 @@
           <w:numId w:val="3"/>
         </w:numPr>
       </w:pPr>
+      <w:proofErr w:type="spellStart"/>
       <w:r>
         <w:rPr>
           <w:rFonts w:ascii="Consolas" w:hAnsi="Consolas" w:cs="Consolas"/>
@@ -3351,6 +3993,7 @@
         </w:rPr>
         <w:t>getRefSeqBypos_faster</w:t>
       </w:r>
+      <w:proofErr w:type="spellEnd"/>
     </w:p>
     <w:p>
       <w:pPr>
@@ -3373,7 +4016,178 @@
           <w:sz w:val="18"/>
           <w:szCs w:val="18"/>
         </w:rPr>
-        <w:t>def getRefSeqBypos_faster(refFastahandle, fasterrefindex, currentChromNO, startpos, endpos,  currentChromNOlen=None, seektuple=()):</w:t>
+        <w:t xml:space="preserve">def </w:t>
+      </w:r>
+      <w:proofErr w:type="spellStart"/>
+      <w:r>
+        <w:rPr>
+          <w:rFonts w:ascii="Microsoft YaHei UI" w:eastAsia="Microsoft YaHei UI" w:cs="Microsoft YaHei UI"/>
+          <w:kern w:val="0"/>
+          <w:sz w:val="18"/>
+          <w:szCs w:val="18"/>
+        </w:rPr>
+        <w:t>getRefSeqBypos_</w:t>
+      </w:r>
+      <w:proofErr w:type="gramStart"/>
+      <w:r>
+        <w:rPr>
+          <w:rFonts w:ascii="Microsoft YaHei UI" w:eastAsia="Microsoft YaHei UI" w:cs="Microsoft YaHei UI"/>
+          <w:kern w:val="0"/>
+          <w:sz w:val="18"/>
+          <w:szCs w:val="18"/>
+        </w:rPr>
+        <w:t>faster</w:t>
+      </w:r>
+      <w:proofErr w:type="spellEnd"/>
+      <w:r>
+        <w:rPr>
+          <w:rFonts w:ascii="Microsoft YaHei UI" w:eastAsia="Microsoft YaHei UI" w:cs="Microsoft YaHei UI"/>
+          <w:kern w:val="0"/>
+          <w:sz w:val="18"/>
+          <w:szCs w:val="18"/>
+        </w:rPr>
+        <w:t>(</w:t>
+      </w:r>
+      <w:proofErr w:type="spellStart"/>
+      <w:proofErr w:type="gramEnd"/>
+      <w:r>
+        <w:rPr>
+          <w:rFonts w:ascii="Microsoft YaHei UI" w:eastAsia="Microsoft YaHei UI" w:cs="Microsoft YaHei UI"/>
+          <w:kern w:val="0"/>
+          <w:sz w:val="18"/>
+          <w:szCs w:val="18"/>
+        </w:rPr>
+        <w:t>refFastahandle</w:t>
+      </w:r>
+      <w:proofErr w:type="spellEnd"/>
+      <w:r>
+        <w:rPr>
+          <w:rFonts w:ascii="Microsoft YaHei UI" w:eastAsia="Microsoft YaHei UI" w:cs="Microsoft YaHei UI"/>
+          <w:kern w:val="0"/>
+          <w:sz w:val="18"/>
+          <w:szCs w:val="18"/>
+        </w:rPr>
+        <w:t xml:space="preserve">, </w:t>
+      </w:r>
+      <w:proofErr w:type="spellStart"/>
+      <w:r>
+        <w:rPr>
+          <w:rFonts w:ascii="Microsoft YaHei UI" w:eastAsia="Microsoft YaHei UI" w:cs="Microsoft YaHei UI"/>
+          <w:kern w:val="0"/>
+          <w:sz w:val="18"/>
+          <w:szCs w:val="18"/>
+        </w:rPr>
+        <w:t>fasterrefindex</w:t>
+      </w:r>
+      <w:proofErr w:type="spellEnd"/>
+      <w:r>
+        <w:rPr>
+          <w:rFonts w:ascii="Microsoft YaHei UI" w:eastAsia="Microsoft YaHei UI" w:cs="Microsoft YaHei UI"/>
+          <w:kern w:val="0"/>
+          <w:sz w:val="18"/>
+          <w:szCs w:val="18"/>
+        </w:rPr>
+        <w:t xml:space="preserve">, </w:t>
+      </w:r>
+      <w:proofErr w:type="spellStart"/>
+      <w:r>
+        <w:rPr>
+          <w:rFonts w:ascii="Microsoft YaHei UI" w:eastAsia="Microsoft YaHei UI" w:cs="Microsoft YaHei UI"/>
+          <w:kern w:val="0"/>
+          <w:sz w:val="18"/>
+          <w:szCs w:val="18"/>
+        </w:rPr>
+        <w:t>currentChromNO</w:t>
+      </w:r>
+      <w:proofErr w:type="spellEnd"/>
+      <w:r>
+        <w:rPr>
+          <w:rFonts w:ascii="Microsoft YaHei UI" w:eastAsia="Microsoft YaHei UI" w:cs="Microsoft YaHei UI"/>
+          <w:kern w:val="0"/>
+          <w:sz w:val="18"/>
+          <w:szCs w:val="18"/>
+        </w:rPr>
+        <w:t xml:space="preserve">, </w:t>
+      </w:r>
+      <w:proofErr w:type="spellStart"/>
+      <w:r>
+        <w:rPr>
+          <w:rFonts w:ascii="Microsoft YaHei UI" w:eastAsia="Microsoft YaHei UI" w:cs="Microsoft YaHei UI"/>
+          <w:kern w:val="0"/>
+          <w:sz w:val="18"/>
+          <w:szCs w:val="18"/>
+        </w:rPr>
+        <w:t>startpos</w:t>
+      </w:r>
+      <w:proofErr w:type="spellEnd"/>
+      <w:r>
+        <w:rPr>
+          <w:rFonts w:ascii="Microsoft YaHei UI" w:eastAsia="Microsoft YaHei UI" w:cs="Microsoft YaHei UI"/>
+          <w:kern w:val="0"/>
+          <w:sz w:val="18"/>
+          <w:szCs w:val="18"/>
+        </w:rPr>
+        <w:t xml:space="preserve">, </w:t>
+      </w:r>
+      <w:proofErr w:type="spellStart"/>
+      <w:r>
+        <w:rPr>
+          <w:rFonts w:ascii="Microsoft YaHei UI" w:eastAsia="Microsoft YaHei UI" w:cs="Microsoft YaHei UI"/>
+          <w:kern w:val="0"/>
+          <w:sz w:val="18"/>
+          <w:szCs w:val="18"/>
+        </w:rPr>
+        <w:t>endpos</w:t>
+      </w:r>
+      <w:proofErr w:type="spellEnd"/>
+      <w:r>
+        <w:rPr>
+          <w:rFonts w:ascii="Microsoft YaHei UI" w:eastAsia="Microsoft YaHei UI" w:cs="Microsoft YaHei UI"/>
+          <w:kern w:val="0"/>
+          <w:sz w:val="18"/>
+          <w:szCs w:val="18"/>
+        </w:rPr>
+        <w:t xml:space="preserve">,  </w:t>
+      </w:r>
+      <w:proofErr w:type="spellStart"/>
+      <w:r>
+        <w:rPr>
+          <w:rFonts w:ascii="Microsoft YaHei UI" w:eastAsia="Microsoft YaHei UI" w:cs="Microsoft YaHei UI"/>
+          <w:kern w:val="0"/>
+          <w:sz w:val="18"/>
+          <w:szCs w:val="18"/>
+        </w:rPr>
+        <w:t>currentChromNOlen</w:t>
+      </w:r>
+      <w:proofErr w:type="spellEnd"/>
+      <w:r>
+        <w:rPr>
+          <w:rFonts w:ascii="Microsoft YaHei UI" w:eastAsia="Microsoft YaHei UI" w:cs="Microsoft YaHei UI"/>
+          <w:kern w:val="0"/>
+          <w:sz w:val="18"/>
+          <w:szCs w:val="18"/>
+        </w:rPr>
+        <w:t xml:space="preserve">=None, </w:t>
+      </w:r>
+      <w:proofErr w:type="spellStart"/>
+      <w:r>
+        <w:rPr>
+          <w:rFonts w:ascii="Microsoft YaHei UI" w:eastAsia="Microsoft YaHei UI" w:cs="Microsoft YaHei UI"/>
+          <w:kern w:val="0"/>
+          <w:sz w:val="18"/>
+          <w:szCs w:val="18"/>
+        </w:rPr>
+        <w:t>seektuple</w:t>
+      </w:r>
+      <w:proofErr w:type="spellEnd"/>
+      <w:r>
+        <w:rPr>
+          <w:rFonts w:ascii="Microsoft YaHei UI" w:eastAsia="Microsoft YaHei UI" w:cs="Microsoft YaHei UI"/>
+          <w:kern w:val="0"/>
+          <w:sz w:val="18"/>
+          <w:szCs w:val="18"/>
+        </w:rPr>
+        <w:t>=()):</w:t>
       </w:r>
     </w:p>
     <w:p>
@@ -3445,7 +4259,49 @@
           <w:sz w:val="18"/>
           <w:szCs w:val="18"/>
         </w:rPr>
-        <w:t xml:space="preserve">    seektuple=(filepos,basesbeforefilepos)</w:t>
+        <w:t xml:space="preserve">    </w:t>
+      </w:r>
+      <w:proofErr w:type="spellStart"/>
+      <w:r>
+        <w:rPr>
+          <w:rFonts w:ascii="Microsoft YaHei UI" w:eastAsia="Microsoft YaHei UI" w:cs="Microsoft YaHei UI"/>
+          <w:kern w:val="0"/>
+          <w:sz w:val="18"/>
+          <w:szCs w:val="18"/>
+        </w:rPr>
+        <w:t>seektuple</w:t>
+      </w:r>
+      <w:proofErr w:type="spellEnd"/>
+      <w:r>
+        <w:rPr>
+          <w:rFonts w:ascii="Microsoft YaHei UI" w:eastAsia="Microsoft YaHei UI" w:cs="Microsoft YaHei UI"/>
+          <w:kern w:val="0"/>
+          <w:sz w:val="18"/>
+          <w:szCs w:val="18"/>
+        </w:rPr>
+        <w:t>=(</w:t>
+      </w:r>
+      <w:proofErr w:type="spellStart"/>
+      <w:proofErr w:type="gramStart"/>
+      <w:r>
+        <w:rPr>
+          <w:rFonts w:ascii="Microsoft YaHei UI" w:eastAsia="Microsoft YaHei UI" w:cs="Microsoft YaHei UI"/>
+          <w:kern w:val="0"/>
+          <w:sz w:val="18"/>
+          <w:szCs w:val="18"/>
+        </w:rPr>
+        <w:t>filepos,basesbeforefilepos</w:t>
+      </w:r>
+      <w:proofErr w:type="spellEnd"/>
+      <w:proofErr w:type="gramEnd"/>
+      <w:r>
+        <w:rPr>
+          <w:rFonts w:ascii="Microsoft YaHei UI" w:eastAsia="Microsoft YaHei UI" w:cs="Microsoft YaHei UI"/>
+          <w:kern w:val="0"/>
+          <w:sz w:val="18"/>
+          <w:szCs w:val="18"/>
+        </w:rPr>
+        <w:t>)</w:t>
       </w:r>
     </w:p>
     <w:p>
@@ -3469,7 +4325,27 @@
           <w:sz w:val="18"/>
           <w:szCs w:val="18"/>
         </w:rPr>
-        <w:t xml:space="preserve">    the refSeqMap has only one chromosome's sequence</w:t>
+        <w:t xml:space="preserve">    the </w:t>
+      </w:r>
+      <w:proofErr w:type="spellStart"/>
+      <w:r>
+        <w:rPr>
+          <w:rFonts w:ascii="Microsoft YaHei UI" w:eastAsia="Microsoft YaHei UI" w:cs="Microsoft YaHei UI"/>
+          <w:kern w:val="0"/>
+          <w:sz w:val="18"/>
+          <w:szCs w:val="18"/>
+        </w:rPr>
+        <w:t>refSeqMap</w:t>
+      </w:r>
+      <w:proofErr w:type="spellEnd"/>
+      <w:r>
+        <w:rPr>
+          <w:rFonts w:ascii="Microsoft YaHei UI" w:eastAsia="Microsoft YaHei UI" w:cs="Microsoft YaHei UI"/>
+          <w:kern w:val="0"/>
+          <w:sz w:val="18"/>
+          <w:szCs w:val="18"/>
+        </w:rPr>
+        <w:t xml:space="preserve"> has only one chromosome's sequence</w:t>
       </w:r>
     </w:p>
     <w:p>
@@ -3493,8 +4369,19 @@
           <w:sz w:val="18"/>
           <w:szCs w:val="18"/>
         </w:rPr>
-        <w:t xml:space="preserve">    There is no restriction on refFastahander</w:t>
-      </w:r>
+        <w:t xml:space="preserve">    There is no restriction on </w:t>
+      </w:r>
+      <w:proofErr w:type="spellStart"/>
+      <w:r>
+        <w:rPr>
+          <w:rFonts w:ascii="Microsoft YaHei UI" w:eastAsia="Microsoft YaHei UI" w:cs="Microsoft YaHei UI"/>
+          <w:kern w:val="0"/>
+          <w:sz w:val="18"/>
+          <w:szCs w:val="18"/>
+        </w:rPr>
+        <w:t>refFastahander</w:t>
+      </w:r>
+      <w:proofErr w:type="spellEnd"/>
     </w:p>
     <w:p>
       <w:pPr>
@@ -3517,8 +4404,29 @@
           <w:sz w:val="18"/>
           <w:szCs w:val="18"/>
         </w:rPr>
-        <w:t xml:space="preserve">    refindex must indexed by </w:t>
-      </w:r>
+        <w:t xml:space="preserve">    </w:t>
+      </w:r>
+      <w:proofErr w:type="spellStart"/>
+      <w:r>
+        <w:rPr>
+          <w:rFonts w:ascii="Microsoft YaHei UI" w:eastAsia="Microsoft YaHei UI" w:cs="Microsoft YaHei UI"/>
+          <w:kern w:val="0"/>
+          <w:sz w:val="18"/>
+          <w:szCs w:val="18"/>
+        </w:rPr>
+        <w:t>refindex</w:t>
+      </w:r>
+      <w:proofErr w:type="spellEnd"/>
+      <w:r>
+        <w:rPr>
+          <w:rFonts w:ascii="Microsoft YaHei UI" w:eastAsia="Microsoft YaHei UI" w:cs="Microsoft YaHei UI"/>
+          <w:kern w:val="0"/>
+          <w:sz w:val="18"/>
+          <w:szCs w:val="18"/>
+        </w:rPr>
+        <w:t xml:space="preserve"> must indexed by </w:t>
+      </w:r>
+      <w:proofErr w:type="spellStart"/>
       <w:r>
         <w:rPr>
           <w:rFonts w:ascii="Microsoft YaHei UI" w:eastAsia="Microsoft YaHei UI" w:cs="Microsoft YaHei UI"/>
@@ -3527,17 +4435,30 @@
           <w:sz w:val="18"/>
           <w:szCs w:val="18"/>
         </w:rPr>
-        <w:t xml:space="preserve">generateFasterRefIndex </w:t>
-      </w:r>
+        <w:t>generateFasterRefIndex</w:t>
+      </w:r>
+      <w:proofErr w:type="spellEnd"/>
       <w:r>
         <w:rPr>
           <w:rFonts w:ascii="Microsoft YaHei UI" w:eastAsia="Microsoft YaHei UI" w:cs="Microsoft YaHei UI"/>
+          <w:color w:val="FF0000"/>
           <w:kern w:val="0"/>
           <w:sz w:val="18"/>
           <w:szCs w:val="18"/>
         </w:rPr>
+        <w:t xml:space="preserve"> </w:t>
+      </w:r>
+      <w:proofErr w:type="spellStart"/>
+      <w:r>
+        <w:rPr>
+          <w:rFonts w:ascii="Microsoft YaHei UI" w:eastAsia="Microsoft YaHei UI" w:cs="Microsoft YaHei UI"/>
+          <w:kern w:val="0"/>
+          <w:sz w:val="18"/>
+          <w:szCs w:val="18"/>
+        </w:rPr>
         <w:t>func</w:t>
       </w:r>
+      <w:proofErr w:type="spellEnd"/>
     </w:p>
     <w:p>
       <w:pPr>
@@ -3616,6 +4537,7 @@
           <w:numId w:val="3"/>
         </w:numPr>
       </w:pPr>
+      <w:proofErr w:type="spellStart"/>
       <w:r>
         <w:rPr>
           <w:rFonts w:ascii="Consolas" w:hAnsi="Consolas" w:cs="Consolas"/>
@@ -3626,6 +4548,7 @@
         </w:rPr>
         <w:t>getdepthByPos</w:t>
       </w:r>
+      <w:proofErr w:type="spellEnd"/>
       <w:r>
         <w:rPr>
           <w:rFonts w:ascii="Consolas" w:hAnsi="Consolas" w:cs="Consolas" w:hint="eastAsia"/>
@@ -3665,6 +4588,7 @@
         </w:rPr>
         <w:t>，所以</w:t>
       </w:r>
+      <w:proofErr w:type="spellStart"/>
       <w:r>
         <w:rPr>
           <w:rFonts w:ascii="Consolas" w:hAnsi="Consolas" w:cs="Consolas"/>
@@ -3675,6 +4599,7 @@
         </w:rPr>
         <w:t>getdepthByPos</w:t>
       </w:r>
+      <w:proofErr w:type="spellEnd"/>
       <w:r>
         <w:rPr>
           <w:rFonts w:ascii="Consolas" w:hAnsi="Consolas" w:cs="Consolas" w:hint="eastAsia"/>
@@ -3733,7 +4658,51 @@
           <w:sz w:val="20"/>
           <w:szCs w:val="20"/>
         </w:rPr>
-        <w:t>]*len(self.title)</w:t>
+        <w:t>]*</w:t>
+      </w:r>
+      <w:proofErr w:type="spellStart"/>
+      <w:r>
+        <w:rPr>
+          <w:rFonts w:ascii="Consolas" w:hAnsi="Consolas" w:cs="Consolas" w:hint="eastAsia"/>
+          <w:bCs/>
+          <w:kern w:val="0"/>
+          <w:sz w:val="20"/>
+          <w:szCs w:val="20"/>
+        </w:rPr>
+        <w:t>len</w:t>
+      </w:r>
+      <w:proofErr w:type="spellEnd"/>
+      <w:r>
+        <w:rPr>
+          <w:rFonts w:ascii="Consolas" w:hAnsi="Consolas" w:cs="Consolas" w:hint="eastAsia"/>
+          <w:bCs/>
+          <w:kern w:val="0"/>
+          <w:sz w:val="20"/>
+          <w:szCs w:val="20"/>
+        </w:rPr>
+        <w:t>(</w:t>
+      </w:r>
+      <w:proofErr w:type="spellStart"/>
+      <w:r>
+        <w:rPr>
+          <w:rFonts w:ascii="Consolas" w:hAnsi="Consolas" w:cs="Consolas" w:hint="eastAsia"/>
+          <w:bCs/>
+          <w:kern w:val="0"/>
+          <w:sz w:val="20"/>
+          <w:szCs w:val="20"/>
+        </w:rPr>
+        <w:t>self.title</w:t>
+      </w:r>
+      <w:proofErr w:type="spellEnd"/>
+      <w:r>
+        <w:rPr>
+          <w:rFonts w:ascii="Consolas" w:hAnsi="Consolas" w:cs="Consolas" w:hint="eastAsia"/>
+          <w:bCs/>
+          <w:kern w:val="0"/>
+          <w:sz w:val="20"/>
+          <w:szCs w:val="20"/>
+        </w:rPr>
+        <w:t>)</w:t>
       </w:r>
       <w:r>
         <w:rPr>
@@ -3755,6 +4724,7 @@
         </w:numPr>
         <w:ind w:firstLineChars="0"/>
       </w:pPr>
+      <w:proofErr w:type="spellStart"/>
       <w:r>
         <w:rPr>
           <w:rFonts w:ascii="Consolas" w:hAnsi="Consolas" w:cs="Consolas"/>
@@ -3766,6 +4736,7 @@
         </w:rPr>
         <w:t>GATK_depthfile</w:t>
       </w:r>
+      <w:proofErr w:type="spellEnd"/>
       <w:r>
         <w:rPr>
           <w:rFonts w:ascii="Consolas" w:hAnsi="Consolas" w:cs="Consolas" w:hint="eastAsia"/>
@@ -3777,6 +4748,7 @@
         </w:rPr>
         <w:t>函数中的</w:t>
       </w:r>
+      <w:proofErr w:type="spellStart"/>
       <w:r>
         <w:rPr>
           <w:rFonts w:ascii="Consolas" w:hAnsi="Consolas" w:cs="Consolas"/>
@@ -3788,6 +4760,7 @@
         </w:rPr>
         <w:t>getdepthByPos_optimized</w:t>
       </w:r>
+      <w:proofErr w:type="spellEnd"/>
       <w:r>
         <w:rPr>
           <w:rFonts w:ascii="Consolas" w:hAnsi="Consolas" w:cs="Consolas" w:hint="eastAsia"/>
@@ -3799,6 +4772,7 @@
         </w:rPr>
         <w:t>方法为</w:t>
       </w:r>
+      <w:proofErr w:type="spellStart"/>
       <w:r>
         <w:rPr>
           <w:rFonts w:ascii="Consolas" w:hAnsi="Consolas" w:cs="Consolas"/>
@@ -3809,6 +4783,7 @@
         </w:rPr>
         <w:t>getdepthByPos</w:t>
       </w:r>
+      <w:proofErr w:type="spellEnd"/>
       <w:r>
         <w:rPr>
           <w:rFonts w:ascii="Consolas" w:hAnsi="Consolas" w:cs="Consolas" w:hint="eastAsia"/>
@@ -3833,7 +4808,35 @@
         <w:rPr>
           <w:rFonts w:hint="eastAsia"/>
         </w:rPr>
-        <w:t>读入方式改为read()读入内存，在其中结构化为位置作为键的map，然后再该map中查找位置，而非readline()的方式从硬盘查找位置</w:t>
+        <w:t>读入方式改为read()读入内存，在其中结构化为位置作为键的map，</w:t>
+      </w:r>
+      <w:proofErr w:type="gramStart"/>
+      <w:r>
+        <w:rPr>
+          <w:rFonts w:hint="eastAsia"/>
+        </w:rPr>
+        <w:t>然后再该</w:t>
+      </w:r>
+      <w:proofErr w:type="gramEnd"/>
+      <w:r>
+        <w:rPr>
+          <w:rFonts w:hint="eastAsia"/>
+        </w:rPr>
+        <w:t>map中查找位置，而非</w:t>
+      </w:r>
+      <w:proofErr w:type="spellStart"/>
+      <w:r>
+        <w:rPr>
+          <w:rFonts w:hint="eastAsia"/>
+        </w:rPr>
+        <w:t>readline</w:t>
+      </w:r>
+      <w:proofErr w:type="spellEnd"/>
+      <w:r>
+        <w:rPr>
+          <w:rFonts w:hint="eastAsia"/>
+        </w:rPr>
+        <w:t>()的方式从硬盘查找位置</w:t>
       </w:r>
     </w:p>
     <w:p>
@@ -3849,7 +4852,35 @@
         <w:rPr>
           <w:rFonts w:hint="eastAsia"/>
         </w:rPr>
-        <w:t>多次实例化GATK_depthfile类时，可能都是对一个gatkdepth文件经行实例化，那么用这样的逻辑来避免多次生成map，由于每次查找某个染色体的某个位置都一定要把这个染色体的depth都加载到内存，而单线程程序一般会生成多个实例，而且处理的时候同时处理同一个染色体，所以如果这几个实例都使用一个depth文件，则可以加载一次内存就够了。而多线程程序中不同线程不一定会在同一个时间处理同一个染色体，所以一定要为每个对象加载一次。是否加载通过如下逻辑判断，如果是多线程 或者 还没有加载 或者 将加载不同文件，</w:t>
+        <w:t>多次实例化</w:t>
+      </w:r>
+      <w:proofErr w:type="spellStart"/>
+      <w:r>
+        <w:rPr>
+          <w:rFonts w:hint="eastAsia"/>
+        </w:rPr>
+        <w:t>GATK_depthfile</w:t>
+      </w:r>
+      <w:proofErr w:type="spellEnd"/>
+      <w:r>
+        <w:rPr>
+          <w:rFonts w:hint="eastAsia"/>
+        </w:rPr>
+        <w:t>类时，可能都是对一个</w:t>
+      </w:r>
+      <w:proofErr w:type="spellStart"/>
+      <w:r>
+        <w:rPr>
+          <w:rFonts w:hint="eastAsia"/>
+        </w:rPr>
+        <w:t>gatkdepth</w:t>
+      </w:r>
+      <w:proofErr w:type="spellEnd"/>
+      <w:r>
+        <w:rPr>
+          <w:rFonts w:hint="eastAsia"/>
+        </w:rPr>
+        <w:t>文件经行实例化，那么用这样的逻辑来避免多次生成map，由于每次查找某个染色体的某个位置都一定要把这个染色体的depth都加载到内存，而单线程程序一般会生成多个实例，而且处理的时候同时处理同一个染色体，所以如果这几个实例都使用一个depth文件，则可以加载一次内存就够了。而多线程程序中不同线程不一定会在同一个时间处理同一个染色体，所以一定要为每个对象加载一次。是否加载通过如下逻辑判断，如果是多线程 或者 还没有加载 或者 将加载不同文件，</w:t>
       </w:r>
       <w:r>
         <w:rPr>
@@ -3922,6 +4953,7 @@
           <w:szCs w:val="21"/>
         </w:rPr>
       </w:pPr>
+      <w:proofErr w:type="spellStart"/>
       <w:r>
         <w:rPr>
           <w:rFonts w:ascii="Consolas" w:hAnsi="Consolas" w:cs="Consolas" w:hint="eastAsia"/>
@@ -3942,6 +4974,7 @@
         </w:rPr>
         <w:t>etflankseqs</w:t>
       </w:r>
+      <w:proofErr w:type="spellEnd"/>
       <w:r>
         <w:rPr>
           <w:rFonts w:ascii="Consolas" w:hAnsi="Consolas" w:cs="Consolas" w:hint="eastAsia"/>
@@ -3952,6 +4985,7 @@
         </w:rPr>
         <w:t>函数，对</w:t>
       </w:r>
+      <w:proofErr w:type="spellStart"/>
       <w:r>
         <w:rPr>
           <w:rFonts w:ascii="Consolas" w:hAnsi="Consolas" w:cs="Consolas" w:hint="eastAsia"/>
@@ -3962,6 +4996,7 @@
         </w:rPr>
         <w:t>vcf</w:t>
       </w:r>
+      <w:proofErr w:type="spellEnd"/>
       <w:r>
         <w:rPr>
           <w:rFonts w:ascii="Consolas" w:hAnsi="Consolas" w:cs="Consolas" w:hint="eastAsia"/>
@@ -3972,6 +5007,7 @@
         </w:rPr>
         <w:t>数据表中（一般为</w:t>
       </w:r>
+      <w:proofErr w:type="spellStart"/>
       <w:r>
         <w:rPr>
           <w:rFonts w:ascii="Consolas" w:hAnsi="Consolas" w:cs="Consolas" w:hint="eastAsia"/>
@@ -3980,8 +5016,9 @@
           <w:kern w:val="0"/>
           <w:szCs w:val="21"/>
         </w:rPr>
-        <w:t>toplevel vcf</w:t>
-      </w:r>
+        <w:t>toplevel</w:t>
+      </w:r>
+      <w:proofErr w:type="spellEnd"/>
       <w:r>
         <w:rPr>
           <w:rFonts w:ascii="Consolas" w:hAnsi="Consolas" w:cs="Consolas" w:hint="eastAsia"/>
@@ -3990,8 +5027,31 @@
           <w:kern w:val="0"/>
           <w:szCs w:val="21"/>
         </w:rPr>
+        <w:t xml:space="preserve"> </w:t>
+      </w:r>
+      <w:proofErr w:type="spellStart"/>
+      <w:r>
+        <w:rPr>
+          <w:rFonts w:ascii="Consolas" w:hAnsi="Consolas" w:cs="Consolas" w:hint="eastAsia"/>
+          <w:bCs/>
+          <w:color w:val="000000"/>
+          <w:kern w:val="0"/>
+          <w:szCs w:val="21"/>
+        </w:rPr>
+        <w:t>vcf</w:t>
+      </w:r>
+      <w:proofErr w:type="spellEnd"/>
+      <w:r>
+        <w:rPr>
+          <w:rFonts w:ascii="Consolas" w:hAnsi="Consolas" w:cs="Consolas" w:hint="eastAsia"/>
+          <w:bCs/>
+          <w:color w:val="000000"/>
+          <w:kern w:val="0"/>
+          <w:szCs w:val="21"/>
+        </w:rPr>
         <w:t>表），的某个染色体号的所有</w:t>
       </w:r>
+      <w:proofErr w:type="spellStart"/>
       <w:r>
         <w:rPr>
           <w:rFonts w:ascii="Consolas" w:hAnsi="Consolas" w:cs="Consolas" w:hint="eastAsia"/>
@@ -4002,6 +5062,7 @@
         </w:rPr>
         <w:t>snp</w:t>
       </w:r>
+      <w:proofErr w:type="spellEnd"/>
       <w:r>
         <w:rPr>
           <w:rFonts w:ascii="Consolas" w:hAnsi="Consolas" w:cs="Consolas" w:hint="eastAsia"/>
@@ -4032,6 +5093,7 @@
         </w:rPr>
         <w:t>项为该</w:t>
       </w:r>
+      <w:proofErr w:type="spellStart"/>
       <w:r>
         <w:rPr>
           <w:rFonts w:ascii="Consolas" w:hAnsi="Consolas" w:cs="Consolas" w:hint="eastAsia"/>
@@ -4042,6 +5104,7 @@
         </w:rPr>
         <w:t>snp</w:t>
       </w:r>
+      <w:proofErr w:type="spellEnd"/>
       <w:r>
         <w:rPr>
           <w:rFonts w:ascii="Consolas" w:hAnsi="Consolas" w:cs="Consolas" w:hint="eastAsia"/>
@@ -4075,6 +5138,7 @@
         </w:rPr>
         <w:t>输入参数为：染色体号，染色体长度，</w:t>
       </w:r>
+      <w:proofErr w:type="spellStart"/>
       <w:r>
         <w:rPr>
           <w:rFonts w:ascii="Consolas" w:hAnsi="Consolas" w:cs="Consolas" w:hint="eastAsia"/>
@@ -4085,6 +5149,7 @@
         </w:rPr>
         <w:t>yao</w:t>
       </w:r>
+      <w:proofErr w:type="spellEnd"/>
     </w:p>
     <w:p>
       <w:pPr>
@@ -4117,7 +5182,21 @@
         <w:rPr>
           <w:rFonts w:hint="eastAsia"/>
         </w:rPr>
-        <w:t>控制在计算fst时，是否考虑差异固定；</w:t>
+        <w:t>控制在计算</w:t>
+      </w:r>
+      <w:proofErr w:type="spellStart"/>
+      <w:r>
+        <w:rPr>
+          <w:rFonts w:hint="eastAsia"/>
+        </w:rPr>
+        <w:t>fst</w:t>
+      </w:r>
+      <w:proofErr w:type="spellEnd"/>
+      <w:r>
+        <w:rPr>
+          <w:rFonts w:hint="eastAsia"/>
+        </w:rPr>
+        <w:t>时，是否考虑差异固定；</w:t>
       </w:r>
     </w:p>
     <w:p>
@@ -4133,42 +5212,296 @@
         <w:rPr>
           <w:rFonts w:hint="eastAsia"/>
         </w:rPr>
-        <w:t>总的来讲，当某个种群所有被测个体都是一种等位基因时，则该位点当做在该种群中固定，否则不当做固定位点。</w:t>
-      </w:r>
-    </w:p>
-    <w:p>
-      <w:r>
-        <w:rPr>
-          <w:rFonts w:hint="eastAsia"/>
-        </w:rPr>
-        <w:t>那么，具体来讲，判断根据两个文件（或者仅根据vcf），一个是vcf中的depth，当vcf没有该位点时根据GATK.depth文件判断：</w:t>
-      </w:r>
-    </w:p>
-    <w:p>
-      <w:r>
-        <w:rPr>
-          <w:rFonts w:hint="eastAsia"/>
-        </w:rPr>
-        <w:t>如果是pool的数据，vcf中的depth，与GATK.depth文件中的depth等同，判断是否固定的深度标准是GATK.depth.summary中的</w:t>
-      </w:r>
+        <w:t>总的来讲，当某个种群所有被测个体都是一种等位基因时，则该位点</w:t>
+      </w:r>
+      <w:proofErr w:type="gramStart"/>
+      <w:r>
+        <w:rPr>
+          <w:rFonts w:hint="eastAsia"/>
+        </w:rPr>
+        <w:t>当做</w:t>
+      </w:r>
+      <w:proofErr w:type="gramEnd"/>
+      <w:r>
+        <w:rPr>
+          <w:rFonts w:hint="eastAsia"/>
+        </w:rPr>
+        <w:t>在该种群中固定，否则不</w:t>
+      </w:r>
+      <w:proofErr w:type="gramStart"/>
+      <w:r>
+        <w:rPr>
+          <w:rFonts w:hint="eastAsia"/>
+        </w:rPr>
+        <w:t>当做</w:t>
+      </w:r>
+      <w:proofErr w:type="gramEnd"/>
+      <w:r>
+        <w:rPr>
+          <w:rFonts w:hint="eastAsia"/>
+        </w:rPr>
+        <w:t>固定位点。</w:t>
+      </w:r>
+    </w:p>
+    <w:p>
+      <w:r>
+        <w:rPr>
+          <w:rFonts w:hint="eastAsia"/>
+        </w:rPr>
+        <w:t>那么，具体来讲，判断根据两个文件（或者仅根据</w:t>
+      </w:r>
+      <w:proofErr w:type="spellStart"/>
+      <w:r>
+        <w:rPr>
+          <w:rFonts w:hint="eastAsia"/>
+        </w:rPr>
+        <w:t>vcf</w:t>
+      </w:r>
+      <w:proofErr w:type="spellEnd"/>
+      <w:r>
+        <w:rPr>
+          <w:rFonts w:hint="eastAsia"/>
+        </w:rPr>
+        <w:t>），一个是</w:t>
+      </w:r>
+      <w:proofErr w:type="spellStart"/>
+      <w:r>
+        <w:rPr>
+          <w:rFonts w:hint="eastAsia"/>
+        </w:rPr>
+        <w:t>vcf</w:t>
+      </w:r>
+      <w:proofErr w:type="spellEnd"/>
+      <w:r>
+        <w:rPr>
+          <w:rFonts w:hint="eastAsia"/>
+        </w:rPr>
+        <w:t>中的depth，当</w:t>
+      </w:r>
+      <w:proofErr w:type="spellStart"/>
+      <w:r>
+        <w:rPr>
+          <w:rFonts w:hint="eastAsia"/>
+        </w:rPr>
+        <w:t>vcf</w:t>
+      </w:r>
+      <w:proofErr w:type="spellEnd"/>
+      <w:r>
+        <w:rPr>
+          <w:rFonts w:hint="eastAsia"/>
+        </w:rPr>
+        <w:t>没有该位点时根据</w:t>
+      </w:r>
+      <w:proofErr w:type="spellStart"/>
+      <w:r>
+        <w:rPr>
+          <w:rFonts w:hint="eastAsia"/>
+        </w:rPr>
+        <w:t>GATK.depth</w:t>
+      </w:r>
+      <w:proofErr w:type="spellEnd"/>
+      <w:r>
+        <w:rPr>
+          <w:rFonts w:hint="eastAsia"/>
+        </w:rPr>
+        <w:t>文件判断：</w:t>
+      </w:r>
+    </w:p>
+    <w:p>
+      <w:r>
+        <w:rPr>
+          <w:rFonts w:hint="eastAsia"/>
+        </w:rPr>
+        <w:t>如果是pool的数据，</w:t>
+      </w:r>
+      <w:proofErr w:type="spellStart"/>
+      <w:r>
+        <w:rPr>
+          <w:rFonts w:hint="eastAsia"/>
+        </w:rPr>
+        <w:t>vcf</w:t>
+      </w:r>
+      <w:proofErr w:type="spellEnd"/>
+      <w:r>
+        <w:rPr>
+          <w:rFonts w:hint="eastAsia"/>
+        </w:rPr>
+        <w:t>中的depth，与</w:t>
+      </w:r>
+      <w:proofErr w:type="spellStart"/>
+      <w:r>
+        <w:rPr>
+          <w:rFonts w:hint="eastAsia"/>
+        </w:rPr>
+        <w:t>GATK.depth</w:t>
+      </w:r>
+      <w:proofErr w:type="spellEnd"/>
+      <w:r>
+        <w:rPr>
+          <w:rFonts w:hint="eastAsia"/>
+        </w:rPr>
+        <w:t>文件中的depth等同，判断是否固定的深度标准是</w:t>
+      </w:r>
+      <w:proofErr w:type="spellStart"/>
+      <w:r>
+        <w:rPr>
+          <w:rFonts w:hint="eastAsia"/>
+        </w:rPr>
+        <w:t>GATK.depth.summary</w:t>
+      </w:r>
+      <w:proofErr w:type="spellEnd"/>
+      <w:r>
+        <w:rPr>
+          <w:rFonts w:hint="eastAsia"/>
+        </w:rPr>
+        <w:t>中的</w:t>
+      </w:r>
+      <w:proofErr w:type="spellStart"/>
       <w:r>
         <w:t>granular_median</w:t>
       </w:r>
-    </w:p>
-    <w:p>
-      <w:r>
-        <w:rPr>
-          <w:rFonts w:hint="eastAsia"/>
-        </w:rPr>
-        <w:t>如果是indvd的数据，则总共多少个个体的信息从vcf的title中得知，在vcf中，测到的AC等于个体数的话则判断固定为alt，如果vcf中没有该位点，GATK.depth文件中每个个体的深度如果超过4，则判定为固定位该位点。</w:t>
-      </w:r>
-    </w:p>
-    <w:p>
-      <w:r>
-        <w:rPr>
-          <w:rFonts w:hint="eastAsia"/>
-        </w:rPr>
-        <w:t>如果没有depth文件，则仅从vcf中是否判定为固定（pool的话就是ref为0，indvd的话就是ac=个体数），或有无该位点判断固定。</w:t>
+      <w:proofErr w:type="spellEnd"/>
+    </w:p>
+    <w:p>
+      <w:r>
+        <w:rPr>
+          <w:rFonts w:hint="eastAsia"/>
+        </w:rPr>
+        <w:t>如果是</w:t>
+      </w:r>
+      <w:proofErr w:type="spellStart"/>
+      <w:r>
+        <w:rPr>
+          <w:rFonts w:hint="eastAsia"/>
+        </w:rPr>
+        <w:t>indvd</w:t>
+      </w:r>
+      <w:proofErr w:type="spellEnd"/>
+      <w:r>
+        <w:rPr>
+          <w:rFonts w:hint="eastAsia"/>
+        </w:rPr>
+        <w:t>的数据，则总共多少个个体的信息从</w:t>
+      </w:r>
+      <w:proofErr w:type="spellStart"/>
+      <w:r>
+        <w:rPr>
+          <w:rFonts w:hint="eastAsia"/>
+        </w:rPr>
+        <w:t>vcf</w:t>
+      </w:r>
+      <w:proofErr w:type="spellEnd"/>
+      <w:r>
+        <w:rPr>
+          <w:rFonts w:hint="eastAsia"/>
+        </w:rPr>
+        <w:t>的title中得知，在</w:t>
+      </w:r>
+      <w:proofErr w:type="spellStart"/>
+      <w:r>
+        <w:rPr>
+          <w:rFonts w:hint="eastAsia"/>
+        </w:rPr>
+        <w:t>vcf</w:t>
+      </w:r>
+      <w:proofErr w:type="spellEnd"/>
+      <w:r>
+        <w:rPr>
+          <w:rFonts w:hint="eastAsia"/>
+        </w:rPr>
+        <w:t>中，测到的AC等于个体数的话</w:t>
+      </w:r>
+      <w:proofErr w:type="gramStart"/>
+      <w:r>
+        <w:rPr>
+          <w:rFonts w:hint="eastAsia"/>
+        </w:rPr>
+        <w:t>则判断</w:t>
+      </w:r>
+      <w:proofErr w:type="gramEnd"/>
+      <w:r>
+        <w:rPr>
+          <w:rFonts w:hint="eastAsia"/>
+        </w:rPr>
+        <w:t>固定为alt，如果</w:t>
+      </w:r>
+      <w:proofErr w:type="spellStart"/>
+      <w:r>
+        <w:rPr>
+          <w:rFonts w:hint="eastAsia"/>
+        </w:rPr>
+        <w:t>vcf</w:t>
+      </w:r>
+      <w:proofErr w:type="spellEnd"/>
+      <w:r>
+        <w:rPr>
+          <w:rFonts w:hint="eastAsia"/>
+        </w:rPr>
+        <w:t>中没有该位点，</w:t>
+      </w:r>
+      <w:proofErr w:type="spellStart"/>
+      <w:r>
+        <w:rPr>
+          <w:rFonts w:hint="eastAsia"/>
+        </w:rPr>
+        <w:t>GATK.depth</w:t>
+      </w:r>
+      <w:proofErr w:type="spellEnd"/>
+      <w:r>
+        <w:rPr>
+          <w:rFonts w:hint="eastAsia"/>
+        </w:rPr>
+        <w:t>文件中每个个体的深度如果超过4，则判定为</w:t>
+      </w:r>
+      <w:proofErr w:type="gramStart"/>
+      <w:r>
+        <w:rPr>
+          <w:rFonts w:hint="eastAsia"/>
+        </w:rPr>
+        <w:t>固定位该</w:t>
+      </w:r>
+      <w:proofErr w:type="gramEnd"/>
+      <w:r>
+        <w:rPr>
+          <w:rFonts w:hint="eastAsia"/>
+        </w:rPr>
+        <w:t>位点。</w:t>
+      </w:r>
+    </w:p>
+    <w:p>
+      <w:r>
+        <w:rPr>
+          <w:rFonts w:hint="eastAsia"/>
+        </w:rPr>
+        <w:t>如果没有depth文件，则仅从</w:t>
+      </w:r>
+      <w:proofErr w:type="spellStart"/>
+      <w:r>
+        <w:rPr>
+          <w:rFonts w:hint="eastAsia"/>
+        </w:rPr>
+        <w:t>vcf</w:t>
+      </w:r>
+      <w:proofErr w:type="spellEnd"/>
+      <w:r>
+        <w:rPr>
+          <w:rFonts w:hint="eastAsia"/>
+        </w:rPr>
+        <w:t>中是否判定为固定（pool的话就是ref为0，</w:t>
+      </w:r>
+      <w:proofErr w:type="spellStart"/>
+      <w:r>
+        <w:rPr>
+          <w:rFonts w:hint="eastAsia"/>
+        </w:rPr>
+        <w:t>indvd</w:t>
+      </w:r>
+      <w:proofErr w:type="spellEnd"/>
+      <w:r>
+        <w:rPr>
+          <w:rFonts w:hint="eastAsia"/>
+        </w:rPr>
+        <w:t>的话就是ac=个体数），或有无该位点判断固定。</w:t>
       </w:r>
     </w:p>
     <w:p>
@@ -4196,53 +5529,131 @@
           <w:rFonts w:hint="eastAsia"/>
           <w:b/>
         </w:rPr>
-        <w:t>临时性添加了Caculate_df的功能，此种情况下只提供一个vcf文件，但要提供两个群体名列表文件，对应vcf文件的title。当不指定-f 参数时则不影响原来计算hp的功能。</w:t>
-      </w:r>
-    </w:p>
-    <w:p>
-      <w:pPr>
-        <w:rPr>
+        <w:t>临时性添加了</w:t>
+      </w:r>
+      <w:proofErr w:type="spellStart"/>
+      <w:r>
+        <w:rPr>
+          <w:rFonts w:hint="eastAsia"/>
           <w:b/>
         </w:rPr>
-      </w:pPr>
-    </w:p>
-    <w:p>
-      <w:pPr>
-        <w:rPr>
+        <w:t>Caculate_df</w:t>
+      </w:r>
+      <w:proofErr w:type="spellEnd"/>
+      <w:r>
+        <w:rPr>
+          <w:rFonts w:hint="eastAsia"/>
           <w:b/>
         </w:rPr>
-      </w:pPr>
+        <w:t>的功能，此种情况下只提供一个</w:t>
+      </w:r>
+      <w:proofErr w:type="spellStart"/>
       <w:r>
         <w:rPr>
           <w:rFonts w:hint="eastAsia"/>
           <w:b/>
         </w:rPr>
-        <w:t>使用多sql的示例</w:t>
-      </w:r>
-    </w:p>
-    <w:p>
-      <w:pPr>
-        <w:rPr>
+        <w:t>vcf</w:t>
+      </w:r>
+      <w:proofErr w:type="spellEnd"/>
+      <w:r>
+        <w:rPr>
+          <w:rFonts w:hint="eastAsia"/>
           <w:b/>
         </w:rPr>
-      </w:pPr>
-      <w:r>
-        <w:rPr>
+        <w:t>文件，但要提供两个群体名列表文件，对应</w:t>
+      </w:r>
+      <w:proofErr w:type="spellStart"/>
+      <w:r>
+        <w:rPr>
+          <w:rFonts w:hint="eastAsia"/>
           <w:b/>
         </w:rPr>
-        <w:t>&gt;&gt;&gt; dbvariantstools.operateDB("insert",*l,data=[('KB742382.1',26,".","AAA","bbb","p"),('KB742382.1',27,".","f","l","123,0")])</w:t>
-      </w:r>
-    </w:p>
-    <w:p>
-      <w:pPr>
-        <w:rPr>
+        <w:t>vcf</w:t>
+      </w:r>
+      <w:proofErr w:type="spellEnd"/>
+      <w:r>
+        <w:rPr>
+          <w:rFonts w:hint="eastAsia"/>
           <w:b/>
         </w:rPr>
-      </w:pPr>
-      <w:r>
+        <w:t>文件的title。当不指定-f 参数时则不影响原来计算hp的功能。</w:t>
+      </w:r>
+    </w:p>
+    <w:p>
+      <w:pPr>
         <w:rPr>
           <w:b/>
         </w:rPr>
+      </w:pPr>
+    </w:p>
+    <w:p>
+      <w:pPr>
+        <w:rPr>
+          <w:b/>
+        </w:rPr>
+      </w:pPr>
+      <w:r>
+        <w:rPr>
+          <w:rFonts w:hint="eastAsia"/>
+          <w:b/>
+        </w:rPr>
+        <w:t>使用多</w:t>
+      </w:r>
+      <w:proofErr w:type="spellStart"/>
+      <w:r>
+        <w:rPr>
+          <w:rFonts w:hint="eastAsia"/>
+          <w:b/>
+        </w:rPr>
+        <w:t>sql</w:t>
+      </w:r>
+      <w:proofErr w:type="spellEnd"/>
+      <w:r>
+        <w:rPr>
+          <w:rFonts w:hint="eastAsia"/>
+          <w:b/>
+        </w:rPr>
+        <w:t>的示例</w:t>
+      </w:r>
+    </w:p>
+    <w:p>
+      <w:pPr>
+        <w:rPr>
+          <w:b/>
+        </w:rPr>
+      </w:pPr>
+      <w:r>
+        <w:rPr>
+          <w:b/>
+        </w:rPr>
+        <w:t xml:space="preserve">&gt;&gt;&gt; </w:t>
+      </w:r>
+      <w:proofErr w:type="gramStart"/>
+      <w:r>
+        <w:rPr>
+          <w:b/>
+        </w:rPr>
+        <w:t>dbvariantstools.operateDB</w:t>
+      </w:r>
+      <w:proofErr w:type="gramEnd"/>
+      <w:r>
+        <w:rPr>
+          <w:b/>
+        </w:rPr>
+        <w:t>("insert",*l,data=[('KB742382.1',26,".","AAA","bbb","p"),('KB742382.1',27,".","f","l","123,0")])</w:t>
+      </w:r>
+    </w:p>
+    <w:p>
+      <w:pPr>
+        <w:rPr>
+          <w:b/>
+        </w:rPr>
+      </w:pPr>
+      <w:r>
+        <w:rPr>
+          <w:b/>
+        </w:rPr>
         <w:t>0</w:t>
       </w:r>
     </w:p>
@@ -4256,7 +5667,49 @@
         <w:rPr>
           <w:b/>
         </w:rPr>
-        <w:t>&gt;&gt;&gt; l=["insert into mspsgjlksy10pop_toplevel_pekingduckref_new(chrID,snp_pos,snpID,ref_base,alt_base,wegeon__pool_withindel_vcf_alt) VALUES(%s,%s,%s,%s,%s,%s)","insert into mspsgjlksy10pop_toplevel_pekingduckref_new(chrID,snp_pos,snpID,ref_base,alt_base,wegeon__pool_withindel_vcf_dep) VALUES(%s,%s,%s,%s,%s,%s)"]</w:t>
+        <w:t>&gt;&gt;&gt; l</w:t>
+      </w:r>
+      <w:proofErr w:type="gramStart"/>
+      <w:r>
+        <w:rPr>
+          <w:b/>
+        </w:rPr>
+        <w:t>=[</w:t>
+      </w:r>
+      <w:proofErr w:type="gramEnd"/>
+      <w:r>
+        <w:rPr>
+          <w:b/>
+        </w:rPr>
+        <w:t>"insert into mspsgjlksy10pop_toplevel_pekingduckref_new(chrID,snp_pos,snpID,ref_base,alt_base,wegeon__pool_withindel_vcf_alt) VALUES(%</w:t>
+      </w:r>
+      <w:proofErr w:type="spellStart"/>
+      <w:r>
+        <w:rPr>
+          <w:b/>
+        </w:rPr>
+        <w:t>s,%s,%s,%s,%s,%s</w:t>
+      </w:r>
+      <w:proofErr w:type="spellEnd"/>
+      <w:r>
+        <w:rPr>
+          <w:b/>
+        </w:rPr>
+        <w:t>)","insert into mspsgjlksy10pop_toplevel_pekingduckref_new(chrID,snp_pos,snpID,ref_base,alt_base,wegeon__pool_withindel_vcf_dep) VALUES(%</w:t>
+      </w:r>
+      <w:proofErr w:type="spellStart"/>
+      <w:r>
+        <w:rPr>
+          <w:b/>
+        </w:rPr>
+        <w:t>s,%s,%s,%s,%s,%s</w:t>
+      </w:r>
+      <w:proofErr w:type="spellEnd"/>
+      <w:r>
+        <w:rPr>
+          <w:b/>
+        </w:rPr>
+        <w:t>)"]</w:t>
       </w:r>
     </w:p>
     <w:p>
@@ -4265,6 +5718,7 @@
           <w:color w:val="000000" w:themeColor="text1"/>
         </w:rPr>
       </w:pPr>
+      <w:proofErr w:type="spellStart"/>
       <w:r>
         <w:rPr>
           <w:rFonts w:ascii="Consolas" w:hAnsi="Consolas" w:cs="Consolas"/>
@@ -4277,6 +5731,7 @@
         <w:lastRenderedPageBreak/>
         <w:t>generateIndexByChrom</w:t>
       </w:r>
+      <w:proofErr w:type="spellEnd"/>
       <w:r>
         <w:rPr>
           <w:rFonts w:ascii="Consolas" w:hAnsi="Consolas" w:cs="Consolas" w:hint="eastAsia"/>
@@ -4310,6 +5765,7 @@
         </w:rPr>
         <w:t xml:space="preserve"> </w:t>
       </w:r>
+      <w:proofErr w:type="spellStart"/>
       <w:r>
         <w:rPr>
           <w:rFonts w:ascii="Consolas" w:hAnsi="Consolas" w:cs="Consolas"/>
@@ -4321,6 +5777,7 @@
         </w:rPr>
         <w:t>generateFasterRefIndex</w:t>
       </w:r>
+      <w:proofErr w:type="spellEnd"/>
       <w:r>
         <w:rPr>
           <w:rFonts w:ascii="Consolas" w:hAnsi="Consolas" w:cs="Consolas" w:hint="eastAsia"/>

</xml_diff>

<commit_message>
add src/bioinfodevlop building in setup.py coping import issues and env , but not solved properly
</commit_message>
<xml_diff>
--- a/life文档.docx
+++ b/life文档.docx
@@ -53,105 +53,31 @@
           <w:szCs w:val="24"/>
         </w:rPr>
       </w:pPr>
-      <w:proofErr w:type="spellStart"/>
       <w:r>
         <w:rPr>
           <w:rFonts w:ascii="Times New Roman" w:hAnsi="Times New Roman" w:cs="Times New Roman"/>
           <w:sz w:val="24"/>
           <w:szCs w:val="24"/>
         </w:rPr>
-        <w:t>seq_rec</w:t>
-      </w:r>
-      <w:proofErr w:type="spellEnd"/>
+        <w:t>seq_rec=AlignIO.parse(sf,'phylip').__next__()</w:t>
+      </w:r>
+    </w:p>
+    <w:p>
+      <w:pPr>
+        <w:rPr>
+          <w:rFonts w:ascii="宋体" w:eastAsia="宋体" w:hAnsi="宋体" w:cs="Times New Roman"/>
+          <w:sz w:val="24"/>
+          <w:szCs w:val="24"/>
+        </w:rPr>
+      </w:pPr>
       <w:r>
         <w:rPr>
           <w:rFonts w:ascii="Times New Roman" w:hAnsi="Times New Roman" w:cs="Times New Roman"/>
           <w:sz w:val="24"/>
           <w:szCs w:val="24"/>
         </w:rPr>
-        <w:t>=</w:t>
-      </w:r>
-      <w:proofErr w:type="spellStart"/>
-      <w:r>
-        <w:rPr>
-          <w:rFonts w:ascii="Times New Roman" w:hAnsi="Times New Roman" w:cs="Times New Roman"/>
-          <w:sz w:val="24"/>
-          <w:szCs w:val="24"/>
-        </w:rPr>
-        <w:t>AlignIO.parse</w:t>
-      </w:r>
-      <w:proofErr w:type="spellEnd"/>
-      <w:r>
-        <w:rPr>
-          <w:rFonts w:ascii="Times New Roman" w:hAnsi="Times New Roman" w:cs="Times New Roman"/>
-          <w:sz w:val="24"/>
-          <w:szCs w:val="24"/>
-        </w:rPr>
-        <w:t>(sf,'</w:t>
-      </w:r>
-      <w:proofErr w:type="spellStart"/>
-      <w:r>
-        <w:rPr>
-          <w:rFonts w:ascii="Times New Roman" w:hAnsi="Times New Roman" w:cs="Times New Roman"/>
-          <w:sz w:val="24"/>
-          <w:szCs w:val="24"/>
-        </w:rPr>
-        <w:t>phylip</w:t>
-      </w:r>
-      <w:proofErr w:type="spellEnd"/>
-      <w:r>
-        <w:rPr>
-          <w:rFonts w:ascii="Times New Roman" w:hAnsi="Times New Roman" w:cs="Times New Roman"/>
-          <w:sz w:val="24"/>
-          <w:szCs w:val="24"/>
-        </w:rPr>
-        <w:t>'</w:t>
-      </w:r>
-      <w:proofErr w:type="gramStart"/>
-      <w:r>
-        <w:rPr>
-          <w:rFonts w:ascii="Times New Roman" w:hAnsi="Times New Roman" w:cs="Times New Roman"/>
-          <w:sz w:val="24"/>
-          <w:szCs w:val="24"/>
-        </w:rPr>
-        <w:t>)._</w:t>
-      </w:r>
-      <w:proofErr w:type="gramEnd"/>
-      <w:r>
-        <w:rPr>
-          <w:rFonts w:ascii="Times New Roman" w:hAnsi="Times New Roman" w:cs="Times New Roman"/>
-          <w:sz w:val="24"/>
-          <w:szCs w:val="24"/>
-        </w:rPr>
-        <w:t>_next__()</w:t>
-      </w:r>
-    </w:p>
-    <w:p>
-      <w:pPr>
-        <w:rPr>
-          <w:rFonts w:ascii="宋体" w:eastAsia="宋体" w:hAnsi="宋体" w:cs="Times New Roman"/>
-          <w:sz w:val="24"/>
-          <w:szCs w:val="24"/>
-        </w:rPr>
-      </w:pPr>
-      <w:r>
-        <w:rPr>
-          <w:rFonts w:ascii="Times New Roman" w:hAnsi="Times New Roman" w:cs="Times New Roman"/>
-          <w:sz w:val="24"/>
-          <w:szCs w:val="24"/>
-        </w:rPr>
-        <w:t>print(</w:t>
-      </w:r>
-      <w:proofErr w:type="spellStart"/>
-      <w:r>
-        <w:rPr>
-          <w:rFonts w:ascii="Times New Roman" w:hAnsi="Times New Roman" w:cs="Times New Roman"/>
-          <w:sz w:val="24"/>
-          <w:szCs w:val="24"/>
-        </w:rPr>
-        <w:t>seq_rec,CD_sites_idx</w:t>
-      </w:r>
-      <w:proofErr w:type="spellEnd"/>
+        <w:t>print(seq_rec,CD_sites_idx</w:t>
+      </w:r>
       <w:r>
         <w:rPr>
           <w:rFonts w:ascii="宋体" w:eastAsia="宋体" w:hAnsi="宋体" w:cs="Times New Roman"/>
@@ -325,23 +251,13 @@
           <w:szCs w:val="24"/>
         </w:rPr>
       </w:pPr>
-      <w:proofErr w:type="gramStart"/>
       <w:r>
         <w:rPr>
           <w:rFonts w:ascii="Times New Roman" w:hAnsi="Times New Roman" w:cs="Times New Roman"/>
           <w:sz w:val="24"/>
           <w:szCs w:val="24"/>
         </w:rPr>
-        <w:t>tlist.append</w:t>
-      </w:r>
-      <w:proofErr w:type="gramEnd"/>
-      <w:r>
-        <w:rPr>
-          <w:rFonts w:ascii="Times New Roman" w:hAnsi="Times New Roman" w:cs="Times New Roman"/>
-          <w:sz w:val="24"/>
-          <w:szCs w:val="24"/>
-        </w:rPr>
-        <w:t>(list(treeWithNodeLables.find_clades(name=r"\d*_"+targetSpeciesName))[0])</w:t>
+        <w:t>tlist.append(list(treeWithNodeLables.find_clades(name=r"\d*_"+targetSpeciesName))[0])</w:t>
       </w:r>
     </w:p>
     <w:p>
@@ -476,7 +392,6 @@
           <w:szCs w:val="24"/>
         </w:rPr>
       </w:pPr>
-      <w:proofErr w:type="spellStart"/>
       <w:r>
         <w:rPr>
           <w:rFonts w:ascii="Times New Roman" w:hAnsi="Times New Roman" w:cs="Times New Roman"/>
@@ -485,7 +400,6 @@
         </w:rPr>
         <w:t>VCFutil.VCF_Data</w:t>
       </w:r>
-      <w:proofErr w:type="spellEnd"/>
     </w:p>
     <w:p>
       <w:pPr>
@@ -700,7 +614,6 @@
             </w:pPr>
             <w:bookmarkStart w:id="0" w:name="OLE_LINK1"/>
             <w:bookmarkStart w:id="1" w:name="OLE_LINK2"/>
-            <w:proofErr w:type="spellStart"/>
             <w:r>
               <w:rPr>
                 <w:rFonts w:ascii="Times New Roman" w:hAnsi="Times New Roman" w:cs="Times New Roman"/>
@@ -715,16 +628,7 @@
                 <w:sz w:val="24"/>
                 <w:szCs w:val="24"/>
               </w:rPr>
-              <w:t>a</w:t>
-            </w:r>
-            <w:proofErr w:type="spellEnd"/>
-            <w:r>
-              <w:rPr>
-                <w:rFonts w:ascii="Times New Roman" w:hAnsi="Times New Roman" w:cs="Times New Roman"/>
-                <w:sz w:val="24"/>
-                <w:szCs w:val="24"/>
-              </w:rPr>
-              <w:t>()</w:t>
+              <w:t>a()</w:t>
             </w:r>
             <w:bookmarkEnd w:id="0"/>
             <w:bookmarkEnd w:id="1"/>
@@ -764,18 +668,8 @@
                 <w:sz w:val="24"/>
                 <w:szCs w:val="24"/>
               </w:rPr>
-              <w:t xml:space="preserve">from </w:t>
-            </w:r>
-            <w:proofErr w:type="spellStart"/>
-            <w:r>
-              <w:rPr>
-                <w:rFonts w:ascii="Times New Roman" w:hAnsi="Times New Roman" w:cs="Times New Roman"/>
-                <w:sz w:val="24"/>
-                <w:szCs w:val="24"/>
-              </w:rPr>
-              <w:t>NGS.BasicUtil</w:t>
-            </w:r>
-            <w:proofErr w:type="spellEnd"/>
+              <w:t xml:space="preserve">from NGS.BasicUtil import </w:t>
+            </w:r>
             <w:r>
               <w:rPr>
                 <w:rFonts w:ascii="Times New Roman" w:hAnsi="Times New Roman" w:cs="Times New Roman"/>
@@ -784,24 +678,6 @@
               </w:rPr>
               <w:t xml:space="preserve"> </w:t>
             </w:r>
-            <w:proofErr w:type="gramStart"/>
-            <w:r>
-              <w:rPr>
-                <w:rFonts w:ascii="Times New Roman" w:hAnsi="Times New Roman" w:cs="Times New Roman"/>
-                <w:sz w:val="24"/>
-                <w:szCs w:val="24"/>
-              </w:rPr>
-              <w:t xml:space="preserve">import </w:t>
-            </w:r>
-            <w:r>
-              <w:rPr>
-                <w:rFonts w:ascii="Times New Roman" w:hAnsi="Times New Roman" w:cs="Times New Roman"/>
-                <w:sz w:val="24"/>
-                <w:szCs w:val="24"/>
-              </w:rPr>
-              <w:t xml:space="preserve"> </w:t>
-            </w:r>
-            <w:proofErr w:type="spellStart"/>
             <w:r>
               <w:rPr>
                 <w:rFonts w:ascii="Times New Roman" w:hAnsi="Times New Roman" w:cs="Times New Roman"/>
@@ -810,8 +686,6 @@
               </w:rPr>
               <w:t>VCFutil</w:t>
             </w:r>
-            <w:proofErr w:type="spellEnd"/>
-            <w:proofErr w:type="gramEnd"/>
           </w:p>
         </w:tc>
         <w:tc>
@@ -834,7 +708,6 @@
               </w:rPr>
               <w:t>初始化参数为</w:t>
             </w:r>
-            <w:proofErr w:type="spellStart"/>
             <w:r>
               <w:rPr>
                 <w:rFonts w:ascii="Times New Roman" w:hAnsi="Times New Roman" w:cs="Times New Roman" w:hint="eastAsia"/>
@@ -851,7 +724,6 @@
               </w:rPr>
               <w:t>cf</w:t>
             </w:r>
-            <w:proofErr w:type="spellEnd"/>
             <w:r>
               <w:rPr>
                 <w:rFonts w:ascii="Times New Roman" w:hAnsi="Times New Roman" w:cs="Times New Roman" w:hint="eastAsia"/>
@@ -882,7 +754,6 @@
               </w:rPr>
               <w:t>将</w:t>
             </w:r>
-            <w:proofErr w:type="spellStart"/>
             <w:r>
               <w:rPr>
                 <w:rFonts w:ascii="Times New Roman" w:hAnsi="Times New Roman" w:cs="Times New Roman" w:hint="eastAsia"/>
@@ -899,7 +770,6 @@
               </w:rPr>
               <w:t>cf</w:t>
             </w:r>
-            <w:proofErr w:type="spellEnd"/>
             <w:r>
               <w:rPr>
                 <w:rFonts w:ascii="Times New Roman" w:hAnsi="Times New Roman" w:cs="Times New Roman" w:hint="eastAsia"/>
@@ -908,7 +778,6 @@
               </w:rPr>
               <w:t>文件加载到内存，如果第一次加载某个</w:t>
             </w:r>
-            <w:proofErr w:type="spellStart"/>
             <w:r>
               <w:rPr>
                 <w:rFonts w:ascii="Times New Roman" w:hAnsi="Times New Roman" w:cs="Times New Roman" w:hint="eastAsia"/>
@@ -925,7 +794,6 @@
               </w:rPr>
               <w:t>cf</w:t>
             </w:r>
-            <w:proofErr w:type="spellEnd"/>
             <w:r>
               <w:rPr>
                 <w:rFonts w:ascii="Times New Roman" w:hAnsi="Times New Roman" w:cs="Times New Roman" w:hint="eastAsia"/>
@@ -934,7 +802,6 @@
               </w:rPr>
               <w:t>文件会自动简历索引文件，要求</w:t>
             </w:r>
-            <w:proofErr w:type="spellStart"/>
             <w:r>
               <w:rPr>
                 <w:rFonts w:ascii="Times New Roman" w:hAnsi="Times New Roman" w:cs="Times New Roman" w:hint="eastAsia"/>
@@ -951,7 +818,6 @@
               </w:rPr>
               <w:t>cf</w:t>
             </w:r>
-            <w:proofErr w:type="spellEnd"/>
             <w:r>
               <w:rPr>
                 <w:rFonts w:ascii="Times New Roman" w:hAnsi="Times New Roman" w:cs="Times New Roman" w:hint="eastAsia"/>
@@ -995,7 +861,6 @@
                 <w:szCs w:val="24"/>
               </w:rPr>
             </w:pPr>
-            <w:proofErr w:type="spellStart"/>
             <w:r>
               <w:rPr>
                 <w:rFonts w:ascii="Times New Roman" w:hAnsi="Times New Roman" w:cs="Times New Roman"/>
@@ -1004,7 +869,6 @@
               </w:rPr>
               <w:t>getVcfListByChrom</w:t>
             </w:r>
-            <w:proofErr w:type="spellEnd"/>
           </w:p>
         </w:tc>
         <w:tc>
@@ -1027,7 +891,6 @@
               </w:rPr>
               <w:t>通过</w:t>
             </w:r>
-            <w:proofErr w:type="spellStart"/>
             <w:r>
               <w:rPr>
                 <w:rFonts w:ascii="Times New Roman" w:hAnsi="Times New Roman" w:cs="Times New Roman"/>
@@ -1036,7 +899,6 @@
               </w:rPr>
               <w:t>VCF_Data</w:t>
             </w:r>
-            <w:proofErr w:type="spellEnd"/>
             <w:r>
               <w:rPr>
                 <w:rFonts w:ascii="Times New Roman" w:hAnsi="Times New Roman" w:cs="Times New Roman" w:hint="eastAsia"/>
@@ -1068,7 +930,6 @@
                 <w:szCs w:val="24"/>
               </w:rPr>
             </w:pPr>
-            <w:proofErr w:type="spellStart"/>
             <w:r>
               <w:rPr>
                 <w:rFonts w:ascii="Times New Roman" w:hAnsi="Times New Roman" w:cs="Times New Roman" w:hint="eastAsia"/>
@@ -1086,7 +947,6 @@
               </w:rPr>
               <w:t>hrom</w:t>
             </w:r>
-            <w:proofErr w:type="spellEnd"/>
             <w:r>
               <w:rPr>
                 <w:rFonts w:ascii="Times New Roman" w:hAnsi="Times New Roman" w:cs="Times New Roman" w:hint="eastAsia"/>
@@ -1109,25 +969,7 @@
                 <w:sz w:val="24"/>
                 <w:szCs w:val="24"/>
               </w:rPr>
-              <w:t>,</w:t>
-            </w:r>
-            <w:proofErr w:type="spellStart"/>
-            <w:r>
-              <w:rPr>
-                <w:rFonts w:ascii="Times New Roman" w:hAnsi="Times New Roman" w:cs="Times New Roman"/>
-                <w:sz w:val="24"/>
-                <w:szCs w:val="24"/>
-              </w:rPr>
-              <w:t>startpos</w:t>
-            </w:r>
-            <w:proofErr w:type="spellEnd"/>
-            <w:r>
-              <w:rPr>
-                <w:rFonts w:ascii="Times New Roman" w:hAnsi="Times New Roman" w:cs="Times New Roman"/>
-                <w:sz w:val="24"/>
-                <w:szCs w:val="24"/>
-              </w:rPr>
-              <w:t>=</w:t>
+              <w:t>,startpos=</w:t>
             </w:r>
             <w:r>
               <w:rPr>
@@ -1159,25 +1001,7 @@
                 <w:sz w:val="24"/>
                 <w:szCs w:val="24"/>
               </w:rPr>
-              <w:t>,</w:t>
-            </w:r>
-            <w:proofErr w:type="spellStart"/>
-            <w:r>
-              <w:rPr>
-                <w:rFonts w:ascii="Times New Roman" w:hAnsi="Times New Roman" w:cs="Times New Roman"/>
-                <w:sz w:val="24"/>
-                <w:szCs w:val="24"/>
-              </w:rPr>
-              <w:t>endpos</w:t>
-            </w:r>
-            <w:proofErr w:type="spellEnd"/>
-            <w:r>
-              <w:rPr>
-                <w:rFonts w:ascii="Times New Roman" w:hAnsi="Times New Roman" w:cs="Times New Roman"/>
-                <w:sz w:val="24"/>
-                <w:szCs w:val="24"/>
-              </w:rPr>
-              <w:t>=</w:t>
+              <w:t>,endpos=</w:t>
             </w:r>
             <w:r>
               <w:rPr>
@@ -1234,25 +1058,7 @@
                 <w:sz w:val="24"/>
                 <w:szCs w:val="24"/>
               </w:rPr>
-              <w:t xml:space="preserve">, </w:t>
-            </w:r>
-            <w:proofErr w:type="spellStart"/>
-            <w:r>
-              <w:rPr>
-                <w:rFonts w:ascii="Times New Roman" w:hAnsi="Times New Roman" w:cs="Times New Roman"/>
-                <w:sz w:val="24"/>
-                <w:szCs w:val="24"/>
-              </w:rPr>
-              <w:t>dilutetodensity</w:t>
-            </w:r>
-            <w:proofErr w:type="spellEnd"/>
-            <w:r>
-              <w:rPr>
-                <w:rFonts w:ascii="Times New Roman" w:hAnsi="Times New Roman" w:cs="Times New Roman"/>
-                <w:sz w:val="24"/>
-                <w:szCs w:val="24"/>
-              </w:rPr>
-              <w:t>=</w:t>
+              <w:t>, dilutetodensity=</w:t>
             </w:r>
             <w:r>
               <w:rPr>
@@ -1332,43 +1138,7 @@
                 <w:sz w:val="24"/>
                 <w:szCs w:val="24"/>
               </w:rPr>
-              <w:t xml:space="preserve">, </w:t>
-            </w:r>
-            <w:proofErr w:type="spellStart"/>
-            <w:r>
-              <w:rPr>
-                <w:rFonts w:ascii="Times New Roman" w:hAnsi="Times New Roman" w:cs="Times New Roman"/>
-                <w:sz w:val="24"/>
-                <w:szCs w:val="24"/>
-              </w:rPr>
-              <w:t>posUniq</w:t>
-            </w:r>
-            <w:proofErr w:type="spellEnd"/>
-            <w:r>
-              <w:rPr>
-                <w:rFonts w:ascii="Times New Roman" w:hAnsi="Times New Roman" w:cs="Times New Roman"/>
-                <w:sz w:val="24"/>
-                <w:szCs w:val="24"/>
-              </w:rPr>
-              <w:t xml:space="preserve">=True, </w:t>
-            </w:r>
-            <w:proofErr w:type="spellStart"/>
-            <w:r>
-              <w:rPr>
-                <w:rFonts w:ascii="Times New Roman" w:hAnsi="Times New Roman" w:cs="Times New Roman"/>
-                <w:sz w:val="24"/>
-                <w:szCs w:val="24"/>
-              </w:rPr>
-              <w:t>considerINDELandmultpleallele</w:t>
-            </w:r>
-            <w:proofErr w:type="spellEnd"/>
-            <w:r>
-              <w:rPr>
-                <w:rFonts w:ascii="Times New Roman" w:hAnsi="Times New Roman" w:cs="Times New Roman"/>
-                <w:sz w:val="24"/>
-                <w:szCs w:val="24"/>
-              </w:rPr>
-              <w:t>=</w:t>
+              <w:t>, posUniq=True, considerINDELandmultpleallele=</w:t>
             </w:r>
             <w:r>
               <w:rPr>
@@ -1408,25 +1178,7 @@
                 <w:sz w:val="24"/>
                 <w:szCs w:val="24"/>
               </w:rPr>
-              <w:t>,</w:t>
-            </w:r>
-            <w:proofErr w:type="spellStart"/>
-            <w:r>
-              <w:rPr>
-                <w:rFonts w:ascii="Times New Roman" w:hAnsi="Times New Roman" w:cs="Times New Roman"/>
-                <w:sz w:val="24"/>
-                <w:szCs w:val="24"/>
-              </w:rPr>
-              <w:t>MQfilter</w:t>
-            </w:r>
-            <w:proofErr w:type="spellEnd"/>
-            <w:r>
-              <w:rPr>
-                <w:rFonts w:ascii="Times New Roman" w:hAnsi="Times New Roman" w:cs="Times New Roman"/>
-                <w:sz w:val="24"/>
-                <w:szCs w:val="24"/>
-              </w:rPr>
-              <w:t>=</w:t>
+              <w:t>,MQfilter=</w:t>
             </w:r>
             <w:r>
               <w:rPr>
@@ -1467,7 +1219,6 @@
               <w:lastRenderedPageBreak/>
               <w:t>返回该</w:t>
             </w:r>
-            <w:proofErr w:type="spellStart"/>
             <w:r>
               <w:rPr>
                 <w:rFonts w:ascii="Times New Roman" w:hAnsi="Times New Roman" w:cs="Times New Roman" w:hint="eastAsia"/>
@@ -1484,32 +1235,13 @@
               </w:rPr>
               <w:t>cf</w:t>
             </w:r>
-            <w:proofErr w:type="spellEnd"/>
-            <w:r>
-              <w:rPr>
-                <w:rFonts w:ascii="Times New Roman" w:hAnsi="Times New Roman" w:cs="Times New Roman" w:hint="eastAsia"/>
-                <w:sz w:val="24"/>
-                <w:szCs w:val="24"/>
-              </w:rPr>
-              <w:t>文件的</w:t>
-            </w:r>
-            <w:proofErr w:type="gramStart"/>
-            <w:r>
-              <w:rPr>
-                <w:rFonts w:ascii="Times New Roman" w:hAnsi="Times New Roman" w:cs="Times New Roman" w:hint="eastAsia"/>
-                <w:sz w:val="24"/>
-                <w:szCs w:val="24"/>
-              </w:rPr>
-              <w:t>的</w:t>
-            </w:r>
-            <w:proofErr w:type="gramEnd"/>
-            <w:r>
-              <w:rPr>
-                <w:rFonts w:ascii="Times New Roman" w:hAnsi="Times New Roman" w:cs="Times New Roman" w:hint="eastAsia"/>
-                <w:sz w:val="24"/>
-                <w:szCs w:val="24"/>
-              </w:rPr>
-              <w:t>某一条染色体的全部记录或某一区段的记录，返</w:t>
+            <w:r>
+              <w:rPr>
+                <w:rFonts w:ascii="Times New Roman" w:hAnsi="Times New Roman" w:cs="Times New Roman" w:hint="eastAsia"/>
+                <w:sz w:val="24"/>
+                <w:szCs w:val="24"/>
+              </w:rPr>
+              <w:t>文件的的某一条染色体的全部记录或某一区段的记录，返</w:t>
             </w:r>
             <w:r>
               <w:rPr>
@@ -1520,7 +1252,6 @@
               <w:lastRenderedPageBreak/>
               <w:t>回值为列表，元素为</w:t>
             </w:r>
-            <w:proofErr w:type="spellStart"/>
             <w:r>
               <w:rPr>
                 <w:rFonts w:ascii="Times New Roman" w:hAnsi="Times New Roman" w:cs="Times New Roman" w:hint="eastAsia"/>
@@ -1537,7 +1268,6 @@
               </w:rPr>
               <w:t>cf</w:t>
             </w:r>
-            <w:proofErr w:type="spellEnd"/>
             <w:r>
               <w:rPr>
                 <w:rFonts w:ascii="Times New Roman" w:hAnsi="Times New Roman" w:cs="Times New Roman" w:hint="eastAsia"/>
@@ -1610,25 +1340,7 @@
                 <w:sz w:val="24"/>
                 <w:szCs w:val="24"/>
               </w:rPr>
-              <w:t xml:space="preserve">from </w:t>
-            </w:r>
-            <w:proofErr w:type="spellStart"/>
-            <w:r>
-              <w:rPr>
-                <w:rFonts w:ascii="Times New Roman" w:hAnsi="Times New Roman" w:cs="Times New Roman"/>
-                <w:sz w:val="24"/>
-                <w:szCs w:val="24"/>
-              </w:rPr>
-              <w:t>NGS.BasicUtil</w:t>
-            </w:r>
-            <w:proofErr w:type="spellEnd"/>
-            <w:r>
-              <w:rPr>
-                <w:rFonts w:ascii="Times New Roman" w:hAnsi="Times New Roman" w:cs="Times New Roman"/>
-                <w:sz w:val="24"/>
-                <w:szCs w:val="24"/>
-              </w:rPr>
-              <w:t xml:space="preserve"> import</w:t>
+              <w:t>from NGS.BasicUtil import</w:t>
             </w:r>
             <w:r>
               <w:rPr>
@@ -1688,18 +1400,8 @@
                 <w:sz w:val="24"/>
                 <w:szCs w:val="24"/>
               </w:rPr>
-              <w:t>该实例化对象可以用来调用相关函数进行</w:t>
-            </w:r>
-            <w:proofErr w:type="gramStart"/>
-            <w:r>
-              <w:rPr>
-                <w:rFonts w:ascii="Times New Roman" w:hAnsi="Times New Roman" w:cs="Times New Roman" w:hint="eastAsia"/>
-                <w:sz w:val="24"/>
-                <w:szCs w:val="24"/>
-              </w:rPr>
-              <w:t>滑窗操作</w:t>
-            </w:r>
-            <w:proofErr w:type="gramEnd"/>
+              <w:t>该实例化对象可以用来调用相关函数进行滑窗操作</w:t>
+            </w:r>
           </w:p>
         </w:tc>
       </w:tr>
@@ -1719,7 +1421,6 @@
                 <w:szCs w:val="24"/>
               </w:rPr>
             </w:pPr>
-            <w:proofErr w:type="spellStart"/>
             <w:r>
               <w:rPr>
                 <w:rFonts w:ascii="Times New Roman" w:hAnsi="Times New Roman" w:cs="Times New Roman"/>
@@ -1728,7 +1429,6 @@
               </w:rPr>
               <w:t>slidWindowOverlap</w:t>
             </w:r>
-            <w:proofErr w:type="spellEnd"/>
           </w:p>
         </w:tc>
         <w:tc>
@@ -1813,7 +1513,6 @@
               </w:rPr>
               <w:t>顺序排列的列表（如：</w:t>
             </w:r>
-            <w:proofErr w:type="spellStart"/>
             <w:r>
               <w:rPr>
                 <w:rFonts w:ascii="Times New Roman" w:hAnsi="Times New Roman" w:cs="Times New Roman"/>
@@ -1822,7 +1521,6 @@
               </w:rPr>
               <w:t>getVcfListByChrom</w:t>
             </w:r>
-            <w:proofErr w:type="spellEnd"/>
             <w:r>
               <w:rPr>
                 <w:rFonts w:ascii="Times New Roman" w:hAnsi="Times New Roman" w:cs="Times New Roman" w:hint="eastAsia"/>
@@ -1837,18 +1535,8 @@
                 <w:sz w:val="24"/>
                 <w:szCs w:val="24"/>
               </w:rPr>
-              <w:t xml:space="preserve">, </w:t>
-            </w:r>
-            <w:proofErr w:type="spellStart"/>
-            <w:r>
-              <w:rPr>
-                <w:rFonts w:ascii="Times New Roman" w:hAnsi="Times New Roman" w:cs="Times New Roman"/>
-                <w:sz w:val="24"/>
-                <w:szCs w:val="24"/>
-              </w:rPr>
-              <w:t>L_End_Pos</w:t>
-            </w:r>
-            <w:proofErr w:type="spellEnd"/>
+              <w:t>, L_End_Pos</w:t>
+            </w:r>
             <w:r>
               <w:rPr>
                 <w:rFonts w:ascii="Times New Roman" w:hAnsi="Times New Roman" w:cs="Times New Roman" w:hint="eastAsia"/>
@@ -1871,18 +1559,8 @@
                 <w:sz w:val="24"/>
                 <w:szCs w:val="24"/>
               </w:rPr>
-              <w:t xml:space="preserve">, </w:t>
-            </w:r>
-            <w:proofErr w:type="spellStart"/>
-            <w:r>
-              <w:rPr>
-                <w:rFonts w:ascii="Times New Roman" w:hAnsi="Times New Roman" w:cs="Times New Roman"/>
-                <w:sz w:val="24"/>
-                <w:szCs w:val="24"/>
-              </w:rPr>
-              <w:t>windowWidth</w:t>
-            </w:r>
-            <w:proofErr w:type="spellEnd"/>
+              <w:t>, windowWidth</w:t>
+            </w:r>
             <w:r>
               <w:rPr>
                 <w:rFonts w:ascii="Times New Roman" w:hAnsi="Times New Roman" w:cs="Times New Roman" w:hint="eastAsia"/>
@@ -1905,18 +1583,8 @@
                 <w:sz w:val="24"/>
                 <w:szCs w:val="24"/>
               </w:rPr>
-              <w:t xml:space="preserve">, </w:t>
-            </w:r>
-            <w:proofErr w:type="spellStart"/>
-            <w:r>
-              <w:rPr>
-                <w:rFonts w:ascii="Times New Roman" w:hAnsi="Times New Roman" w:cs="Times New Roman"/>
-                <w:sz w:val="24"/>
-                <w:szCs w:val="24"/>
-              </w:rPr>
-              <w:t>slideSize</w:t>
-            </w:r>
-            <w:proofErr w:type="spellEnd"/>
+              <w:t>, slideSize</w:t>
+            </w:r>
             <w:r>
               <w:rPr>
                 <w:rFonts w:ascii="Times New Roman" w:hAnsi="Times New Roman" w:cs="Times New Roman" w:hint="eastAsia"/>
@@ -1939,18 +1607,8 @@
                 <w:sz w:val="24"/>
                 <w:szCs w:val="24"/>
               </w:rPr>
-              <w:t xml:space="preserve">, </w:t>
-            </w:r>
-            <w:proofErr w:type="spellStart"/>
-            <w:r>
-              <w:rPr>
-                <w:rFonts w:ascii="Times New Roman" w:hAnsi="Times New Roman" w:cs="Times New Roman"/>
-                <w:sz w:val="24"/>
-                <w:szCs w:val="24"/>
-              </w:rPr>
-              <w:t>Caculator</w:t>
-            </w:r>
-            <w:proofErr w:type="spellEnd"/>
+              <w:t>, Caculator</w:t>
+            </w:r>
             <w:r>
               <w:rPr>
                 <w:rFonts w:ascii="Times New Roman" w:hAnsi="Times New Roman" w:cs="Times New Roman" w:hint="eastAsia"/>
@@ -1973,25 +1631,7 @@
                 <w:sz w:val="24"/>
                 <w:szCs w:val="24"/>
               </w:rPr>
-              <w:t>,</w:t>
-            </w:r>
-            <w:proofErr w:type="spellStart"/>
-            <w:r>
-              <w:rPr>
-                <w:rFonts w:ascii="Times New Roman" w:hAnsi="Times New Roman" w:cs="Times New Roman"/>
-                <w:sz w:val="24"/>
-                <w:szCs w:val="24"/>
-              </w:rPr>
-              <w:t>L_Start_Pos</w:t>
-            </w:r>
-            <w:proofErr w:type="spellEnd"/>
-            <w:r>
-              <w:rPr>
-                <w:rFonts w:ascii="Times New Roman" w:hAnsi="Times New Roman" w:cs="Times New Roman"/>
-                <w:sz w:val="24"/>
-                <w:szCs w:val="24"/>
-              </w:rPr>
-              <w:t>=</w:t>
+              <w:t>,L_Start_Pos=</w:t>
             </w:r>
             <w:r>
               <w:rPr>
@@ -2079,7 +1719,6 @@
               </w:rPr>
               <w:t>按照参数指定方式滑窗，计算每个窗口的值，计算方法有</w:t>
             </w:r>
-            <w:proofErr w:type="spellStart"/>
             <w:r>
               <w:rPr>
                 <w:rFonts w:ascii="Times New Roman" w:hAnsi="Times New Roman" w:cs="Times New Roman" w:hint="eastAsia"/>
@@ -2096,7 +1735,6 @@
               </w:rPr>
               <w:t>ulator</w:t>
             </w:r>
-            <w:proofErr w:type="spellEnd"/>
             <w:r>
               <w:rPr>
                 <w:rFonts w:ascii="Times New Roman" w:hAnsi="Times New Roman" w:cs="Times New Roman" w:hint="eastAsia"/>
@@ -2164,7 +1802,6 @@
                 <w:szCs w:val="24"/>
               </w:rPr>
             </w:pPr>
-            <w:proofErr w:type="spellStart"/>
             <w:r>
               <w:rPr>
                 <w:rFonts w:ascii="Times New Roman" w:hAnsi="Times New Roman" w:cs="Times New Roman"/>
@@ -2182,7 +1819,6 @@
               <w:lastRenderedPageBreak/>
               <w:t>Gs</w:t>
             </w:r>
-            <w:proofErr w:type="spellEnd"/>
             <w:r>
               <w:rPr>
                 <w:rFonts w:ascii="Times New Roman" w:hAnsi="Times New Roman" w:cs="Times New Roman"/>
@@ -2429,7 +2065,6 @@
           <w:szCs w:val="24"/>
         </w:rPr>
       </w:pPr>
-      <w:proofErr w:type="spellStart"/>
       <w:r>
         <w:rPr>
           <w:rFonts w:ascii="Times New Roman" w:eastAsia="宋体" w:hAnsi="Times New Roman" w:cs="Times New Roman"/>
@@ -2438,7 +2073,6 @@
         </w:rPr>
         <w:t>alinmultPopSnpPos</w:t>
       </w:r>
-      <w:proofErr w:type="spellEnd"/>
       <w:r>
         <w:rPr>
           <w:rFonts w:ascii="Times New Roman" w:eastAsia="宋体" w:hAnsi="Times New Roman" w:cs="Times New Roman"/>
@@ -2525,23 +2159,13 @@
         </w:rPr>
         <w:t>参数：</w:t>
       </w:r>
-      <w:proofErr w:type="spellStart"/>
-      <w:r>
-        <w:rPr>
-          <w:rFonts w:ascii="Times New Roman" w:eastAsia="宋体" w:hAnsi="Times New Roman" w:cs="Times New Roman"/>
-          <w:sz w:val="24"/>
-          <w:szCs w:val="24"/>
-        </w:rPr>
-        <w:t>vcfMaplist</w:t>
-      </w:r>
-      <w:proofErr w:type="spellEnd"/>
-      <w:r>
-        <w:rPr>
-          <w:rFonts w:ascii="Times New Roman" w:eastAsia="宋体" w:hAnsi="Times New Roman" w:cs="Times New Roman"/>
-          <w:sz w:val="24"/>
-          <w:szCs w:val="24"/>
-        </w:rPr>
-        <w:t>=</w:t>
+      <w:r>
+        <w:rPr>
+          <w:rFonts w:ascii="Times New Roman" w:eastAsia="宋体" w:hAnsi="Times New Roman" w:cs="Times New Roman"/>
+          <w:sz w:val="24"/>
+          <w:szCs w:val="24"/>
+        </w:rPr>
+        <w:t>vcfMaplist=</w:t>
       </w:r>
       <w:r>
         <w:rPr>
@@ -2575,23 +2199,13 @@
         </w:rPr>
         <w:t>数据，</w:t>
       </w:r>
-      <w:proofErr w:type="spellStart"/>
-      <w:r>
-        <w:rPr>
-          <w:rFonts w:ascii="Times New Roman" w:eastAsia="宋体" w:hAnsi="Times New Roman" w:cs="Times New Roman"/>
-          <w:sz w:val="24"/>
-          <w:szCs w:val="24"/>
-        </w:rPr>
-        <w:t>jointmode</w:t>
-      </w:r>
-      <w:proofErr w:type="spellEnd"/>
-      <w:r>
-        <w:rPr>
-          <w:rFonts w:ascii="Times New Roman" w:eastAsia="宋体" w:hAnsi="Times New Roman" w:cs="Times New Roman"/>
-          <w:sz w:val="24"/>
-          <w:szCs w:val="24"/>
-        </w:rPr>
-        <w:t>=</w:t>
+      <w:r>
+        <w:rPr>
+          <w:rFonts w:ascii="Times New Roman" w:eastAsia="宋体" w:hAnsi="Times New Roman" w:cs="Times New Roman"/>
+          <w:sz w:val="24"/>
+          <w:szCs w:val="24"/>
+        </w:rPr>
+        <w:t>jointmode=</w:t>
       </w:r>
       <w:r>
         <w:rPr>
@@ -2607,25 +2221,7 @@
           <w:sz w:val="24"/>
           <w:szCs w:val="24"/>
         </w:rPr>
-        <w:t>“o”/“</w:t>
-      </w:r>
-      <w:proofErr w:type="spellStart"/>
-      <w:r>
-        <w:rPr>
-          <w:rFonts w:ascii="Times New Roman" w:eastAsia="宋体" w:hAnsi="Times New Roman" w:cs="Times New Roman"/>
-          <w:sz w:val="24"/>
-          <w:szCs w:val="24"/>
-        </w:rPr>
-        <w:t>i</w:t>
-      </w:r>
-      <w:proofErr w:type="spellEnd"/>
-      <w:r>
-        <w:rPr>
-          <w:rFonts w:ascii="Times New Roman" w:eastAsia="宋体" w:hAnsi="Times New Roman" w:cs="Times New Roman"/>
-          <w:sz w:val="24"/>
-          <w:szCs w:val="24"/>
-        </w:rPr>
-        <w:t>”</w:t>
+        <w:t>“o”/“i”</w:t>
       </w:r>
       <w:r>
         <w:rPr>
@@ -2715,25 +2311,7 @@
           <w:sz w:val="24"/>
           <w:szCs w:val="24"/>
         </w:rPr>
-        <w:t>vcffile</w:t>
-      </w:r>
-      <w:proofErr w:type="gramStart"/>
-      <w:r>
-        <w:rPr>
-          <w:rFonts w:ascii="Times New Roman" w:eastAsia="宋体" w:hAnsi="Times New Roman" w:cs="Times New Roman"/>
-          <w:sz w:val="24"/>
-          <w:szCs w:val="24"/>
-        </w:rPr>
-        <w:t>1,vcffle</w:t>
-      </w:r>
-      <w:proofErr w:type="gramEnd"/>
-      <w:r>
-        <w:rPr>
-          <w:rFonts w:ascii="Times New Roman" w:eastAsia="宋体" w:hAnsi="Times New Roman" w:cs="Times New Roman"/>
-          <w:sz w:val="24"/>
-          <w:szCs w:val="24"/>
-        </w:rPr>
-        <w:t>2,vcffile3…</w:t>
+        <w:t>vcffile1,vcffle2,vcffile3…</w:t>
       </w:r>
       <w:r>
         <w:rPr>
@@ -2816,9 +2394,24 @@
           <w:sz w:val="24"/>
           <w:szCs w:val="24"/>
         </w:rPr>
-        <w:t>[</w:t>
-      </w:r>
-      <w:proofErr w:type="spellStart"/>
+        <w:t>[chrNo:[</w:t>
+      </w:r>
+      <w:r>
+        <w:rPr>
+          <w:rFonts w:ascii="Times New Roman" w:eastAsia="宋体" w:hAnsi="Times New Roman" w:cs="Times New Roman"/>
+          <w:sz w:val="24"/>
+          <w:szCs w:val="24"/>
+        </w:rPr>
+        <w:t>vcffile1</w:t>
+      </w:r>
+      <w:r>
+        <w:rPr>
+          <w:rFonts w:ascii="Times New Roman" w:eastAsia="宋体" w:hAnsi="Times New Roman" w:cs="Times New Roman"/>
+          <w:sz w:val="24"/>
+          <w:szCs w:val="24"/>
+        </w:rPr>
+        <w:t>中</w:t>
+      </w:r>
       <w:r>
         <w:rPr>
           <w:rFonts w:ascii="Times New Roman" w:eastAsia="宋体" w:hAnsi="Times New Roman" w:cs="Times New Roman"/>
@@ -2827,22 +2420,29 @@
         </w:rPr>
         <w:t>chrNo</w:t>
       </w:r>
-      <w:proofErr w:type="spellEnd"/>
-      <w:r>
-        <w:rPr>
-          <w:rFonts w:ascii="Times New Roman" w:eastAsia="宋体" w:hAnsi="Times New Roman" w:cs="Times New Roman"/>
-          <w:sz w:val="24"/>
-          <w:szCs w:val="24"/>
-        </w:rPr>
-        <w:t>:[</w:t>
-      </w:r>
-      <w:r>
-        <w:rPr>
-          <w:rFonts w:ascii="Times New Roman" w:eastAsia="宋体" w:hAnsi="Times New Roman" w:cs="Times New Roman"/>
-          <w:sz w:val="24"/>
-          <w:szCs w:val="24"/>
-        </w:rPr>
-        <w:t>vcffile1</w:t>
+      <w:r>
+        <w:rPr>
+          <w:rFonts w:ascii="Times New Roman" w:eastAsia="宋体" w:hAnsi="Times New Roman" w:cs="Times New Roman"/>
+          <w:sz w:val="24"/>
+          <w:szCs w:val="24"/>
+        </w:rPr>
+        <w:t>的记录</w:t>
+      </w:r>
+      <w:r>
+        <w:rPr>
+          <w:rFonts w:ascii="Times New Roman" w:eastAsia="宋体" w:hAnsi="Times New Roman" w:cs="Times New Roman"/>
+          <w:sz w:val="24"/>
+          <w:szCs w:val="24"/>
+        </w:rPr>
+        <w:t>],{chrNo:[</w:t>
+      </w:r>
+      <w:r>
+        <w:rPr>
+          <w:rFonts w:ascii="Times New Roman" w:eastAsia="宋体" w:hAnsi="Times New Roman" w:cs="Times New Roman"/>
+          <w:sz w:val="24"/>
+          <w:szCs w:val="24"/>
+        </w:rPr>
+        <w:t xml:space="preserve"> vcffile2</w:t>
       </w:r>
       <w:r>
         <w:rPr>
@@ -2852,7 +2452,6 @@
         </w:rPr>
         <w:t>中</w:t>
       </w:r>
-      <w:proofErr w:type="spellStart"/>
       <w:r>
         <w:rPr>
           <w:rFonts w:ascii="Times New Roman" w:eastAsia="宋体" w:hAnsi="Times New Roman" w:cs="Times New Roman"/>
@@ -2861,7 +2460,6 @@
         </w:rPr>
         <w:t>chrNo</w:t>
       </w:r>
-      <w:proofErr w:type="spellEnd"/>
       <w:r>
         <w:rPr>
           <w:rFonts w:ascii="Times New Roman" w:eastAsia="宋体" w:hAnsi="Times New Roman" w:cs="Times New Roman"/>
@@ -2876,9 +2474,32 @@
           <w:sz w:val="24"/>
           <w:szCs w:val="24"/>
         </w:rPr>
-        <w:t>],{</w:t>
-      </w:r>
-      <w:proofErr w:type="spellStart"/>
+        <w:t>]},,,,,,]</w:t>
+      </w:r>
+      <w:r>
+        <w:rPr>
+          <w:rFonts w:ascii="Times New Roman" w:eastAsia="宋体" w:hAnsi="Times New Roman" w:cs="Times New Roman"/>
+          <w:sz w:val="24"/>
+          <w:szCs w:val="24"/>
+        </w:rPr>
+        <w:t>。每个</w:t>
+      </w:r>
+      <w:r>
+        <w:rPr>
+          <w:rFonts w:ascii="Times New Roman" w:eastAsia="宋体" w:hAnsi="Times New Roman" w:cs="Times New Roman"/>
+          <w:sz w:val="24"/>
+          <w:szCs w:val="24"/>
+        </w:rPr>
+        <w:t>VCF</w:t>
+      </w:r>
+      <w:r>
+        <w:rPr>
+          <w:rFonts w:ascii="Times New Roman" w:eastAsia="宋体" w:hAnsi="Times New Roman" w:cs="Times New Roman"/>
+          <w:sz w:val="24"/>
+          <w:szCs w:val="24"/>
+        </w:rPr>
+        <w:t>文件的对应</w:t>
+      </w:r>
       <w:r>
         <w:rPr>
           <w:rFonts w:ascii="Times New Roman" w:eastAsia="宋体" w:hAnsi="Times New Roman" w:cs="Times New Roman"/>
@@ -2887,91 +2508,6 @@
         </w:rPr>
         <w:t>chrNo</w:t>
       </w:r>
-      <w:proofErr w:type="spellEnd"/>
-      <w:r>
-        <w:rPr>
-          <w:rFonts w:ascii="Times New Roman" w:eastAsia="宋体" w:hAnsi="Times New Roman" w:cs="Times New Roman"/>
-          <w:sz w:val="24"/>
-          <w:szCs w:val="24"/>
-        </w:rPr>
-        <w:t>:[</w:t>
-      </w:r>
-      <w:r>
-        <w:rPr>
-          <w:rFonts w:ascii="Times New Roman" w:eastAsia="宋体" w:hAnsi="Times New Roman" w:cs="Times New Roman"/>
-          <w:sz w:val="24"/>
-          <w:szCs w:val="24"/>
-        </w:rPr>
-        <w:t xml:space="preserve"> vcffile2</w:t>
-      </w:r>
-      <w:r>
-        <w:rPr>
-          <w:rFonts w:ascii="Times New Roman" w:eastAsia="宋体" w:hAnsi="Times New Roman" w:cs="Times New Roman"/>
-          <w:sz w:val="24"/>
-          <w:szCs w:val="24"/>
-        </w:rPr>
-        <w:t>中</w:t>
-      </w:r>
-      <w:proofErr w:type="spellStart"/>
-      <w:r>
-        <w:rPr>
-          <w:rFonts w:ascii="Times New Roman" w:eastAsia="宋体" w:hAnsi="Times New Roman" w:cs="Times New Roman"/>
-          <w:sz w:val="24"/>
-          <w:szCs w:val="24"/>
-        </w:rPr>
-        <w:t>chrNo</w:t>
-      </w:r>
-      <w:proofErr w:type="spellEnd"/>
-      <w:r>
-        <w:rPr>
-          <w:rFonts w:ascii="Times New Roman" w:eastAsia="宋体" w:hAnsi="Times New Roman" w:cs="Times New Roman"/>
-          <w:sz w:val="24"/>
-          <w:szCs w:val="24"/>
-        </w:rPr>
-        <w:t>的记录</w:t>
-      </w:r>
-      <w:r>
-        <w:rPr>
-          <w:rFonts w:ascii="Times New Roman" w:eastAsia="宋体" w:hAnsi="Times New Roman" w:cs="Times New Roman"/>
-          <w:sz w:val="24"/>
-          <w:szCs w:val="24"/>
-        </w:rPr>
-        <w:t>]},,,,,,]</w:t>
-      </w:r>
-      <w:r>
-        <w:rPr>
-          <w:rFonts w:ascii="Times New Roman" w:eastAsia="宋体" w:hAnsi="Times New Roman" w:cs="Times New Roman"/>
-          <w:sz w:val="24"/>
-          <w:szCs w:val="24"/>
-        </w:rPr>
-        <w:t>。每个</w:t>
-      </w:r>
-      <w:r>
-        <w:rPr>
-          <w:rFonts w:ascii="Times New Roman" w:eastAsia="宋体" w:hAnsi="Times New Roman" w:cs="Times New Roman"/>
-          <w:sz w:val="24"/>
-          <w:szCs w:val="24"/>
-        </w:rPr>
-        <w:t>VCF</w:t>
-      </w:r>
-      <w:r>
-        <w:rPr>
-          <w:rFonts w:ascii="Times New Roman" w:eastAsia="宋体" w:hAnsi="Times New Roman" w:cs="Times New Roman"/>
-          <w:sz w:val="24"/>
-          <w:szCs w:val="24"/>
-        </w:rPr>
-        <w:t>文件的对应</w:t>
-      </w:r>
-      <w:proofErr w:type="spellStart"/>
-      <w:r>
-        <w:rPr>
-          <w:rFonts w:ascii="Times New Roman" w:eastAsia="宋体" w:hAnsi="Times New Roman" w:cs="Times New Roman"/>
-          <w:sz w:val="24"/>
-          <w:szCs w:val="24"/>
-        </w:rPr>
-        <w:t>chrNo</w:t>
-      </w:r>
-      <w:proofErr w:type="spellEnd"/>
       <w:r>
         <w:rPr>
           <w:rFonts w:ascii="Times New Roman" w:eastAsia="宋体" w:hAnsi="Times New Roman" w:cs="Times New Roman"/>
@@ -2988,23 +2524,13 @@
         </w:rPr>
         <w:t>的</w:t>
       </w:r>
-      <w:proofErr w:type="spellStart"/>
-      <w:r>
-        <w:rPr>
-          <w:rFonts w:ascii="Times New Roman" w:eastAsia="宋体" w:hAnsi="Times New Roman" w:cs="Times New Roman"/>
-          <w:sz w:val="24"/>
-          <w:szCs w:val="24"/>
-        </w:rPr>
-        <w:t>VCF_Data</w:t>
-      </w:r>
-      <w:proofErr w:type="spellEnd"/>
-      <w:r>
-        <w:rPr>
-          <w:rFonts w:ascii="Times New Roman" w:eastAsia="宋体" w:hAnsi="Times New Roman" w:cs="Times New Roman"/>
-          <w:sz w:val="24"/>
-          <w:szCs w:val="24"/>
-        </w:rPr>
-        <w:t>()</w:t>
+      <w:r>
+        <w:rPr>
+          <w:rFonts w:ascii="Times New Roman" w:eastAsia="宋体" w:hAnsi="Times New Roman" w:cs="Times New Roman"/>
+          <w:sz w:val="24"/>
+          <w:szCs w:val="24"/>
+        </w:rPr>
+        <w:t>VCF_Data()</w:t>
       </w:r>
       <w:r>
         <w:rPr>
@@ -3014,7 +2540,6 @@
         </w:rPr>
         <w:t>类的</w:t>
       </w:r>
-      <w:proofErr w:type="spellStart"/>
       <w:r>
         <w:rPr>
           <w:rFonts w:ascii="Times New Roman" w:eastAsia="宋体" w:hAnsi="Times New Roman" w:cs="Times New Roman"/>
@@ -3023,7 +2548,6 @@
         </w:rPr>
         <w:t>getVcfListByChrom</w:t>
       </w:r>
-      <w:proofErr w:type="spellEnd"/>
       <w:r>
         <w:rPr>
           <w:rFonts w:ascii="Times New Roman" w:eastAsia="宋体" w:hAnsi="Times New Roman" w:cs="Times New Roman"/>
@@ -3057,25 +2581,7 @@
           <w:sz w:val="24"/>
           <w:szCs w:val="24"/>
         </w:rPr>
-        <w:t>[</w:t>
-      </w:r>
-      <w:proofErr w:type="gramStart"/>
-      <w:r>
-        <w:rPr>
-          <w:rFonts w:ascii="Times New Roman" w:eastAsia="宋体" w:hAnsi="Times New Roman" w:cs="Times New Roman"/>
-          <w:sz w:val="24"/>
-          <w:szCs w:val="24"/>
-        </w:rPr>
-        <w:t>chrNo:[</w:t>
-      </w:r>
-      <w:proofErr w:type="gramEnd"/>
-      <w:r>
-        <w:rPr>
-          <w:rFonts w:ascii="Times New Roman" w:eastAsia="宋体" w:hAnsi="Times New Roman" w:cs="Times New Roman"/>
-          <w:sz w:val="24"/>
-          <w:szCs w:val="24"/>
-        </w:rPr>
-        <w:t xml:space="preserve">(pos,REF,ALT,INFO,FORMAT,sample,...),(pos,REF,ALT,INFO,FORMAT,sample,...),,,,,],{chrNo:[]},,,,,,] </w:t>
+        <w:t xml:space="preserve">[chrNo:[(pos,REF,ALT,INFO,FORMAT,sample,...),(pos,REF,ALT,INFO,FORMAT,sample,...),,,,,],{chrNo:[]},,,,,,] </w:t>
       </w:r>
       <w:r>
         <w:rPr>
@@ -3285,25 +2791,7 @@
           <w:szCs w:val="24"/>
         </w:rPr>
         <w:tab/>
-        <w:t xml:space="preserve">  [pos</w:t>
-      </w:r>
-      <w:proofErr w:type="gramStart"/>
-      <w:r>
-        <w:rPr>
-          <w:rFonts w:ascii="Times New Roman" w:eastAsia="宋体" w:hAnsi="Times New Roman" w:cs="Times New Roman"/>
-          <w:sz w:val="24"/>
-          <w:szCs w:val="24"/>
-        </w:rPr>
-        <w:t>2,REF</w:t>
-      </w:r>
-      <w:proofErr w:type="gramEnd"/>
-      <w:r>
-        <w:rPr>
-          <w:rFonts w:ascii="Times New Roman" w:eastAsia="宋体" w:hAnsi="Times New Roman" w:cs="Times New Roman"/>
-          <w:sz w:val="24"/>
-          <w:szCs w:val="24"/>
-        </w:rPr>
-        <w:t xml:space="preserve">,ALT,(              ), </w:t>
+        <w:t xml:space="preserve">  [pos2,REF,ALT,(              ), </w:t>
       </w:r>
       <w:r>
         <w:rPr>
@@ -3439,7 +2927,6 @@
         </w:rPr>
         <w:t>外连接方式合并，若某</w:t>
       </w:r>
-      <w:proofErr w:type="spellStart"/>
       <w:r>
         <w:rPr>
           <w:rFonts w:ascii="Times New Roman" w:eastAsia="宋体" w:hAnsi="Times New Roman" w:cs="Times New Roman" w:hint="eastAsia"/>
@@ -3456,7 +2943,6 @@
         </w:rPr>
         <w:t>cf</w:t>
       </w:r>
-      <w:proofErr w:type="spellEnd"/>
       <w:r>
         <w:rPr>
           <w:rFonts w:ascii="Times New Roman" w:eastAsia="宋体" w:hAnsi="Times New Roman" w:cs="Times New Roman" w:hint="eastAsia"/>
@@ -3513,7 +2999,6 @@
         </w:rPr>
         <w:t>。</w:t>
       </w:r>
-      <w:proofErr w:type="gramStart"/>
       <w:r>
         <w:rPr>
           <w:rFonts w:ascii="Times New Roman" w:eastAsia="宋体" w:hAnsi="Times New Roman" w:cs="Times New Roman" w:hint="eastAsia"/>
@@ -3530,8 +3015,6 @@
         </w:rPr>
         <w:t>各</w:t>
       </w:r>
-      <w:proofErr w:type="spellStart"/>
-      <w:proofErr w:type="gramEnd"/>
       <w:r>
         <w:rPr>
           <w:rFonts w:ascii="Times New Roman" w:eastAsia="宋体" w:hAnsi="Times New Roman" w:cs="Times New Roman" w:hint="eastAsia"/>
@@ -3548,7 +3031,6 @@
         </w:rPr>
         <w:t>cffile</w:t>
       </w:r>
-      <w:proofErr w:type="spellEnd"/>
       <w:r>
         <w:rPr>
           <w:rFonts w:ascii="Times New Roman" w:eastAsia="宋体" w:hAnsi="Times New Roman" w:cs="Times New Roman" w:hint="eastAsia"/>
@@ -3622,7 +3104,6 @@
           <w:szCs w:val="21"/>
         </w:rPr>
       </w:pPr>
-      <w:proofErr w:type="spellStart"/>
       <w:r>
         <w:rPr>
           <w:rFonts w:ascii="Consolas" w:hAnsi="Consolas" w:cs="Consolas" w:hint="eastAsia"/>
@@ -3634,7 +3115,6 @@
         <w:lastRenderedPageBreak/>
         <w:t>vcf</w:t>
       </w:r>
-      <w:proofErr w:type="spellEnd"/>
       <w:r>
         <w:rPr>
           <w:rFonts w:ascii="Consolas" w:hAnsi="Consolas" w:cs="Consolas" w:hint="eastAsia"/>
@@ -3645,7 +3125,6 @@
         </w:rPr>
         <w:t>数据表标准为：五列必须列，分别为</w:t>
       </w:r>
-      <w:proofErr w:type="spellStart"/>
       <w:r>
         <w:rPr>
           <w:rFonts w:ascii="Consolas" w:hAnsi="Consolas" w:cs="Consolas" w:hint="eastAsia"/>
@@ -3656,7 +3135,6 @@
         </w:rPr>
         <w:t>chrID</w:t>
       </w:r>
-      <w:proofErr w:type="spellEnd"/>
       <w:r>
         <w:rPr>
           <w:rFonts w:ascii="Consolas" w:hAnsi="Consolas" w:cs="Consolas" w:hint="eastAsia"/>
@@ -3667,7 +3145,6 @@
         </w:rPr>
         <w:t>，</w:t>
       </w:r>
-      <w:proofErr w:type="spellStart"/>
       <w:r>
         <w:rPr>
           <w:rFonts w:ascii="Consolas" w:hAnsi="Consolas" w:cs="Consolas" w:hint="eastAsia"/>
@@ -3678,7 +3155,6 @@
         </w:rPr>
         <w:t>snp_pos,snpID,ref_base,alt_base</w:t>
       </w:r>
-      <w:proofErr w:type="spellEnd"/>
       <w:r>
         <w:rPr>
           <w:rFonts w:ascii="Consolas" w:hAnsi="Consolas" w:cs="Consolas" w:hint="eastAsia"/>
@@ -3698,7 +3174,6 @@
           <w:szCs w:val="21"/>
         </w:rPr>
       </w:pPr>
-      <w:proofErr w:type="spellStart"/>
       <w:r>
         <w:rPr>
           <w:rFonts w:ascii="Consolas" w:hAnsi="Consolas" w:cs="Consolas" w:hint="eastAsia"/>
@@ -3707,9 +3182,8 @@
           <w:kern w:val="0"/>
           <w:szCs w:val="21"/>
         </w:rPr>
-        <w:t>toplevel</w:t>
-      </w:r>
-      <w:proofErr w:type="spellEnd"/>
+        <w:t>toplevel vcf</w:t>
+      </w:r>
       <w:r>
         <w:rPr>
           <w:rFonts w:ascii="Consolas" w:hAnsi="Consolas" w:cs="Consolas" w:hint="eastAsia"/>
@@ -3718,9 +3192,74 @@
           <w:kern w:val="0"/>
           <w:szCs w:val="21"/>
         </w:rPr>
+        <w:t>数据表为</w:t>
+      </w:r>
+      <w:r>
+        <w:rPr>
+          <w:rFonts w:ascii="Consolas" w:hAnsi="Consolas" w:cs="Consolas" w:hint="eastAsia"/>
+          <w:bCs/>
+          <w:color w:val="000000"/>
+          <w:kern w:val="0"/>
+          <w:szCs w:val="21"/>
+        </w:rPr>
+        <w:t>chrID</w:t>
+      </w:r>
+      <w:r>
+        <w:rPr>
+          <w:rFonts w:ascii="Consolas" w:hAnsi="Consolas" w:cs="Consolas" w:hint="eastAsia"/>
+          <w:bCs/>
+          <w:color w:val="000000"/>
+          <w:kern w:val="0"/>
+          <w:szCs w:val="21"/>
+        </w:rPr>
+        <w:t>，</w:t>
+      </w:r>
+      <w:r>
+        <w:rPr>
+          <w:rFonts w:ascii="Consolas" w:hAnsi="Consolas" w:cs="Consolas" w:hint="eastAsia"/>
+          <w:bCs/>
+          <w:color w:val="000000"/>
+          <w:kern w:val="0"/>
+          <w:szCs w:val="21"/>
+        </w:rPr>
+        <w:t>snp_pos,snpID,ref_base,alt_base</w:t>
+      </w:r>
+      <w:r>
+        <w:rPr>
+          <w:rFonts w:ascii="Consolas" w:hAnsi="Consolas" w:cs="Consolas" w:hint="eastAsia"/>
+          <w:bCs/>
+          <w:color w:val="000000"/>
+          <w:kern w:val="0"/>
+          <w:szCs w:val="21"/>
+        </w:rPr>
+        <w:t>，</w:t>
+      </w:r>
+      <w:r>
+        <w:rPr>
+          <w:rFonts w:ascii="Consolas" w:hAnsi="Consolas" w:cs="Consolas" w:hint="eastAsia"/>
+          <w:bCs/>
+          <w:color w:val="000000"/>
+          <w:kern w:val="0"/>
+          <w:szCs w:val="21"/>
+        </w:rPr>
+        <w:t>context,</w:t>
+      </w:r>
+      <w:r>
+        <w:rPr>
+          <w:szCs w:val="21"/>
+        </w:rPr>
         <w:t xml:space="preserve"> </w:t>
       </w:r>
-      <w:proofErr w:type="spellStart"/>
+      <w:r>
+        <w:rPr>
+          <w:rFonts w:ascii="Consolas" w:hAnsi="Consolas" w:cs="Consolas"/>
+          <w:bCs/>
+          <w:color w:val="000000"/>
+          <w:kern w:val="0"/>
+          <w:szCs w:val="21"/>
+        </w:rPr>
+        <w:t>wegeon_indvd_SNV_vcf_alt</w:t>
+      </w:r>
       <w:r>
         <w:rPr>
           <w:rFonts w:ascii="Consolas" w:hAnsi="Consolas" w:cs="Consolas" w:hint="eastAsia"/>
@@ -3729,119 +3268,24 @@
           <w:kern w:val="0"/>
           <w:szCs w:val="21"/>
         </w:rPr>
-        <w:t>vcf</w:t>
-      </w:r>
-      <w:proofErr w:type="spellEnd"/>
-      <w:r>
-        <w:rPr>
-          <w:rFonts w:ascii="Consolas" w:hAnsi="Consolas" w:cs="Consolas" w:hint="eastAsia"/>
+        <w:t>,</w:t>
+      </w:r>
+      <w:r>
+        <w:rPr>
+          <w:szCs w:val="21"/>
+        </w:rPr>
+        <w:t xml:space="preserve"> </w:t>
+      </w:r>
+      <w:r>
+        <w:rPr>
+          <w:rFonts w:ascii="Consolas" w:hAnsi="Consolas" w:cs="Consolas"/>
           <w:bCs/>
           <w:color w:val="000000"/>
           <w:kern w:val="0"/>
           <w:szCs w:val="21"/>
         </w:rPr>
-        <w:t>数据表为</w:t>
-      </w:r>
-      <w:proofErr w:type="spellStart"/>
-      <w:r>
-        <w:rPr>
-          <w:rFonts w:ascii="Consolas" w:hAnsi="Consolas" w:cs="Consolas" w:hint="eastAsia"/>
-          <w:bCs/>
-          <w:color w:val="000000"/>
-          <w:kern w:val="0"/>
-          <w:szCs w:val="21"/>
-        </w:rPr>
-        <w:t>chrID</w:t>
-      </w:r>
-      <w:proofErr w:type="spellEnd"/>
-      <w:r>
-        <w:rPr>
-          <w:rFonts w:ascii="Consolas" w:hAnsi="Consolas" w:cs="Consolas" w:hint="eastAsia"/>
-          <w:bCs/>
-          <w:color w:val="000000"/>
-          <w:kern w:val="0"/>
-          <w:szCs w:val="21"/>
-        </w:rPr>
-        <w:t>，</w:t>
-      </w:r>
-      <w:proofErr w:type="spellStart"/>
-      <w:r>
-        <w:rPr>
-          <w:rFonts w:ascii="Consolas" w:hAnsi="Consolas" w:cs="Consolas" w:hint="eastAsia"/>
-          <w:bCs/>
-          <w:color w:val="000000"/>
-          <w:kern w:val="0"/>
-          <w:szCs w:val="21"/>
-        </w:rPr>
-        <w:t>snp_pos,snpID,ref_base,alt_base</w:t>
-      </w:r>
-      <w:proofErr w:type="spellEnd"/>
-      <w:r>
-        <w:rPr>
-          <w:rFonts w:ascii="Consolas" w:hAnsi="Consolas" w:cs="Consolas" w:hint="eastAsia"/>
-          <w:bCs/>
-          <w:color w:val="000000"/>
-          <w:kern w:val="0"/>
-          <w:szCs w:val="21"/>
-        </w:rPr>
-        <w:t>，</w:t>
-      </w:r>
-      <w:r>
-        <w:rPr>
-          <w:rFonts w:ascii="Consolas" w:hAnsi="Consolas" w:cs="Consolas" w:hint="eastAsia"/>
-          <w:bCs/>
-          <w:color w:val="000000"/>
-          <w:kern w:val="0"/>
-          <w:szCs w:val="21"/>
-        </w:rPr>
-        <w:t>context,</w:t>
-      </w:r>
-      <w:r>
-        <w:rPr>
-          <w:szCs w:val="21"/>
-        </w:rPr>
-        <w:t xml:space="preserve"> </w:t>
-      </w:r>
-      <w:proofErr w:type="spellStart"/>
-      <w:r>
-        <w:rPr>
-          <w:rFonts w:ascii="Consolas" w:hAnsi="Consolas" w:cs="Consolas"/>
-          <w:bCs/>
-          <w:color w:val="000000"/>
-          <w:kern w:val="0"/>
-          <w:szCs w:val="21"/>
-        </w:rPr>
-        <w:t>wegeon_indvd_SNV_vcf_alt</w:t>
-      </w:r>
-      <w:proofErr w:type="spellEnd"/>
-      <w:r>
-        <w:rPr>
-          <w:rFonts w:ascii="Consolas" w:hAnsi="Consolas" w:cs="Consolas" w:hint="eastAsia"/>
-          <w:bCs/>
-          <w:color w:val="000000"/>
-          <w:kern w:val="0"/>
-          <w:szCs w:val="21"/>
-        </w:rPr>
-        <w:t>,</w:t>
-      </w:r>
-      <w:r>
-        <w:rPr>
-          <w:szCs w:val="21"/>
-        </w:rPr>
-        <w:t xml:space="preserve"> </w:t>
-      </w:r>
-      <w:proofErr w:type="spellStart"/>
-      <w:r>
-        <w:rPr>
-          <w:rFonts w:ascii="Consolas" w:hAnsi="Consolas" w:cs="Consolas"/>
-          <w:bCs/>
-          <w:color w:val="000000"/>
-          <w:kern w:val="0"/>
-          <w:szCs w:val="21"/>
-        </w:rPr>
         <w:t>wegeon_indvd_SNV_vcf_dep</w:t>
       </w:r>
-      <w:proofErr w:type="spellEnd"/>
       <w:r>
         <w:rPr>
           <w:rFonts w:ascii="Consolas" w:hAnsi="Consolas" w:cs="Consolas" w:hint="eastAsia"/>
@@ -3875,14 +3319,12 @@
           <w:numId w:val="3"/>
         </w:numPr>
       </w:pPr>
-      <w:proofErr w:type="spellStart"/>
       <w:r>
         <w:rPr>
           <w:bCs/>
         </w:rPr>
         <w:t>getRefSeqBypos</w:t>
       </w:r>
-      <w:proofErr w:type="spellEnd"/>
       <w:r>
         <w:rPr>
           <w:rFonts w:hint="eastAsia"/>
@@ -3905,7 +3347,6 @@
           <w:numId w:val="3"/>
         </w:numPr>
       </w:pPr>
-      <w:proofErr w:type="spellStart"/>
       <w:r>
         <w:rPr>
           <w:rFonts w:ascii="Consolas" w:hAnsi="Consolas" w:cs="Consolas"/>
@@ -3919,7 +3360,6 @@
         </w:rPr>
         <w:t>generateFasterRefIndex</w:t>
       </w:r>
-      <w:proofErr w:type="spellEnd"/>
       <w:r>
         <w:rPr>
           <w:rFonts w:ascii="Consolas" w:hAnsi="Consolas" w:cs="Consolas"/>
@@ -3943,35 +3383,7 @@
           <w:szCs w:val="20"/>
           <w:highlight w:val="yellow"/>
         </w:rPr>
-        <w:t>这个函数怎么处理染色体名的回去好好查</w:t>
-      </w:r>
-      <w:proofErr w:type="gramStart"/>
-      <w:r>
-        <w:rPr>
-          <w:rFonts w:ascii="Consolas" w:hAnsi="Consolas" w:cs="Consolas" w:hint="eastAsia"/>
-          <w:b/>
-          <w:bCs/>
-          <w:color w:val="000000"/>
-          <w:kern w:val="0"/>
-          <w:sz w:val="20"/>
-          <w:szCs w:val="20"/>
-          <w:highlight w:val="yellow"/>
-        </w:rPr>
-        <w:t>查看</w:t>
-      </w:r>
-      <w:proofErr w:type="gramEnd"/>
-      <w:r>
-        <w:rPr>
-          <w:rFonts w:ascii="Consolas" w:hAnsi="Consolas" w:cs="Consolas" w:hint="eastAsia"/>
-          <w:b/>
-          <w:bCs/>
-          <w:color w:val="000000"/>
-          <w:kern w:val="0"/>
-          <w:sz w:val="20"/>
-          <w:szCs w:val="20"/>
-          <w:highlight w:val="yellow"/>
-        </w:rPr>
-        <w:t>看</w:t>
+        <w:t>这个函数怎么处理染色体名的回去好好查查看看</w:t>
       </w:r>
     </w:p>
     <w:p>
@@ -3981,7 +3393,6 @@
           <w:numId w:val="3"/>
         </w:numPr>
       </w:pPr>
-      <w:proofErr w:type="spellStart"/>
       <w:r>
         <w:rPr>
           <w:rFonts w:ascii="Consolas" w:hAnsi="Consolas" w:cs="Consolas"/>
@@ -3993,7 +3404,6 @@
         </w:rPr>
         <w:t>getRefSeqBypos_faster</w:t>
       </w:r>
-      <w:proofErr w:type="spellEnd"/>
     </w:p>
     <w:p>
       <w:pPr>
@@ -4016,178 +3426,7 @@
           <w:sz w:val="18"/>
           <w:szCs w:val="18"/>
         </w:rPr>
-        <w:t xml:space="preserve">def </w:t>
-      </w:r>
-      <w:proofErr w:type="spellStart"/>
-      <w:r>
-        <w:rPr>
-          <w:rFonts w:ascii="Microsoft YaHei UI" w:eastAsia="Microsoft YaHei UI" w:cs="Microsoft YaHei UI"/>
-          <w:kern w:val="0"/>
-          <w:sz w:val="18"/>
-          <w:szCs w:val="18"/>
-        </w:rPr>
-        <w:t>getRefSeqBypos_</w:t>
-      </w:r>
-      <w:proofErr w:type="gramStart"/>
-      <w:r>
-        <w:rPr>
-          <w:rFonts w:ascii="Microsoft YaHei UI" w:eastAsia="Microsoft YaHei UI" w:cs="Microsoft YaHei UI"/>
-          <w:kern w:val="0"/>
-          <w:sz w:val="18"/>
-          <w:szCs w:val="18"/>
-        </w:rPr>
-        <w:t>faster</w:t>
-      </w:r>
-      <w:proofErr w:type="spellEnd"/>
-      <w:r>
-        <w:rPr>
-          <w:rFonts w:ascii="Microsoft YaHei UI" w:eastAsia="Microsoft YaHei UI" w:cs="Microsoft YaHei UI"/>
-          <w:kern w:val="0"/>
-          <w:sz w:val="18"/>
-          <w:szCs w:val="18"/>
-        </w:rPr>
-        <w:t>(</w:t>
-      </w:r>
-      <w:proofErr w:type="spellStart"/>
-      <w:proofErr w:type="gramEnd"/>
-      <w:r>
-        <w:rPr>
-          <w:rFonts w:ascii="Microsoft YaHei UI" w:eastAsia="Microsoft YaHei UI" w:cs="Microsoft YaHei UI"/>
-          <w:kern w:val="0"/>
-          <w:sz w:val="18"/>
-          <w:szCs w:val="18"/>
-        </w:rPr>
-        <w:t>refFastahandle</w:t>
-      </w:r>
-      <w:proofErr w:type="spellEnd"/>
-      <w:r>
-        <w:rPr>
-          <w:rFonts w:ascii="Microsoft YaHei UI" w:eastAsia="Microsoft YaHei UI" w:cs="Microsoft YaHei UI"/>
-          <w:kern w:val="0"/>
-          <w:sz w:val="18"/>
-          <w:szCs w:val="18"/>
-        </w:rPr>
-        <w:t xml:space="preserve">, </w:t>
-      </w:r>
-      <w:proofErr w:type="spellStart"/>
-      <w:r>
-        <w:rPr>
-          <w:rFonts w:ascii="Microsoft YaHei UI" w:eastAsia="Microsoft YaHei UI" w:cs="Microsoft YaHei UI"/>
-          <w:kern w:val="0"/>
-          <w:sz w:val="18"/>
-          <w:szCs w:val="18"/>
-        </w:rPr>
-        <w:t>fasterrefindex</w:t>
-      </w:r>
-      <w:proofErr w:type="spellEnd"/>
-      <w:r>
-        <w:rPr>
-          <w:rFonts w:ascii="Microsoft YaHei UI" w:eastAsia="Microsoft YaHei UI" w:cs="Microsoft YaHei UI"/>
-          <w:kern w:val="0"/>
-          <w:sz w:val="18"/>
-          <w:szCs w:val="18"/>
-        </w:rPr>
-        <w:t xml:space="preserve">, </w:t>
-      </w:r>
-      <w:proofErr w:type="spellStart"/>
-      <w:r>
-        <w:rPr>
-          <w:rFonts w:ascii="Microsoft YaHei UI" w:eastAsia="Microsoft YaHei UI" w:cs="Microsoft YaHei UI"/>
-          <w:kern w:val="0"/>
-          <w:sz w:val="18"/>
-          <w:szCs w:val="18"/>
-        </w:rPr>
-        <w:t>currentChromNO</w:t>
-      </w:r>
-      <w:proofErr w:type="spellEnd"/>
-      <w:r>
-        <w:rPr>
-          <w:rFonts w:ascii="Microsoft YaHei UI" w:eastAsia="Microsoft YaHei UI" w:cs="Microsoft YaHei UI"/>
-          <w:kern w:val="0"/>
-          <w:sz w:val="18"/>
-          <w:szCs w:val="18"/>
-        </w:rPr>
-        <w:t xml:space="preserve">, </w:t>
-      </w:r>
-      <w:proofErr w:type="spellStart"/>
-      <w:r>
-        <w:rPr>
-          <w:rFonts w:ascii="Microsoft YaHei UI" w:eastAsia="Microsoft YaHei UI" w:cs="Microsoft YaHei UI"/>
-          <w:kern w:val="0"/>
-          <w:sz w:val="18"/>
-          <w:szCs w:val="18"/>
-        </w:rPr>
-        <w:t>startpos</w:t>
-      </w:r>
-      <w:proofErr w:type="spellEnd"/>
-      <w:r>
-        <w:rPr>
-          <w:rFonts w:ascii="Microsoft YaHei UI" w:eastAsia="Microsoft YaHei UI" w:cs="Microsoft YaHei UI"/>
-          <w:kern w:val="0"/>
-          <w:sz w:val="18"/>
-          <w:szCs w:val="18"/>
-        </w:rPr>
-        <w:t xml:space="preserve">, </w:t>
-      </w:r>
-      <w:proofErr w:type="spellStart"/>
-      <w:r>
-        <w:rPr>
-          <w:rFonts w:ascii="Microsoft YaHei UI" w:eastAsia="Microsoft YaHei UI" w:cs="Microsoft YaHei UI"/>
-          <w:kern w:val="0"/>
-          <w:sz w:val="18"/>
-          <w:szCs w:val="18"/>
-        </w:rPr>
-        <w:t>endpos</w:t>
-      </w:r>
-      <w:proofErr w:type="spellEnd"/>
-      <w:r>
-        <w:rPr>
-          <w:rFonts w:ascii="Microsoft YaHei UI" w:eastAsia="Microsoft YaHei UI" w:cs="Microsoft YaHei UI"/>
-          <w:kern w:val="0"/>
-          <w:sz w:val="18"/>
-          <w:szCs w:val="18"/>
-        </w:rPr>
-        <w:t xml:space="preserve">,  </w:t>
-      </w:r>
-      <w:proofErr w:type="spellStart"/>
-      <w:r>
-        <w:rPr>
-          <w:rFonts w:ascii="Microsoft YaHei UI" w:eastAsia="Microsoft YaHei UI" w:cs="Microsoft YaHei UI"/>
-          <w:kern w:val="0"/>
-          <w:sz w:val="18"/>
-          <w:szCs w:val="18"/>
-        </w:rPr>
-        <w:t>currentChromNOlen</w:t>
-      </w:r>
-      <w:proofErr w:type="spellEnd"/>
-      <w:r>
-        <w:rPr>
-          <w:rFonts w:ascii="Microsoft YaHei UI" w:eastAsia="Microsoft YaHei UI" w:cs="Microsoft YaHei UI"/>
-          <w:kern w:val="0"/>
-          <w:sz w:val="18"/>
-          <w:szCs w:val="18"/>
-        </w:rPr>
-        <w:t xml:space="preserve">=None, </w:t>
-      </w:r>
-      <w:proofErr w:type="spellStart"/>
-      <w:r>
-        <w:rPr>
-          <w:rFonts w:ascii="Microsoft YaHei UI" w:eastAsia="Microsoft YaHei UI" w:cs="Microsoft YaHei UI"/>
-          <w:kern w:val="0"/>
-          <w:sz w:val="18"/>
-          <w:szCs w:val="18"/>
-        </w:rPr>
-        <w:t>seektuple</w:t>
-      </w:r>
-      <w:proofErr w:type="spellEnd"/>
-      <w:r>
-        <w:rPr>
-          <w:rFonts w:ascii="Microsoft YaHei UI" w:eastAsia="Microsoft YaHei UI" w:cs="Microsoft YaHei UI"/>
-          <w:kern w:val="0"/>
-          <w:sz w:val="18"/>
-          <w:szCs w:val="18"/>
-        </w:rPr>
-        <w:t>=()):</w:t>
+        <w:t>def getRefSeqBypos_faster(refFastahandle, fasterrefindex, currentChromNO, startpos, endpos,  currentChromNOlen=None, seektuple=()):</w:t>
       </w:r>
     </w:p>
     <w:p>
@@ -4259,49 +3498,7 @@
           <w:sz w:val="18"/>
           <w:szCs w:val="18"/>
         </w:rPr>
-        <w:t xml:space="preserve">    </w:t>
-      </w:r>
-      <w:proofErr w:type="spellStart"/>
-      <w:r>
-        <w:rPr>
-          <w:rFonts w:ascii="Microsoft YaHei UI" w:eastAsia="Microsoft YaHei UI" w:cs="Microsoft YaHei UI"/>
-          <w:kern w:val="0"/>
-          <w:sz w:val="18"/>
-          <w:szCs w:val="18"/>
-        </w:rPr>
-        <w:t>seektuple</w:t>
-      </w:r>
-      <w:proofErr w:type="spellEnd"/>
-      <w:r>
-        <w:rPr>
-          <w:rFonts w:ascii="Microsoft YaHei UI" w:eastAsia="Microsoft YaHei UI" w:cs="Microsoft YaHei UI"/>
-          <w:kern w:val="0"/>
-          <w:sz w:val="18"/>
-          <w:szCs w:val="18"/>
-        </w:rPr>
-        <w:t>=(</w:t>
-      </w:r>
-      <w:proofErr w:type="spellStart"/>
-      <w:proofErr w:type="gramStart"/>
-      <w:r>
-        <w:rPr>
-          <w:rFonts w:ascii="Microsoft YaHei UI" w:eastAsia="Microsoft YaHei UI" w:cs="Microsoft YaHei UI"/>
-          <w:kern w:val="0"/>
-          <w:sz w:val="18"/>
-          <w:szCs w:val="18"/>
-        </w:rPr>
-        <w:t>filepos,basesbeforefilepos</w:t>
-      </w:r>
-      <w:proofErr w:type="spellEnd"/>
-      <w:proofErr w:type="gramEnd"/>
-      <w:r>
-        <w:rPr>
-          <w:rFonts w:ascii="Microsoft YaHei UI" w:eastAsia="Microsoft YaHei UI" w:cs="Microsoft YaHei UI"/>
-          <w:kern w:val="0"/>
-          <w:sz w:val="18"/>
-          <w:szCs w:val="18"/>
-        </w:rPr>
-        <w:t>)</w:t>
+        <w:t xml:space="preserve">    seektuple=(filepos,basesbeforefilepos)</w:t>
       </w:r>
     </w:p>
     <w:p>
@@ -4325,27 +3522,7 @@
           <w:sz w:val="18"/>
           <w:szCs w:val="18"/>
         </w:rPr>
-        <w:t xml:space="preserve">    the </w:t>
-      </w:r>
-      <w:proofErr w:type="spellStart"/>
-      <w:r>
-        <w:rPr>
-          <w:rFonts w:ascii="Microsoft YaHei UI" w:eastAsia="Microsoft YaHei UI" w:cs="Microsoft YaHei UI"/>
-          <w:kern w:val="0"/>
-          <w:sz w:val="18"/>
-          <w:szCs w:val="18"/>
-        </w:rPr>
-        <w:t>refSeqMap</w:t>
-      </w:r>
-      <w:proofErr w:type="spellEnd"/>
-      <w:r>
-        <w:rPr>
-          <w:rFonts w:ascii="Microsoft YaHei UI" w:eastAsia="Microsoft YaHei UI" w:cs="Microsoft YaHei UI"/>
-          <w:kern w:val="0"/>
-          <w:sz w:val="18"/>
-          <w:szCs w:val="18"/>
-        </w:rPr>
-        <w:t xml:space="preserve"> has only one chromosome's sequence</w:t>
+        <w:t xml:space="preserve">    the refSeqMap has only one chromosome's sequence</w:t>
       </w:r>
     </w:p>
     <w:p>
@@ -4369,19 +3546,8 @@
           <w:sz w:val="18"/>
           <w:szCs w:val="18"/>
         </w:rPr>
-        <w:t xml:space="preserve">    There is no restriction on </w:t>
-      </w:r>
-      <w:proofErr w:type="spellStart"/>
-      <w:r>
-        <w:rPr>
-          <w:rFonts w:ascii="Microsoft YaHei UI" w:eastAsia="Microsoft YaHei UI" w:cs="Microsoft YaHei UI"/>
-          <w:kern w:val="0"/>
-          <w:sz w:val="18"/>
-          <w:szCs w:val="18"/>
-        </w:rPr>
-        <w:t>refFastahander</w:t>
-      </w:r>
-      <w:proofErr w:type="spellEnd"/>
+        <w:t xml:space="preserve">    There is no restriction on refFastahander</w:t>
+      </w:r>
     </w:p>
     <w:p>
       <w:pPr>
@@ -4404,19 +3570,18 @@
           <w:sz w:val="18"/>
           <w:szCs w:val="18"/>
         </w:rPr>
-        <w:t xml:space="preserve">    </w:t>
-      </w:r>
-      <w:proofErr w:type="spellStart"/>
+        <w:t xml:space="preserve">    refindex must indexed by </w:t>
+      </w:r>
       <w:r>
         <w:rPr>
           <w:rFonts w:ascii="Microsoft YaHei UI" w:eastAsia="Microsoft YaHei UI" w:cs="Microsoft YaHei UI"/>
+          <w:color w:val="FF0000"/>
           <w:kern w:val="0"/>
           <w:sz w:val="18"/>
           <w:szCs w:val="18"/>
         </w:rPr>
-        <w:t>refindex</w:t>
-      </w:r>
-      <w:proofErr w:type="spellEnd"/>
+        <w:t xml:space="preserve">generateFasterRefIndex </w:t>
+      </w:r>
       <w:r>
         <w:rPr>
           <w:rFonts w:ascii="Microsoft YaHei UI" w:eastAsia="Microsoft YaHei UI" w:cs="Microsoft YaHei UI"/>
@@ -4424,41 +3589,8 @@
           <w:sz w:val="18"/>
           <w:szCs w:val="18"/>
         </w:rPr>
-        <w:t xml:space="preserve"> must indexed by </w:t>
-      </w:r>
-      <w:proofErr w:type="spellStart"/>
-      <w:r>
-        <w:rPr>
-          <w:rFonts w:ascii="Microsoft YaHei UI" w:eastAsia="Microsoft YaHei UI" w:cs="Microsoft YaHei UI"/>
-          <w:color w:val="FF0000"/>
-          <w:kern w:val="0"/>
-          <w:sz w:val="18"/>
-          <w:szCs w:val="18"/>
-        </w:rPr>
-        <w:t>generateFasterRefIndex</w:t>
-      </w:r>
-      <w:proofErr w:type="spellEnd"/>
-      <w:r>
-        <w:rPr>
-          <w:rFonts w:ascii="Microsoft YaHei UI" w:eastAsia="Microsoft YaHei UI" w:cs="Microsoft YaHei UI"/>
-          <w:color w:val="FF0000"/>
-          <w:kern w:val="0"/>
-          <w:sz w:val="18"/>
-          <w:szCs w:val="18"/>
-        </w:rPr>
-        <w:t xml:space="preserve"> </w:t>
-      </w:r>
-      <w:proofErr w:type="spellStart"/>
-      <w:r>
-        <w:rPr>
-          <w:rFonts w:ascii="Microsoft YaHei UI" w:eastAsia="Microsoft YaHei UI" w:cs="Microsoft YaHei UI"/>
-          <w:kern w:val="0"/>
-          <w:sz w:val="18"/>
-          <w:szCs w:val="18"/>
-        </w:rPr>
         <w:t>func</w:t>
       </w:r>
-      <w:proofErr w:type="spellEnd"/>
     </w:p>
     <w:p>
       <w:pPr>
@@ -4537,7 +3669,6 @@
           <w:numId w:val="3"/>
         </w:numPr>
       </w:pPr>
-      <w:proofErr w:type="spellStart"/>
       <w:r>
         <w:rPr>
           <w:rFonts w:ascii="Consolas" w:hAnsi="Consolas" w:cs="Consolas"/>
@@ -4548,7 +3679,6 @@
         </w:rPr>
         <w:t>getdepthByPos</w:t>
       </w:r>
-      <w:proofErr w:type="spellEnd"/>
       <w:r>
         <w:rPr>
           <w:rFonts w:ascii="Consolas" w:hAnsi="Consolas" w:cs="Consolas" w:hint="eastAsia"/>
@@ -4588,7 +3718,6 @@
         </w:rPr>
         <w:t>，所以</w:t>
       </w:r>
-      <w:proofErr w:type="spellStart"/>
       <w:r>
         <w:rPr>
           <w:rFonts w:ascii="Consolas" w:hAnsi="Consolas" w:cs="Consolas"/>
@@ -4599,7 +3728,6 @@
         </w:rPr>
         <w:t>getdepthByPos</w:t>
       </w:r>
-      <w:proofErr w:type="spellEnd"/>
       <w:r>
         <w:rPr>
           <w:rFonts w:ascii="Consolas" w:hAnsi="Consolas" w:cs="Consolas" w:hint="eastAsia"/>
@@ -4658,51 +3786,7 @@
           <w:sz w:val="20"/>
           <w:szCs w:val="20"/>
         </w:rPr>
-        <w:t>]*</w:t>
-      </w:r>
-      <w:proofErr w:type="spellStart"/>
-      <w:r>
-        <w:rPr>
-          <w:rFonts w:ascii="Consolas" w:hAnsi="Consolas" w:cs="Consolas" w:hint="eastAsia"/>
-          <w:bCs/>
-          <w:kern w:val="0"/>
-          <w:sz w:val="20"/>
-          <w:szCs w:val="20"/>
-        </w:rPr>
-        <w:t>len</w:t>
-      </w:r>
-      <w:proofErr w:type="spellEnd"/>
-      <w:r>
-        <w:rPr>
-          <w:rFonts w:ascii="Consolas" w:hAnsi="Consolas" w:cs="Consolas" w:hint="eastAsia"/>
-          <w:bCs/>
-          <w:kern w:val="0"/>
-          <w:sz w:val="20"/>
-          <w:szCs w:val="20"/>
-        </w:rPr>
-        <w:t>(</w:t>
-      </w:r>
-      <w:proofErr w:type="spellStart"/>
-      <w:r>
-        <w:rPr>
-          <w:rFonts w:ascii="Consolas" w:hAnsi="Consolas" w:cs="Consolas" w:hint="eastAsia"/>
-          <w:bCs/>
-          <w:kern w:val="0"/>
-          <w:sz w:val="20"/>
-          <w:szCs w:val="20"/>
-        </w:rPr>
-        <w:t>self.title</w:t>
-      </w:r>
-      <w:proofErr w:type="spellEnd"/>
-      <w:r>
-        <w:rPr>
-          <w:rFonts w:ascii="Consolas" w:hAnsi="Consolas" w:cs="Consolas" w:hint="eastAsia"/>
-          <w:bCs/>
-          <w:kern w:val="0"/>
-          <w:sz w:val="20"/>
-          <w:szCs w:val="20"/>
-        </w:rPr>
-        <w:t>)</w:t>
+        <w:t>]*len(self.title)</w:t>
       </w:r>
       <w:r>
         <w:rPr>
@@ -4724,7 +3808,6 @@
         </w:numPr>
         <w:ind w:firstLineChars="0"/>
       </w:pPr>
-      <w:proofErr w:type="spellStart"/>
       <w:r>
         <w:rPr>
           <w:rFonts w:ascii="Consolas" w:hAnsi="Consolas" w:cs="Consolas"/>
@@ -4736,7 +3819,6 @@
         </w:rPr>
         <w:t>GATK_depthfile</w:t>
       </w:r>
-      <w:proofErr w:type="spellEnd"/>
       <w:r>
         <w:rPr>
           <w:rFonts w:ascii="Consolas" w:hAnsi="Consolas" w:cs="Consolas" w:hint="eastAsia"/>
@@ -4748,7 +3830,6 @@
         </w:rPr>
         <w:t>函数中的</w:t>
       </w:r>
-      <w:proofErr w:type="spellStart"/>
       <w:r>
         <w:rPr>
           <w:rFonts w:ascii="Consolas" w:hAnsi="Consolas" w:cs="Consolas"/>
@@ -4760,7 +3841,6 @@
         </w:rPr>
         <w:t>getdepthByPos_optimized</w:t>
       </w:r>
-      <w:proofErr w:type="spellEnd"/>
       <w:r>
         <w:rPr>
           <w:rFonts w:ascii="Consolas" w:hAnsi="Consolas" w:cs="Consolas" w:hint="eastAsia"/>
@@ -4772,7 +3852,6 @@
         </w:rPr>
         <w:t>方法为</w:t>
       </w:r>
-      <w:proofErr w:type="spellStart"/>
       <w:r>
         <w:rPr>
           <w:rFonts w:ascii="Consolas" w:hAnsi="Consolas" w:cs="Consolas"/>
@@ -4783,7 +3862,6 @@
         </w:rPr>
         <w:t>getdepthByPos</w:t>
       </w:r>
-      <w:proofErr w:type="spellEnd"/>
       <w:r>
         <w:rPr>
           <w:rFonts w:ascii="Consolas" w:hAnsi="Consolas" w:cs="Consolas" w:hint="eastAsia"/>
@@ -4808,35 +3886,7 @@
         <w:rPr>
           <w:rFonts w:hint="eastAsia"/>
         </w:rPr>
-        <w:t>读入方式改为read()读入内存，在其中结构化为位置作为键的map，</w:t>
-      </w:r>
-      <w:proofErr w:type="gramStart"/>
-      <w:r>
-        <w:rPr>
-          <w:rFonts w:hint="eastAsia"/>
-        </w:rPr>
-        <w:t>然后再该</w:t>
-      </w:r>
-      <w:proofErr w:type="gramEnd"/>
-      <w:r>
-        <w:rPr>
-          <w:rFonts w:hint="eastAsia"/>
-        </w:rPr>
-        <w:t>map中查找位置，而非</w:t>
-      </w:r>
-      <w:proofErr w:type="spellStart"/>
-      <w:r>
-        <w:rPr>
-          <w:rFonts w:hint="eastAsia"/>
-        </w:rPr>
-        <w:t>readline</w:t>
-      </w:r>
-      <w:proofErr w:type="spellEnd"/>
-      <w:r>
-        <w:rPr>
-          <w:rFonts w:hint="eastAsia"/>
-        </w:rPr>
-        <w:t>()的方式从硬盘查找位置</w:t>
+        <w:t>读入方式改为read()读入内存，在其中结构化为位置作为键的map，然后再该map中查找位置，而非readline()的方式从硬盘查找位置</w:t>
       </w:r>
     </w:p>
     <w:p>
@@ -4852,35 +3902,7 @@
         <w:rPr>
           <w:rFonts w:hint="eastAsia"/>
         </w:rPr>
-        <w:t>多次实例化</w:t>
-      </w:r>
-      <w:proofErr w:type="spellStart"/>
-      <w:r>
-        <w:rPr>
-          <w:rFonts w:hint="eastAsia"/>
-        </w:rPr>
-        <w:t>GATK_depthfile</w:t>
-      </w:r>
-      <w:proofErr w:type="spellEnd"/>
-      <w:r>
-        <w:rPr>
-          <w:rFonts w:hint="eastAsia"/>
-        </w:rPr>
-        <w:t>类时，可能都是对一个</w:t>
-      </w:r>
-      <w:proofErr w:type="spellStart"/>
-      <w:r>
-        <w:rPr>
-          <w:rFonts w:hint="eastAsia"/>
-        </w:rPr>
-        <w:t>gatkdepth</w:t>
-      </w:r>
-      <w:proofErr w:type="spellEnd"/>
-      <w:r>
-        <w:rPr>
-          <w:rFonts w:hint="eastAsia"/>
-        </w:rPr>
-        <w:t>文件经行实例化，那么用这样的逻辑来避免多次生成map，由于每次查找某个染色体的某个位置都一定要把这个染色体的depth都加载到内存，而单线程程序一般会生成多个实例，而且处理的时候同时处理同一个染色体，所以如果这几个实例都使用一个depth文件，则可以加载一次内存就够了。而多线程程序中不同线程不一定会在同一个时间处理同一个染色体，所以一定要为每个对象加载一次。是否加载通过如下逻辑判断，如果是多线程 或者 还没有加载 或者 将加载不同文件，</w:t>
+        <w:t>多次实例化GATK_depthfile类时，可能都是对一个gatkdepth文件经行实例化，那么用这样的逻辑来避免多次生成map，由于每次查找某个染色体的某个位置都一定要把这个染色体的depth都加载到内存，而单线程程序一般会生成多个实例，而且处理的时候同时处理同一个染色体，所以如果这几个实例都使用一个depth文件，则可以加载一次内存就够了。而多线程程序中不同线程不一定会在同一个时间处理同一个染色体，所以一定要为每个对象加载一次。是否加载通过如下逻辑判断，如果是多线程 或者 还没有加载 或者 将加载不同文件，</w:t>
       </w:r>
       <w:r>
         <w:rPr>
@@ -4953,7 +3975,6 @@
           <w:szCs w:val="21"/>
         </w:rPr>
       </w:pPr>
-      <w:proofErr w:type="spellStart"/>
       <w:r>
         <w:rPr>
           <w:rFonts w:ascii="Consolas" w:hAnsi="Consolas" w:cs="Consolas" w:hint="eastAsia"/>
@@ -4974,7 +3995,6 @@
         </w:rPr>
         <w:t>etflankseqs</w:t>
       </w:r>
-      <w:proofErr w:type="spellEnd"/>
       <w:r>
         <w:rPr>
           <w:rFonts w:ascii="Consolas" w:hAnsi="Consolas" w:cs="Consolas" w:hint="eastAsia"/>
@@ -4985,7 +4005,6 @@
         </w:rPr>
         <w:t>函数，对</w:t>
       </w:r>
-      <w:proofErr w:type="spellStart"/>
       <w:r>
         <w:rPr>
           <w:rFonts w:ascii="Consolas" w:hAnsi="Consolas" w:cs="Consolas" w:hint="eastAsia"/>
@@ -4996,7 +4015,6 @@
         </w:rPr>
         <w:t>vcf</w:t>
       </w:r>
-      <w:proofErr w:type="spellEnd"/>
       <w:r>
         <w:rPr>
           <w:rFonts w:ascii="Consolas" w:hAnsi="Consolas" w:cs="Consolas" w:hint="eastAsia"/>
@@ -5007,7 +4025,6 @@
         </w:rPr>
         <w:t>数据表中（一般为</w:t>
       </w:r>
-      <w:proofErr w:type="spellStart"/>
       <w:r>
         <w:rPr>
           <w:rFonts w:ascii="Consolas" w:hAnsi="Consolas" w:cs="Consolas" w:hint="eastAsia"/>
@@ -5016,9 +4033,8 @@
           <w:kern w:val="0"/>
           <w:szCs w:val="21"/>
         </w:rPr>
-        <w:t>toplevel</w:t>
-      </w:r>
-      <w:proofErr w:type="spellEnd"/>
+        <w:t>toplevel vcf</w:t>
+      </w:r>
       <w:r>
         <w:rPr>
           <w:rFonts w:ascii="Consolas" w:hAnsi="Consolas" w:cs="Consolas" w:hint="eastAsia"/>
@@ -5027,9 +4043,8 @@
           <w:kern w:val="0"/>
           <w:szCs w:val="21"/>
         </w:rPr>
-        <w:t xml:space="preserve"> </w:t>
-      </w:r>
-      <w:proofErr w:type="spellStart"/>
+        <w:t>表），的某个染色体号的所有</w:t>
+      </w:r>
       <w:r>
         <w:rPr>
           <w:rFonts w:ascii="Consolas" w:hAnsi="Consolas" w:cs="Consolas" w:hint="eastAsia"/>
@@ -5038,9 +4053,8 @@
           <w:kern w:val="0"/>
           <w:szCs w:val="21"/>
         </w:rPr>
-        <w:t>vcf</w:t>
-      </w:r>
-      <w:proofErr w:type="spellEnd"/>
+        <w:t>snp</w:t>
+      </w:r>
       <w:r>
         <w:rPr>
           <w:rFonts w:ascii="Consolas" w:hAnsi="Consolas" w:cs="Consolas" w:hint="eastAsia"/>
@@ -5049,9 +4063,8 @@
           <w:kern w:val="0"/>
           <w:szCs w:val="21"/>
         </w:rPr>
-        <w:t>表），的某个染色体号的所有</w:t>
-      </w:r>
-      <w:proofErr w:type="spellStart"/>
+        <w:t>，输出其上下游的序列，并且填充表中的</w:t>
+      </w:r>
       <w:r>
         <w:rPr>
           <w:rFonts w:ascii="Consolas" w:hAnsi="Consolas" w:cs="Consolas" w:hint="eastAsia"/>
@@ -5060,51 +4073,28 @@
           <w:kern w:val="0"/>
           <w:szCs w:val="21"/>
         </w:rPr>
+        <w:t>context</w:t>
+      </w:r>
+      <w:r>
+        <w:rPr>
+          <w:rFonts w:ascii="Consolas" w:hAnsi="Consolas" w:cs="Consolas" w:hint="eastAsia"/>
+          <w:bCs/>
+          <w:color w:val="000000"/>
+          <w:kern w:val="0"/>
+          <w:szCs w:val="21"/>
+        </w:rPr>
+        <w:t>项为该</w:t>
+      </w:r>
+      <w:r>
+        <w:rPr>
+          <w:rFonts w:ascii="Consolas" w:hAnsi="Consolas" w:cs="Consolas" w:hint="eastAsia"/>
+          <w:bCs/>
+          <w:color w:val="000000"/>
+          <w:kern w:val="0"/>
+          <w:szCs w:val="21"/>
+        </w:rPr>
         <w:t>snp</w:t>
       </w:r>
-      <w:proofErr w:type="spellEnd"/>
-      <w:r>
-        <w:rPr>
-          <w:rFonts w:ascii="Consolas" w:hAnsi="Consolas" w:cs="Consolas" w:hint="eastAsia"/>
-          <w:bCs/>
-          <w:color w:val="000000"/>
-          <w:kern w:val="0"/>
-          <w:szCs w:val="21"/>
-        </w:rPr>
-        <w:t>，输出其上下游的序列，并且填充表中的</w:t>
-      </w:r>
-      <w:r>
-        <w:rPr>
-          <w:rFonts w:ascii="Consolas" w:hAnsi="Consolas" w:cs="Consolas" w:hint="eastAsia"/>
-          <w:bCs/>
-          <w:color w:val="000000"/>
-          <w:kern w:val="0"/>
-          <w:szCs w:val="21"/>
-        </w:rPr>
-        <w:t>context</w:t>
-      </w:r>
-      <w:r>
-        <w:rPr>
-          <w:rFonts w:ascii="Consolas" w:hAnsi="Consolas" w:cs="Consolas" w:hint="eastAsia"/>
-          <w:bCs/>
-          <w:color w:val="000000"/>
-          <w:kern w:val="0"/>
-          <w:szCs w:val="21"/>
-        </w:rPr>
-        <w:t>项为该</w:t>
-      </w:r>
-      <w:proofErr w:type="spellStart"/>
-      <w:r>
-        <w:rPr>
-          <w:rFonts w:ascii="Consolas" w:hAnsi="Consolas" w:cs="Consolas" w:hint="eastAsia"/>
-          <w:bCs/>
-          <w:color w:val="000000"/>
-          <w:kern w:val="0"/>
-          <w:szCs w:val="21"/>
-        </w:rPr>
-        <w:t>snp</w:t>
-      </w:r>
-      <w:proofErr w:type="spellEnd"/>
       <w:r>
         <w:rPr>
           <w:rFonts w:ascii="Consolas" w:hAnsi="Consolas" w:cs="Consolas" w:hint="eastAsia"/>
@@ -5138,7 +4128,6 @@
         </w:rPr>
         <w:t>输入参数为：染色体号，染色体长度，</w:t>
       </w:r>
-      <w:proofErr w:type="spellStart"/>
       <w:r>
         <w:rPr>
           <w:rFonts w:ascii="Consolas" w:hAnsi="Consolas" w:cs="Consolas" w:hint="eastAsia"/>
@@ -5149,7 +4138,6 @@
         </w:rPr>
         <w:t>yao</w:t>
       </w:r>
-      <w:proofErr w:type="spellEnd"/>
     </w:p>
     <w:p>
       <w:pPr>
@@ -5182,21 +4170,23 @@
         <w:rPr>
           <w:rFonts w:hint="eastAsia"/>
         </w:rPr>
-        <w:t>控制在计算</w:t>
-      </w:r>
-      <w:proofErr w:type="spellStart"/>
+        <w:t>控制在计算fst时，是否考虑差异固定；</w:t>
+      </w:r>
+    </w:p>
+    <w:p>
       <w:r>
         <w:rPr>
           <w:rFonts w:hint="eastAsia"/>
         </w:rPr>
-        <w:t>fst</w:t>
-      </w:r>
-      <w:proofErr w:type="spellEnd"/>
+        <w:t>当判断是否某个位点在该种群中固定时，用如下思路：</w:t>
+      </w:r>
+    </w:p>
+    <w:p>
       <w:r>
         <w:rPr>
           <w:rFonts w:hint="eastAsia"/>
         </w:rPr>
-        <w:t>时，是否考虑差异固定；</w:t>
+        <w:t>总的来讲，当某个种群所有被测个体都是一种等位基因时，则该位点当做在该种群中固定，否则不当做固定位点。</w:t>
       </w:r>
     </w:p>
     <w:p>
@@ -5204,7 +4194,7 @@
         <w:rPr>
           <w:rFonts w:hint="eastAsia"/>
         </w:rPr>
-        <w:t>当判断是否某个位点在该种群中固定时，用如下思路：</w:t>
+        <w:t>那么，具体来讲，判断根据两个文件（或者仅根据vcf），一个是vcf中的depth，当vcf没有该位点时根据GATK.depth文件判断：</w:t>
       </w:r>
     </w:p>
     <w:p>
@@ -5212,296 +4202,26 @@
         <w:rPr>
           <w:rFonts w:hint="eastAsia"/>
         </w:rPr>
-        <w:t>总的来讲，当某个种群所有被测个体都是一种等位基因时，则该位点</w:t>
-      </w:r>
-      <w:proofErr w:type="gramStart"/>
+        <w:t>如果是pool的数据，vcf中的depth，与GATK.depth文件中的depth等同，判断是否固定的深度标准是GATK.depth.summary中的</w:t>
+      </w:r>
+      <w:r>
+        <w:t>granular_median</w:t>
+      </w:r>
+    </w:p>
+    <w:p>
       <w:r>
         <w:rPr>
           <w:rFonts w:hint="eastAsia"/>
         </w:rPr>
-        <w:t>当做</w:t>
-      </w:r>
-      <w:proofErr w:type="gramEnd"/>
+        <w:t>如果是indvd的数据，则总共多少个个体的信息从vcf的title中得知，在vcf中，测到的AC等于个体数的话则判断固定为alt，如果vcf中没有该位点，GATK.depth文件中每个个体的深度如果超过4，则判定为固定位该位点。</w:t>
+      </w:r>
+    </w:p>
+    <w:p>
       <w:r>
         <w:rPr>
           <w:rFonts w:hint="eastAsia"/>
         </w:rPr>
-        <w:t>在该种群中固定，否则不</w:t>
-      </w:r>
-      <w:proofErr w:type="gramStart"/>
-      <w:r>
-        <w:rPr>
-          <w:rFonts w:hint="eastAsia"/>
-        </w:rPr>
-        <w:t>当做</w:t>
-      </w:r>
-      <w:proofErr w:type="gramEnd"/>
-      <w:r>
-        <w:rPr>
-          <w:rFonts w:hint="eastAsia"/>
-        </w:rPr>
-        <w:t>固定位点。</w:t>
-      </w:r>
-    </w:p>
-    <w:p>
-      <w:r>
-        <w:rPr>
-          <w:rFonts w:hint="eastAsia"/>
-        </w:rPr>
-        <w:t>那么，具体来讲，判断根据两个文件（或者仅根据</w:t>
-      </w:r>
-      <w:proofErr w:type="spellStart"/>
-      <w:r>
-        <w:rPr>
-          <w:rFonts w:hint="eastAsia"/>
-        </w:rPr>
-        <w:t>vcf</w:t>
-      </w:r>
-      <w:proofErr w:type="spellEnd"/>
-      <w:r>
-        <w:rPr>
-          <w:rFonts w:hint="eastAsia"/>
-        </w:rPr>
-        <w:t>），一个是</w:t>
-      </w:r>
-      <w:proofErr w:type="spellStart"/>
-      <w:r>
-        <w:rPr>
-          <w:rFonts w:hint="eastAsia"/>
-        </w:rPr>
-        <w:t>vcf</w:t>
-      </w:r>
-      <w:proofErr w:type="spellEnd"/>
-      <w:r>
-        <w:rPr>
-          <w:rFonts w:hint="eastAsia"/>
-        </w:rPr>
-        <w:t>中的depth，当</w:t>
-      </w:r>
-      <w:proofErr w:type="spellStart"/>
-      <w:r>
-        <w:rPr>
-          <w:rFonts w:hint="eastAsia"/>
-        </w:rPr>
-        <w:t>vcf</w:t>
-      </w:r>
-      <w:proofErr w:type="spellEnd"/>
-      <w:r>
-        <w:rPr>
-          <w:rFonts w:hint="eastAsia"/>
-        </w:rPr>
-        <w:t>没有该位点时根据</w:t>
-      </w:r>
-      <w:proofErr w:type="spellStart"/>
-      <w:r>
-        <w:rPr>
-          <w:rFonts w:hint="eastAsia"/>
-        </w:rPr>
-        <w:t>GATK.depth</w:t>
-      </w:r>
-      <w:proofErr w:type="spellEnd"/>
-      <w:r>
-        <w:rPr>
-          <w:rFonts w:hint="eastAsia"/>
-        </w:rPr>
-        <w:t>文件判断：</w:t>
-      </w:r>
-    </w:p>
-    <w:p>
-      <w:r>
-        <w:rPr>
-          <w:rFonts w:hint="eastAsia"/>
-        </w:rPr>
-        <w:t>如果是pool的数据，</w:t>
-      </w:r>
-      <w:proofErr w:type="spellStart"/>
-      <w:r>
-        <w:rPr>
-          <w:rFonts w:hint="eastAsia"/>
-        </w:rPr>
-        <w:t>vcf</w:t>
-      </w:r>
-      <w:proofErr w:type="spellEnd"/>
-      <w:r>
-        <w:rPr>
-          <w:rFonts w:hint="eastAsia"/>
-        </w:rPr>
-        <w:t>中的depth，与</w:t>
-      </w:r>
-      <w:proofErr w:type="spellStart"/>
-      <w:r>
-        <w:rPr>
-          <w:rFonts w:hint="eastAsia"/>
-        </w:rPr>
-        <w:t>GATK.depth</w:t>
-      </w:r>
-      <w:proofErr w:type="spellEnd"/>
-      <w:r>
-        <w:rPr>
-          <w:rFonts w:hint="eastAsia"/>
-        </w:rPr>
-        <w:t>文件中的depth等同，判断是否固定的深度标准是</w:t>
-      </w:r>
-      <w:proofErr w:type="spellStart"/>
-      <w:r>
-        <w:rPr>
-          <w:rFonts w:hint="eastAsia"/>
-        </w:rPr>
-        <w:t>GATK.depth.summary</w:t>
-      </w:r>
-      <w:proofErr w:type="spellEnd"/>
-      <w:r>
-        <w:rPr>
-          <w:rFonts w:hint="eastAsia"/>
-        </w:rPr>
-        <w:t>中的</w:t>
-      </w:r>
-      <w:proofErr w:type="spellStart"/>
-      <w:r>
-        <w:t>granular_median</w:t>
-      </w:r>
-      <w:proofErr w:type="spellEnd"/>
-    </w:p>
-    <w:p>
-      <w:r>
-        <w:rPr>
-          <w:rFonts w:hint="eastAsia"/>
-        </w:rPr>
-        <w:t>如果是</w:t>
-      </w:r>
-      <w:proofErr w:type="spellStart"/>
-      <w:r>
-        <w:rPr>
-          <w:rFonts w:hint="eastAsia"/>
-        </w:rPr>
-        <w:t>indvd</w:t>
-      </w:r>
-      <w:proofErr w:type="spellEnd"/>
-      <w:r>
-        <w:rPr>
-          <w:rFonts w:hint="eastAsia"/>
-        </w:rPr>
-        <w:t>的数据，则总共多少个个体的信息从</w:t>
-      </w:r>
-      <w:proofErr w:type="spellStart"/>
-      <w:r>
-        <w:rPr>
-          <w:rFonts w:hint="eastAsia"/>
-        </w:rPr>
-        <w:t>vcf</w:t>
-      </w:r>
-      <w:proofErr w:type="spellEnd"/>
-      <w:r>
-        <w:rPr>
-          <w:rFonts w:hint="eastAsia"/>
-        </w:rPr>
-        <w:t>的title中得知，在</w:t>
-      </w:r>
-      <w:proofErr w:type="spellStart"/>
-      <w:r>
-        <w:rPr>
-          <w:rFonts w:hint="eastAsia"/>
-        </w:rPr>
-        <w:t>vcf</w:t>
-      </w:r>
-      <w:proofErr w:type="spellEnd"/>
-      <w:r>
-        <w:rPr>
-          <w:rFonts w:hint="eastAsia"/>
-        </w:rPr>
-        <w:t>中，测到的AC等于个体数的话</w:t>
-      </w:r>
-      <w:proofErr w:type="gramStart"/>
-      <w:r>
-        <w:rPr>
-          <w:rFonts w:hint="eastAsia"/>
-        </w:rPr>
-        <w:t>则判断</w:t>
-      </w:r>
-      <w:proofErr w:type="gramEnd"/>
-      <w:r>
-        <w:rPr>
-          <w:rFonts w:hint="eastAsia"/>
-        </w:rPr>
-        <w:t>固定为alt，如果</w:t>
-      </w:r>
-      <w:proofErr w:type="spellStart"/>
-      <w:r>
-        <w:rPr>
-          <w:rFonts w:hint="eastAsia"/>
-        </w:rPr>
-        <w:t>vcf</w:t>
-      </w:r>
-      <w:proofErr w:type="spellEnd"/>
-      <w:r>
-        <w:rPr>
-          <w:rFonts w:hint="eastAsia"/>
-        </w:rPr>
-        <w:t>中没有该位点，</w:t>
-      </w:r>
-      <w:proofErr w:type="spellStart"/>
-      <w:r>
-        <w:rPr>
-          <w:rFonts w:hint="eastAsia"/>
-        </w:rPr>
-        <w:t>GATK.depth</w:t>
-      </w:r>
-      <w:proofErr w:type="spellEnd"/>
-      <w:r>
-        <w:rPr>
-          <w:rFonts w:hint="eastAsia"/>
-        </w:rPr>
-        <w:t>文件中每个个体的深度如果超过4，则判定为</w:t>
-      </w:r>
-      <w:proofErr w:type="gramStart"/>
-      <w:r>
-        <w:rPr>
-          <w:rFonts w:hint="eastAsia"/>
-        </w:rPr>
-        <w:t>固定位该</w:t>
-      </w:r>
-      <w:proofErr w:type="gramEnd"/>
-      <w:r>
-        <w:rPr>
-          <w:rFonts w:hint="eastAsia"/>
-        </w:rPr>
-        <w:t>位点。</w:t>
-      </w:r>
-    </w:p>
-    <w:p>
-      <w:r>
-        <w:rPr>
-          <w:rFonts w:hint="eastAsia"/>
-        </w:rPr>
-        <w:t>如果没有depth文件，则仅从</w:t>
-      </w:r>
-      <w:proofErr w:type="spellStart"/>
-      <w:r>
-        <w:rPr>
-          <w:rFonts w:hint="eastAsia"/>
-        </w:rPr>
-        <w:t>vcf</w:t>
-      </w:r>
-      <w:proofErr w:type="spellEnd"/>
-      <w:r>
-        <w:rPr>
-          <w:rFonts w:hint="eastAsia"/>
-        </w:rPr>
-        <w:t>中是否判定为固定（pool的话就是ref为0，</w:t>
-      </w:r>
-      <w:proofErr w:type="spellStart"/>
-      <w:r>
-        <w:rPr>
-          <w:rFonts w:hint="eastAsia"/>
-        </w:rPr>
-        <w:t>indvd</w:t>
-      </w:r>
-      <w:proofErr w:type="spellEnd"/>
-      <w:r>
-        <w:rPr>
-          <w:rFonts w:hint="eastAsia"/>
-        </w:rPr>
-        <w:t>的话就是ac=个体数），或有无该位点判断固定。</w:t>
+        <w:t>如果没有depth文件，则仅从vcf中是否判定为固定（pool的话就是ref为0，indvd的话就是ac=个体数），或有无该位点判断固定。</w:t>
       </w:r>
     </w:p>
     <w:p>
@@ -5529,187 +4249,67 @@
           <w:rFonts w:hint="eastAsia"/>
           <w:b/>
         </w:rPr>
-        <w:t>临时性添加了</w:t>
-      </w:r>
-      <w:proofErr w:type="spellStart"/>
+        <w:t>临时性添加了Caculate_df的功能，此种情况下只提供一个vcf文件，但要提供两个群体名列表文件，对应vcf文件的title。当不指定-f 参数时则不影响原来计算hp的功能。</w:t>
+      </w:r>
+    </w:p>
+    <w:p>
+      <w:pPr>
+        <w:rPr>
+          <w:b/>
+        </w:rPr>
+      </w:pPr>
+    </w:p>
+    <w:p>
+      <w:pPr>
+        <w:rPr>
+          <w:b/>
+        </w:rPr>
+      </w:pPr>
       <w:r>
         <w:rPr>
           <w:rFonts w:hint="eastAsia"/>
           <w:b/>
         </w:rPr>
-        <w:t>Caculate_df</w:t>
-      </w:r>
-      <w:proofErr w:type="spellEnd"/>
-      <w:r>
-        <w:rPr>
-          <w:rFonts w:hint="eastAsia"/>
+        <w:t>使用多sql的示例</w:t>
+      </w:r>
+    </w:p>
+    <w:p>
+      <w:pPr>
+        <w:rPr>
           <w:b/>
         </w:rPr>
-        <w:t>的功能，此种情况下只提供一个</w:t>
-      </w:r>
-      <w:proofErr w:type="spellStart"/>
-      <w:r>
-        <w:rPr>
-          <w:rFonts w:hint="eastAsia"/>
+      </w:pPr>
+      <w:r>
+        <w:rPr>
           <w:b/>
         </w:rPr>
-        <w:t>vcf</w:t>
-      </w:r>
-      <w:proofErr w:type="spellEnd"/>
-      <w:r>
-        <w:rPr>
-          <w:rFonts w:hint="eastAsia"/>
+        <w:t>&gt;&gt;&gt; dbvariantstools.operateDB("insert",*l,data=[('KB742382.1',26,".","AAA","bbb","p"),('KB742382.1',27,".","f","l","123,0")])</w:t>
+      </w:r>
+    </w:p>
+    <w:p>
+      <w:pPr>
+        <w:rPr>
           <w:b/>
         </w:rPr>
-        <w:t>文件，但要提供两个群体名列表文件，对应</w:t>
-      </w:r>
-      <w:proofErr w:type="spellStart"/>
-      <w:r>
-        <w:rPr>
-          <w:rFonts w:hint="eastAsia"/>
+      </w:pPr>
+      <w:r>
+        <w:rPr>
           <w:b/>
         </w:rPr>
-        <w:t>vcf</w:t>
-      </w:r>
-      <w:proofErr w:type="spellEnd"/>
-      <w:r>
-        <w:rPr>
-          <w:rFonts w:hint="eastAsia"/>
+        <w:t>0</w:t>
+      </w:r>
+    </w:p>
+    <w:p>
+      <w:pPr>
+        <w:rPr>
           <w:b/>
         </w:rPr>
-        <w:t>文件的title。当不指定-f 参数时则不影响原来计算hp的功能。</w:t>
-      </w:r>
-    </w:p>
-    <w:p>
-      <w:pPr>
+      </w:pPr>
+      <w:r>
         <w:rPr>
           <w:b/>
         </w:rPr>
-      </w:pPr>
-    </w:p>
-    <w:p>
-      <w:pPr>
-        <w:rPr>
-          <w:b/>
-        </w:rPr>
-      </w:pPr>
-      <w:r>
-        <w:rPr>
-          <w:rFonts w:hint="eastAsia"/>
-          <w:b/>
-        </w:rPr>
-        <w:t>使用多</w:t>
-      </w:r>
-      <w:proofErr w:type="spellStart"/>
-      <w:r>
-        <w:rPr>
-          <w:rFonts w:hint="eastAsia"/>
-          <w:b/>
-        </w:rPr>
-        <w:t>sql</w:t>
-      </w:r>
-      <w:proofErr w:type="spellEnd"/>
-      <w:r>
-        <w:rPr>
-          <w:rFonts w:hint="eastAsia"/>
-          <w:b/>
-        </w:rPr>
-        <w:t>的示例</w:t>
-      </w:r>
-    </w:p>
-    <w:p>
-      <w:pPr>
-        <w:rPr>
-          <w:b/>
-        </w:rPr>
-      </w:pPr>
-      <w:r>
-        <w:rPr>
-          <w:b/>
-        </w:rPr>
-        <w:t xml:space="preserve">&gt;&gt;&gt; </w:t>
-      </w:r>
-      <w:proofErr w:type="gramStart"/>
-      <w:r>
-        <w:rPr>
-          <w:b/>
-        </w:rPr>
-        <w:t>dbvariantstools.operateDB</w:t>
-      </w:r>
-      <w:proofErr w:type="gramEnd"/>
-      <w:r>
-        <w:rPr>
-          <w:b/>
-        </w:rPr>
-        <w:t>("insert",*l,data=[('KB742382.1',26,".","AAA","bbb","p"),('KB742382.1',27,".","f","l","123,0")])</w:t>
-      </w:r>
-    </w:p>
-    <w:p>
-      <w:pPr>
-        <w:rPr>
-          <w:b/>
-        </w:rPr>
-      </w:pPr>
-      <w:r>
-        <w:rPr>
-          <w:b/>
-        </w:rPr>
-        <w:t>0</w:t>
-      </w:r>
-    </w:p>
-    <w:p>
-      <w:pPr>
-        <w:rPr>
-          <w:b/>
-        </w:rPr>
-      </w:pPr>
-      <w:r>
-        <w:rPr>
-          <w:b/>
-        </w:rPr>
-        <w:t>&gt;&gt;&gt; l</w:t>
-      </w:r>
-      <w:proofErr w:type="gramStart"/>
-      <w:r>
-        <w:rPr>
-          <w:b/>
-        </w:rPr>
-        <w:t>=[</w:t>
-      </w:r>
-      <w:proofErr w:type="gramEnd"/>
-      <w:r>
-        <w:rPr>
-          <w:b/>
-        </w:rPr>
-        <w:t>"insert into mspsgjlksy10pop_toplevel_pekingduckref_new(chrID,snp_pos,snpID,ref_base,alt_base,wegeon__pool_withindel_vcf_alt) VALUES(%</w:t>
-      </w:r>
-      <w:proofErr w:type="spellStart"/>
-      <w:r>
-        <w:rPr>
-          <w:b/>
-        </w:rPr>
-        <w:t>s,%s,%s,%s,%s,%s</w:t>
-      </w:r>
-      <w:proofErr w:type="spellEnd"/>
-      <w:r>
-        <w:rPr>
-          <w:b/>
-        </w:rPr>
-        <w:t>)","insert into mspsgjlksy10pop_toplevel_pekingduckref_new(chrID,snp_pos,snpID,ref_base,alt_base,wegeon__pool_withindel_vcf_dep) VALUES(%</w:t>
-      </w:r>
-      <w:proofErr w:type="spellStart"/>
-      <w:r>
-        <w:rPr>
-          <w:b/>
-        </w:rPr>
-        <w:t>s,%s,%s,%s,%s,%s</w:t>
-      </w:r>
-      <w:proofErr w:type="spellEnd"/>
-      <w:r>
-        <w:rPr>
-          <w:b/>
-        </w:rPr>
-        <w:t>)"]</w:t>
+        <w:t>&gt;&gt;&gt; l=["insert into mspsgjlksy10pop_toplevel_pekingduckref_new(chrID,snp_pos,snpID,ref_base,alt_base,wegeon__pool_withindel_vcf_alt) VALUES(%s,%s,%s,%s,%s,%s)","insert into mspsgjlksy10pop_toplevel_pekingduckref_new(chrID,snp_pos,snpID,ref_base,alt_base,wegeon__pool_withindel_vcf_dep) VALUES(%s,%s,%s,%s,%s,%s)"]</w:t>
       </w:r>
     </w:p>
     <w:p>
@@ -5718,7 +4318,6 @@
           <w:color w:val="000000" w:themeColor="text1"/>
         </w:rPr>
       </w:pPr>
-      <w:proofErr w:type="spellStart"/>
       <w:r>
         <w:rPr>
           <w:rFonts w:ascii="Consolas" w:hAnsi="Consolas" w:cs="Consolas"/>
@@ -5731,7 +4330,6 @@
         <w:lastRenderedPageBreak/>
         <w:t>generateIndexByChrom</w:t>
       </w:r>
-      <w:proofErr w:type="spellEnd"/>
       <w:r>
         <w:rPr>
           <w:rFonts w:ascii="Consolas" w:hAnsi="Consolas" w:cs="Consolas" w:hint="eastAsia"/>
@@ -5765,7 +4363,6 @@
         </w:rPr>
         <w:t xml:space="preserve"> </w:t>
       </w:r>
-      <w:proofErr w:type="spellStart"/>
       <w:r>
         <w:rPr>
           <w:rFonts w:ascii="Consolas" w:hAnsi="Consolas" w:cs="Consolas"/>
@@ -5777,7 +4374,6 @@
         </w:rPr>
         <w:t>generateFasterRefIndex</w:t>
       </w:r>
-      <w:proofErr w:type="spellEnd"/>
       <w:r>
         <w:rPr>
           <w:rFonts w:ascii="Consolas" w:hAnsi="Consolas" w:cs="Consolas" w:hint="eastAsia"/>
@@ -5789,6 +4385,504 @@
         </w:rPr>
         <w:t>的区别？</w:t>
       </w:r>
+    </w:p>
+    <w:p>
+      <w:pPr>
+        <w:pStyle w:val="a4"/>
+        <w:ind w:left="840" w:firstLineChars="0" w:firstLine="0"/>
+        <w:rPr>
+          <w:rFonts w:ascii="Times New Roman" w:eastAsia="宋体" w:hAnsi="Times New Roman" w:cs="Times New Roman"/>
+          <w:sz w:val="24"/>
+          <w:szCs w:val="24"/>
+        </w:rPr>
+      </w:pPr>
+    </w:p>
+    <w:p>
+      <w:pPr>
+        <w:rPr>
+          <w:rFonts w:ascii="Consolas" w:hAnsi="Consolas" w:cs="Consolas"/>
+          <w:bCs/>
+          <w:color w:val="000000" w:themeColor="text1"/>
+          <w:kern w:val="0"/>
+          <w:sz w:val="20"/>
+          <w:szCs w:val="20"/>
+        </w:rPr>
+      </w:pPr>
+      <w:r>
+        <w:rPr>
+          <w:rFonts w:ascii="Consolas" w:hAnsi="Consolas" w:cs="Consolas"/>
+          <w:bCs/>
+          <w:color w:val="000000" w:themeColor="text1"/>
+          <w:kern w:val="0"/>
+          <w:sz w:val="20"/>
+          <w:szCs w:val="20"/>
+        </w:rPr>
+        <w:t>generateIndexByChrom</w:t>
+      </w:r>
+      <w:r>
+        <w:rPr>
+          <w:rFonts w:ascii="Consolas" w:hAnsi="Consolas" w:cs="Consolas" w:hint="eastAsia"/>
+          <w:bCs/>
+          <w:color w:val="000000" w:themeColor="text1"/>
+          <w:kern w:val="0"/>
+          <w:sz w:val="20"/>
+          <w:szCs w:val="20"/>
+        </w:rPr>
+        <w:t xml:space="preserve"> </w:t>
+      </w:r>
+      <w:r>
+        <w:rPr>
+          <w:rFonts w:ascii="Consolas" w:hAnsi="Consolas" w:cs="Consolas" w:hint="eastAsia"/>
+          <w:bCs/>
+          <w:color w:val="000000" w:themeColor="text1"/>
+          <w:kern w:val="0"/>
+          <w:sz w:val="20"/>
+          <w:szCs w:val="20"/>
+        </w:rPr>
+        <w:t>与</w:t>
+      </w:r>
+      <w:r>
+        <w:rPr>
+          <w:rFonts w:ascii="Consolas" w:hAnsi="Consolas" w:cs="Consolas"/>
+          <w:bCs/>
+          <w:color w:val="000000" w:themeColor="text1"/>
+          <w:kern w:val="0"/>
+          <w:sz w:val="20"/>
+          <w:szCs w:val="20"/>
+        </w:rPr>
+        <w:t>getRefSeqMap</w:t>
+      </w:r>
+      <w:r>
+        <w:rPr>
+          <w:rFonts w:ascii="Consolas" w:hAnsi="Consolas" w:cs="Consolas" w:hint="eastAsia"/>
+          <w:bCs/>
+          <w:color w:val="000000" w:themeColor="text1"/>
+          <w:kern w:val="0"/>
+          <w:sz w:val="20"/>
+          <w:szCs w:val="20"/>
+        </w:rPr>
+        <w:t>配套使用。</w:t>
+      </w:r>
+    </w:p>
+    <w:p>
+      <w:pPr>
+        <w:rPr>
+          <w:rFonts w:ascii="Consolas" w:hAnsi="Consolas" w:cs="Consolas"/>
+          <w:bCs/>
+          <w:color w:val="000000" w:themeColor="text1"/>
+          <w:kern w:val="0"/>
+          <w:sz w:val="20"/>
+          <w:szCs w:val="20"/>
+        </w:rPr>
+      </w:pPr>
+    </w:p>
+    <w:p>
+      <w:pPr>
+        <w:rPr>
+          <w:rFonts w:ascii="Consolas" w:hAnsi="Consolas" w:cs="Consolas"/>
+          <w:bCs/>
+          <w:color w:val="000000" w:themeColor="text1"/>
+          <w:kern w:val="0"/>
+          <w:sz w:val="20"/>
+          <w:szCs w:val="20"/>
+        </w:rPr>
+      </w:pPr>
+      <w:r>
+        <w:rPr>
+          <w:rFonts w:ascii="Consolas" w:hAnsi="Consolas" w:cs="Consolas"/>
+          <w:bCs/>
+          <w:color w:val="000000" w:themeColor="text1"/>
+          <w:kern w:val="0"/>
+          <w:sz w:val="20"/>
+          <w:szCs w:val="20"/>
+        </w:rPr>
+        <w:t xml:space="preserve">generateFasterRefIndex </w:t>
+      </w:r>
+      <w:r>
+        <w:rPr>
+          <w:rFonts w:ascii="Consolas" w:hAnsi="Consolas" w:cs="Consolas" w:hint="eastAsia"/>
+          <w:bCs/>
+          <w:color w:val="000000" w:themeColor="text1"/>
+          <w:kern w:val="0"/>
+          <w:sz w:val="20"/>
+          <w:szCs w:val="20"/>
+        </w:rPr>
+        <w:t>中</w:t>
+      </w:r>
+      <w:r>
+        <w:rPr>
+          <w:rFonts w:ascii="Consolas" w:hAnsi="Consolas" w:cs="Consolas"/>
+          <w:bCs/>
+          <w:color w:val="000000" w:themeColor="text1"/>
+          <w:kern w:val="0"/>
+          <w:sz w:val="20"/>
+          <w:szCs w:val="20"/>
+        </w:rPr>
+        <w:t xml:space="preserve">chrsignal </w:t>
+      </w:r>
+      <w:r>
+        <w:rPr>
+          <w:rFonts w:ascii="Consolas" w:hAnsi="Consolas" w:cs="Consolas"/>
+          <w:bCs/>
+          <w:color w:val="000000" w:themeColor="text1"/>
+          <w:kern w:val="0"/>
+          <w:sz w:val="20"/>
+          <w:szCs w:val="20"/>
+        </w:rPr>
+        <w:t>代替原来</w:t>
+      </w:r>
+      <w:r>
+        <w:rPr>
+          <w:rFonts w:ascii="Consolas" w:hAnsi="Consolas" w:cs="Consolas"/>
+          <w:bCs/>
+          <w:color w:val="000000" w:themeColor="text1"/>
+          <w:kern w:val="0"/>
+          <w:sz w:val="20"/>
+          <w:szCs w:val="20"/>
+        </w:rPr>
+        <w:t xml:space="preserve"> mapname == "transcript:"</w:t>
+      </w:r>
+      <w:r>
+        <w:rPr>
+          <w:rFonts w:ascii="Consolas" w:hAnsi="Consolas" w:cs="Consolas"/>
+          <w:bCs/>
+          <w:color w:val="000000" w:themeColor="text1"/>
+          <w:kern w:val="0"/>
+          <w:sz w:val="20"/>
+          <w:szCs w:val="20"/>
+        </w:rPr>
+        <w:t>的功能，即</w:t>
+      </w:r>
+      <w:r>
+        <w:rPr>
+          <w:rFonts w:ascii="Consolas" w:hAnsi="Consolas" w:cs="Consolas"/>
+          <w:bCs/>
+          <w:color w:val="000000" w:themeColor="text1"/>
+          <w:kern w:val="0"/>
+          <w:sz w:val="20"/>
+          <w:szCs w:val="20"/>
+        </w:rPr>
+        <w:t xml:space="preserve"> </w:t>
+      </w:r>
+      <w:r>
+        <w:rPr>
+          <w:rFonts w:ascii="Consolas" w:hAnsi="Consolas" w:cs="Consolas"/>
+          <w:bCs/>
+          <w:color w:val="000000" w:themeColor="text1"/>
+          <w:kern w:val="0"/>
+          <w:sz w:val="20"/>
+          <w:szCs w:val="20"/>
+        </w:rPr>
+        <w:t>令</w:t>
+      </w:r>
+      <w:r>
+        <w:rPr>
+          <w:rFonts w:ascii="Consolas" w:hAnsi="Consolas" w:cs="Consolas"/>
+          <w:bCs/>
+          <w:color w:val="000000" w:themeColor="text1"/>
+          <w:kern w:val="0"/>
+          <w:sz w:val="20"/>
+          <w:szCs w:val="20"/>
+        </w:rPr>
+        <w:t xml:space="preserve">  chrsignal= "transcript:"</w:t>
+      </w:r>
+    </w:p>
+    <w:p>
+      <w:pPr>
+        <w:rPr>
+          <w:rFonts w:ascii="Consolas" w:hAnsi="Consolas" w:cs="Consolas"/>
+          <w:bCs/>
+          <w:color w:val="000000" w:themeColor="text1"/>
+          <w:kern w:val="0"/>
+          <w:sz w:val="20"/>
+          <w:szCs w:val="20"/>
+        </w:rPr>
+      </w:pPr>
+      <w:r>
+        <w:rPr>
+          <w:rFonts w:ascii="Consolas" w:hAnsi="Consolas" w:cs="Consolas" w:hint="eastAsia"/>
+          <w:bCs/>
+          <w:color w:val="000000" w:themeColor="text1"/>
+          <w:kern w:val="0"/>
+          <w:sz w:val="20"/>
+          <w:szCs w:val="20"/>
+        </w:rPr>
+        <w:t>且</w:t>
+      </w:r>
+    </w:p>
+    <w:p>
+      <w:pPr>
+        <w:rPr>
+          <w:rFonts w:ascii="Consolas" w:hAnsi="Consolas" w:cs="Consolas"/>
+          <w:bCs/>
+          <w:color w:val="000000" w:themeColor="text1"/>
+          <w:kern w:val="0"/>
+          <w:sz w:val="20"/>
+          <w:szCs w:val="20"/>
+        </w:rPr>
+      </w:pPr>
+      <w:r>
+        <w:rPr>
+          <w:rFonts w:ascii="Consolas" w:hAnsi="Consolas" w:cs="Consolas" w:hint="eastAsia"/>
+          <w:bCs/>
+          <w:color w:val="000000" w:themeColor="text1"/>
+          <w:kern w:val="0"/>
+          <w:sz w:val="20"/>
+          <w:szCs w:val="20"/>
+        </w:rPr>
+        <w:t>每个染色体分段定位，即整个</w:t>
+      </w:r>
+      <w:r>
+        <w:rPr>
+          <w:rFonts w:ascii="Consolas" w:hAnsi="Consolas" w:cs="Consolas"/>
+          <w:bCs/>
+          <w:color w:val="000000" w:themeColor="text1"/>
+          <w:kern w:val="0"/>
+          <w:sz w:val="20"/>
+          <w:szCs w:val="20"/>
+        </w:rPr>
+        <w:t>chr</w:t>
+      </w:r>
+      <w:r>
+        <w:rPr>
+          <w:rFonts w:ascii="Consolas" w:hAnsi="Consolas" w:cs="Consolas" w:hint="eastAsia"/>
+          <w:bCs/>
+          <w:color w:val="000000" w:themeColor="text1"/>
+          <w:kern w:val="0"/>
+          <w:sz w:val="20"/>
+          <w:szCs w:val="20"/>
+        </w:rPr>
+        <w:t>拆为很多小块，每个小块都有</w:t>
+      </w:r>
+      <w:r>
+        <w:rPr>
+          <w:rFonts w:ascii="Consolas" w:hAnsi="Consolas" w:cs="Consolas" w:hint="eastAsia"/>
+          <w:bCs/>
+          <w:color w:val="000000" w:themeColor="text1"/>
+          <w:kern w:val="0"/>
+          <w:sz w:val="20"/>
+          <w:szCs w:val="20"/>
+        </w:rPr>
+        <w:t>f</w:t>
+      </w:r>
+      <w:r>
+        <w:rPr>
+          <w:rFonts w:ascii="Consolas" w:hAnsi="Consolas" w:cs="Consolas"/>
+          <w:bCs/>
+          <w:color w:val="000000" w:themeColor="text1"/>
+          <w:kern w:val="0"/>
+          <w:sz w:val="20"/>
+          <w:szCs w:val="20"/>
+        </w:rPr>
+        <w:t>ilehandler</w:t>
+      </w:r>
+      <w:r>
+        <w:rPr>
+          <w:rFonts w:ascii="Consolas" w:hAnsi="Consolas" w:cs="Consolas" w:hint="eastAsia"/>
+          <w:bCs/>
+          <w:color w:val="000000" w:themeColor="text1"/>
+          <w:kern w:val="0"/>
+          <w:sz w:val="20"/>
+          <w:szCs w:val="20"/>
+        </w:rPr>
+        <w:t>的位置和该位置之前的碱基数量：</w:t>
+      </w:r>
+    </w:p>
+    <w:p>
+      <w:pPr>
+        <w:rPr>
+          <w:rFonts w:ascii="Consolas" w:hAnsi="Consolas" w:cs="Consolas"/>
+          <w:bCs/>
+          <w:color w:val="000000" w:themeColor="text1"/>
+          <w:kern w:val="0"/>
+          <w:sz w:val="20"/>
+          <w:szCs w:val="20"/>
+        </w:rPr>
+      </w:pPr>
+      <w:r>
+        <w:rPr>
+          <w:rFonts w:ascii="Consolas" w:hAnsi="Consolas" w:cs="Consolas"/>
+          <w:bCs/>
+          <w:color w:val="000000" w:themeColor="text1"/>
+          <w:kern w:val="0"/>
+          <w:sz w:val="20"/>
+          <w:szCs w:val="20"/>
+        </w:rPr>
+        <w:t>refChromIndex[currentChromNo]</w:t>
+      </w:r>
+      <w:r>
+        <w:rPr>
+          <w:rFonts w:ascii="Consolas" w:hAnsi="Consolas" w:cs="Consolas"/>
+          <w:bCs/>
+          <w:color w:val="000000" w:themeColor="text1"/>
+          <w:kern w:val="0"/>
+          <w:sz w:val="20"/>
+          <w:szCs w:val="20"/>
+        </w:rPr>
+        <w:t>.</w:t>
+      </w:r>
+      <w:r>
+        <w:rPr>
+          <w:rFonts w:ascii="Consolas" w:hAnsi="Consolas" w:cs="Consolas"/>
+          <w:bCs/>
+          <w:color w:val="000000" w:themeColor="text1"/>
+          <w:kern w:val="0"/>
+          <w:sz w:val="20"/>
+          <w:szCs w:val="20"/>
+        </w:rPr>
+        <w:t>append((basecount,int(refFastaFile.tell())))</w:t>
+      </w:r>
+    </w:p>
+    <w:p>
+      <w:pPr>
+        <w:rPr>
+          <w:rFonts w:ascii="Consolas" w:hAnsi="Consolas" w:cs="Consolas"/>
+          <w:bCs/>
+          <w:color w:val="000000" w:themeColor="text1"/>
+          <w:kern w:val="0"/>
+          <w:sz w:val="20"/>
+          <w:szCs w:val="20"/>
+        </w:rPr>
+      </w:pPr>
+    </w:p>
+    <w:p>
+      <w:pPr>
+        <w:rPr>
+          <w:rFonts w:ascii="Consolas" w:hAnsi="Consolas" w:cs="Consolas" w:hint="eastAsia"/>
+          <w:bCs/>
+          <w:color w:val="000000" w:themeColor="text1"/>
+          <w:kern w:val="0"/>
+          <w:sz w:val="20"/>
+          <w:szCs w:val="20"/>
+        </w:rPr>
+      </w:pPr>
+      <w:r>
+        <w:rPr>
+          <w:rFonts w:ascii="Consolas" w:hAnsi="Consolas" w:cs="Consolas" w:hint="eastAsia"/>
+          <w:bCs/>
+          <w:color w:val="000000" w:themeColor="text1"/>
+          <w:kern w:val="0"/>
+          <w:sz w:val="20"/>
+          <w:szCs w:val="20"/>
+        </w:rPr>
+        <w:t>重写了</w:t>
+      </w:r>
+      <w:r>
+        <w:rPr>
+          <w:rFonts w:ascii="Consolas" w:hAnsi="Consolas" w:cs="Consolas"/>
+          <w:bCs/>
+          <w:color w:val="000000" w:themeColor="text1"/>
+          <w:kern w:val="0"/>
+          <w:sz w:val="20"/>
+          <w:szCs w:val="20"/>
+        </w:rPr>
+        <w:t>getRefSeqMap</w:t>
+      </w:r>
+      <w:r>
+        <w:rPr>
+          <w:rFonts w:ascii="Consolas" w:hAnsi="Consolas" w:cs="Consolas" w:hint="eastAsia"/>
+          <w:bCs/>
+          <w:color w:val="000000" w:themeColor="text1"/>
+          <w:kern w:val="0"/>
+          <w:sz w:val="20"/>
+          <w:szCs w:val="20"/>
+        </w:rPr>
+        <w:t>函数，增加了</w:t>
+      </w:r>
+      <w:r>
+        <w:rPr>
+          <w:rFonts w:ascii="Consolas" w:hAnsi="Consolas" w:cs="Consolas"/>
+          <w:bCs/>
+          <w:color w:val="000000" w:themeColor="text1"/>
+          <w:kern w:val="0"/>
+          <w:sz w:val="20"/>
+          <w:szCs w:val="20"/>
+        </w:rPr>
+        <w:t>refFastafilehander</w:t>
+      </w:r>
+      <w:r>
+        <w:rPr>
+          <w:rFonts w:ascii="Consolas" w:hAnsi="Consolas" w:cs="Consolas" w:hint="eastAsia"/>
+          <w:bCs/>
+          <w:color w:val="000000" w:themeColor="text1"/>
+          <w:kern w:val="0"/>
+          <w:sz w:val="20"/>
+          <w:szCs w:val="20"/>
+        </w:rPr>
+        <w:t>,</w:t>
+      </w:r>
+      <w:r>
+        <w:rPr>
+          <w:rFonts w:ascii="Consolas" w:hAnsi="Consolas" w:cs="Consolas"/>
+          <w:bCs/>
+          <w:color w:val="000000" w:themeColor="text1"/>
+          <w:kern w:val="0"/>
+          <w:sz w:val="20"/>
+          <w:szCs w:val="20"/>
+        </w:rPr>
+        <w:t xml:space="preserve"> </w:t>
+      </w:r>
+      <w:r>
+        <w:rPr>
+          <w:rFonts w:ascii="Consolas" w:hAnsi="Consolas" w:cs="Consolas"/>
+          <w:color w:val="000000"/>
+          <w:kern w:val="0"/>
+          <w:sz w:val="24"/>
+          <w:szCs w:val="24"/>
+          <w:highlight w:val="yellow"/>
+        </w:rPr>
+        <w:t>fastaidxer</w:t>
+      </w:r>
+      <w:r>
+        <w:rPr>
+          <w:rFonts w:ascii="Consolas" w:hAnsi="Consolas" w:cs="Consolas" w:hint="eastAsia"/>
+          <w:color w:val="000000"/>
+          <w:kern w:val="0"/>
+          <w:sz w:val="24"/>
+          <w:szCs w:val="24"/>
+          <w:highlight w:val="yellow"/>
+        </w:rPr>
+        <w:t>参数，使得不用再调用函数外找到</w:t>
+      </w:r>
+      <w:r>
+        <w:rPr>
+          <w:rFonts w:ascii="Consolas" w:hAnsi="Consolas" w:cs="Consolas"/>
+          <w:color w:val="000000"/>
+          <w:kern w:val="0"/>
+          <w:sz w:val="24"/>
+          <w:szCs w:val="24"/>
+        </w:rPr>
+        <w:t>refFastafilehander</w:t>
+      </w:r>
+      <w:r>
+        <w:rPr>
+          <w:rFonts w:ascii="Consolas" w:hAnsi="Consolas" w:cs="Consolas" w:hint="eastAsia"/>
+          <w:color w:val="000000"/>
+          <w:kern w:val="0"/>
+          <w:sz w:val="24"/>
+          <w:szCs w:val="24"/>
+          <w:highlight w:val="yellow"/>
+        </w:rPr>
+        <w:t>的位置，而在函数内部，根据索引类找到位置。</w:t>
+      </w:r>
+    </w:p>
+    <w:p>
+      <w:pPr>
+        <w:pStyle w:val="a4"/>
+        <w:ind w:left="840" w:firstLineChars="0" w:firstLine="0"/>
+        <w:rPr>
+          <w:rFonts w:ascii="Times New Roman" w:eastAsia="宋体" w:hAnsi="Times New Roman" w:cs="Times New Roman"/>
+          <w:sz w:val="24"/>
+          <w:szCs w:val="24"/>
+        </w:rPr>
+      </w:pPr>
+    </w:p>
+    <w:p>
+      <w:pPr>
+        <w:rPr>
+          <w:bCs/>
+        </w:rPr>
+      </w:pPr>
     </w:p>
     <w:p>
       <w:pPr>

</xml_diff>